<commit_message>
feat: adiciona requisitos e tecnologias utilizadas no projeto
</commit_message>
<xml_diff>
--- a/Documentacao/Documentacao.docx
+++ b/Documentacao/Documentacao.docx
@@ -12,7 +12,6 @@
           <w:szCs w:val="24"/>
         </w:rPr>
       </w:pPr>
-      <w:bookmarkStart w:id="0" w:name="_GoBack"/>
       <w:r>
         <w:rPr>
           <w:rFonts w:ascii="Arial" w:hAnsi="Arial" w:cs="Arial"/>
@@ -400,17 +399,7 @@
           <w:sz w:val="28"/>
           <w:szCs w:val="24"/>
         </w:rPr>
-        <w:t>platafo</w:t>
-      </w:r>
-      <w:r>
-        <w:rPr>
-          <w:rFonts w:ascii="Arial" w:hAnsi="Arial" w:cs="Arial"/>
-          <w:b/>
-          <w:bCs/>
-          <w:sz w:val="28"/>
-          <w:szCs w:val="24"/>
-        </w:rPr>
-        <w:t>rma de adaptação didática com IA para alunos com TEA</w:t>
+        <w:t>plataforma de adaptação didática com IA para alunos com TEA</w:t>
       </w:r>
     </w:p>
     <w:p>
@@ -746,17 +735,7 @@
           <w:sz w:val="28"/>
           <w:szCs w:val="24"/>
         </w:rPr>
-        <w:t>platafo</w:t>
-      </w:r>
-      <w:r>
-        <w:rPr>
-          <w:rFonts w:ascii="Arial" w:hAnsi="Arial" w:cs="Arial"/>
-          <w:b/>
-          <w:bCs/>
-          <w:sz w:val="28"/>
-          <w:szCs w:val="24"/>
-        </w:rPr>
-        <w:t>rma de adaptação didática com IA para alunos com TEA</w:t>
+        <w:t>plataforma de adaptação didática com IA para alunos com TEA</w:t>
       </w:r>
     </w:p>
     <w:p>
@@ -1139,7 +1118,7 @@
           <w:szCs w:val="24"/>
           <w:lang w:val="en-US"/>
         </w:rPr>
-        <w:t>Inclusão</w:t>
+        <w:t>In</w:t>
       </w:r>
       <w:r>
         <w:rPr>
@@ -1148,6 +1127,15 @@
           <w:szCs w:val="24"/>
           <w:lang w:val="en-US"/>
         </w:rPr>
+        <w:t>clusão</w:t>
+      </w:r>
+      <w:r>
+        <w:rPr>
+          <w:rFonts w:ascii="Arial" w:hAnsi="Arial" w:cs="Arial"/>
+          <w:sz w:val="24"/>
+          <w:szCs w:val="24"/>
+          <w:lang w:val="en-US"/>
+        </w:rPr>
         <w:t>.</w:t>
       </w:r>
     </w:p>
@@ -2192,23 +2180,23 @@
     </w:p>
     <w:p>
       <w:pPr>
-        <w:spacing w:line="240" w:lineRule="auto"/>
-        <w:rPr>
-          <w:rFonts w:ascii="Arial" w:eastAsia="Times New Roman" w:hAnsi="Arial" w:cs="Arial"/>
-          <w:b/>
-          <w:bCs/>
-          <w:sz w:val="30"/>
-          <w:szCs w:val="30"/>
-          <w:lang w:eastAsia="pt-BR"/>
-        </w:rPr>
-      </w:pPr>
-      <w:r>
-        <w:rPr>
-          <w:rFonts w:ascii="Arial" w:eastAsia="Times New Roman" w:hAnsi="Arial" w:cs="Arial"/>
-          <w:b/>
-          <w:bCs/>
-          <w:sz w:val="30"/>
-          <w:szCs w:val="30"/>
+        <w:spacing w:after="0" w:line="360" w:lineRule="auto"/>
+        <w:rPr>
+          <w:rFonts w:ascii="Arial" w:eastAsia="Times New Roman" w:hAnsi="Arial" w:cs="Arial"/>
+          <w:b/>
+          <w:bCs/>
+          <w:sz w:val="24"/>
+          <w:szCs w:val="24"/>
+          <w:lang w:eastAsia="pt-BR"/>
+        </w:rPr>
+      </w:pPr>
+      <w:r>
+        <w:rPr>
+          <w:rFonts w:ascii="Arial" w:eastAsia="Times New Roman" w:hAnsi="Arial" w:cs="Arial"/>
+          <w:b/>
+          <w:bCs/>
+          <w:sz w:val="24"/>
+          <w:szCs w:val="24"/>
           <w:lang w:eastAsia="pt-BR"/>
         </w:rPr>
         <w:t>INTRODUÇÃO</w:t>
@@ -2216,7 +2204,7 @@
     </w:p>
     <w:p>
       <w:pPr>
-        <w:spacing w:line="240" w:lineRule="auto"/>
+        <w:spacing w:after="0" w:line="360" w:lineRule="auto"/>
         <w:rPr>
           <w:rFonts w:ascii="Arial" w:eastAsia="Times New Roman" w:hAnsi="Arial" w:cs="Arial"/>
           <w:b/>
@@ -2240,7 +2228,7 @@
     </w:p>
     <w:p>
       <w:pPr>
-        <w:spacing w:line="240" w:lineRule="auto"/>
+        <w:spacing w:after="0" w:line="360" w:lineRule="auto"/>
         <w:rPr>
           <w:rFonts w:ascii="Arial" w:eastAsia="Times New Roman" w:hAnsi="Arial" w:cs="Arial"/>
           <w:sz w:val="24"/>
@@ -2260,7 +2248,7 @@
     </w:p>
     <w:p>
       <w:pPr>
-        <w:spacing w:line="240" w:lineRule="auto"/>
+        <w:spacing w:after="0" w:line="360" w:lineRule="auto"/>
         <w:rPr>
           <w:rFonts w:ascii="Arial" w:eastAsia="Times New Roman" w:hAnsi="Arial" w:cs="Arial"/>
           <w:sz w:val="24"/>
@@ -2294,14 +2282,6 @@
           <w:lang w:eastAsia="pt-BR"/>
         </w:rPr>
         <w:tab/>
-      </w:r>
-      <w:r>
-        <w:rPr>
-          <w:rFonts w:ascii="Arial" w:eastAsia="Times New Roman" w:hAnsi="Arial" w:cs="Arial"/>
-          <w:sz w:val="24"/>
-          <w:szCs w:val="24"/>
-          <w:lang w:eastAsia="pt-BR"/>
-        </w:rPr>
         <w:t>agógicos identificados compreendem:</w:t>
       </w:r>
     </w:p>
@@ -2311,7 +2291,7 @@
           <w:ilvl w:val="0"/>
           <w:numId w:val="32"/>
         </w:numPr>
-        <w:spacing w:after="0" w:line="240" w:lineRule="auto"/>
+        <w:spacing w:after="0" w:line="360" w:lineRule="auto"/>
         <w:ind w:left="0"/>
         <w:rPr>
           <w:rFonts w:ascii="Arial" w:eastAsia="Times New Roman" w:hAnsi="Arial" w:cs="Arial"/>
@@ -2347,7 +2327,7 @@
           <w:ilvl w:val="0"/>
           <w:numId w:val="32"/>
         </w:numPr>
-        <w:spacing w:after="0" w:line="240" w:lineRule="auto"/>
+        <w:spacing w:after="0" w:line="360" w:lineRule="auto"/>
         <w:ind w:left="0"/>
         <w:rPr>
           <w:rFonts w:ascii="Arial" w:eastAsia="Times New Roman" w:hAnsi="Arial" w:cs="Arial"/>
@@ -2383,7 +2363,7 @@
           <w:ilvl w:val="0"/>
           <w:numId w:val="32"/>
         </w:numPr>
-        <w:spacing w:after="0" w:line="240" w:lineRule="auto"/>
+        <w:spacing w:after="0" w:line="360" w:lineRule="auto"/>
         <w:ind w:left="0"/>
         <w:rPr>
           <w:rFonts w:ascii="Arial" w:eastAsia="Times New Roman" w:hAnsi="Arial" w:cs="Arial"/>
@@ -2415,7 +2395,7 @@
     </w:p>
     <w:p>
       <w:pPr>
-        <w:spacing w:line="240" w:lineRule="auto"/>
+        <w:spacing w:after="0" w:line="360" w:lineRule="auto"/>
         <w:rPr>
           <w:rFonts w:ascii="Arial" w:eastAsia="Times New Roman" w:hAnsi="Arial" w:cs="Arial"/>
           <w:sz w:val="24"/>
@@ -2435,7 +2415,7 @@
     </w:p>
     <w:p>
       <w:pPr>
-        <w:spacing w:line="240" w:lineRule="auto"/>
+        <w:spacing w:after="0" w:line="360" w:lineRule="auto"/>
         <w:rPr>
           <w:rFonts w:ascii="Arial" w:eastAsia="Times New Roman" w:hAnsi="Arial" w:cs="Arial"/>
           <w:b/>
@@ -2459,7 +2439,7 @@
     </w:p>
     <w:p>
       <w:pPr>
-        <w:spacing w:line="240" w:lineRule="auto"/>
+        <w:spacing w:after="0" w:line="360" w:lineRule="auto"/>
         <w:rPr>
           <w:rFonts w:ascii="Arial" w:eastAsia="Times New Roman" w:hAnsi="Arial" w:cs="Arial"/>
           <w:sz w:val="24"/>
@@ -2494,12 +2474,30 @@
           <w:szCs w:val="24"/>
           <w:lang w:eastAsia="pt-BR"/>
         </w:rPr>
-        <w:t>, uma ferramenta baseada em Inteligência Artificial que apoia professores do ensino médio na adaptação rápida e automatizada de materiais pedagógicos (textos, PDFs, slides e atividades) em versões acessíveis para alunos com TEA nível 1.</w:t>
-      </w:r>
-    </w:p>
-    <w:p>
-      <w:pPr>
-        <w:spacing w:line="240" w:lineRule="auto"/>
+        <w:t>, uma ferramenta baseada em Inteligência Artificial que a</w:t>
+      </w:r>
+      <w:r>
+        <w:rPr>
+          <w:rFonts w:ascii="Arial" w:eastAsia="Times New Roman" w:hAnsi="Arial" w:cs="Arial"/>
+          <w:sz w:val="24"/>
+          <w:szCs w:val="24"/>
+          <w:lang w:eastAsia="pt-BR"/>
+        </w:rPr>
+        <w:t>poia professores da ETEC Professor Camargo Aranha</w:t>
+      </w:r>
+      <w:r>
+        <w:rPr>
+          <w:rFonts w:ascii="Arial" w:eastAsia="Times New Roman" w:hAnsi="Arial" w:cs="Arial"/>
+          <w:sz w:val="24"/>
+          <w:szCs w:val="24"/>
+          <w:lang w:eastAsia="pt-BR"/>
+        </w:rPr>
+        <w:t xml:space="preserve"> na adaptação rápida e automatizada de materiais pedagógicos (textos, PDFs, slides e atividades) em versões acessíveis para alunos com TEA nível 1.</w:t>
+      </w:r>
+    </w:p>
+    <w:p>
+      <w:pPr>
+        <w:spacing w:after="0" w:line="360" w:lineRule="auto"/>
         <w:rPr>
           <w:rFonts w:ascii="Arial" w:eastAsia="Times New Roman" w:hAnsi="Arial" w:cs="Arial"/>
           <w:b/>
@@ -2523,107 +2521,185 @@
     </w:p>
     <w:p>
       <w:pPr>
-        <w:numPr>
-          <w:ilvl w:val="0"/>
-          <w:numId w:val="33"/>
-        </w:numPr>
-        <w:spacing w:after="0" w:line="240" w:lineRule="auto"/>
-        <w:ind w:left="0"/>
-        <w:rPr>
-          <w:rFonts w:ascii="Arial" w:eastAsia="Times New Roman" w:hAnsi="Arial" w:cs="Arial"/>
-          <w:sz w:val="24"/>
-          <w:szCs w:val="24"/>
-          <w:lang w:eastAsia="pt-BR"/>
-        </w:rPr>
-      </w:pPr>
-      <w:r>
-        <w:rPr>
-          <w:rFonts w:ascii="Arial" w:eastAsia="Times New Roman" w:hAnsi="Arial" w:cs="Arial"/>
-          <w:sz w:val="24"/>
-          <w:szCs w:val="24"/>
-          <w:lang w:eastAsia="pt-BR"/>
-        </w:rPr>
-        <w:t>Implementar algoritmos de Inteligência Artificial para simplificar a linguagem, estruturar conteúdos em etapas e destacar conceitos-chave de forma automatizada.</w:t>
-      </w:r>
-    </w:p>
-    <w:p>
-      <w:pPr>
-        <w:numPr>
-          <w:ilvl w:val="0"/>
-          <w:numId w:val="33"/>
-        </w:numPr>
-        <w:spacing w:after="0" w:line="240" w:lineRule="auto"/>
-        <w:ind w:left="0"/>
-        <w:rPr>
-          <w:rFonts w:ascii="Arial" w:eastAsia="Times New Roman" w:hAnsi="Arial" w:cs="Arial"/>
-          <w:sz w:val="24"/>
-          <w:szCs w:val="24"/>
-          <w:lang w:eastAsia="pt-BR"/>
-        </w:rPr>
-      </w:pPr>
-      <w:r>
-        <w:rPr>
-          <w:rFonts w:ascii="Arial" w:eastAsia="Times New Roman" w:hAnsi="Arial" w:cs="Arial"/>
-          <w:sz w:val="24"/>
-          <w:szCs w:val="24"/>
-          <w:lang w:eastAsia="pt-BR"/>
-        </w:rPr>
-        <w:t>Aplicar as diretrizes do Desenho Universal para a Aprendizagem (DUA) e o design instrucional do modelo ADDIE na interface e nas saídas da plataforma.</w:t>
-      </w:r>
-    </w:p>
-    <w:p>
-      <w:pPr>
-        <w:numPr>
-          <w:ilvl w:val="0"/>
-          <w:numId w:val="33"/>
-        </w:numPr>
-        <w:spacing w:after="0" w:line="240" w:lineRule="auto"/>
-        <w:ind w:left="0"/>
-        <w:rPr>
-          <w:rFonts w:ascii="Arial" w:eastAsia="Times New Roman" w:hAnsi="Arial" w:cs="Arial"/>
-          <w:sz w:val="24"/>
-          <w:szCs w:val="24"/>
-          <w:lang w:eastAsia="pt-BR"/>
-        </w:rPr>
-      </w:pPr>
-      <w:r>
-        <w:rPr>
-          <w:rFonts w:ascii="Arial" w:eastAsia="Times New Roman" w:hAnsi="Arial" w:cs="Arial"/>
-          <w:sz w:val="24"/>
-          <w:szCs w:val="24"/>
-          <w:lang w:eastAsia="pt-BR"/>
-        </w:rPr>
-        <w:t>Validar a eficácia do sistema através de pesquisas de campo em parceria com a clínica especializada Movthera e a comunidade escolar.</w:t>
-      </w:r>
-    </w:p>
-    <w:p>
-      <w:pPr>
-        <w:numPr>
-          <w:ilvl w:val="0"/>
-          <w:numId w:val="33"/>
-        </w:numPr>
-        <w:spacing w:after="0" w:line="240" w:lineRule="auto"/>
-        <w:ind w:left="0"/>
-        <w:rPr>
-          <w:rFonts w:ascii="Arial" w:eastAsia="Times New Roman" w:hAnsi="Arial" w:cs="Arial"/>
-          <w:sz w:val="24"/>
-          <w:szCs w:val="24"/>
-          <w:lang w:eastAsia="pt-BR"/>
-        </w:rPr>
-      </w:pPr>
-      <w:r>
-        <w:rPr>
-          <w:rFonts w:ascii="Arial" w:eastAsia="Times New Roman" w:hAnsi="Arial" w:cs="Arial"/>
-          <w:sz w:val="24"/>
-          <w:szCs w:val="24"/>
-          <w:lang w:eastAsia="pt-BR"/>
-        </w:rPr>
-        <w:t>Delimitar o escopo inicial de adaptação para as disciplinas da área de Humanas e Linguagens: Língua Portuguesa, Literatura, História, Geografia, Sociologia e Filosofia.</w:t>
-      </w:r>
-    </w:p>
-    <w:p>
-      <w:pPr>
-        <w:spacing w:line="240" w:lineRule="auto"/>
+        <w:spacing w:after="0" w:line="360" w:lineRule="auto"/>
+        <w:rPr>
+          <w:rFonts w:ascii="Arial" w:eastAsia="Times New Roman" w:hAnsi="Arial" w:cs="Arial"/>
+          <w:bCs/>
+          <w:sz w:val="24"/>
+          <w:szCs w:val="24"/>
+          <w:lang w:eastAsia="pt-BR"/>
+        </w:rPr>
+      </w:pPr>
+      <w:r>
+        <w:rPr>
+          <w:rFonts w:ascii="Arial" w:eastAsia="Times New Roman" w:hAnsi="Arial" w:cs="Arial"/>
+          <w:b/>
+          <w:bCs/>
+          <w:sz w:val="24"/>
+          <w:szCs w:val="24"/>
+          <w:lang w:eastAsia="pt-BR"/>
+        </w:rPr>
+        <w:t xml:space="preserve">RF01 - </w:t>
+      </w:r>
+      <w:r>
+        <w:rPr>
+          <w:rFonts w:ascii="Arial" w:eastAsia="Times New Roman" w:hAnsi="Arial" w:cs="Arial"/>
+          <w:bCs/>
+          <w:sz w:val="24"/>
+          <w:szCs w:val="24"/>
+          <w:lang w:eastAsia="pt-BR"/>
+        </w:rPr>
+        <w:t>Upload de Documentos: O sistema deve permitir o envio de arquivos no formato .pdf.</w:t>
+      </w:r>
+    </w:p>
+    <w:p>
+      <w:pPr>
+        <w:spacing w:after="0" w:line="360" w:lineRule="auto"/>
+        <w:rPr>
+          <w:rFonts w:ascii="Arial" w:eastAsia="Times New Roman" w:hAnsi="Arial" w:cs="Arial"/>
+          <w:bCs/>
+          <w:sz w:val="24"/>
+          <w:szCs w:val="24"/>
+          <w:lang w:eastAsia="pt-BR"/>
+        </w:rPr>
+      </w:pPr>
+      <w:r>
+        <w:rPr>
+          <w:rFonts w:ascii="Arial" w:eastAsia="Times New Roman" w:hAnsi="Arial" w:cs="Arial"/>
+          <w:b/>
+          <w:bCs/>
+          <w:sz w:val="24"/>
+          <w:szCs w:val="24"/>
+          <w:lang w:eastAsia="pt-BR"/>
+        </w:rPr>
+        <w:t xml:space="preserve">RF02 - </w:t>
+      </w:r>
+      <w:r>
+        <w:rPr>
+          <w:rFonts w:ascii="Arial" w:eastAsia="Times New Roman" w:hAnsi="Arial" w:cs="Arial"/>
+          <w:bCs/>
+          <w:sz w:val="24"/>
+          <w:szCs w:val="24"/>
+          <w:lang w:eastAsia="pt-BR"/>
+        </w:rPr>
+        <w:t>Validação de Entrada: O sistema deve verificar o formato antes de iniciar o processamento.</w:t>
+      </w:r>
+    </w:p>
+    <w:p>
+      <w:pPr>
+        <w:spacing w:after="0" w:line="360" w:lineRule="auto"/>
+        <w:rPr>
+          <w:rFonts w:ascii="Arial" w:eastAsia="Times New Roman" w:hAnsi="Arial" w:cs="Arial"/>
+          <w:b/>
+          <w:bCs/>
+          <w:sz w:val="24"/>
+          <w:szCs w:val="24"/>
+          <w:lang w:eastAsia="pt-BR"/>
+        </w:rPr>
+      </w:pPr>
+      <w:r>
+        <w:rPr>
+          <w:rFonts w:ascii="Arial" w:eastAsia="Times New Roman" w:hAnsi="Arial" w:cs="Arial"/>
+          <w:b/>
+          <w:bCs/>
+          <w:sz w:val="24"/>
+          <w:szCs w:val="24"/>
+          <w:lang w:eastAsia="pt-BR"/>
+        </w:rPr>
+        <w:lastRenderedPageBreak/>
+        <w:t xml:space="preserve">RF03 - </w:t>
+      </w:r>
+      <w:r>
+        <w:rPr>
+          <w:rFonts w:ascii="Arial" w:eastAsia="Times New Roman" w:hAnsi="Arial" w:cs="Arial"/>
+          <w:bCs/>
+          <w:sz w:val="24"/>
+          <w:szCs w:val="24"/>
+          <w:lang w:eastAsia="pt-BR"/>
+        </w:rPr>
+        <w:t xml:space="preserve">Extração de Conteúdo: O sistema deve extrair o </w:t>
+      </w:r>
+      <w:r>
+        <w:rPr>
+          <w:rFonts w:ascii="Arial" w:eastAsia="Times New Roman" w:hAnsi="Arial" w:cs="Arial"/>
+          <w:bCs/>
+          <w:sz w:val="24"/>
+          <w:szCs w:val="24"/>
+          <w:lang w:eastAsia="pt-BR"/>
+        </w:rPr>
+        <w:t>conteúdo e identificar, com o auxílio da IA, as ambiguidades ou possíveis interferências (com base nos parâmetros passados), do arquivo selecionado</w:t>
+      </w:r>
+    </w:p>
+    <w:p>
+      <w:pPr>
+        <w:spacing w:after="0" w:line="360" w:lineRule="auto"/>
+        <w:rPr>
+          <w:rFonts w:ascii="Arial" w:eastAsia="Times New Roman" w:hAnsi="Arial" w:cs="Arial"/>
+          <w:bCs/>
+          <w:sz w:val="24"/>
+          <w:szCs w:val="24"/>
+          <w:lang w:eastAsia="pt-BR"/>
+        </w:rPr>
+      </w:pPr>
+      <w:r>
+        <w:rPr>
+          <w:rFonts w:ascii="Arial" w:eastAsia="Times New Roman" w:hAnsi="Arial" w:cs="Arial"/>
+          <w:b/>
+          <w:bCs/>
+          <w:sz w:val="24"/>
+          <w:szCs w:val="24"/>
+          <w:lang w:eastAsia="pt-BR"/>
+        </w:rPr>
+        <w:t xml:space="preserve">RF04 - </w:t>
+      </w:r>
+      <w:r>
+        <w:rPr>
+          <w:rFonts w:ascii="Arial" w:eastAsia="Times New Roman" w:hAnsi="Arial" w:cs="Arial"/>
+          <w:bCs/>
+          <w:sz w:val="24"/>
+          <w:szCs w:val="24"/>
+          <w:lang w:eastAsia="pt-BR"/>
+        </w:rPr>
+        <w:t>O sistema deve ter um botão para acionar a conversão</w:t>
+      </w:r>
+    </w:p>
+    <w:p>
+      <w:pPr>
+        <w:spacing w:after="0" w:line="360" w:lineRule="auto"/>
+        <w:rPr>
+          <w:rFonts w:ascii="Arial" w:eastAsia="Times New Roman" w:hAnsi="Arial" w:cs="Arial"/>
+          <w:b/>
+          <w:bCs/>
+          <w:sz w:val="24"/>
+          <w:szCs w:val="24"/>
+          <w:lang w:eastAsia="pt-BR"/>
+        </w:rPr>
+      </w:pPr>
+      <w:r>
+        <w:rPr>
+          <w:rFonts w:ascii="Arial" w:eastAsia="Times New Roman" w:hAnsi="Arial" w:cs="Arial"/>
+          <w:b/>
+          <w:bCs/>
+          <w:sz w:val="24"/>
+          <w:szCs w:val="24"/>
+          <w:lang w:eastAsia="pt-BR"/>
+        </w:rPr>
+        <w:t xml:space="preserve">RF05 – </w:t>
+      </w:r>
+      <w:r>
+        <w:rPr>
+          <w:rFonts w:ascii="Arial" w:eastAsia="Times New Roman" w:hAnsi="Arial" w:cs="Arial"/>
+          <w:bCs/>
+          <w:sz w:val="24"/>
+          <w:szCs w:val="24"/>
+          <w:lang w:eastAsia="pt-BR"/>
+        </w:rPr>
+        <w:t>O download do arquivo ficará disponibilizado na tela assim que finalizado com um breve resumo do que foi mudado e melhorado</w:t>
+      </w:r>
+    </w:p>
+    <w:p>
+      <w:pPr>
+        <w:spacing w:after="0" w:line="360" w:lineRule="auto"/>
         <w:rPr>
           <w:rFonts w:ascii="Arial" w:eastAsia="Times New Roman" w:hAnsi="Arial" w:cs="Arial"/>
           <w:b/>
@@ -2647,7 +2723,7 @@
     </w:p>
     <w:p>
       <w:pPr>
-        <w:spacing w:line="240" w:lineRule="auto"/>
+        <w:spacing w:after="0" w:line="360" w:lineRule="auto"/>
         <w:rPr>
           <w:rFonts w:ascii="Arial" w:eastAsia="Times New Roman" w:hAnsi="Arial" w:cs="Arial"/>
           <w:sz w:val="24"/>
@@ -2664,6 +2740,17 @@
         </w:rPr>
         <w:t>A metodologia deste projeto é de natureza aplicada e qualitativa, estruturada sob os seguintes pilares:</w:t>
       </w:r>
+    </w:p>
+    <w:p>
+      <w:pPr>
+        <w:spacing w:after="0" w:line="360" w:lineRule="auto"/>
+        <w:rPr>
+          <w:rFonts w:ascii="Arial" w:eastAsia="Times New Roman" w:hAnsi="Arial" w:cs="Arial"/>
+          <w:sz w:val="24"/>
+          <w:szCs w:val="24"/>
+          <w:lang w:eastAsia="pt-BR"/>
+        </w:rPr>
+      </w:pPr>
     </w:p>
     <w:p>
       <w:pPr>
@@ -2671,75 +2758,51 @@
           <w:ilvl w:val="0"/>
           <w:numId w:val="34"/>
         </w:numPr>
-        <w:spacing w:after="0" w:line="240" w:lineRule="auto"/>
+        <w:spacing w:after="0" w:line="360" w:lineRule="auto"/>
         <w:ind w:left="0"/>
         <w:rPr>
           <w:rFonts w:ascii="Arial" w:eastAsia="Times New Roman" w:hAnsi="Arial" w:cs="Arial"/>
           <w:sz w:val="24"/>
           <w:szCs w:val="24"/>
-          <w:lang w:eastAsia="pt-BR"/>
-        </w:rPr>
-      </w:pPr>
-      <w:r>
-        <w:rPr>
-          <w:rFonts w:ascii="Arial" w:eastAsia="Times New Roman" w:hAnsi="Arial" w:cs="Arial"/>
-          <w:b/>
-          <w:bCs/>
-          <w:sz w:val="24"/>
-          <w:szCs w:val="24"/>
-          <w:lang w:eastAsia="pt-BR"/>
-        </w:rPr>
-        <w:lastRenderedPageBreak/>
-        <w:t>Engenharia de Software e Design Instrucional:</w:t>
-      </w:r>
-      <w:r>
-        <w:rPr>
-          <w:rFonts w:ascii="Arial" w:eastAsia="Times New Roman" w:hAnsi="Arial" w:cs="Arial"/>
-          <w:sz w:val="24"/>
-          <w:szCs w:val="24"/>
-          <w:lang w:eastAsia="pt-BR"/>
-        </w:rPr>
-        <w:t xml:space="preserve"> Uso do modelo </w:t>
-      </w:r>
-      <w:r>
-        <w:rPr>
-          <w:rFonts w:ascii="Arial" w:eastAsia="Times New Roman" w:hAnsi="Arial" w:cs="Arial"/>
-          <w:b/>
-          <w:bCs/>
-          <w:sz w:val="24"/>
-          <w:szCs w:val="24"/>
-          <w:lang w:eastAsia="pt-BR"/>
-        </w:rPr>
-        <w:t>ADDIE</w:t>
-      </w:r>
-      <w:r>
-        <w:rPr>
-          <w:rFonts w:ascii="Arial" w:eastAsia="Times New Roman" w:hAnsi="Arial" w:cs="Arial"/>
-          <w:sz w:val="24"/>
-          <w:szCs w:val="24"/>
-          <w:lang w:eastAsia="pt-BR"/>
-        </w:rPr>
-        <w:t xml:space="preserve"> (Análise, Design, Desenvolvimento, Implementação e Avaliação) para o fluxo geral do sistema e a metodologia ágil </w:t>
-      </w:r>
-      <w:r>
-        <w:rPr>
-          <w:rFonts w:ascii="Arial" w:eastAsia="Times New Roman" w:hAnsi="Arial" w:cs="Arial"/>
-          <w:b/>
-          <w:bCs/>
-          <w:sz w:val="24"/>
-          <w:szCs w:val="24"/>
-          <w:lang w:eastAsia="pt-BR"/>
-        </w:rPr>
-        <w:t>Scrum</w:t>
-      </w:r>
-      <w:r>
-        <w:rPr>
-          <w:rFonts w:ascii="Arial" w:eastAsia="Times New Roman" w:hAnsi="Arial" w:cs="Arial"/>
-          <w:sz w:val="24"/>
-          <w:szCs w:val="24"/>
-          <w:lang w:eastAsia="pt-BR"/>
-        </w:rPr>
-        <w:t xml:space="preserve"> para a gestão do desenvolvimento.</w:t>
+          <w:lang w:val="en-US" w:eastAsia="pt-BR"/>
+        </w:rPr>
+      </w:pPr>
+      <w:r>
+        <w:rPr>
+          <w:rFonts w:ascii="Arial" w:eastAsia="Times New Roman" w:hAnsi="Arial" w:cs="Arial"/>
+          <w:b/>
+          <w:sz w:val="24"/>
+          <w:szCs w:val="24"/>
+          <w:lang w:val="en-US" w:eastAsia="pt-BR"/>
+        </w:rPr>
+        <w:t>Tecnologias Utilizadas:</w:t>
+      </w:r>
+      <w:r>
+        <w:rPr>
+          <w:rFonts w:ascii="Arial" w:eastAsia="Times New Roman" w:hAnsi="Arial" w:cs="Arial"/>
+          <w:sz w:val="24"/>
+          <w:szCs w:val="24"/>
+          <w:lang w:val="en-US" w:eastAsia="pt-BR"/>
+        </w:rPr>
+        <w:t xml:space="preserve"> Java, Spring Boot, Spring Security, JWT Au</w:t>
+      </w:r>
+      <w:r>
+        <w:rPr>
+          <w:rFonts w:ascii="Arial" w:eastAsia="Times New Roman" w:hAnsi="Arial" w:cs="Arial"/>
+          <w:sz w:val="24"/>
+          <w:szCs w:val="24"/>
+          <w:lang w:val="en-US" w:eastAsia="pt-BR"/>
+        </w:rPr>
+        <w:t>thenti</w:t>
+      </w:r>
+      <w:r>
+        <w:rPr>
+          <w:rFonts w:ascii="Arial" w:eastAsia="Times New Roman" w:hAnsi="Arial" w:cs="Arial"/>
+          <w:sz w:val="24"/>
+          <w:szCs w:val="24"/>
+          <w:lang w:val="en-US" w:eastAsia="pt-BR"/>
+        </w:rPr>
+        <w:t>cation, Spring Data JPA, Maven, Lombok, Flyway, REST API, PostgreSQL, Spring AI, OpenAI API, Docker, React, CSS, JavaScript, HTML</w:t>
       </w:r>
     </w:p>
     <w:p>
@@ -2748,7 +2811,7 @@
           <w:ilvl w:val="0"/>
           <w:numId w:val="34"/>
         </w:numPr>
-        <w:spacing w:after="0" w:line="240" w:lineRule="auto"/>
+        <w:spacing w:after="0" w:line="360" w:lineRule="auto"/>
         <w:ind w:left="0"/>
         <w:rPr>
           <w:rFonts w:ascii="Arial" w:eastAsia="Times New Roman" w:hAnsi="Arial" w:cs="Arial"/>
@@ -2775,7 +2838,38 @@
           <w:szCs w:val="24"/>
           <w:lang w:eastAsia="pt-BR"/>
         </w:rPr>
-        <w:t xml:space="preserve"> Aplicação dos princípios do </w:t>
+        <w:t xml:space="preserve"> Aplicação dos </w:t>
+      </w:r>
+      <w:r>
+        <w:rPr>
+          <w:rFonts w:ascii="Arial" w:eastAsia="Times New Roman" w:hAnsi="Arial" w:cs="Arial"/>
+          <w:sz w:val="24"/>
+          <w:szCs w:val="24"/>
+          <w:u w:val="single"/>
+          <w:lang w:eastAsia="pt-BR"/>
+        </w:rPr>
+        <w:t>princíp</w:t>
+      </w:r>
+      <w:bookmarkStart w:id="0" w:name="_GoBack"/>
+      <w:bookmarkEnd w:id="0"/>
+      <w:r>
+        <w:rPr>
+          <w:rFonts w:ascii="Arial" w:eastAsia="Times New Roman" w:hAnsi="Arial" w:cs="Arial"/>
+          <w:sz w:val="24"/>
+          <w:szCs w:val="24"/>
+          <w:u w:val="single"/>
+          <w:lang w:eastAsia="pt-BR"/>
+        </w:rPr>
+        <w:t>ios</w:t>
+      </w:r>
+      <w:r>
+        <w:rPr>
+          <w:rFonts w:ascii="Arial" w:eastAsia="Times New Roman" w:hAnsi="Arial" w:cs="Arial"/>
+          <w:sz w:val="24"/>
+          <w:szCs w:val="24"/>
+          <w:lang w:eastAsia="pt-BR"/>
+        </w:rPr>
+        <w:t xml:space="preserve"> do </w:t>
       </w:r>
       <w:r>
         <w:rPr>
@@ -2804,7 +2898,7 @@
           <w:ilvl w:val="0"/>
           <w:numId w:val="34"/>
         </w:numPr>
-        <w:spacing w:after="0" w:line="240" w:lineRule="auto"/>
+        <w:spacing w:after="0" w:line="360" w:lineRule="auto"/>
         <w:ind w:left="0"/>
         <w:rPr>
           <w:rFonts w:ascii="Arial" w:eastAsia="Times New Roman" w:hAnsi="Arial" w:cs="Arial"/>
@@ -2856,7 +2950,92 @@
     </w:p>
     <w:p>
       <w:pPr>
-        <w:spacing w:line="240" w:lineRule="auto"/>
+        <w:numPr>
+          <w:ilvl w:val="0"/>
+          <w:numId w:val="34"/>
+        </w:numPr>
+        <w:spacing w:after="0" w:line="360" w:lineRule="auto"/>
+        <w:ind w:left="0"/>
+        <w:rPr>
+          <w:rFonts w:ascii="Arial" w:eastAsia="Times New Roman" w:hAnsi="Arial" w:cs="Arial"/>
+          <w:sz w:val="24"/>
+          <w:szCs w:val="24"/>
+          <w:lang w:eastAsia="pt-BR"/>
+        </w:rPr>
+      </w:pPr>
+      <w:r>
+        <w:rPr>
+          <w:rFonts w:ascii="Arial" w:eastAsia="Times New Roman" w:hAnsi="Arial" w:cs="Arial"/>
+          <w:b/>
+          <w:bCs/>
+          <w:sz w:val="24"/>
+          <w:szCs w:val="24"/>
+          <w:lang w:eastAsia="pt-BR"/>
+        </w:rPr>
+        <w:t>Engenharia de Software e Design Instrucional:</w:t>
+      </w:r>
+      <w:r>
+        <w:rPr>
+          <w:rFonts w:ascii="Arial" w:eastAsia="Times New Roman" w:hAnsi="Arial" w:cs="Arial"/>
+          <w:sz w:val="24"/>
+          <w:szCs w:val="24"/>
+          <w:lang w:eastAsia="pt-BR"/>
+        </w:rPr>
+        <w:t xml:space="preserve"> Uso do modelo </w:t>
+      </w:r>
+      <w:r>
+        <w:rPr>
+          <w:rFonts w:ascii="Arial" w:eastAsia="Times New Roman" w:hAnsi="Arial" w:cs="Arial"/>
+          <w:b/>
+          <w:bCs/>
+          <w:sz w:val="24"/>
+          <w:szCs w:val="24"/>
+          <w:lang w:eastAsia="pt-BR"/>
+        </w:rPr>
+        <w:t>ADDIE</w:t>
+      </w:r>
+      <w:r>
+        <w:rPr>
+          <w:rFonts w:ascii="Arial" w:eastAsia="Times New Roman" w:hAnsi="Arial" w:cs="Arial"/>
+          <w:sz w:val="24"/>
+          <w:szCs w:val="24"/>
+          <w:lang w:eastAsia="pt-BR"/>
+        </w:rPr>
+        <w:t xml:space="preserve"> (Análise, Design, Desenvolvimento, Implementação e Avaliação) para o fluxo geral do sistema e a metodologia ágil </w:t>
+      </w:r>
+      <w:r>
+        <w:rPr>
+          <w:rFonts w:ascii="Arial" w:eastAsia="Times New Roman" w:hAnsi="Arial" w:cs="Arial"/>
+          <w:b/>
+          <w:bCs/>
+          <w:sz w:val="24"/>
+          <w:szCs w:val="24"/>
+          <w:lang w:eastAsia="pt-BR"/>
+        </w:rPr>
+        <w:t>Scrum</w:t>
+      </w:r>
+      <w:r>
+        <w:rPr>
+          <w:rFonts w:ascii="Arial" w:eastAsia="Times New Roman" w:hAnsi="Arial" w:cs="Arial"/>
+          <w:sz w:val="24"/>
+          <w:szCs w:val="24"/>
+          <w:lang w:eastAsia="pt-BR"/>
+        </w:rPr>
+        <w:t xml:space="preserve"> para a gestão do desenvolvimento</w:t>
+      </w:r>
+      <w:r>
+        <w:rPr>
+          <w:rFonts w:ascii="Arial" w:eastAsia="Times New Roman" w:hAnsi="Arial" w:cs="Arial"/>
+          <w:sz w:val="24"/>
+          <w:szCs w:val="24"/>
+          <w:lang w:eastAsia="pt-BR"/>
+        </w:rPr>
+        <w:t>.</w:t>
+      </w:r>
+    </w:p>
+    <w:p>
+      <w:pPr>
+        <w:spacing w:after="0" w:line="360" w:lineRule="auto"/>
         <w:rPr>
           <w:rFonts w:ascii="Arial" w:eastAsia="Times New Roman" w:hAnsi="Arial" w:cs="Arial"/>
           <w:b/>
@@ -2880,46 +3059,36 @@
     </w:p>
     <w:p>
       <w:pPr>
-        <w:spacing w:line="240" w:lineRule="auto"/>
-        <w:rPr>
-          <w:rFonts w:ascii="Arial" w:eastAsia="Times New Roman" w:hAnsi="Arial" w:cs="Arial"/>
-          <w:sz w:val="24"/>
-          <w:szCs w:val="24"/>
-          <w:lang w:eastAsia="pt-BR"/>
-        </w:rPr>
-      </w:pPr>
-      <w:r>
-        <w:rPr>
-          <w:rFonts w:ascii="Arial" w:eastAsia="Times New Roman" w:hAnsi="Arial" w:cs="Arial"/>
-          <w:sz w:val="24"/>
-          <w:szCs w:val="24"/>
-          <w:lang w:eastAsia="pt-BR"/>
-        </w:rPr>
-        <w:t xml:space="preserve">O </w:t>
-      </w:r>
-      <w:r>
-        <w:rPr>
-          <w:rFonts w:ascii="Arial" w:eastAsia="Times New Roman" w:hAnsi="Arial" w:cs="Arial"/>
-          <w:b/>
-          <w:bCs/>
-          <w:sz w:val="24"/>
-          <w:szCs w:val="24"/>
-          <w:lang w:eastAsia="pt-BR"/>
-        </w:rPr>
-        <w:t>TEA Learn</w:t>
-      </w:r>
-      <w:r>
-        <w:rPr>
-          <w:rFonts w:ascii="Arial" w:eastAsia="Times New Roman" w:hAnsi="Arial" w:cs="Arial"/>
-          <w:sz w:val="24"/>
-          <w:szCs w:val="24"/>
-          <w:lang w:eastAsia="pt-BR"/>
-        </w:rPr>
-        <w:t xml:space="preserve"> resolve o problema da exclusão pedagógica ao automatizar o processo de diferenciação curricular. O professor insere o material didático padrão na plataforma, e a IA reestrutura o conteúdo instantaneamente. O sistema entrega um material reformulado com frases curtas, organização em tópicos, divisão em etapas sequenciais e uma estrutura visual limpa e simplificada. Dessa forma, reduz-se a carga de trabalho do docente e garante-se a autonomia e a inclusão real do estudante com TEA nível 1 no ambiente escolar.</w:t>
-      </w:r>
-    </w:p>
-    <w:p>
-      <w:pPr>
+        <w:spacing w:after="0" w:line="360" w:lineRule="auto"/>
+        <w:rPr>
+          <w:rFonts w:ascii="Arial" w:eastAsia="Times New Roman" w:hAnsi="Arial" w:cs="Arial"/>
+          <w:sz w:val="24"/>
+          <w:szCs w:val="24"/>
+          <w:lang w:eastAsia="pt-BR"/>
+        </w:rPr>
+      </w:pPr>
+      <w:r>
+        <w:rPr>
+          <w:rFonts w:ascii="Arial" w:eastAsia="Times New Roman" w:hAnsi="Arial" w:cs="Arial"/>
+          <w:sz w:val="24"/>
+          <w:szCs w:val="24"/>
+          <w:lang w:eastAsia="pt-BR"/>
+        </w:rPr>
+        <w:t xml:space="preserve">"O TEA Learn automatiza a adaptação de conteúdos para garantir a inclusão de todos os alunos." </w:t>
+      </w:r>
+      <w:r>
+        <w:rPr>
+          <w:rFonts w:ascii="Arial" w:eastAsia="Times New Roman" w:hAnsi="Arial" w:cs="Arial"/>
+          <w:sz w:val="24"/>
+          <w:szCs w:val="24"/>
+          <w:lang w:eastAsia="pt-BR"/>
+        </w:rPr>
+        <w:t>O professor insere o material didático padrão na plataforma, e a IA reestrutura o conteúdo instantaneamente. O sistema entrega um material reformulado com frases curtas, organização em tópicos, divisão em etapas sequenciais e uma estrutura visual limpa e simplificada. Dessa forma, reduz-se a carga de trabalho do docente e garante-se a autonomia e a inclusão real do estudante com TEA nível 1 no ambiente escolar.</w:t>
+      </w:r>
+    </w:p>
+    <w:p>
+      <w:pPr>
+        <w:spacing w:after="0" w:line="360" w:lineRule="auto"/>
         <w:jc w:val="both"/>
         <w:rPr>
           <w:rFonts w:ascii="Arial" w:hAnsi="Arial" w:cs="Arial"/>
@@ -2930,6 +3099,7 @@
     </w:p>
     <w:p>
       <w:pPr>
+        <w:spacing w:after="0" w:line="360" w:lineRule="auto"/>
         <w:jc w:val="both"/>
         <w:rPr>
           <w:rFonts w:ascii="Arial" w:hAnsi="Arial" w:cs="Arial"/>
@@ -2940,19 +3110,20 @@
     </w:p>
     <w:p>
       <w:pPr>
-        <w:jc w:val="center"/>
-        <w:rPr>
-          <w:rFonts w:ascii="Arial" w:hAnsi="Arial" w:cs="Arial"/>
-          <w:b/>
-          <w:sz w:val="32"/>
-          <w:szCs w:val="24"/>
-        </w:rPr>
-      </w:pPr>
-      <w:r>
-        <w:rPr>
-          <w:rFonts w:ascii="Arial" w:hAnsi="Arial" w:cs="Arial"/>
-          <w:b/>
-          <w:sz w:val="32"/>
+        <w:spacing w:after="0" w:line="360" w:lineRule="auto"/>
+        <w:jc w:val="center"/>
+        <w:rPr>
+          <w:rFonts w:ascii="Arial" w:hAnsi="Arial" w:cs="Arial"/>
+          <w:b/>
+          <w:sz w:val="24"/>
+          <w:szCs w:val="24"/>
+        </w:rPr>
+      </w:pPr>
+      <w:r>
+        <w:rPr>
+          <w:rFonts w:ascii="Arial" w:hAnsi="Arial" w:cs="Arial"/>
+          <w:b/>
+          <w:sz w:val="24"/>
           <w:szCs w:val="24"/>
         </w:rPr>
         <w:t>DESENVOLVIMENTO</w:t>
@@ -2960,34 +3131,57 @@
     </w:p>
     <w:p>
       <w:pPr>
-        <w:jc w:val="center"/>
-        <w:rPr>
-          <w:rFonts w:ascii="Arial" w:hAnsi="Arial" w:cs="Arial"/>
-          <w:sz w:val="24"/>
-          <w:szCs w:val="24"/>
-        </w:rPr>
-      </w:pPr>
-    </w:p>
-    <w:p>
-      <w:pPr>
-        <w:jc w:val="center"/>
-        <w:rPr>
-          <w:rFonts w:ascii="Arial" w:hAnsi="Arial" w:cs="Arial"/>
-          <w:b/>
-          <w:sz w:val="28"/>
-        </w:rPr>
-      </w:pPr>
-      <w:r>
-        <w:rPr>
-          <w:rFonts w:ascii="Arial" w:hAnsi="Arial" w:cs="Arial"/>
-          <w:b/>
-          <w:sz w:val="28"/>
+        <w:spacing w:after="0" w:line="360" w:lineRule="auto"/>
+        <w:rPr>
+          <w:rFonts w:ascii="Arial" w:hAnsi="Arial" w:cs="Arial"/>
+          <w:sz w:val="24"/>
+          <w:szCs w:val="24"/>
+        </w:rPr>
+      </w:pPr>
+      <w:r>
+        <w:rPr>
+          <w:rFonts w:ascii="Arial" w:hAnsi="Arial" w:cs="Arial"/>
+          <w:sz w:val="24"/>
+          <w:szCs w:val="24"/>
+        </w:rPr>
+        <w:lastRenderedPageBreak/>
+        <w:t>Após uma série de pesquisas, alguns modelos e métodos foram adotados e aprendidos por nós durante o desenvolvimento desse projeto. Além disso, realizamos resumos para estudo e facilitação da implementação no projeto, como:</w:t>
+      </w:r>
+    </w:p>
+    <w:p>
+      <w:pPr>
+        <w:spacing w:after="0" w:line="360" w:lineRule="auto"/>
+        <w:rPr>
+          <w:rFonts w:ascii="Arial" w:hAnsi="Arial" w:cs="Arial"/>
+          <w:sz w:val="24"/>
+          <w:szCs w:val="24"/>
+        </w:rPr>
+      </w:pPr>
+    </w:p>
+    <w:p>
+      <w:pPr>
+        <w:spacing w:after="0" w:line="360" w:lineRule="auto"/>
+        <w:jc w:val="center"/>
+        <w:rPr>
+          <w:rFonts w:ascii="Arial" w:hAnsi="Arial" w:cs="Arial"/>
+          <w:b/>
+          <w:sz w:val="24"/>
+          <w:szCs w:val="24"/>
+        </w:rPr>
+      </w:pPr>
+      <w:r>
+        <w:rPr>
+          <w:rFonts w:ascii="Arial" w:hAnsi="Arial" w:cs="Arial"/>
+          <w:b/>
+          <w:sz w:val="24"/>
+          <w:szCs w:val="24"/>
         </w:rPr>
         <w:t>TEACCH</w:t>
       </w:r>
     </w:p>
     <w:p>
       <w:pPr>
+        <w:spacing w:after="0" w:line="360" w:lineRule="auto"/>
         <w:ind w:firstLine="708"/>
         <w:jc w:val="both"/>
         <w:rPr>
@@ -3011,6 +3205,7 @@
     </w:p>
     <w:p>
       <w:pPr>
+        <w:spacing w:after="0" w:line="360" w:lineRule="auto"/>
         <w:jc w:val="both"/>
         <w:rPr>
           <w:rFonts w:ascii="Arial" w:hAnsi="Arial" w:cs="Arial"/>
@@ -3023,6 +3218,7 @@
     </w:p>
     <w:p>
       <w:pPr>
+        <w:spacing w:after="0" w:line="360" w:lineRule="auto"/>
         <w:jc w:val="both"/>
         <w:rPr>
           <w:rFonts w:ascii="Arial" w:hAnsi="Arial" w:cs="Arial"/>
@@ -3048,7 +3244,7 @@
           <w:ilvl w:val="0"/>
           <w:numId w:val="19"/>
         </w:numPr>
-        <w:spacing w:line="256" w:lineRule="auto"/>
+        <w:spacing w:after="0" w:line="360" w:lineRule="auto"/>
         <w:jc w:val="both"/>
         <w:rPr>
           <w:rFonts w:ascii="Arial" w:hAnsi="Arial" w:cs="Arial"/>
@@ -3081,7 +3277,7 @@
           <w:ilvl w:val="0"/>
           <w:numId w:val="19"/>
         </w:numPr>
-        <w:spacing w:line="256" w:lineRule="auto"/>
+        <w:spacing w:after="0" w:line="360" w:lineRule="auto"/>
         <w:jc w:val="both"/>
         <w:rPr>
           <w:rFonts w:ascii="Arial" w:hAnsi="Arial" w:cs="Arial"/>
@@ -3114,7 +3310,7 @@
           <w:ilvl w:val="0"/>
           <w:numId w:val="19"/>
         </w:numPr>
-        <w:spacing w:line="256" w:lineRule="auto"/>
+        <w:spacing w:after="0" w:line="360" w:lineRule="auto"/>
         <w:jc w:val="both"/>
         <w:rPr>
           <w:rFonts w:ascii="Arial" w:hAnsi="Arial" w:cs="Arial"/>
@@ -3147,7 +3343,7 @@
           <w:ilvl w:val="0"/>
           <w:numId w:val="19"/>
         </w:numPr>
-        <w:spacing w:line="256" w:lineRule="auto"/>
+        <w:spacing w:after="0" w:line="360" w:lineRule="auto"/>
         <w:jc w:val="both"/>
         <w:rPr>
           <w:rFonts w:ascii="Arial" w:hAnsi="Arial" w:cs="Arial"/>
@@ -3175,6 +3371,7 @@
     </w:p>
     <w:p>
       <w:pPr>
+        <w:spacing w:after="0" w:line="360" w:lineRule="auto"/>
         <w:jc w:val="both"/>
         <w:rPr>
           <w:rFonts w:ascii="Arial" w:hAnsi="Arial" w:cs="Arial"/>
@@ -3185,6 +3382,7 @@
     </w:p>
     <w:p>
       <w:pPr>
+        <w:spacing w:after="0" w:line="360" w:lineRule="auto"/>
         <w:jc w:val="both"/>
         <w:rPr>
           <w:rFonts w:ascii="Arial" w:hAnsi="Arial" w:cs="Arial"/>
@@ -3210,7 +3408,7 @@
           <w:ilvl w:val="0"/>
           <w:numId w:val="20"/>
         </w:numPr>
-        <w:spacing w:line="256" w:lineRule="auto"/>
+        <w:spacing w:after="0" w:line="360" w:lineRule="auto"/>
         <w:jc w:val="both"/>
         <w:rPr>
           <w:rFonts w:ascii="Arial" w:hAnsi="Arial" w:cs="Arial"/>
@@ -3243,7 +3441,7 @@
           <w:ilvl w:val="0"/>
           <w:numId w:val="20"/>
         </w:numPr>
-        <w:spacing w:line="256" w:lineRule="auto"/>
+        <w:spacing w:after="0" w:line="360" w:lineRule="auto"/>
         <w:jc w:val="both"/>
         <w:rPr>
           <w:rFonts w:ascii="Arial" w:hAnsi="Arial" w:cs="Arial"/>
@@ -3258,7 +3456,6 @@
           <w:sz w:val="24"/>
           <w:szCs w:val="24"/>
         </w:rPr>
-        <w:lastRenderedPageBreak/>
         <w:t>Comunicação</w:t>
       </w:r>
       <w:r>
@@ -3277,7 +3474,7 @@
           <w:ilvl w:val="0"/>
           <w:numId w:val="20"/>
         </w:numPr>
-        <w:spacing w:line="256" w:lineRule="auto"/>
+        <w:spacing w:after="0" w:line="360" w:lineRule="auto"/>
         <w:jc w:val="both"/>
         <w:rPr>
           <w:rFonts w:ascii="Arial" w:hAnsi="Arial" w:cs="Arial"/>
@@ -3310,7 +3507,7 @@
           <w:ilvl w:val="0"/>
           <w:numId w:val="20"/>
         </w:numPr>
-        <w:spacing w:line="256" w:lineRule="auto"/>
+        <w:spacing w:after="0" w:line="360" w:lineRule="auto"/>
         <w:jc w:val="both"/>
         <w:rPr>
           <w:rFonts w:ascii="Arial" w:hAnsi="Arial" w:cs="Arial"/>
@@ -3338,6 +3535,7 @@
     </w:p>
     <w:p>
       <w:pPr>
+        <w:spacing w:after="0" w:line="360" w:lineRule="auto"/>
         <w:jc w:val="both"/>
         <w:rPr>
           <w:rFonts w:ascii="Arial" w:hAnsi="Arial" w:cs="Arial"/>
@@ -3348,6 +3546,7 @@
     </w:p>
     <w:p>
       <w:pPr>
+        <w:spacing w:after="0" w:line="360" w:lineRule="auto"/>
         <w:jc w:val="both"/>
         <w:rPr>
           <w:rFonts w:ascii="Arial" w:hAnsi="Arial" w:cs="Arial"/>
@@ -3375,42 +3574,39 @@
     </w:p>
     <w:p>
       <w:pPr>
+        <w:spacing w:after="0" w:line="360" w:lineRule="auto"/>
         <w:jc w:val="both"/>
         <w:rPr>
           <w:rFonts w:ascii="Arial" w:hAnsi="Arial" w:cs="Arial"/>
           <w:sz w:val="24"/>
-        </w:rPr>
-      </w:pPr>
-    </w:p>
-    <w:p>
-      <w:pPr>
-        <w:jc w:val="both"/>
-        <w:rPr>
-          <w:rFonts w:ascii="Arial" w:hAnsi="Arial" w:cs="Arial"/>
-          <w:sz w:val="24"/>
-        </w:rPr>
-      </w:pPr>
-    </w:p>
-    <w:p>
-      <w:pPr>
-        <w:jc w:val="center"/>
-        <w:rPr>
-          <w:rFonts w:ascii="Arial" w:hAnsi="Arial" w:cs="Arial"/>
-          <w:b/>
-          <w:sz w:val="28"/>
-        </w:rPr>
-      </w:pPr>
-      <w:r>
-        <w:rPr>
-          <w:rFonts w:ascii="Arial" w:hAnsi="Arial" w:cs="Arial"/>
-          <w:b/>
-          <w:sz w:val="28"/>
+          <w:szCs w:val="24"/>
+        </w:rPr>
+      </w:pPr>
+    </w:p>
+    <w:p>
+      <w:pPr>
+        <w:spacing w:after="0" w:line="360" w:lineRule="auto"/>
+        <w:jc w:val="center"/>
+        <w:rPr>
+          <w:rFonts w:ascii="Arial" w:hAnsi="Arial" w:cs="Arial"/>
+          <w:b/>
+          <w:sz w:val="24"/>
+          <w:szCs w:val="24"/>
+        </w:rPr>
+      </w:pPr>
+      <w:r>
+        <w:rPr>
+          <w:rFonts w:ascii="Arial" w:hAnsi="Arial" w:cs="Arial"/>
+          <w:b/>
+          <w:sz w:val="24"/>
+          <w:szCs w:val="24"/>
         </w:rPr>
         <w:t>ABA</w:t>
       </w:r>
     </w:p>
     <w:p>
       <w:pPr>
+        <w:spacing w:after="0" w:line="360" w:lineRule="auto"/>
         <w:ind w:firstLine="708"/>
         <w:jc w:val="both"/>
         <w:rPr>
@@ -3425,11 +3621,13 @@
           <w:sz w:val="24"/>
           <w:szCs w:val="24"/>
         </w:rPr>
+        <w:lastRenderedPageBreak/>
         <w:t>Análise do Comportamento Aplicada, é uma intervenção científica baseada no reforço positivo para desenvolver habilidades sociais, acadêmicas e de autonomia em autistas</w:t>
       </w:r>
     </w:p>
     <w:p>
       <w:pPr>
+        <w:spacing w:after="0" w:line="360" w:lineRule="auto"/>
         <w:jc w:val="both"/>
         <w:rPr>
           <w:rFonts w:ascii="Arial" w:hAnsi="Arial" w:cs="Arial"/>
@@ -3441,7 +3639,7 @@
     <w:p>
       <w:pPr>
         <w:shd w:val="clear" w:color="auto" w:fill="FFFFFF"/>
-        <w:spacing w:after="0" w:line="360" w:lineRule="atLeast"/>
+        <w:spacing w:after="0" w:line="360" w:lineRule="auto"/>
         <w:jc w:val="both"/>
         <w:rPr>
           <w:rFonts w:ascii="Arial" w:eastAsia="Times New Roman" w:hAnsi="Arial" w:cs="Arial"/>
@@ -3469,7 +3667,7 @@
     <w:p>
       <w:pPr>
         <w:shd w:val="clear" w:color="auto" w:fill="FFFFFF"/>
-        <w:spacing w:after="0" w:line="360" w:lineRule="atLeast"/>
+        <w:spacing w:after="0" w:line="360" w:lineRule="auto"/>
         <w:jc w:val="both"/>
         <w:rPr>
           <w:rFonts w:ascii="Arial" w:eastAsia="Times New Roman" w:hAnsi="Arial" w:cs="Arial"/>
@@ -3490,7 +3688,7 @@
           <w:numId w:val="21"/>
         </w:numPr>
         <w:shd w:val="clear" w:color="auto" w:fill="FFFFFF"/>
-        <w:spacing w:after="180" w:line="360" w:lineRule="atLeast"/>
+        <w:spacing w:after="0" w:line="360" w:lineRule="auto"/>
         <w:jc w:val="both"/>
         <w:rPr>
           <w:rFonts w:ascii="Arial" w:eastAsia="Times New Roman" w:hAnsi="Arial" w:cs="Arial"/>
@@ -3531,7 +3729,7 @@
           <w:numId w:val="21"/>
         </w:numPr>
         <w:shd w:val="clear" w:color="auto" w:fill="FFFFFF"/>
-        <w:spacing w:after="180" w:line="360" w:lineRule="atLeast"/>
+        <w:spacing w:after="0" w:line="360" w:lineRule="auto"/>
         <w:jc w:val="both"/>
         <w:rPr>
           <w:rFonts w:ascii="Arial" w:eastAsia="Times New Roman" w:hAnsi="Arial" w:cs="Arial"/>
@@ -3572,7 +3770,7 @@
           <w:numId w:val="21"/>
         </w:numPr>
         <w:shd w:val="clear" w:color="auto" w:fill="FFFFFF"/>
-        <w:spacing w:after="180" w:line="360" w:lineRule="atLeast"/>
+        <w:spacing w:after="0" w:line="360" w:lineRule="auto"/>
         <w:jc w:val="both"/>
         <w:rPr>
           <w:rFonts w:ascii="Arial" w:eastAsia="Times New Roman" w:hAnsi="Arial" w:cs="Arial"/>
@@ -3613,7 +3811,7 @@
           <w:numId w:val="21"/>
         </w:numPr>
         <w:shd w:val="clear" w:color="auto" w:fill="FFFFFF"/>
-        <w:spacing w:after="180" w:line="360" w:lineRule="atLeast"/>
+        <w:spacing w:after="0" w:line="360" w:lineRule="auto"/>
         <w:jc w:val="both"/>
         <w:rPr>
           <w:rFonts w:ascii="Arial" w:eastAsia="Times New Roman" w:hAnsi="Arial" w:cs="Arial"/>
@@ -3654,10 +3852,10 @@
           <w:numId w:val="21"/>
         </w:numPr>
         <w:shd w:val="clear" w:color="auto" w:fill="FFFFFF"/>
-        <w:spacing w:after="180" w:line="360" w:lineRule="atLeast"/>
+        <w:spacing w:after="0" w:line="360" w:lineRule="auto"/>
         <w:jc w:val="both"/>
         <w:rPr>
-          <w:rFonts w:ascii="Times New Roman" w:eastAsia="Times New Roman" w:hAnsi="Times New Roman" w:cs="Times New Roman"/>
+          <w:rFonts w:ascii="Arial" w:eastAsia="Times New Roman" w:hAnsi="Arial" w:cs="Arial"/>
           <w:sz w:val="24"/>
           <w:szCs w:val="24"/>
           <w:lang w:eastAsia="pt-BR"/>
@@ -3689,7 +3887,7 @@
     <w:p>
       <w:pPr>
         <w:shd w:val="clear" w:color="auto" w:fill="FFFFFF"/>
-        <w:spacing w:after="0" w:line="360" w:lineRule="atLeast"/>
+        <w:spacing w:after="0" w:line="360" w:lineRule="auto"/>
         <w:jc w:val="both"/>
         <w:rPr>
           <w:rFonts w:ascii="Arial" w:eastAsia="Times New Roman" w:hAnsi="Arial" w:cs="Arial"/>
@@ -3703,7 +3901,7 @@
     <w:p>
       <w:pPr>
         <w:shd w:val="clear" w:color="auto" w:fill="FFFFFF"/>
-        <w:spacing w:after="0" w:line="360" w:lineRule="atLeast"/>
+        <w:spacing w:after="0" w:line="360" w:lineRule="auto"/>
         <w:jc w:val="both"/>
         <w:rPr>
           <w:rFonts w:ascii="Arial" w:eastAsia="Times New Roman" w:hAnsi="Arial" w:cs="Arial"/>
@@ -3731,7 +3929,7 @@
     <w:p>
       <w:pPr>
         <w:shd w:val="clear" w:color="auto" w:fill="FFFFFF"/>
-        <w:spacing w:after="0" w:line="360" w:lineRule="atLeast"/>
+        <w:spacing w:after="0" w:line="360" w:lineRule="auto"/>
         <w:jc w:val="both"/>
         <w:rPr>
           <w:rFonts w:ascii="Arial" w:eastAsia="Times New Roman" w:hAnsi="Arial" w:cs="Arial"/>
@@ -3750,7 +3948,7 @@
           <w:numId w:val="22"/>
         </w:numPr>
         <w:shd w:val="clear" w:color="auto" w:fill="FFFFFF"/>
-        <w:spacing w:after="180" w:line="360" w:lineRule="atLeast"/>
+        <w:spacing w:after="0" w:line="360" w:lineRule="auto"/>
         <w:jc w:val="both"/>
         <w:rPr>
           <w:rFonts w:ascii="Arial" w:eastAsia="Times New Roman" w:hAnsi="Arial" w:cs="Arial"/>
@@ -3791,7 +3989,7 @@
           <w:numId w:val="22"/>
         </w:numPr>
         <w:shd w:val="clear" w:color="auto" w:fill="FFFFFF"/>
-        <w:spacing w:after="180" w:line="360" w:lineRule="atLeast"/>
+        <w:spacing w:after="0" w:line="360" w:lineRule="auto"/>
         <w:jc w:val="both"/>
         <w:rPr>
           <w:rFonts w:ascii="Arial" w:eastAsia="Times New Roman" w:hAnsi="Arial" w:cs="Arial"/>
@@ -3832,7 +4030,7 @@
           <w:numId w:val="22"/>
         </w:numPr>
         <w:shd w:val="clear" w:color="auto" w:fill="FFFFFF"/>
-        <w:spacing w:after="180" w:line="360" w:lineRule="atLeast"/>
+        <w:spacing w:after="0" w:line="360" w:lineRule="auto"/>
         <w:jc w:val="both"/>
         <w:rPr>
           <w:rFonts w:ascii="Arial" w:eastAsia="Times New Roman" w:hAnsi="Arial" w:cs="Arial"/>
@@ -3873,7 +4071,7 @@
           <w:numId w:val="22"/>
         </w:numPr>
         <w:shd w:val="clear" w:color="auto" w:fill="FFFFFF"/>
-        <w:spacing w:after="180" w:line="360" w:lineRule="atLeast"/>
+        <w:spacing w:after="0" w:line="360" w:lineRule="auto"/>
         <w:jc w:val="both"/>
         <w:rPr>
           <w:rFonts w:ascii="Arial" w:eastAsia="Times New Roman" w:hAnsi="Arial" w:cs="Arial"/>
@@ -3893,7 +4091,6 @@
           <w:szCs w:val="24"/>
           <w:lang w:eastAsia="pt-BR"/>
         </w:rPr>
-        <w:lastRenderedPageBreak/>
         <w:t>Redução de Comportamentos:</w:t>
       </w:r>
       <w:r>
@@ -3909,34 +4106,38 @@
     </w:p>
     <w:p>
       <w:pPr>
-        <w:rPr>
-          <w:rFonts w:ascii="Arial" w:hAnsi="Arial" w:cs="Arial"/>
-          <w:sz w:val="24"/>
-          <w:szCs w:val="24"/>
-        </w:rPr>
-      </w:pPr>
-    </w:p>
-    <w:p>
-      <w:pPr>
-        <w:jc w:val="center"/>
-        <w:rPr>
-          <w:rFonts w:ascii="Arial" w:hAnsi="Arial" w:cs="Arial"/>
-          <w:b/>
-          <w:sz w:val="28"/>
-        </w:rPr>
-      </w:pPr>
-      <w:r>
-        <w:rPr>
-          <w:rFonts w:ascii="Arial" w:hAnsi="Arial" w:cs="Arial"/>
-          <w:b/>
-          <w:sz w:val="28"/>
+        <w:spacing w:after="0" w:line="360" w:lineRule="auto"/>
+        <w:rPr>
+          <w:rFonts w:ascii="Arial" w:hAnsi="Arial" w:cs="Arial"/>
+          <w:sz w:val="24"/>
+          <w:szCs w:val="24"/>
+        </w:rPr>
+      </w:pPr>
+    </w:p>
+    <w:p>
+      <w:pPr>
+        <w:spacing w:after="0" w:line="360" w:lineRule="auto"/>
+        <w:jc w:val="center"/>
+        <w:rPr>
+          <w:rFonts w:ascii="Arial" w:hAnsi="Arial" w:cs="Arial"/>
+          <w:b/>
+          <w:sz w:val="24"/>
+          <w:szCs w:val="24"/>
+        </w:rPr>
+      </w:pPr>
+      <w:r>
+        <w:rPr>
+          <w:rFonts w:ascii="Arial" w:hAnsi="Arial" w:cs="Arial"/>
+          <w:b/>
+          <w:sz w:val="24"/>
+          <w:szCs w:val="24"/>
         </w:rPr>
         <w:t>TEA</w:t>
       </w:r>
     </w:p>
     <w:p>
       <w:pPr>
-        <w:spacing w:before="100" w:beforeAutospacing="1" w:after="100" w:afterAutospacing="1" w:line="240" w:lineRule="auto"/>
+        <w:spacing w:before="100" w:beforeAutospacing="1" w:after="0" w:line="360" w:lineRule="auto"/>
         <w:ind w:firstLine="708"/>
         <w:jc w:val="both"/>
         <w:rPr>
@@ -3973,12 +4174,22 @@
           <w:szCs w:val="24"/>
           <w:lang w:eastAsia="pt-BR"/>
         </w:rPr>
-        <w:t xml:space="preserve"> é uma condição do desenvolvimento que afeta principalmente a forma como a pessoa se comunica, interage socialmente e organiza seu comportamento. Ele é chamado de “espectro” porque pode se manifestar de maneiras muito diferentes em cada indivíduo — alguns têm mais autonomia, outros precisam de apoio constante.</w:t>
-      </w:r>
-    </w:p>
-    <w:p>
-      <w:pPr>
-        <w:spacing w:before="100" w:beforeAutospacing="1" w:after="100" w:afterAutospacing="1" w:line="240" w:lineRule="auto"/>
+        <w:t xml:space="preserve"> é uma condição do desenvolvimento que afeta principalmente a forma como a pessoa se comunica, interage socialmente e organiza seu comportamento. Ele é chamado de “espectro” porque pode se </w:t>
+      </w:r>
+      <w:r>
+        <w:rPr>
+          <w:rFonts w:ascii="Arial" w:eastAsia="Times New Roman" w:hAnsi="Arial" w:cs="Arial"/>
+          <w:sz w:val="24"/>
+          <w:szCs w:val="24"/>
+          <w:lang w:eastAsia="pt-BR"/>
+        </w:rPr>
+        <w:lastRenderedPageBreak/>
+        <w:t>manifestar de maneiras muito diferentes em cada indivíduo — alguns têm mais autonomia, outros precisam de apoio constante.</w:t>
+      </w:r>
+    </w:p>
+    <w:p>
+      <w:pPr>
+        <w:spacing w:before="100" w:beforeAutospacing="1" w:after="0" w:line="360" w:lineRule="auto"/>
         <w:jc w:val="both"/>
         <w:outlineLvl w:val="2"/>
         <w:rPr>
@@ -4008,7 +4219,7 @@
           <w:ilvl w:val="0"/>
           <w:numId w:val="29"/>
         </w:numPr>
-        <w:spacing w:before="100" w:beforeAutospacing="1" w:after="100" w:afterAutospacing="1" w:line="240" w:lineRule="auto"/>
+        <w:spacing w:before="100" w:beforeAutospacing="1" w:after="0" w:line="360" w:lineRule="auto"/>
         <w:jc w:val="both"/>
         <w:rPr>
           <w:rFonts w:ascii="Arial" w:eastAsia="Times New Roman" w:hAnsi="Arial" w:cs="Arial"/>
@@ -4044,7 +4255,7 @@
           <w:ilvl w:val="0"/>
           <w:numId w:val="29"/>
         </w:numPr>
-        <w:spacing w:before="100" w:beforeAutospacing="1" w:after="100" w:afterAutospacing="1" w:line="240" w:lineRule="auto"/>
+        <w:spacing w:before="100" w:beforeAutospacing="1" w:after="0" w:line="360" w:lineRule="auto"/>
         <w:jc w:val="both"/>
         <w:rPr>
           <w:rFonts w:ascii="Arial" w:eastAsia="Times New Roman" w:hAnsi="Arial" w:cs="Arial"/>
@@ -4080,7 +4291,7 @@
           <w:ilvl w:val="0"/>
           <w:numId w:val="29"/>
         </w:numPr>
-        <w:spacing w:before="100" w:beforeAutospacing="1" w:after="100" w:afterAutospacing="1" w:line="240" w:lineRule="auto"/>
+        <w:spacing w:before="100" w:beforeAutospacing="1" w:after="0" w:line="360" w:lineRule="auto"/>
         <w:jc w:val="both"/>
         <w:rPr>
           <w:rFonts w:ascii="Arial" w:eastAsia="Times New Roman" w:hAnsi="Arial" w:cs="Arial"/>
@@ -4112,7 +4323,7 @@
     </w:p>
     <w:p>
       <w:pPr>
-        <w:spacing w:before="100" w:beforeAutospacing="1" w:after="100" w:afterAutospacing="1" w:line="240" w:lineRule="auto"/>
+        <w:spacing w:before="100" w:beforeAutospacing="1" w:after="0" w:line="360" w:lineRule="auto"/>
         <w:ind w:firstLine="708"/>
         <w:jc w:val="both"/>
         <w:rPr>
@@ -4154,7 +4365,7 @@
     </w:p>
     <w:p>
       <w:pPr>
-        <w:spacing w:before="100" w:beforeAutospacing="1" w:after="100" w:afterAutospacing="1" w:line="240" w:lineRule="auto"/>
+        <w:spacing w:before="100" w:beforeAutospacing="1" w:after="0" w:line="360" w:lineRule="auto"/>
         <w:jc w:val="both"/>
         <w:outlineLvl w:val="2"/>
         <w:rPr>
@@ -4180,7 +4391,7 @@
     </w:p>
     <w:p>
       <w:pPr>
-        <w:spacing w:before="100" w:beforeAutospacing="1" w:after="100" w:afterAutospacing="1" w:line="240" w:lineRule="auto"/>
+        <w:spacing w:before="100" w:beforeAutospacing="1" w:after="0" w:line="360" w:lineRule="auto"/>
         <w:ind w:firstLine="708"/>
         <w:jc w:val="both"/>
         <w:rPr>
@@ -4226,7 +4437,7 @@
           <w:ilvl w:val="0"/>
           <w:numId w:val="30"/>
         </w:numPr>
-        <w:spacing w:before="100" w:beforeAutospacing="1" w:after="100" w:afterAutospacing="1" w:line="240" w:lineRule="auto"/>
+        <w:spacing w:before="100" w:beforeAutospacing="1" w:after="0" w:line="360" w:lineRule="auto"/>
         <w:jc w:val="both"/>
         <w:rPr>
           <w:rFonts w:ascii="Arial" w:eastAsia="Times New Roman" w:hAnsi="Arial" w:cs="Arial"/>
@@ -4251,7 +4462,7 @@
           <w:ilvl w:val="0"/>
           <w:numId w:val="30"/>
         </w:numPr>
-        <w:spacing w:before="100" w:beforeAutospacing="1" w:after="100" w:afterAutospacing="1" w:line="240" w:lineRule="auto"/>
+        <w:spacing w:before="100" w:beforeAutospacing="1" w:after="0" w:line="360" w:lineRule="auto"/>
         <w:jc w:val="both"/>
         <w:rPr>
           <w:rFonts w:ascii="Arial" w:eastAsia="Times New Roman" w:hAnsi="Arial" w:cs="Arial"/>
@@ -4272,7 +4483,7 @@
     </w:p>
     <w:p>
       <w:pPr>
-        <w:spacing w:before="100" w:beforeAutospacing="1" w:after="100" w:afterAutospacing="1" w:line="240" w:lineRule="auto"/>
+        <w:spacing w:before="100" w:beforeAutospacing="1" w:after="0" w:line="360" w:lineRule="auto"/>
         <w:ind w:firstLine="708"/>
         <w:jc w:val="both"/>
         <w:rPr>
@@ -4294,7 +4505,7 @@
     </w:p>
     <w:p>
       <w:pPr>
-        <w:spacing w:before="100" w:beforeAutospacing="1" w:after="100" w:afterAutospacing="1" w:line="240" w:lineRule="auto"/>
+        <w:spacing w:before="100" w:beforeAutospacing="1" w:after="0" w:line="360" w:lineRule="auto"/>
         <w:jc w:val="both"/>
         <w:outlineLvl w:val="2"/>
         <w:rPr>
@@ -4320,7 +4531,7 @@
     </w:p>
     <w:p>
       <w:pPr>
-        <w:spacing w:before="100" w:beforeAutospacing="1" w:after="100" w:afterAutospacing="1" w:line="240" w:lineRule="auto"/>
+        <w:spacing w:before="100" w:beforeAutospacing="1" w:after="0" w:line="360" w:lineRule="auto"/>
         <w:jc w:val="both"/>
         <w:rPr>
           <w:rFonts w:ascii="Arial" w:eastAsia="Times New Roman" w:hAnsi="Arial" w:cs="Arial"/>
@@ -4345,7 +4556,7 @@
           <w:ilvl w:val="0"/>
           <w:numId w:val="31"/>
         </w:numPr>
-        <w:spacing w:before="100" w:beforeAutospacing="1" w:after="100" w:afterAutospacing="1" w:line="240" w:lineRule="auto"/>
+        <w:spacing w:before="100" w:beforeAutospacing="1" w:after="0" w:line="360" w:lineRule="auto"/>
         <w:jc w:val="both"/>
         <w:rPr>
           <w:rFonts w:ascii="Arial" w:eastAsia="Times New Roman" w:hAnsi="Arial" w:cs="Arial"/>
@@ -4381,7 +4592,7 @@
           <w:ilvl w:val="0"/>
           <w:numId w:val="31"/>
         </w:numPr>
-        <w:spacing w:before="100" w:beforeAutospacing="1" w:after="100" w:afterAutospacing="1" w:line="240" w:lineRule="auto"/>
+        <w:spacing w:before="100" w:beforeAutospacing="1" w:after="0" w:line="360" w:lineRule="auto"/>
         <w:jc w:val="both"/>
         <w:rPr>
           <w:rFonts w:ascii="Arial" w:eastAsia="Times New Roman" w:hAnsi="Arial" w:cs="Arial"/>
@@ -4413,7 +4624,7 @@
     </w:p>
     <w:p>
       <w:pPr>
-        <w:spacing w:before="100" w:beforeAutospacing="1" w:after="100" w:afterAutospacing="1" w:line="240" w:lineRule="auto"/>
+        <w:spacing w:before="100" w:beforeAutospacing="1" w:after="0" w:line="360" w:lineRule="auto"/>
         <w:ind w:firstLine="708"/>
         <w:jc w:val="both"/>
         <w:rPr>
@@ -4430,51 +4641,54 @@
           <w:szCs w:val="24"/>
           <w:lang w:eastAsia="pt-BR"/>
         </w:rPr>
-        <w:t xml:space="preserve">Em resumo, o TEA mostra como cada pessoa se relaciona com o mundo em termos de comunicação e comportamento, enquanto a DI mostra como ela aprende e </w:t>
-      </w:r>
-      <w:r>
-        <w:rPr>
-          <w:rFonts w:ascii="Arial" w:eastAsia="Times New Roman" w:hAnsi="Arial" w:cs="Arial"/>
-          <w:sz w:val="24"/>
-          <w:szCs w:val="24"/>
-          <w:lang w:eastAsia="pt-BR"/>
-        </w:rPr>
         <w:lastRenderedPageBreak/>
-        <w:t>aplica o que sabe. Juntas, essas informações ajudam médicos e terapeutas a definir o tipo de apoio necessário para que o indivíduo tenha mais qualidade de vida e autonomia.</w:t>
-      </w:r>
-    </w:p>
-    <w:p>
-      <w:pPr>
-        <w:jc w:val="center"/>
-        <w:rPr>
-          <w:rFonts w:ascii="Arial" w:hAnsi="Arial" w:cs="Arial"/>
-          <w:sz w:val="24"/>
-          <w:szCs w:val="24"/>
-        </w:rPr>
-      </w:pPr>
-    </w:p>
-    <w:p>
-      <w:pPr>
-        <w:jc w:val="center"/>
-        <w:rPr>
-          <w:rFonts w:ascii="Arial" w:hAnsi="Arial" w:cs="Arial"/>
-          <w:b/>
-          <w:sz w:val="24"/>
-          <w:szCs w:val="24"/>
-        </w:rPr>
-      </w:pPr>
-      <w:r>
-        <w:rPr>
-          <w:rFonts w:ascii="Arial" w:hAnsi="Arial" w:cs="Arial"/>
-          <w:b/>
-          <w:sz w:val="24"/>
-          <w:szCs w:val="24"/>
-        </w:rPr>
-        <w:t>O QUE É ADDIE:</w:t>
-      </w:r>
-    </w:p>
-    <w:p>
-      <w:pPr>
+        <w:t>Em resumo, o TEA mostra como cada pessoa se relaciona com o mundo em termos de comunicação e comportamento, enquanto a DI mostra como ela aprende e aplica o que sabe. Juntas, essas informações ajudam médicos e terapeutas a definir o tipo de apoio necessário para que o indivíduo tenha mais qualidade de vida e autonomia.</w:t>
+      </w:r>
+    </w:p>
+    <w:p>
+      <w:pPr>
+        <w:spacing w:after="0" w:line="360" w:lineRule="auto"/>
+        <w:jc w:val="center"/>
+        <w:rPr>
+          <w:rFonts w:ascii="Arial" w:hAnsi="Arial" w:cs="Arial"/>
+          <w:sz w:val="24"/>
+          <w:szCs w:val="24"/>
+        </w:rPr>
+      </w:pPr>
+    </w:p>
+    <w:p>
+      <w:pPr>
+        <w:spacing w:after="0" w:line="360" w:lineRule="auto"/>
+        <w:jc w:val="center"/>
+        <w:rPr>
+          <w:rFonts w:ascii="Arial" w:hAnsi="Arial" w:cs="Arial"/>
+          <w:b/>
+          <w:sz w:val="24"/>
+          <w:szCs w:val="24"/>
+        </w:rPr>
+      </w:pPr>
+      <w:r>
+        <w:rPr>
+          <w:rFonts w:ascii="Arial" w:hAnsi="Arial" w:cs="Arial"/>
+          <w:b/>
+          <w:sz w:val="24"/>
+          <w:szCs w:val="24"/>
+        </w:rPr>
+        <w:t>ADDIE</w:t>
+      </w:r>
+      <w:r>
+        <w:rPr>
+          <w:rFonts w:ascii="Arial" w:hAnsi="Arial" w:cs="Arial"/>
+          <w:b/>
+          <w:sz w:val="24"/>
+          <w:szCs w:val="24"/>
+        </w:rPr>
+        <w:t>:</w:t>
+      </w:r>
+    </w:p>
+    <w:p>
+      <w:pPr>
+        <w:spacing w:after="0" w:line="360" w:lineRule="auto"/>
         <w:ind w:firstLine="708"/>
         <w:jc w:val="both"/>
         <w:rPr>
@@ -4512,6 +4726,7 @@
     </w:p>
     <w:p>
       <w:pPr>
+        <w:spacing w:after="0" w:line="360" w:lineRule="auto"/>
         <w:ind w:firstLine="708"/>
         <w:jc w:val="both"/>
         <w:rPr>
@@ -4549,6 +4764,7 @@
     </w:p>
     <w:p>
       <w:pPr>
+        <w:spacing w:after="0" w:line="360" w:lineRule="auto"/>
         <w:ind w:firstLine="708"/>
         <w:jc w:val="both"/>
         <w:rPr>
@@ -4586,6 +4802,7 @@
     </w:p>
     <w:p>
       <w:pPr>
+        <w:spacing w:after="0" w:line="360" w:lineRule="auto"/>
         <w:ind w:firstLine="708"/>
         <w:jc w:val="both"/>
         <w:rPr>
@@ -4623,44 +4840,48 @@
     </w:p>
     <w:p>
       <w:pPr>
-        <w:rPr>
-          <w:rFonts w:ascii="Arial" w:hAnsi="Arial" w:cs="Arial"/>
-          <w:sz w:val="24"/>
-          <w:szCs w:val="24"/>
-        </w:rPr>
-      </w:pPr>
-    </w:p>
-    <w:p>
-      <w:pPr>
-        <w:rPr>
-          <w:rFonts w:ascii="Arial" w:hAnsi="Arial" w:cs="Arial"/>
-          <w:sz w:val="24"/>
-          <w:szCs w:val="24"/>
-        </w:rPr>
-      </w:pPr>
-    </w:p>
-    <w:p>
-      <w:pPr>
-        <w:jc w:val="center"/>
-        <w:rPr>
-          <w:rFonts w:ascii="Arial" w:hAnsi="Arial" w:cs="Arial"/>
-          <w:b/>
-          <w:sz w:val="28"/>
-          <w:szCs w:val="24"/>
-        </w:rPr>
-      </w:pPr>
-      <w:r>
-        <w:rPr>
-          <w:rFonts w:ascii="Arial" w:hAnsi="Arial" w:cs="Arial"/>
-          <w:b/>
-          <w:sz w:val="28"/>
-          <w:szCs w:val="24"/>
-        </w:rPr>
-        <w:t>O QUE É DIAGRAMA DE GANTT</w:t>
-      </w:r>
-    </w:p>
-    <w:p>
-      <w:pPr>
+        <w:spacing w:after="0" w:line="360" w:lineRule="auto"/>
+        <w:rPr>
+          <w:rFonts w:ascii="Arial" w:hAnsi="Arial" w:cs="Arial"/>
+          <w:sz w:val="24"/>
+          <w:szCs w:val="24"/>
+        </w:rPr>
+      </w:pPr>
+    </w:p>
+    <w:p>
+      <w:pPr>
+        <w:spacing w:after="0" w:line="360" w:lineRule="auto"/>
+        <w:rPr>
+          <w:rFonts w:ascii="Arial" w:hAnsi="Arial" w:cs="Arial"/>
+          <w:sz w:val="24"/>
+          <w:szCs w:val="24"/>
+        </w:rPr>
+      </w:pPr>
+    </w:p>
+    <w:p>
+      <w:pPr>
+        <w:spacing w:after="0" w:line="360" w:lineRule="auto"/>
+        <w:jc w:val="center"/>
+        <w:rPr>
+          <w:rFonts w:ascii="Arial" w:hAnsi="Arial" w:cs="Arial"/>
+          <w:b/>
+          <w:sz w:val="24"/>
+          <w:szCs w:val="24"/>
+        </w:rPr>
+      </w:pPr>
+      <w:r>
+        <w:rPr>
+          <w:rFonts w:ascii="Arial" w:hAnsi="Arial" w:cs="Arial"/>
+          <w:b/>
+          <w:sz w:val="24"/>
+          <w:szCs w:val="24"/>
+        </w:rPr>
+        <w:t>DIAGRAMA DE GANTT</w:t>
+      </w:r>
+    </w:p>
+    <w:p>
+      <w:pPr>
+        <w:spacing w:after="0" w:line="360" w:lineRule="auto"/>
         <w:jc w:val="both"/>
         <w:rPr>
           <w:rFonts w:ascii="Arial" w:hAnsi="Arial" w:cs="Arial"/>
@@ -4675,33 +4896,43 @@
           <w:szCs w:val="24"/>
         </w:rPr>
         <w:tab/>
-        <w:t>É uma ferramenta visual de gestão de projetos com foco em simplificar datas de entrega, quais as tarefas foram e serão feitas e quanto tempo cada uma levou. A mecânica de estruturação é feita com base na adição de tarefas de forma vertical e os períodos de realização ou prazos de forma horizontal.</w:t>
-      </w:r>
-    </w:p>
-    <w:p>
-      <w:pPr>
-        <w:rPr>
-          <w:rFonts w:ascii="Arial" w:hAnsi="Arial" w:cs="Arial"/>
-          <w:sz w:val="24"/>
-          <w:szCs w:val="24"/>
-        </w:rPr>
-      </w:pPr>
-    </w:p>
-    <w:p>
-      <w:pPr>
-        <w:jc w:val="center"/>
-        <w:rPr>
-          <w:rFonts w:ascii="Arial" w:hAnsi="Arial" w:cs="Arial"/>
-          <w:b/>
-          <w:sz w:val="28"/>
-          <w:szCs w:val="24"/>
-        </w:rPr>
-      </w:pPr>
-      <w:r>
-        <w:rPr>
-          <w:rFonts w:ascii="Arial" w:hAnsi="Arial" w:cs="Arial"/>
-          <w:b/>
-          <w:sz w:val="28"/>
+        <w:t>F</w:t>
+      </w:r>
+      <w:r>
+        <w:rPr>
+          <w:rFonts w:ascii="Arial" w:hAnsi="Arial" w:cs="Arial"/>
+          <w:sz w:val="24"/>
+          <w:szCs w:val="24"/>
+        </w:rPr>
+        <w:t>erramenta visual de gestão de projetos com foco em simplificar datas de entrega, quais as tarefas foram e serão feitas e quanto tempo cada uma levou. A mecânica de estruturação é feita com base na adição de tarefas de forma vertical e os períodos de realização ou prazos de forma horizontal.</w:t>
+      </w:r>
+    </w:p>
+    <w:p>
+      <w:pPr>
+        <w:spacing w:after="0" w:line="360" w:lineRule="auto"/>
+        <w:rPr>
+          <w:rFonts w:ascii="Arial" w:hAnsi="Arial" w:cs="Arial"/>
+          <w:sz w:val="24"/>
+          <w:szCs w:val="24"/>
+        </w:rPr>
+      </w:pPr>
+    </w:p>
+    <w:p>
+      <w:pPr>
+        <w:spacing w:after="0" w:line="360" w:lineRule="auto"/>
+        <w:jc w:val="center"/>
+        <w:rPr>
+          <w:rFonts w:ascii="Arial" w:hAnsi="Arial" w:cs="Arial"/>
+          <w:b/>
+          <w:sz w:val="24"/>
+          <w:szCs w:val="24"/>
+        </w:rPr>
+      </w:pPr>
+      <w:r>
+        <w:rPr>
+          <w:rFonts w:ascii="Arial" w:hAnsi="Arial" w:cs="Arial"/>
+          <w:b/>
+          <w:sz w:val="24"/>
           <w:szCs w:val="24"/>
         </w:rPr>
         <w:t>DUA</w:t>
@@ -4709,38 +4940,44 @@
     </w:p>
     <w:p>
       <w:pPr>
+        <w:spacing w:after="0" w:line="360" w:lineRule="auto"/>
         <w:ind w:firstLine="708"/>
         <w:jc w:val="both"/>
         <w:rPr>
           <w:rFonts w:ascii="Arial" w:hAnsi="Arial" w:cs="Arial"/>
           <w:sz w:val="24"/>
-        </w:rPr>
-      </w:pPr>
-      <w:r>
-        <w:rPr>
-          <w:rFonts w:ascii="Arial" w:hAnsi="Arial" w:cs="Arial"/>
-          <w:bCs/>
-          <w:sz w:val="24"/>
+          <w:szCs w:val="24"/>
+        </w:rPr>
+      </w:pPr>
+      <w:r>
+        <w:rPr>
+          <w:rFonts w:ascii="Arial" w:hAnsi="Arial" w:cs="Arial"/>
+          <w:bCs/>
+          <w:sz w:val="24"/>
+          <w:szCs w:val="24"/>
         </w:rPr>
         <w:t>O Desenho Universal da Aprendizagem (DUA) é uma proposta que ajuda a tornar a escola mais acessível e inclusiva, especialmente para estudantes com Transtorno do Espectro Autista (TEA). Ele busca reduzir barreiras na aprendizagem oferecendo diferentes formas de ensinar, aprender e se expressar.</w:t>
       </w:r>
     </w:p>
     <w:p>
       <w:pPr>
+        <w:spacing w:after="0" w:line="360" w:lineRule="auto"/>
         <w:jc w:val="both"/>
         <w:rPr>
           <w:rFonts w:ascii="Arial" w:hAnsi="Arial" w:cs="Arial"/>
           <w:b/>
           <w:bCs/>
           <w:sz w:val="24"/>
-        </w:rPr>
-      </w:pPr>
-      <w:r>
-        <w:rPr>
-          <w:rFonts w:ascii="Arial" w:hAnsi="Arial" w:cs="Arial"/>
-          <w:b/>
-          <w:bCs/>
-          <w:sz w:val="24"/>
+          <w:szCs w:val="24"/>
+        </w:rPr>
+      </w:pPr>
+      <w:r>
+        <w:rPr>
+          <w:rFonts w:ascii="Arial" w:hAnsi="Arial" w:cs="Arial"/>
+          <w:b/>
+          <w:bCs/>
+          <w:sz w:val="24"/>
+          <w:szCs w:val="24"/>
         </w:rPr>
         <w:t>O que é o DUA</w:t>
       </w:r>
@@ -4751,26 +4988,29 @@
           <w:ilvl w:val="0"/>
           <w:numId w:val="26"/>
         </w:numPr>
+        <w:spacing w:after="0" w:line="360" w:lineRule="auto"/>
         <w:jc w:val="both"/>
         <w:rPr>
           <w:rFonts w:ascii="Arial" w:hAnsi="Arial" w:cs="Arial"/>
           <w:sz w:val="24"/>
-        </w:rPr>
-      </w:pPr>
-      <w:r>
-        <w:rPr>
-          <w:rFonts w:ascii="Arial" w:hAnsi="Arial" w:cs="Arial"/>
-          <w:b/>
-          <w:bCs/>
-          <w:sz w:val="24"/>
-        </w:rPr>
-        <w:lastRenderedPageBreak/>
+          <w:szCs w:val="24"/>
+        </w:rPr>
+      </w:pPr>
+      <w:r>
+        <w:rPr>
+          <w:rFonts w:ascii="Arial" w:hAnsi="Arial" w:cs="Arial"/>
+          <w:b/>
+          <w:bCs/>
+          <w:sz w:val="24"/>
+          <w:szCs w:val="24"/>
+        </w:rPr>
         <w:t>DUA</w:t>
       </w:r>
       <w:r>
         <w:rPr>
           <w:rFonts w:ascii="Arial" w:hAnsi="Arial" w:cs="Arial"/>
           <w:sz w:val="24"/>
+          <w:szCs w:val="24"/>
         </w:rPr>
         <w:t xml:space="preserve"> significa Desenho Universal da Aprendizagem.</w:t>
       </w:r>
@@ -4781,16 +5021,19 @@
           <w:ilvl w:val="0"/>
           <w:numId w:val="26"/>
         </w:numPr>
+        <w:spacing w:after="0" w:line="360" w:lineRule="auto"/>
         <w:jc w:val="both"/>
         <w:rPr>
           <w:rFonts w:ascii="Arial" w:hAnsi="Arial" w:cs="Arial"/>
           <w:sz w:val="24"/>
-        </w:rPr>
-      </w:pPr>
-      <w:r>
-        <w:rPr>
-          <w:rFonts w:ascii="Arial" w:hAnsi="Arial" w:cs="Arial"/>
-          <w:sz w:val="24"/>
+          <w:szCs w:val="24"/>
+        </w:rPr>
+      </w:pPr>
+      <w:r>
+        <w:rPr>
+          <w:rFonts w:ascii="Arial" w:hAnsi="Arial" w:cs="Arial"/>
+          <w:sz w:val="24"/>
+          <w:szCs w:val="24"/>
         </w:rPr>
         <w:t xml:space="preserve">Seu objetivo é </w:t>
       </w:r>
@@ -4800,6 +5043,7 @@
           <w:b/>
           <w:bCs/>
           <w:sz w:val="24"/>
+          <w:szCs w:val="24"/>
         </w:rPr>
         <w:t>criar ambientes e práticas pedagógicas que funcionem para o maior número possível de alunos</w:t>
       </w:r>
@@ -4807,6 +5051,7 @@
         <w:rPr>
           <w:rFonts w:ascii="Arial" w:hAnsi="Arial" w:cs="Arial"/>
           <w:sz w:val="24"/>
+          <w:szCs w:val="24"/>
         </w:rPr>
         <w:t>, sem precisar de muitas adaptações depois.</w:t>
       </w:r>
@@ -4817,16 +5062,19 @@
           <w:ilvl w:val="0"/>
           <w:numId w:val="26"/>
         </w:numPr>
+        <w:spacing w:after="0" w:line="360" w:lineRule="auto"/>
         <w:jc w:val="both"/>
         <w:rPr>
           <w:rFonts w:ascii="Arial" w:hAnsi="Arial" w:cs="Arial"/>
           <w:sz w:val="24"/>
-        </w:rPr>
-      </w:pPr>
-      <w:r>
-        <w:rPr>
-          <w:rFonts w:ascii="Arial" w:hAnsi="Arial" w:cs="Arial"/>
-          <w:sz w:val="24"/>
+          <w:szCs w:val="24"/>
+        </w:rPr>
+      </w:pPr>
+      <w:r>
+        <w:rPr>
+          <w:rFonts w:ascii="Arial" w:hAnsi="Arial" w:cs="Arial"/>
+          <w:sz w:val="24"/>
+          <w:szCs w:val="24"/>
         </w:rPr>
         <w:t>Ele se baseia em três princípios principais:</w:t>
       </w:r>
@@ -4837,18 +5085,21 @@
           <w:ilvl w:val="1"/>
           <w:numId w:val="26"/>
         </w:numPr>
+        <w:spacing w:after="0" w:line="360" w:lineRule="auto"/>
         <w:jc w:val="both"/>
         <w:rPr>
           <w:rFonts w:ascii="Arial" w:hAnsi="Arial" w:cs="Arial"/>
           <w:sz w:val="24"/>
-        </w:rPr>
-      </w:pPr>
-      <w:r>
-        <w:rPr>
-          <w:rFonts w:ascii="Arial" w:hAnsi="Arial" w:cs="Arial"/>
-          <w:b/>
-          <w:bCs/>
-          <w:sz w:val="24"/>
+          <w:szCs w:val="24"/>
+        </w:rPr>
+      </w:pPr>
+      <w:r>
+        <w:rPr>
+          <w:rFonts w:ascii="Arial" w:hAnsi="Arial" w:cs="Arial"/>
+          <w:b/>
+          <w:bCs/>
+          <w:sz w:val="24"/>
+          <w:szCs w:val="24"/>
         </w:rPr>
         <w:t>Múltiplos meios de envolvimento</w:t>
       </w:r>
@@ -4856,6 +5107,7 @@
         <w:rPr>
           <w:rFonts w:ascii="Arial" w:hAnsi="Arial" w:cs="Arial"/>
           <w:sz w:val="24"/>
+          <w:szCs w:val="24"/>
         </w:rPr>
         <w:t>: diferentes formas de motivar e engajar os alunos.</w:t>
       </w:r>
@@ -4866,18 +5118,21 @@
           <w:ilvl w:val="1"/>
           <w:numId w:val="26"/>
         </w:numPr>
+        <w:spacing w:after="0" w:line="360" w:lineRule="auto"/>
         <w:jc w:val="both"/>
         <w:rPr>
           <w:rFonts w:ascii="Arial" w:hAnsi="Arial" w:cs="Arial"/>
           <w:sz w:val="24"/>
-        </w:rPr>
-      </w:pPr>
-      <w:r>
-        <w:rPr>
-          <w:rFonts w:ascii="Arial" w:hAnsi="Arial" w:cs="Arial"/>
-          <w:b/>
-          <w:bCs/>
-          <w:sz w:val="24"/>
+          <w:szCs w:val="24"/>
+        </w:rPr>
+      </w:pPr>
+      <w:r>
+        <w:rPr>
+          <w:rFonts w:ascii="Arial" w:hAnsi="Arial" w:cs="Arial"/>
+          <w:b/>
+          <w:bCs/>
+          <w:sz w:val="24"/>
+          <w:szCs w:val="24"/>
         </w:rPr>
         <w:t>Múltiplos meios de representação</w:t>
       </w:r>
@@ -4885,6 +5140,7 @@
         <w:rPr>
           <w:rFonts w:ascii="Arial" w:hAnsi="Arial" w:cs="Arial"/>
           <w:sz w:val="24"/>
+          <w:szCs w:val="24"/>
         </w:rPr>
         <w:t>: apresentar os conteúdos de várias maneiras (texto, imagem, áudio, prática).</w:t>
       </w:r>
@@ -4895,18 +5151,21 @@
           <w:ilvl w:val="1"/>
           <w:numId w:val="26"/>
         </w:numPr>
+        <w:spacing w:after="0" w:line="360" w:lineRule="auto"/>
         <w:jc w:val="both"/>
         <w:rPr>
           <w:rFonts w:ascii="Arial" w:hAnsi="Arial" w:cs="Arial"/>
           <w:sz w:val="24"/>
-        </w:rPr>
-      </w:pPr>
-      <w:r>
-        <w:rPr>
-          <w:rFonts w:ascii="Arial" w:hAnsi="Arial" w:cs="Arial"/>
-          <w:b/>
-          <w:bCs/>
-          <w:sz w:val="24"/>
+          <w:szCs w:val="24"/>
+        </w:rPr>
+      </w:pPr>
+      <w:r>
+        <w:rPr>
+          <w:rFonts w:ascii="Arial" w:hAnsi="Arial" w:cs="Arial"/>
+          <w:b/>
+          <w:bCs/>
+          <w:sz w:val="24"/>
+          <w:szCs w:val="24"/>
         </w:rPr>
         <w:t>Múltiplos meios de ação e expressão</w:t>
       </w:r>
@@ -4914,26 +5173,30 @@
         <w:rPr>
           <w:rFonts w:ascii="Arial" w:hAnsi="Arial" w:cs="Arial"/>
           <w:sz w:val="24"/>
+          <w:szCs w:val="24"/>
         </w:rPr>
         <w:t>: permitir que os alunos mostrem o que aprenderam de formas diversas (fala, escrita, desenho, tecnologia).</w:t>
       </w:r>
     </w:p>
     <w:p>
       <w:pPr>
+        <w:spacing w:after="0" w:line="360" w:lineRule="auto"/>
         <w:jc w:val="both"/>
         <w:rPr>
           <w:rFonts w:ascii="Arial" w:hAnsi="Arial" w:cs="Arial"/>
           <w:b/>
           <w:bCs/>
           <w:sz w:val="24"/>
-        </w:rPr>
-      </w:pPr>
-      <w:r>
-        <w:rPr>
-          <w:rFonts w:ascii="Arial" w:hAnsi="Arial" w:cs="Arial"/>
-          <w:b/>
-          <w:bCs/>
-          <w:sz w:val="24"/>
+          <w:szCs w:val="24"/>
+        </w:rPr>
+      </w:pPr>
+      <w:r>
+        <w:rPr>
+          <w:rFonts w:ascii="Arial" w:hAnsi="Arial" w:cs="Arial"/>
+          <w:b/>
+          <w:bCs/>
+          <w:sz w:val="24"/>
+          <w:szCs w:val="24"/>
         </w:rPr>
         <w:t>Relação com o TEA</w:t>
       </w:r>
@@ -4944,16 +5207,19 @@
           <w:ilvl w:val="0"/>
           <w:numId w:val="27"/>
         </w:numPr>
+        <w:spacing w:after="0" w:line="360" w:lineRule="auto"/>
         <w:jc w:val="both"/>
         <w:rPr>
           <w:rFonts w:ascii="Arial" w:hAnsi="Arial" w:cs="Arial"/>
           <w:sz w:val="24"/>
-        </w:rPr>
-      </w:pPr>
-      <w:r>
-        <w:rPr>
-          <w:rFonts w:ascii="Arial" w:hAnsi="Arial" w:cs="Arial"/>
-          <w:sz w:val="24"/>
+          <w:szCs w:val="24"/>
+        </w:rPr>
+      </w:pPr>
+      <w:r>
+        <w:rPr>
+          <w:rFonts w:ascii="Arial" w:hAnsi="Arial" w:cs="Arial"/>
+          <w:sz w:val="24"/>
+          <w:szCs w:val="24"/>
         </w:rPr>
         <w:t xml:space="preserve">O </w:t>
       </w:r>
@@ -4963,6 +5229,7 @@
           <w:b/>
           <w:bCs/>
           <w:sz w:val="24"/>
+          <w:szCs w:val="24"/>
         </w:rPr>
         <w:t>TEA</w:t>
       </w:r>
@@ -4970,6 +5237,7 @@
         <w:rPr>
           <w:rFonts w:ascii="Arial" w:hAnsi="Arial" w:cs="Arial"/>
           <w:sz w:val="24"/>
+          <w:szCs w:val="24"/>
         </w:rPr>
         <w:t xml:space="preserve"> é caracterizado por dificuldades na comunicação, interação social e comportamentos repetitivos.</w:t>
       </w:r>
@@ -4980,16 +5248,19 @@
           <w:ilvl w:val="0"/>
           <w:numId w:val="27"/>
         </w:numPr>
+        <w:spacing w:after="0" w:line="360" w:lineRule="auto"/>
         <w:jc w:val="both"/>
         <w:rPr>
           <w:rFonts w:ascii="Arial" w:hAnsi="Arial" w:cs="Arial"/>
           <w:sz w:val="24"/>
-        </w:rPr>
-      </w:pPr>
-      <w:r>
-        <w:rPr>
-          <w:rFonts w:ascii="Arial" w:hAnsi="Arial" w:cs="Arial"/>
-          <w:sz w:val="24"/>
+          <w:szCs w:val="24"/>
+        </w:rPr>
+      </w:pPr>
+      <w:r>
+        <w:rPr>
+          <w:rFonts w:ascii="Arial" w:hAnsi="Arial" w:cs="Arial"/>
+          <w:sz w:val="24"/>
+          <w:szCs w:val="24"/>
         </w:rPr>
         <w:t>Estudantes com TEA podem ter necessidades muito diferentes uns dos outros.</w:t>
       </w:r>
@@ -5000,16 +5271,19 @@
           <w:ilvl w:val="0"/>
           <w:numId w:val="27"/>
         </w:numPr>
+        <w:spacing w:after="0" w:line="360" w:lineRule="auto"/>
         <w:jc w:val="both"/>
         <w:rPr>
           <w:rFonts w:ascii="Arial" w:hAnsi="Arial" w:cs="Arial"/>
           <w:sz w:val="24"/>
-        </w:rPr>
-      </w:pPr>
-      <w:r>
-        <w:rPr>
-          <w:rFonts w:ascii="Arial" w:hAnsi="Arial" w:cs="Arial"/>
-          <w:sz w:val="24"/>
+          <w:szCs w:val="24"/>
+        </w:rPr>
+      </w:pPr>
+      <w:r>
+        <w:rPr>
+          <w:rFonts w:ascii="Arial" w:hAnsi="Arial" w:cs="Arial"/>
+          <w:sz w:val="24"/>
+          <w:szCs w:val="24"/>
         </w:rPr>
         <w:t xml:space="preserve">O DUA ajuda porque </w:t>
       </w:r>
@@ -5019,6 +5293,7 @@
           <w:b/>
           <w:bCs/>
           <w:sz w:val="24"/>
+          <w:szCs w:val="24"/>
         </w:rPr>
         <w:t>oferece alternativas</w:t>
       </w:r>
@@ -5026,26 +5301,30 @@
         <w:rPr>
           <w:rFonts w:ascii="Arial" w:hAnsi="Arial" w:cs="Arial"/>
           <w:sz w:val="24"/>
+          <w:szCs w:val="24"/>
         </w:rPr>
         <w:t>: se um aluno tem dificuldade em se comunicar verbalmente, pode usar imagens ou tecnologia; se não consegue se concentrar em uma atividade longa, pode ter opções mais curtas ou práticas.</w:t>
       </w:r>
     </w:p>
     <w:p>
       <w:pPr>
+        <w:spacing w:after="0" w:line="360" w:lineRule="auto"/>
         <w:jc w:val="both"/>
         <w:rPr>
           <w:rFonts w:ascii="Arial" w:hAnsi="Arial" w:cs="Arial"/>
           <w:b/>
           <w:bCs/>
           <w:sz w:val="24"/>
-        </w:rPr>
-      </w:pPr>
-      <w:r>
-        <w:rPr>
-          <w:rFonts w:ascii="Arial" w:hAnsi="Arial" w:cs="Arial"/>
-          <w:b/>
-          <w:bCs/>
-          <w:sz w:val="24"/>
+          <w:szCs w:val="24"/>
+        </w:rPr>
+      </w:pPr>
+      <w:r>
+        <w:rPr>
+          <w:rFonts w:ascii="Arial" w:hAnsi="Arial" w:cs="Arial"/>
+          <w:b/>
+          <w:bCs/>
+          <w:sz w:val="24"/>
+          <w:szCs w:val="24"/>
         </w:rPr>
         <w:t>Benefícios do DUA para alunos com TEA</w:t>
       </w:r>
@@ -5056,18 +5335,21 @@
           <w:ilvl w:val="0"/>
           <w:numId w:val="28"/>
         </w:numPr>
+        <w:spacing w:after="0" w:line="360" w:lineRule="auto"/>
         <w:jc w:val="both"/>
         <w:rPr>
           <w:rFonts w:ascii="Arial" w:hAnsi="Arial" w:cs="Arial"/>
           <w:sz w:val="24"/>
-        </w:rPr>
-      </w:pPr>
-      <w:r>
-        <w:rPr>
-          <w:rFonts w:ascii="Arial" w:hAnsi="Arial" w:cs="Arial"/>
-          <w:b/>
-          <w:bCs/>
-          <w:sz w:val="24"/>
+          <w:szCs w:val="24"/>
+        </w:rPr>
+      </w:pPr>
+      <w:r>
+        <w:rPr>
+          <w:rFonts w:ascii="Arial" w:hAnsi="Arial" w:cs="Arial"/>
+          <w:b/>
+          <w:bCs/>
+          <w:sz w:val="24"/>
+          <w:szCs w:val="24"/>
         </w:rPr>
         <w:t>Inclusão escolar</w:t>
       </w:r>
@@ -5075,6 +5357,7 @@
         <w:rPr>
           <w:rFonts w:ascii="Arial" w:hAnsi="Arial" w:cs="Arial"/>
           <w:sz w:val="24"/>
+          <w:szCs w:val="24"/>
         </w:rPr>
         <w:t>: garante que o aluno participe junto com os colegas.</w:t>
       </w:r>
@@ -5085,18 +5368,21 @@
           <w:ilvl w:val="0"/>
           <w:numId w:val="28"/>
         </w:numPr>
+        <w:spacing w:after="0" w:line="360" w:lineRule="auto"/>
         <w:jc w:val="both"/>
         <w:rPr>
           <w:rFonts w:ascii="Arial" w:hAnsi="Arial" w:cs="Arial"/>
           <w:sz w:val="24"/>
-        </w:rPr>
-      </w:pPr>
-      <w:r>
-        <w:rPr>
-          <w:rFonts w:ascii="Arial" w:hAnsi="Arial" w:cs="Arial"/>
-          <w:b/>
-          <w:bCs/>
-          <w:sz w:val="24"/>
+          <w:szCs w:val="24"/>
+        </w:rPr>
+      </w:pPr>
+      <w:r>
+        <w:rPr>
+          <w:rFonts w:ascii="Arial" w:hAnsi="Arial" w:cs="Arial"/>
+          <w:b/>
+          <w:bCs/>
+          <w:sz w:val="24"/>
+          <w:szCs w:val="24"/>
         </w:rPr>
         <w:t>Acessibilidade pedagógica</w:t>
       </w:r>
@@ -5104,6 +5390,7 @@
         <w:rPr>
           <w:rFonts w:ascii="Arial" w:hAnsi="Arial" w:cs="Arial"/>
           <w:sz w:val="24"/>
+          <w:szCs w:val="24"/>
         </w:rPr>
         <w:t>: diminui barreiras que atrapalham o aprendizado.</w:t>
       </w:r>
@@ -5114,18 +5401,21 @@
           <w:ilvl w:val="0"/>
           <w:numId w:val="28"/>
         </w:numPr>
+        <w:spacing w:after="0" w:line="360" w:lineRule="auto"/>
         <w:jc w:val="both"/>
         <w:rPr>
           <w:rFonts w:ascii="Arial" w:hAnsi="Arial" w:cs="Arial"/>
           <w:sz w:val="24"/>
-        </w:rPr>
-      </w:pPr>
-      <w:r>
-        <w:rPr>
-          <w:rFonts w:ascii="Arial" w:hAnsi="Arial" w:cs="Arial"/>
-          <w:b/>
-          <w:bCs/>
-          <w:sz w:val="24"/>
+          <w:szCs w:val="24"/>
+        </w:rPr>
+      </w:pPr>
+      <w:r>
+        <w:rPr>
+          <w:rFonts w:ascii="Arial" w:hAnsi="Arial" w:cs="Arial"/>
+          <w:b/>
+          <w:bCs/>
+          <w:sz w:val="24"/>
+          <w:szCs w:val="24"/>
         </w:rPr>
         <w:t>Flexibilidade</w:t>
       </w:r>
@@ -5133,6 +5423,7 @@
         <w:rPr>
           <w:rFonts w:ascii="Arial" w:hAnsi="Arial" w:cs="Arial"/>
           <w:sz w:val="24"/>
+          <w:szCs w:val="24"/>
         </w:rPr>
         <w:t>: adapta o ensino sem precisar criar soluções isoladas para cada aluno.</w:t>
       </w:r>
@@ -5143,18 +5434,21 @@
           <w:ilvl w:val="0"/>
           <w:numId w:val="28"/>
         </w:numPr>
+        <w:spacing w:after="0" w:line="360" w:lineRule="auto"/>
         <w:jc w:val="both"/>
         <w:rPr>
           <w:rFonts w:ascii="Arial" w:hAnsi="Arial" w:cs="Arial"/>
           <w:sz w:val="24"/>
-        </w:rPr>
-      </w:pPr>
-      <w:r>
-        <w:rPr>
-          <w:rFonts w:ascii="Arial" w:hAnsi="Arial" w:cs="Arial"/>
-          <w:b/>
-          <w:bCs/>
-          <w:sz w:val="24"/>
+          <w:szCs w:val="24"/>
+        </w:rPr>
+      </w:pPr>
+      <w:r>
+        <w:rPr>
+          <w:rFonts w:ascii="Arial" w:hAnsi="Arial" w:cs="Arial"/>
+          <w:b/>
+          <w:bCs/>
+          <w:sz w:val="24"/>
+          <w:szCs w:val="24"/>
         </w:rPr>
         <w:t>Valorização das diferenças</w:t>
       </w:r>
@@ -5162,44 +5456,52 @@
         <w:rPr>
           <w:rFonts w:ascii="Arial" w:hAnsi="Arial" w:cs="Arial"/>
           <w:sz w:val="24"/>
+          <w:szCs w:val="24"/>
         </w:rPr>
         <w:t>: reconhece que cada estudante aprende de forma única.</w:t>
       </w:r>
     </w:p>
     <w:p>
       <w:pPr>
+        <w:spacing w:after="0" w:line="360" w:lineRule="auto"/>
         <w:jc w:val="both"/>
         <w:rPr>
           <w:rFonts w:ascii="Arial" w:hAnsi="Arial" w:cs="Arial"/>
           <w:b/>
           <w:bCs/>
           <w:sz w:val="24"/>
-        </w:rPr>
-      </w:pPr>
-      <w:r>
-        <w:rPr>
-          <w:rFonts w:ascii="Arial" w:hAnsi="Arial" w:cs="Arial"/>
-          <w:b/>
-          <w:bCs/>
-          <w:sz w:val="24"/>
+          <w:szCs w:val="24"/>
+        </w:rPr>
+      </w:pPr>
+      <w:r>
+        <w:rPr>
+          <w:rFonts w:ascii="Arial" w:hAnsi="Arial" w:cs="Arial"/>
+          <w:b/>
+          <w:bCs/>
+          <w:sz w:val="24"/>
+          <w:szCs w:val="24"/>
         </w:rPr>
         <w:t>Conclusão</w:t>
       </w:r>
     </w:p>
     <w:p>
       <w:pPr>
+        <w:spacing w:after="0" w:line="360" w:lineRule="auto"/>
         <w:ind w:firstLine="708"/>
         <w:jc w:val="both"/>
         <w:rPr>
           <w:rFonts w:ascii="Arial" w:hAnsi="Arial" w:cs="Arial"/>
           <w:sz w:val="24"/>
-        </w:rPr>
-      </w:pPr>
-      <w:r>
-        <w:rPr>
-          <w:rFonts w:ascii="Arial" w:hAnsi="Arial" w:cs="Arial"/>
-          <w:sz w:val="24"/>
-        </w:rPr>
+          <w:szCs w:val="24"/>
+        </w:rPr>
+      </w:pPr>
+      <w:r>
+        <w:rPr>
+          <w:rFonts w:ascii="Arial" w:hAnsi="Arial" w:cs="Arial"/>
+          <w:sz w:val="24"/>
+          <w:szCs w:val="24"/>
+        </w:rPr>
+        <w:lastRenderedPageBreak/>
         <w:t xml:space="preserve">O DUA é uma forma de pensar a educação que </w:t>
       </w:r>
       <w:r>
@@ -5208,6 +5510,7 @@
           <w:b/>
           <w:bCs/>
           <w:sz w:val="24"/>
+          <w:szCs w:val="24"/>
         </w:rPr>
         <w:t>favorece todos os alunos</w:t>
       </w:r>
@@ -5215,6 +5518,7 @@
         <w:rPr>
           <w:rFonts w:ascii="Arial" w:hAnsi="Arial" w:cs="Arial"/>
           <w:sz w:val="24"/>
+          <w:szCs w:val="24"/>
         </w:rPr>
         <w:t xml:space="preserve">, mas tem impacto especial para quem está no espectro autista. Ele promove </w:t>
       </w:r>
@@ -5224,6 +5528,7 @@
           <w:b/>
           <w:bCs/>
           <w:sz w:val="24"/>
+          <w:szCs w:val="24"/>
         </w:rPr>
         <w:t>uma escola mais justa, acessível e inclusiva</w:t>
       </w:r>
@@ -5231,123 +5536,76 @@
         <w:rPr>
           <w:rFonts w:ascii="Arial" w:hAnsi="Arial" w:cs="Arial"/>
           <w:sz w:val="24"/>
+          <w:szCs w:val="24"/>
         </w:rPr>
         <w:t>, onde cada estudante pode aprender e se expressar de acordo com suas possibilidades.</w:t>
       </w:r>
     </w:p>
-    <w:p/>
-    <w:p>
-      <w:pPr>
-        <w:jc w:val="center"/>
-        <w:rPr>
-          <w:rFonts w:ascii="Arial" w:hAnsi="Arial" w:cs="Arial"/>
-          <w:b/>
-        </w:rPr>
-      </w:pPr>
-      <w:r>
-        <w:rPr>
-          <w:rFonts w:ascii="Arial" w:hAnsi="Arial" w:cs="Arial"/>
-          <w:b/>
-          <w:sz w:val="28"/>
+    <w:p>
+      <w:pPr>
+        <w:spacing w:after="0" w:line="360" w:lineRule="auto"/>
+        <w:rPr>
+          <w:rFonts w:ascii="Arial" w:hAnsi="Arial" w:cs="Arial"/>
+          <w:sz w:val="24"/>
+          <w:szCs w:val="24"/>
+        </w:rPr>
+      </w:pPr>
+    </w:p>
+    <w:p>
+      <w:pPr>
+        <w:spacing w:after="0" w:line="360" w:lineRule="auto"/>
+        <w:jc w:val="center"/>
+        <w:rPr>
+          <w:rFonts w:ascii="Arial" w:hAnsi="Arial" w:cs="Arial"/>
+          <w:b/>
+          <w:sz w:val="24"/>
+          <w:szCs w:val="24"/>
+        </w:rPr>
+      </w:pPr>
+      <w:r>
+        <w:rPr>
+          <w:rFonts w:ascii="Arial" w:hAnsi="Arial" w:cs="Arial"/>
+          <w:b/>
+          <w:sz w:val="24"/>
+          <w:szCs w:val="24"/>
         </w:rPr>
         <w:t>CORES DO FRONT-END</w:t>
       </w:r>
     </w:p>
     <w:p>
       <w:pPr>
+        <w:spacing w:after="0" w:line="360" w:lineRule="auto"/>
         <w:ind w:firstLine="708"/>
         <w:jc w:val="both"/>
         <w:rPr>
           <w:rFonts w:ascii="Arial" w:hAnsi="Arial" w:cs="Arial"/>
           <w:sz w:val="24"/>
-        </w:rPr>
-      </w:pPr>
-      <w:r>
-        <w:rPr>
-          <w:rFonts w:ascii="Arial" w:hAnsi="Arial" w:cs="Arial"/>
-          <w:sz w:val="24"/>
-        </w:rPr>
-        <w:t xml:space="preserve">O estudo de Valério e Bigoli (2021) indica que o design de interfaces para pessoas com TEA deve priorizar a redução da sobrecarga sensorial através de layouts limpos, previsíveis e com uso de cores suaves ou tons pastéis. A pesquisa enfatiza a </w:t>
-      </w:r>
-      <w:r>
-        <w:rPr>
-          <w:rFonts w:ascii="Arial" w:hAnsi="Arial" w:cs="Arial"/>
-          <w:sz w:val="24"/>
-        </w:rPr>
-        <w:lastRenderedPageBreak/>
-        <w:t>necessidade de evitar contrastes agressivos e animações excessivas, optando por padronização visual para facilitar o foco e a navegação.</w:t>
-      </w:r>
-    </w:p>
-    <w:p>
-      <w:pPr>
-        <w:jc w:val="both"/>
-        <w:rPr>
-          <w:rFonts w:ascii="Arial" w:hAnsi="Arial" w:cs="Arial"/>
-          <w:sz w:val="24"/>
-          <w:szCs w:val="24"/>
-        </w:rPr>
-      </w:pPr>
-    </w:p>
-    <w:p>
-      <w:pPr>
-        <w:jc w:val="both"/>
-        <w:rPr>
-          <w:rFonts w:ascii="Arial" w:hAnsi="Arial" w:cs="Arial"/>
-          <w:sz w:val="24"/>
-          <w:szCs w:val="24"/>
-        </w:rPr>
-      </w:pPr>
-    </w:p>
-    <w:p>
-      <w:pPr>
-        <w:jc w:val="center"/>
-        <w:rPr>
-          <w:rFonts w:ascii="Arial" w:hAnsi="Arial" w:cs="Arial"/>
-          <w:sz w:val="24"/>
-          <w:szCs w:val="24"/>
-        </w:rPr>
-      </w:pPr>
-      <w:r>
-        <w:rPr>
-          <w:rFonts w:ascii="Arial" w:hAnsi="Arial" w:cs="Arial"/>
-          <w:sz w:val="24"/>
-          <w:szCs w:val="24"/>
-        </w:rPr>
-        <w:t>CONCLUSÃO</w:t>
-      </w:r>
-    </w:p>
-    <w:p>
-      <w:pPr>
-        <w:jc w:val="center"/>
-        <w:rPr>
-          <w:rFonts w:ascii="Arial" w:hAnsi="Arial" w:cs="Arial"/>
-          <w:sz w:val="24"/>
-          <w:szCs w:val="24"/>
-        </w:rPr>
-      </w:pPr>
-    </w:p>
-    <w:p>
-      <w:pPr>
-        <w:jc w:val="center"/>
-        <w:rPr>
-          <w:rFonts w:ascii="Arial" w:hAnsi="Arial" w:cs="Arial"/>
-          <w:sz w:val="24"/>
-          <w:szCs w:val="24"/>
-        </w:rPr>
-      </w:pPr>
-    </w:p>
-    <w:p>
-      <w:pPr>
-        <w:jc w:val="center"/>
-        <w:rPr>
-          <w:rFonts w:ascii="Arial" w:hAnsi="Arial" w:cs="Arial"/>
-          <w:sz w:val="24"/>
-          <w:szCs w:val="24"/>
-        </w:rPr>
-      </w:pPr>
-    </w:p>
-    <w:p>
-      <w:pPr>
+          <w:szCs w:val="24"/>
+        </w:rPr>
+      </w:pPr>
+      <w:r>
+        <w:rPr>
+          <w:rFonts w:ascii="Arial" w:hAnsi="Arial" w:cs="Arial"/>
+          <w:sz w:val="24"/>
+          <w:szCs w:val="24"/>
+        </w:rPr>
+        <w:t>O estudo de Valério e Bigoli (2021) indica que o design de interfaces para pessoas com TEA deve priorizar a redução da sobrecarga sensorial através de layouts limpos, previsíveis e com uso de cores suaves ou tons pastéis. A pesquisa enfatiza a necessidade de evitar contrastes agressivos e animações excessivas, optando por padronização visual para facilitar o foco e a navegação.</w:t>
+      </w:r>
+    </w:p>
+    <w:p>
+      <w:pPr>
+        <w:spacing w:after="0" w:line="360" w:lineRule="auto"/>
+        <w:jc w:val="center"/>
+        <w:rPr>
+          <w:rFonts w:ascii="Arial" w:hAnsi="Arial" w:cs="Arial"/>
+          <w:sz w:val="24"/>
+          <w:szCs w:val="24"/>
+        </w:rPr>
+      </w:pPr>
+    </w:p>
+    <w:p>
+      <w:pPr>
+        <w:spacing w:after="0" w:line="360" w:lineRule="auto"/>
         <w:rPr>
           <w:rFonts w:ascii="Arial" w:hAnsi="Arial" w:cs="Arial"/>
           <w:sz w:val="24"/>
@@ -5365,6 +5623,7 @@
     </w:p>
     <w:p>
       <w:pPr>
+        <w:spacing w:after="0" w:line="360" w:lineRule="auto"/>
         <w:rPr>
           <w:rFonts w:ascii="Arial" w:hAnsi="Arial" w:cs="Arial"/>
           <w:sz w:val="24"/>
@@ -5424,15 +5683,17 @@
     </w:p>
     <w:p>
       <w:pPr>
-        <w:rPr>
-          <w:rFonts w:ascii="Arial" w:hAnsi="Arial" w:cs="Arial"/>
-          <w:sz w:val="24"/>
-          <w:szCs w:val="24"/>
-        </w:rPr>
-      </w:pPr>
-    </w:p>
-    <w:p>
-      <w:pPr>
+        <w:spacing w:after="0" w:line="360" w:lineRule="auto"/>
+        <w:rPr>
+          <w:rFonts w:ascii="Arial" w:hAnsi="Arial" w:cs="Arial"/>
+          <w:sz w:val="24"/>
+          <w:szCs w:val="24"/>
+        </w:rPr>
+      </w:pPr>
+    </w:p>
+    <w:p>
+      <w:pPr>
+        <w:spacing w:after="0" w:line="360" w:lineRule="auto"/>
         <w:rPr>
           <w:rFonts w:ascii="Arial" w:hAnsi="Arial" w:cs="Arial"/>
           <w:sz w:val="24"/>
@@ -5450,6 +5711,7 @@
     </w:p>
     <w:p>
       <w:pPr>
+        <w:spacing w:after="0" w:line="360" w:lineRule="auto"/>
         <w:rPr>
           <w:rFonts w:ascii="Arial" w:hAnsi="Arial" w:cs="Arial"/>
           <w:sz w:val="24"/>
@@ -5517,6 +5779,7 @@
     </w:p>
     <w:p>
       <w:pPr>
+        <w:spacing w:after="0" w:line="360" w:lineRule="auto"/>
         <w:rPr>
           <w:rFonts w:ascii="Arial" w:hAnsi="Arial" w:cs="Arial"/>
           <w:sz w:val="24"/>
@@ -5577,15 +5840,17 @@
     </w:p>
     <w:p>
       <w:pPr>
-        <w:rPr>
-          <w:rFonts w:ascii="Arial" w:hAnsi="Arial" w:cs="Arial"/>
-          <w:sz w:val="24"/>
-          <w:szCs w:val="24"/>
-        </w:rPr>
-      </w:pPr>
-    </w:p>
-    <w:p>
-      <w:pPr>
+        <w:spacing w:after="0" w:line="360" w:lineRule="auto"/>
+        <w:rPr>
+          <w:rFonts w:ascii="Arial" w:hAnsi="Arial" w:cs="Arial"/>
+          <w:sz w:val="24"/>
+          <w:szCs w:val="24"/>
+        </w:rPr>
+      </w:pPr>
+    </w:p>
+    <w:p>
+      <w:pPr>
+        <w:spacing w:after="0" w:line="360" w:lineRule="auto"/>
         <w:rPr>
           <w:rFonts w:ascii="Arial" w:hAnsi="Arial" w:cs="Arial"/>
           <w:sz w:val="24"/>
@@ -5603,6 +5868,7 @@
     </w:p>
     <w:p>
       <w:pPr>
+        <w:spacing w:after="0" w:line="360" w:lineRule="auto"/>
         <w:rPr>
           <w:rFonts w:ascii="Arial" w:hAnsi="Arial" w:cs="Arial"/>
           <w:sz w:val="24"/>
@@ -5662,132 +5928,147 @@
     </w:p>
     <w:p>
       <w:pPr>
-        <w:rPr>
-          <w:rFonts w:ascii="Arial" w:hAnsi="Arial" w:cs="Arial"/>
-          <w:sz w:val="24"/>
-          <w:szCs w:val="24"/>
-        </w:rPr>
-      </w:pPr>
-    </w:p>
-    <w:p>
-      <w:pPr>
-        <w:rPr>
-          <w:rFonts w:ascii="Arial" w:hAnsi="Arial" w:cs="Arial"/>
-          <w:sz w:val="24"/>
-          <w:szCs w:val="24"/>
-        </w:rPr>
-      </w:pPr>
-    </w:p>
-    <w:p>
-      <w:pPr>
-        <w:rPr>
-          <w:rFonts w:ascii="Arial" w:hAnsi="Arial" w:cs="Arial"/>
-          <w:sz w:val="24"/>
-          <w:szCs w:val="24"/>
-        </w:rPr>
-      </w:pPr>
-    </w:p>
-    <w:p>
-      <w:pPr>
-        <w:rPr>
-          <w:rFonts w:ascii="Arial" w:hAnsi="Arial" w:cs="Arial"/>
-          <w:sz w:val="24"/>
-          <w:szCs w:val="24"/>
-        </w:rPr>
-      </w:pPr>
-    </w:p>
-    <w:p>
-      <w:pPr>
-        <w:rPr>
-          <w:rFonts w:ascii="Arial" w:hAnsi="Arial" w:cs="Arial"/>
-          <w:sz w:val="24"/>
-          <w:szCs w:val="24"/>
-        </w:rPr>
-      </w:pPr>
-    </w:p>
-    <w:p>
-      <w:pPr>
-        <w:rPr>
-          <w:rFonts w:ascii="Arial" w:hAnsi="Arial" w:cs="Arial"/>
-          <w:sz w:val="24"/>
-          <w:szCs w:val="24"/>
-        </w:rPr>
-      </w:pPr>
-    </w:p>
-    <w:p>
-      <w:pPr>
-        <w:rPr>
-          <w:rFonts w:ascii="Arial" w:hAnsi="Arial" w:cs="Arial"/>
-          <w:sz w:val="24"/>
-          <w:szCs w:val="24"/>
-        </w:rPr>
-      </w:pPr>
-    </w:p>
-    <w:p>
-      <w:pPr>
-        <w:rPr>
-          <w:rFonts w:ascii="Arial" w:hAnsi="Arial" w:cs="Arial"/>
-          <w:sz w:val="24"/>
-          <w:szCs w:val="24"/>
-        </w:rPr>
-      </w:pPr>
-    </w:p>
-    <w:p>
-      <w:pPr>
-        <w:rPr>
-          <w:rFonts w:ascii="Arial" w:hAnsi="Arial" w:cs="Arial"/>
-          <w:sz w:val="24"/>
-          <w:szCs w:val="24"/>
-        </w:rPr>
-      </w:pPr>
-    </w:p>
-    <w:p>
-      <w:pPr>
-        <w:rPr>
-          <w:rFonts w:ascii="Arial" w:hAnsi="Arial" w:cs="Arial"/>
-          <w:sz w:val="24"/>
-          <w:szCs w:val="24"/>
-        </w:rPr>
-      </w:pPr>
-    </w:p>
-    <w:p>
-      <w:pPr>
-        <w:rPr>
-          <w:rFonts w:ascii="Arial" w:hAnsi="Arial" w:cs="Arial"/>
-          <w:sz w:val="24"/>
-          <w:szCs w:val="24"/>
-        </w:rPr>
-      </w:pPr>
-    </w:p>
-    <w:p>
-      <w:pPr>
-        <w:rPr>
-          <w:rFonts w:ascii="Arial" w:hAnsi="Arial" w:cs="Arial"/>
-          <w:sz w:val="24"/>
-          <w:szCs w:val="24"/>
-        </w:rPr>
-      </w:pPr>
-    </w:p>
-    <w:p>
-      <w:pPr>
-        <w:rPr>
-          <w:rFonts w:ascii="Arial" w:hAnsi="Arial" w:cs="Arial"/>
-          <w:sz w:val="24"/>
-          <w:szCs w:val="24"/>
-        </w:rPr>
-      </w:pPr>
-    </w:p>
-    <w:p>
-      <w:pPr>
-        <w:rPr>
-          <w:rFonts w:ascii="Arial" w:hAnsi="Arial" w:cs="Arial"/>
-          <w:sz w:val="24"/>
-          <w:szCs w:val="24"/>
-        </w:rPr>
-      </w:pPr>
-    </w:p>
-    <w:p>
-      <w:pPr>
+        <w:spacing w:after="0" w:line="360" w:lineRule="auto"/>
+        <w:rPr>
+          <w:rFonts w:ascii="Arial" w:hAnsi="Arial" w:cs="Arial"/>
+          <w:sz w:val="24"/>
+          <w:szCs w:val="24"/>
+        </w:rPr>
+      </w:pPr>
+    </w:p>
+    <w:p>
+      <w:pPr>
+        <w:spacing w:after="0" w:line="360" w:lineRule="auto"/>
+        <w:rPr>
+          <w:rFonts w:ascii="Arial" w:hAnsi="Arial" w:cs="Arial"/>
+          <w:sz w:val="24"/>
+          <w:szCs w:val="24"/>
+        </w:rPr>
+      </w:pPr>
+    </w:p>
+    <w:p>
+      <w:pPr>
+        <w:spacing w:after="0" w:line="360" w:lineRule="auto"/>
+        <w:rPr>
+          <w:rFonts w:ascii="Arial" w:hAnsi="Arial" w:cs="Arial"/>
+          <w:sz w:val="24"/>
+          <w:szCs w:val="24"/>
+        </w:rPr>
+      </w:pPr>
+    </w:p>
+    <w:p>
+      <w:pPr>
+        <w:spacing w:after="0" w:line="360" w:lineRule="auto"/>
+        <w:rPr>
+          <w:rFonts w:ascii="Arial" w:hAnsi="Arial" w:cs="Arial"/>
+          <w:sz w:val="24"/>
+          <w:szCs w:val="24"/>
+        </w:rPr>
+      </w:pPr>
+    </w:p>
+    <w:p>
+      <w:pPr>
+        <w:spacing w:after="0" w:line="360" w:lineRule="auto"/>
+        <w:rPr>
+          <w:rFonts w:ascii="Arial" w:hAnsi="Arial" w:cs="Arial"/>
+          <w:sz w:val="24"/>
+          <w:szCs w:val="24"/>
+        </w:rPr>
+      </w:pPr>
+    </w:p>
+    <w:p>
+      <w:pPr>
+        <w:spacing w:after="0" w:line="360" w:lineRule="auto"/>
+        <w:rPr>
+          <w:rFonts w:ascii="Arial" w:hAnsi="Arial" w:cs="Arial"/>
+          <w:sz w:val="24"/>
+          <w:szCs w:val="24"/>
+        </w:rPr>
+      </w:pPr>
+    </w:p>
+    <w:p>
+      <w:pPr>
+        <w:spacing w:after="0" w:line="360" w:lineRule="auto"/>
+        <w:rPr>
+          <w:rFonts w:ascii="Arial" w:hAnsi="Arial" w:cs="Arial"/>
+          <w:sz w:val="24"/>
+          <w:szCs w:val="24"/>
+        </w:rPr>
+      </w:pPr>
+    </w:p>
+    <w:p>
+      <w:pPr>
+        <w:spacing w:after="0" w:line="360" w:lineRule="auto"/>
+        <w:rPr>
+          <w:rFonts w:ascii="Arial" w:hAnsi="Arial" w:cs="Arial"/>
+          <w:sz w:val="24"/>
+          <w:szCs w:val="24"/>
+        </w:rPr>
+      </w:pPr>
+    </w:p>
+    <w:p>
+      <w:pPr>
+        <w:spacing w:after="0" w:line="360" w:lineRule="auto"/>
+        <w:rPr>
+          <w:rFonts w:ascii="Arial" w:hAnsi="Arial" w:cs="Arial"/>
+          <w:sz w:val="24"/>
+          <w:szCs w:val="24"/>
+        </w:rPr>
+      </w:pPr>
+    </w:p>
+    <w:p>
+      <w:pPr>
+        <w:spacing w:after="0" w:line="360" w:lineRule="auto"/>
+        <w:rPr>
+          <w:rFonts w:ascii="Arial" w:hAnsi="Arial" w:cs="Arial"/>
+          <w:sz w:val="24"/>
+          <w:szCs w:val="24"/>
+        </w:rPr>
+      </w:pPr>
+    </w:p>
+    <w:p>
+      <w:pPr>
+        <w:spacing w:after="0" w:line="360" w:lineRule="auto"/>
+        <w:rPr>
+          <w:rFonts w:ascii="Arial" w:hAnsi="Arial" w:cs="Arial"/>
+          <w:sz w:val="24"/>
+          <w:szCs w:val="24"/>
+        </w:rPr>
+      </w:pPr>
+    </w:p>
+    <w:p>
+      <w:pPr>
+        <w:spacing w:after="0" w:line="360" w:lineRule="auto"/>
+        <w:rPr>
+          <w:rFonts w:ascii="Arial" w:hAnsi="Arial" w:cs="Arial"/>
+          <w:sz w:val="24"/>
+          <w:szCs w:val="24"/>
+        </w:rPr>
+      </w:pPr>
+    </w:p>
+    <w:p>
+      <w:pPr>
+        <w:spacing w:after="0" w:line="360" w:lineRule="auto"/>
+        <w:rPr>
+          <w:rFonts w:ascii="Arial" w:hAnsi="Arial" w:cs="Arial"/>
+          <w:sz w:val="24"/>
+          <w:szCs w:val="24"/>
+        </w:rPr>
+      </w:pPr>
+    </w:p>
+    <w:p>
+      <w:pPr>
+        <w:spacing w:after="0" w:line="360" w:lineRule="auto"/>
+        <w:rPr>
+          <w:rFonts w:ascii="Arial" w:hAnsi="Arial" w:cs="Arial"/>
+          <w:sz w:val="24"/>
+          <w:szCs w:val="24"/>
+        </w:rPr>
+      </w:pPr>
+    </w:p>
+    <w:p>
+      <w:pPr>
+        <w:spacing w:after="0" w:line="360" w:lineRule="auto"/>
         <w:rPr>
           <w:rFonts w:ascii="Arial" w:hAnsi="Arial" w:cs="Arial"/>
           <w:sz w:val="24"/>
@@ -5805,6 +6086,7 @@
     </w:p>
     <w:p>
       <w:pPr>
+        <w:spacing w:after="0" w:line="360" w:lineRule="auto"/>
         <w:rPr>
           <w:rFonts w:ascii="Arial" w:hAnsi="Arial" w:cs="Arial"/>
           <w:sz w:val="24"/>
@@ -5872,33 +6154,37 @@
     </w:p>
     <w:p>
       <w:pPr>
-        <w:rPr>
-          <w:rFonts w:ascii="Arial" w:hAnsi="Arial" w:cs="Arial"/>
-          <w:sz w:val="24"/>
-          <w:szCs w:val="24"/>
-        </w:rPr>
-      </w:pPr>
-    </w:p>
-    <w:p>
-      <w:pPr>
-        <w:rPr>
-          <w:rFonts w:ascii="Arial" w:hAnsi="Arial" w:cs="Arial"/>
-          <w:sz w:val="24"/>
-          <w:szCs w:val="24"/>
-        </w:rPr>
-      </w:pPr>
-    </w:p>
-    <w:p>
-      <w:pPr>
-        <w:rPr>
-          <w:rFonts w:ascii="Arial" w:hAnsi="Arial" w:cs="Arial"/>
-          <w:sz w:val="24"/>
-          <w:szCs w:val="24"/>
-        </w:rPr>
-      </w:pPr>
-    </w:p>
-    <w:p>
-      <w:pPr>
+        <w:spacing w:after="0" w:line="360" w:lineRule="auto"/>
+        <w:rPr>
+          <w:rFonts w:ascii="Arial" w:hAnsi="Arial" w:cs="Arial"/>
+          <w:sz w:val="24"/>
+          <w:szCs w:val="24"/>
+        </w:rPr>
+      </w:pPr>
+    </w:p>
+    <w:p>
+      <w:pPr>
+        <w:spacing w:after="0" w:line="360" w:lineRule="auto"/>
+        <w:rPr>
+          <w:rFonts w:ascii="Arial" w:hAnsi="Arial" w:cs="Arial"/>
+          <w:sz w:val="24"/>
+          <w:szCs w:val="24"/>
+        </w:rPr>
+      </w:pPr>
+    </w:p>
+    <w:p>
+      <w:pPr>
+        <w:spacing w:after="0" w:line="360" w:lineRule="auto"/>
+        <w:rPr>
+          <w:rFonts w:ascii="Arial" w:hAnsi="Arial" w:cs="Arial"/>
+          <w:sz w:val="24"/>
+          <w:szCs w:val="24"/>
+        </w:rPr>
+      </w:pPr>
+    </w:p>
+    <w:p>
+      <w:pPr>
+        <w:spacing w:after="0" w:line="360" w:lineRule="auto"/>
         <w:rPr>
           <w:rFonts w:ascii="Arial" w:hAnsi="Arial" w:cs="Arial"/>
           <w:sz w:val="24"/>
@@ -5959,6 +6245,7 @@
     </w:p>
     <w:p>
       <w:pPr>
+        <w:spacing w:after="0" w:line="360" w:lineRule="auto"/>
         <w:rPr>
           <w:rFonts w:ascii="Arial" w:hAnsi="Arial" w:cs="Arial"/>
           <w:sz w:val="24"/>
@@ -6018,15 +6305,17 @@
     </w:p>
     <w:p>
       <w:pPr>
-        <w:rPr>
-          <w:rFonts w:ascii="Arial" w:hAnsi="Arial" w:cs="Arial"/>
-          <w:sz w:val="24"/>
-          <w:szCs w:val="24"/>
-        </w:rPr>
-      </w:pPr>
-    </w:p>
-    <w:p>
-      <w:pPr>
+        <w:spacing w:after="0" w:line="360" w:lineRule="auto"/>
+        <w:rPr>
+          <w:rFonts w:ascii="Arial" w:hAnsi="Arial" w:cs="Arial"/>
+          <w:sz w:val="24"/>
+          <w:szCs w:val="24"/>
+        </w:rPr>
+      </w:pPr>
+    </w:p>
+    <w:p>
+      <w:pPr>
+        <w:spacing w:after="0" w:line="360" w:lineRule="auto"/>
         <w:jc w:val="both"/>
         <w:rPr>
           <w:rFonts w:ascii="Arial" w:hAnsi="Arial" w:cs="Arial"/>
@@ -6089,6 +6378,7 @@
     </w:p>
     <w:p>
       <w:pPr>
+        <w:spacing w:after="0" w:line="360" w:lineRule="auto"/>
         <w:jc w:val="both"/>
         <w:rPr>
           <w:rFonts w:ascii="Arial" w:hAnsi="Arial" w:cs="Arial"/>
@@ -6099,6 +6389,7 @@
     </w:p>
     <w:p>
       <w:pPr>
+        <w:spacing w:after="0" w:line="360" w:lineRule="auto"/>
         <w:jc w:val="both"/>
         <w:rPr>
           <w:rFonts w:ascii="Arial" w:hAnsi="Arial" w:cs="Arial"/>
@@ -6109,86 +6400,95 @@
     </w:p>
     <w:p>
       <w:pPr>
-        <w:rPr>
-          <w:rFonts w:ascii="Arial" w:hAnsi="Arial" w:cs="Arial"/>
-          <w:b/>
-          <w:sz w:val="24"/>
-          <w:szCs w:val="24"/>
-        </w:rPr>
-      </w:pPr>
-    </w:p>
-    <w:p>
-      <w:pPr>
-        <w:rPr>
-          <w:rFonts w:ascii="Arial" w:hAnsi="Arial" w:cs="Arial"/>
-          <w:b/>
-          <w:sz w:val="24"/>
-          <w:szCs w:val="24"/>
-        </w:rPr>
-      </w:pPr>
-    </w:p>
-    <w:p>
-      <w:pPr>
-        <w:rPr>
-          <w:rFonts w:ascii="Arial" w:hAnsi="Arial" w:cs="Arial"/>
-          <w:b/>
-          <w:sz w:val="24"/>
-          <w:szCs w:val="24"/>
-        </w:rPr>
-      </w:pPr>
-    </w:p>
-    <w:p>
-      <w:pPr>
-        <w:rPr>
-          <w:rFonts w:ascii="Arial" w:hAnsi="Arial" w:cs="Arial"/>
-          <w:b/>
-          <w:sz w:val="24"/>
-          <w:szCs w:val="24"/>
-        </w:rPr>
-      </w:pPr>
-    </w:p>
-    <w:p>
-      <w:pPr>
-        <w:rPr>
-          <w:rFonts w:ascii="Arial" w:hAnsi="Arial" w:cs="Arial"/>
-          <w:b/>
-          <w:sz w:val="24"/>
-          <w:szCs w:val="24"/>
-        </w:rPr>
-      </w:pPr>
-    </w:p>
-    <w:p>
-      <w:pPr>
-        <w:rPr>
-          <w:rFonts w:ascii="Arial" w:hAnsi="Arial" w:cs="Arial"/>
-          <w:b/>
-          <w:sz w:val="24"/>
-          <w:szCs w:val="24"/>
-        </w:rPr>
-      </w:pPr>
-    </w:p>
-    <w:p>
-      <w:pPr>
-        <w:rPr>
-          <w:rFonts w:ascii="Arial" w:hAnsi="Arial" w:cs="Arial"/>
-          <w:b/>
-          <w:sz w:val="24"/>
-          <w:szCs w:val="24"/>
-        </w:rPr>
-      </w:pPr>
-    </w:p>
-    <w:p>
-      <w:pPr>
-        <w:rPr>
-          <w:rFonts w:ascii="Arial" w:hAnsi="Arial" w:cs="Arial"/>
-          <w:b/>
-          <w:sz w:val="24"/>
-          <w:szCs w:val="24"/>
-        </w:rPr>
-      </w:pPr>
-    </w:p>
-    <w:p>
-      <w:pPr>
+        <w:spacing w:after="0" w:line="360" w:lineRule="auto"/>
+        <w:rPr>
+          <w:rFonts w:ascii="Arial" w:hAnsi="Arial" w:cs="Arial"/>
+          <w:b/>
+          <w:sz w:val="24"/>
+          <w:szCs w:val="24"/>
+        </w:rPr>
+      </w:pPr>
+    </w:p>
+    <w:p>
+      <w:pPr>
+        <w:spacing w:after="0" w:line="360" w:lineRule="auto"/>
+        <w:rPr>
+          <w:rFonts w:ascii="Arial" w:hAnsi="Arial" w:cs="Arial"/>
+          <w:b/>
+          <w:sz w:val="24"/>
+          <w:szCs w:val="24"/>
+        </w:rPr>
+      </w:pPr>
+    </w:p>
+    <w:p>
+      <w:pPr>
+        <w:spacing w:after="0" w:line="360" w:lineRule="auto"/>
+        <w:rPr>
+          <w:rFonts w:ascii="Arial" w:hAnsi="Arial" w:cs="Arial"/>
+          <w:b/>
+          <w:sz w:val="24"/>
+          <w:szCs w:val="24"/>
+        </w:rPr>
+      </w:pPr>
+    </w:p>
+    <w:p>
+      <w:pPr>
+        <w:spacing w:after="0" w:line="360" w:lineRule="auto"/>
+        <w:rPr>
+          <w:rFonts w:ascii="Arial" w:hAnsi="Arial" w:cs="Arial"/>
+          <w:b/>
+          <w:sz w:val="24"/>
+          <w:szCs w:val="24"/>
+        </w:rPr>
+      </w:pPr>
+    </w:p>
+    <w:p>
+      <w:pPr>
+        <w:spacing w:after="0" w:line="360" w:lineRule="auto"/>
+        <w:rPr>
+          <w:rFonts w:ascii="Arial" w:hAnsi="Arial" w:cs="Arial"/>
+          <w:b/>
+          <w:sz w:val="24"/>
+          <w:szCs w:val="24"/>
+        </w:rPr>
+      </w:pPr>
+    </w:p>
+    <w:p>
+      <w:pPr>
+        <w:spacing w:after="0" w:line="360" w:lineRule="auto"/>
+        <w:rPr>
+          <w:rFonts w:ascii="Arial" w:hAnsi="Arial" w:cs="Arial"/>
+          <w:b/>
+          <w:sz w:val="24"/>
+          <w:szCs w:val="24"/>
+        </w:rPr>
+      </w:pPr>
+    </w:p>
+    <w:p>
+      <w:pPr>
+        <w:spacing w:after="0" w:line="360" w:lineRule="auto"/>
+        <w:rPr>
+          <w:rFonts w:ascii="Arial" w:hAnsi="Arial" w:cs="Arial"/>
+          <w:b/>
+          <w:sz w:val="24"/>
+          <w:szCs w:val="24"/>
+        </w:rPr>
+      </w:pPr>
+    </w:p>
+    <w:p>
+      <w:pPr>
+        <w:spacing w:after="0" w:line="360" w:lineRule="auto"/>
+        <w:rPr>
+          <w:rFonts w:ascii="Arial" w:hAnsi="Arial" w:cs="Arial"/>
+          <w:b/>
+          <w:sz w:val="24"/>
+          <w:szCs w:val="24"/>
+        </w:rPr>
+      </w:pPr>
+    </w:p>
+    <w:p>
+      <w:pPr>
+        <w:spacing w:after="0" w:line="360" w:lineRule="auto"/>
         <w:rPr>
           <w:rFonts w:ascii="Arial" w:hAnsi="Arial" w:cs="Arial"/>
           <w:b/>
@@ -6208,6 +6508,7 @@
     </w:p>
     <w:p>
       <w:pPr>
+        <w:spacing w:after="0" w:line="360" w:lineRule="auto"/>
         <w:rPr>
           <w:rFonts w:ascii="Arial" w:hAnsi="Arial" w:cs="Arial"/>
           <w:sz w:val="24"/>
@@ -6238,6 +6539,7 @@
           <w:ilvl w:val="0"/>
           <w:numId w:val="6"/>
         </w:numPr>
+        <w:spacing w:after="0" w:line="360" w:lineRule="auto"/>
         <w:rPr>
           <w:rFonts w:ascii="Arial" w:hAnsi="Arial" w:cs="Arial"/>
           <w:sz w:val="24"/>
@@ -6266,6 +6568,7 @@
     </w:p>
     <w:p>
       <w:pPr>
+        <w:spacing w:after="0" w:line="360" w:lineRule="auto"/>
         <w:rPr>
           <w:rFonts w:ascii="Arial" w:hAnsi="Arial" w:cs="Arial"/>
           <w:sz w:val="24"/>
@@ -6288,6 +6591,7 @@
           <w:ilvl w:val="0"/>
           <w:numId w:val="5"/>
         </w:numPr>
+        <w:spacing w:after="0" w:line="360" w:lineRule="auto"/>
         <w:rPr>
           <w:rFonts w:ascii="Arial" w:hAnsi="Arial" w:cs="Arial"/>
           <w:sz w:val="24"/>
@@ -6321,6 +6625,7 @@
           <w:ilvl w:val="0"/>
           <w:numId w:val="5"/>
         </w:numPr>
+        <w:spacing w:after="0" w:line="360" w:lineRule="auto"/>
         <w:rPr>
           <w:rFonts w:ascii="Arial" w:hAnsi="Arial" w:cs="Arial"/>
           <w:sz w:val="24"/>
@@ -6349,6 +6654,7 @@
     </w:p>
     <w:p>
       <w:pPr>
+        <w:spacing w:after="0" w:line="360" w:lineRule="auto"/>
         <w:rPr>
           <w:rFonts w:ascii="Arial" w:hAnsi="Arial" w:cs="Arial"/>
           <w:sz w:val="24"/>
@@ -6371,6 +6677,7 @@
           <w:ilvl w:val="0"/>
           <w:numId w:val="13"/>
         </w:numPr>
+        <w:spacing w:after="0" w:line="360" w:lineRule="auto"/>
         <w:rPr>
           <w:rFonts w:ascii="Arial" w:hAnsi="Arial" w:cs="Arial"/>
           <w:sz w:val="24"/>
@@ -6404,6 +6711,7 @@
           <w:ilvl w:val="0"/>
           <w:numId w:val="13"/>
         </w:numPr>
+        <w:spacing w:after="0" w:line="360" w:lineRule="auto"/>
         <w:rPr>
           <w:rFonts w:ascii="Arial" w:hAnsi="Arial" w:cs="Arial"/>
           <w:sz w:val="24"/>
@@ -6432,6 +6740,7 @@
     </w:p>
     <w:p>
       <w:pPr>
+        <w:spacing w:after="0" w:line="360" w:lineRule="auto"/>
         <w:rPr>
           <w:rFonts w:ascii="Arial" w:hAnsi="Arial" w:cs="Arial"/>
           <w:sz w:val="24"/>
@@ -6454,6 +6763,7 @@
           <w:ilvl w:val="0"/>
           <w:numId w:val="14"/>
         </w:numPr>
+        <w:spacing w:after="0" w:line="360" w:lineRule="auto"/>
         <w:rPr>
           <w:rFonts w:ascii="Arial" w:hAnsi="Arial" w:cs="Arial"/>
           <w:sz w:val="24"/>
@@ -6482,6 +6792,7 @@
     </w:p>
     <w:p>
       <w:pPr>
+        <w:spacing w:after="0" w:line="360" w:lineRule="auto"/>
         <w:rPr>
           <w:rFonts w:ascii="Arial" w:hAnsi="Arial" w:cs="Arial"/>
           <w:sz w:val="24"/>
@@ -6501,6 +6812,7 @@
     </w:p>
     <w:p>
       <w:pPr>
+        <w:spacing w:after="0" w:line="360" w:lineRule="auto"/>
         <w:rPr>
           <w:rFonts w:ascii="Arial" w:hAnsi="Arial" w:cs="Arial"/>
           <w:sz w:val="24"/>
@@ -6541,6 +6853,7 @@
     </w:p>
     <w:p>
       <w:pPr>
+        <w:spacing w:after="0" w:line="360" w:lineRule="auto"/>
         <w:rPr>
           <w:rFonts w:ascii="Arial" w:hAnsi="Arial" w:cs="Arial"/>
           <w:sz w:val="24"/>
@@ -6551,6 +6864,7 @@
     </w:p>
     <w:p>
       <w:pPr>
+        <w:spacing w:after="0" w:line="360" w:lineRule="auto"/>
         <w:rPr>
           <w:rFonts w:ascii="Arial" w:hAnsi="Arial" w:cs="Arial"/>
           <w:sz w:val="24"/>
@@ -6587,15 +6901,17 @@
     </w:p>
     <w:p>
       <w:pPr>
-        <w:rPr>
-          <w:rFonts w:ascii="Arial" w:hAnsi="Arial" w:cs="Arial"/>
-          <w:sz w:val="24"/>
-          <w:szCs w:val="24"/>
-        </w:rPr>
-      </w:pPr>
-    </w:p>
-    <w:p>
-      <w:pPr>
+        <w:spacing w:after="0" w:line="360" w:lineRule="auto"/>
+        <w:rPr>
+          <w:rFonts w:ascii="Arial" w:hAnsi="Arial" w:cs="Arial"/>
+          <w:sz w:val="24"/>
+          <w:szCs w:val="24"/>
+        </w:rPr>
+      </w:pPr>
+    </w:p>
+    <w:p>
+      <w:pPr>
+        <w:spacing w:after="0" w:line="360" w:lineRule="auto"/>
         <w:rPr>
           <w:rFonts w:ascii="Arial" w:hAnsi="Arial" w:cs="Arial"/>
           <w:sz w:val="24"/>
@@ -6640,15 +6956,17 @@
     </w:p>
     <w:p>
       <w:pPr>
-        <w:rPr>
-          <w:rFonts w:ascii="Arial" w:hAnsi="Arial" w:cs="Arial"/>
-          <w:sz w:val="24"/>
-          <w:szCs w:val="24"/>
-        </w:rPr>
-      </w:pPr>
-    </w:p>
-    <w:p>
-      <w:pPr>
+        <w:spacing w:after="0" w:line="360" w:lineRule="auto"/>
+        <w:rPr>
+          <w:rFonts w:ascii="Arial" w:hAnsi="Arial" w:cs="Arial"/>
+          <w:sz w:val="24"/>
+          <w:szCs w:val="24"/>
+        </w:rPr>
+      </w:pPr>
+    </w:p>
+    <w:p>
+      <w:pPr>
+        <w:spacing w:after="0" w:line="360" w:lineRule="auto"/>
         <w:rPr>
           <w:rFonts w:ascii="Arial" w:hAnsi="Arial" w:cs="Arial"/>
           <w:sz w:val="24"/>
@@ -6666,6 +6984,7 @@
     </w:p>
     <w:p>
       <w:pPr>
+        <w:spacing w:after="0" w:line="360" w:lineRule="auto"/>
         <w:rPr>
           <w:rFonts w:ascii="Arial" w:hAnsi="Arial" w:cs="Arial"/>
           <w:sz w:val="24"/>
@@ -6684,14 +7003,21 @@
         <w:r>
           <w:rPr>
             <w:rStyle w:val="Hyperlink"/>
+            <w:rFonts w:ascii="Arial" w:hAnsi="Arial" w:cs="Arial"/>
+            <w:sz w:val="24"/>
+            <w:szCs w:val="24"/>
           </w:rPr>
           <w:t>https://ric.cps.sp.gov.br/bitstream/123456789/6940/1/1S2021_Gabriel%20Dutra%20Val%C3%A9rio_OD0902.pdf</w:t>
         </w:r>
       </w:hyperlink>
       <w:r>
+        <w:rPr>
+          <w:rFonts w:ascii="Arial" w:hAnsi="Arial" w:cs="Arial"/>
+          <w:sz w:val="24"/>
+          <w:szCs w:val="24"/>
+        </w:rPr>
         <w:t xml:space="preserve"> </w:t>
       </w:r>
-      <w:bookmarkEnd w:id="0"/>
     </w:p>
     <w:sectPr>
       <w:pgSz w:w="11906" w:h="16838" w:code="9"/>
@@ -12050,7 +12376,7 @@
 </file>
 
 <file path=customXml/itemProps1.xml><?xml version="1.0" encoding="utf-8"?>
-<ds:datastoreItem xmlns:ds="http://schemas.openxmlformats.org/officeDocument/2006/customXml" ds:itemID="{C5EEC10D-1BCD-4D56-8985-B51F55D92EE5}">
+<ds:datastoreItem xmlns:ds="http://schemas.openxmlformats.org/officeDocument/2006/customXml" ds:itemID="{AEC09344-5CC3-4AD7-96A1-0FB4D3E17792}">
   <ds:schemaRefs>
     <ds:schemaRef ds:uri="http://schemas.openxmlformats.org/officeDocument/2006/bibliography"/>
   </ds:schemaRefs>

</xml_diff>

<commit_message>
feat: adiciona alteração nos requisitos, tecnologias e metodologias
</commit_message>
<xml_diff>
--- a/Documentacao/Documentacao.docx
+++ b/Documentacao/Documentacao.docx
@@ -2263,7 +2263,16 @@
           <w:szCs w:val="24"/>
           <w:lang w:eastAsia="pt-BR"/>
         </w:rPr>
-        <w:t>Os principais desafios ped</w:t>
+        <w:t xml:space="preserve">Os </w:t>
+      </w:r>
+      <w:r>
+        <w:rPr>
+          <w:rFonts w:ascii="Arial" w:eastAsia="Times New Roman" w:hAnsi="Arial" w:cs="Arial"/>
+          <w:sz w:val="24"/>
+          <w:szCs w:val="24"/>
+          <w:lang w:eastAsia="pt-BR"/>
+        </w:rPr>
+        <w:t>principais desafios ped</w:t>
       </w:r>
       <w:r>
         <w:rPr>
@@ -2281,7 +2290,6 @@
           <w:szCs w:val="24"/>
           <w:lang w:eastAsia="pt-BR"/>
         </w:rPr>
-        <w:tab/>
         <w:t>agógicos identificados compreendem:</w:t>
       </w:r>
     </w:p>
@@ -2410,7 +2418,18 @@
           <w:szCs w:val="24"/>
           <w:lang w:eastAsia="pt-BR"/>
         </w:rPr>
-        <w:t>Essa lacuna na formação e na infraestrutura pedagógica prejudica diretamente a aprendizagem, a compreensão do conteúdo e a participação ativa desses alunos em sala de aula.</w:t>
+        <w:t>Essa lacuna na formação e na infraestrutura pedagógica prejudica diretamente a aprendizagem, a compreensã</w:t>
+      </w:r>
+      <w:bookmarkStart w:id="0" w:name="_GoBack"/>
+      <w:bookmarkEnd w:id="0"/>
+      <w:r>
+        <w:rPr>
+          <w:rFonts w:ascii="Arial" w:eastAsia="Times New Roman" w:hAnsi="Arial" w:cs="Arial"/>
+          <w:sz w:val="24"/>
+          <w:szCs w:val="24"/>
+          <w:lang w:eastAsia="pt-BR"/>
+        </w:rPr>
+        <w:t>o do conteúdo e a participação ativa desses alunos em sala de aula.</w:t>
       </w:r>
     </w:p>
     <w:p>
@@ -2549,7 +2568,17 @@
           <w:szCs w:val="24"/>
           <w:lang w:eastAsia="pt-BR"/>
         </w:rPr>
-        <w:t>Upload de Documentos: O sistema deve permitir o envio de arquivos no formato .pdf.</w:t>
+        <w:t xml:space="preserve">Upload de Documentos: O sistema deve permitir o envio de arquivos no </w:t>
+      </w:r>
+      <w:r>
+        <w:rPr>
+          <w:rFonts w:ascii="Arial" w:eastAsia="Times New Roman" w:hAnsi="Arial" w:cs="Arial"/>
+          <w:bCs/>
+          <w:sz w:val="24"/>
+          <w:szCs w:val="24"/>
+          <w:lang w:eastAsia="pt-BR"/>
+        </w:rPr>
+        <w:t>formato .pdf e txt.</w:t>
       </w:r>
     </w:p>
     <w:p>
@@ -2627,7 +2656,27 @@
           <w:szCs w:val="24"/>
           <w:lang w:eastAsia="pt-BR"/>
         </w:rPr>
-        <w:t>conteúdo e identificar, com o auxílio da IA, as ambiguidades ou possíveis interferências (com base nos parâmetros passados), do arquivo selecionado</w:t>
+        <w:t>conteúdo e identificar, com o auxílio da IA, as ambiguidades ou possíveis interferências (com base nos parâmetros passados</w:t>
+      </w:r>
+      <w:r>
+        <w:rPr>
+          <w:rFonts w:ascii="Arial" w:eastAsia="Times New Roman" w:hAnsi="Arial" w:cs="Arial"/>
+          <w:bCs/>
+          <w:sz w:val="24"/>
+          <w:szCs w:val="24"/>
+          <w:lang w:eastAsia="pt-BR"/>
+        </w:rPr>
+        <w:t xml:space="preserve"> no prompt</w:t>
+      </w:r>
+      <w:r>
+        <w:rPr>
+          <w:rFonts w:ascii="Arial" w:eastAsia="Times New Roman" w:hAnsi="Arial" w:cs="Arial"/>
+          <w:bCs/>
+          <w:sz w:val="24"/>
+          <w:szCs w:val="24"/>
+          <w:lang w:eastAsia="pt-BR"/>
+        </w:rPr>
+        <w:t>), do arquivo selecionado</w:t>
       </w:r>
     </w:p>
     <w:p>
@@ -2802,7 +2851,34 @@
           <w:szCs w:val="24"/>
           <w:lang w:val="en-US" w:eastAsia="pt-BR"/>
         </w:rPr>
-        <w:t>cation, Spring Data JPA, Maven, Lombok, Flyway, REST API, PostgreSQL, Spring AI, OpenAI API, Docker, React, CSS, JavaScript, HTML</w:t>
+        <w:t xml:space="preserve">cation, Spring Data JPA, Maven, Lombok, Flyway, REST API, PostgreSQL, Spring AI, OpenAI API, Docker, React, CSS, </w:t>
+      </w:r>
+      <w:r>
+        <w:rPr>
+          <w:rFonts w:ascii="Arial" w:eastAsia="Times New Roman" w:hAnsi="Arial" w:cs="Arial"/>
+          <w:sz w:val="24"/>
+          <w:szCs w:val="24"/>
+          <w:lang w:val="en-US" w:eastAsia="pt-BR"/>
+        </w:rPr>
+        <w:t>TypeScript</w:t>
+      </w:r>
+      <w:r>
+        <w:rPr>
+          <w:rFonts w:ascii="Arial" w:eastAsia="Times New Roman" w:hAnsi="Arial" w:cs="Arial"/>
+          <w:sz w:val="24"/>
+          <w:szCs w:val="24"/>
+          <w:lang w:val="en-US" w:eastAsia="pt-BR"/>
+        </w:rPr>
+        <w:t>, HTML</w:t>
+      </w:r>
+      <w:r>
+        <w:rPr>
+          <w:rFonts w:ascii="Arial" w:eastAsia="Times New Roman" w:hAnsi="Arial" w:cs="Arial"/>
+          <w:sz w:val="24"/>
+          <w:szCs w:val="24"/>
+          <w:lang w:val="en-US" w:eastAsia="pt-BR"/>
+        </w:rPr>
+        <w:t>, Taillwind, Swagger, JUnit, Apache PDFbox, Bucket4j e Spring Validation.</w:t>
       </w:r>
     </w:p>
     <w:p>
@@ -2848,19 +2924,7 @@
           <w:u w:val="single"/>
           <w:lang w:eastAsia="pt-BR"/>
         </w:rPr>
-        <w:t>princíp</w:t>
-      </w:r>
-      <w:bookmarkStart w:id="0" w:name="_GoBack"/>
-      <w:bookmarkEnd w:id="0"/>
-      <w:r>
-        <w:rPr>
-          <w:rFonts w:ascii="Arial" w:eastAsia="Times New Roman" w:hAnsi="Arial" w:cs="Arial"/>
-          <w:sz w:val="24"/>
-          <w:szCs w:val="24"/>
-          <w:u w:val="single"/>
-          <w:lang w:eastAsia="pt-BR"/>
-        </w:rPr>
-        <w:t>ios</w:t>
+        <w:t>princípios</w:t>
       </w:r>
       <w:r>
         <w:rPr>
@@ -3001,7 +3065,25 @@
           <w:szCs w:val="24"/>
           <w:lang w:eastAsia="pt-BR"/>
         </w:rPr>
-        <w:t xml:space="preserve"> (Análise, Design, Desenvolvimento, Implementação e Avaliação) para o fluxo geral do sistema e a metodologia ágil </w:t>
+        <w:t xml:space="preserve"> (Análise, Design, Desenvolvimento, Implementação e Avaliação) </w:t>
+      </w:r>
+      <w:r>
+        <w:rPr>
+          <w:rFonts w:ascii="Arial" w:eastAsia="Times New Roman" w:hAnsi="Arial" w:cs="Arial"/>
+          <w:sz w:val="24"/>
+          <w:szCs w:val="24"/>
+          <w:lang w:eastAsia="pt-BR"/>
+        </w:rPr>
+        <w:t>para o fluxo geral do sistem</w:t>
+      </w:r>
+      <w:r>
+        <w:rPr>
+          <w:rFonts w:ascii="Arial" w:eastAsia="Times New Roman" w:hAnsi="Arial" w:cs="Arial"/>
+          <w:sz w:val="24"/>
+          <w:szCs w:val="24"/>
+          <w:lang w:eastAsia="pt-BR"/>
+        </w:rPr>
+        <w:t xml:space="preserve">a metodologia ágil </w:t>
       </w:r>
       <w:r>
         <w:rPr>
@@ -3030,7 +3112,7 @@
           <w:szCs w:val="24"/>
           <w:lang w:eastAsia="pt-BR"/>
         </w:rPr>
-        <w:t>.</w:t>
+        <w:t xml:space="preserve"> e CI/CD </w:t>
       </w:r>
     </w:p>
     <w:p>
@@ -3074,16 +3156,52 @@
           <w:szCs w:val="24"/>
           <w:lang w:eastAsia="pt-BR"/>
         </w:rPr>
-        <w:t xml:space="preserve">"O TEA Learn automatiza a adaptação de conteúdos para garantir a inclusão de todos os alunos." </w:t>
-      </w:r>
-      <w:r>
-        <w:rPr>
-          <w:rFonts w:ascii="Arial" w:eastAsia="Times New Roman" w:hAnsi="Arial" w:cs="Arial"/>
-          <w:sz w:val="24"/>
-          <w:szCs w:val="24"/>
-          <w:lang w:eastAsia="pt-BR"/>
-        </w:rPr>
-        <w:t>O professor insere o material didático padrão na plataforma, e a IA reestrutura o conteúdo instantaneamente. O sistema entrega um material reformulado com frases curtas, organização em tópicos, divisão em etapas sequenciais e uma estrutura visual limpa e simplificada. Dessa forma, reduz-se a carga de trabalho do docente e garante-se a autonomia e a inclusão real do estudante com TEA nível 1 no ambiente escolar.</w:t>
+        <w:t>"O TEA Learn automatiza a adaptação de conteúdos para garant</w:t>
+      </w:r>
+      <w:r>
+        <w:rPr>
+          <w:rFonts w:ascii="Arial" w:eastAsia="Times New Roman" w:hAnsi="Arial" w:cs="Arial"/>
+          <w:sz w:val="24"/>
+          <w:szCs w:val="24"/>
+          <w:lang w:eastAsia="pt-BR"/>
+        </w:rPr>
+        <w:t>ir a inclusão de alunos com TEA (Transtorno do Espectro Autista)</w:t>
+      </w:r>
+      <w:r>
+        <w:rPr>
+          <w:rFonts w:ascii="Arial" w:eastAsia="Times New Roman" w:hAnsi="Arial" w:cs="Arial"/>
+          <w:sz w:val="24"/>
+          <w:szCs w:val="24"/>
+          <w:lang w:eastAsia="pt-BR"/>
+        </w:rPr>
+        <w:t xml:space="preserve">." </w:t>
+      </w:r>
+      <w:r>
+        <w:rPr>
+          <w:rFonts w:ascii="Arial" w:eastAsia="Times New Roman" w:hAnsi="Arial" w:cs="Arial"/>
+          <w:sz w:val="24"/>
+          <w:szCs w:val="24"/>
+          <w:lang w:eastAsia="pt-BR"/>
+        </w:rPr>
+        <w:t>O professor insere o material didático padrão na plataforma, e a IA reestrutura o conteúdo instantaneamente</w:t>
+      </w:r>
+      <w:r>
+        <w:rPr>
+          <w:rFonts w:ascii="Arial" w:eastAsia="Times New Roman" w:hAnsi="Arial" w:cs="Arial"/>
+          <w:sz w:val="24"/>
+          <w:szCs w:val="24"/>
+          <w:lang w:eastAsia="pt-BR"/>
+        </w:rPr>
+        <w:t xml:space="preserve"> com base nas regras de adaptação</w:t>
+      </w:r>
+      <w:r>
+        <w:rPr>
+          <w:rFonts w:ascii="Arial" w:eastAsia="Times New Roman" w:hAnsi="Arial" w:cs="Arial"/>
+          <w:sz w:val="24"/>
+          <w:szCs w:val="24"/>
+          <w:lang w:eastAsia="pt-BR"/>
+        </w:rPr>
+        <w:t>. O sistema entrega um material reformulado com frases curtas, organização em tópicos, divisão em etapas sequenciais e uma estrutura visual limpa e simplificada. Dessa forma, reduz-se a carga de trabalho do docente e garante-se a autonomia e a inclusão real do estudante com TEA nível 1 no ambiente escolar.</w:t>
       </w:r>
     </w:p>
     <w:p>
@@ -3126,6 +3244,7 @@
           <w:sz w:val="24"/>
           <w:szCs w:val="24"/>
         </w:rPr>
+        <w:lastRenderedPageBreak/>
         <w:t>DESENVOLVIMENTO</w:t>
       </w:r>
     </w:p>
@@ -3144,7 +3263,6 @@
           <w:sz w:val="24"/>
           <w:szCs w:val="24"/>
         </w:rPr>
-        <w:lastRenderedPageBreak/>
         <w:t>Após uma série de pesquisas, alguns modelos e métodos foram adotados e aprendidos por nós durante o desenvolvimento desse projeto. Além disso, realizamos resumos para estudo e facilitação da implementação no projeto, como:</w:t>
       </w:r>
     </w:p>
@@ -12376,7 +12494,7 @@
 </file>
 
 <file path=customXml/itemProps1.xml><?xml version="1.0" encoding="utf-8"?>
-<ds:datastoreItem xmlns:ds="http://schemas.openxmlformats.org/officeDocument/2006/customXml" ds:itemID="{AEC09344-5CC3-4AD7-96A1-0FB4D3E17792}">
+<ds:datastoreItem xmlns:ds="http://schemas.openxmlformats.org/officeDocument/2006/customXml" ds:itemID="{86B05C38-FDFF-4CB8-963F-9F8BFF635788}">
   <ds:schemaRefs>
     <ds:schemaRef ds:uri="http://schemas.openxmlformats.org/officeDocument/2006/bibliography"/>
   </ds:schemaRefs>

</xml_diff>

<commit_message>
feat: adiciona alteração no texto da metodologia ADDIE
</commit_message>
<xml_diff>
--- a/Documentacao/Documentacao.docx
+++ b/Documentacao/Documentacao.docx
@@ -2418,18 +2418,7 @@
           <w:szCs w:val="24"/>
           <w:lang w:eastAsia="pt-BR"/>
         </w:rPr>
-        <w:t>Essa lacuna na formação e na infraestrutura pedagógica prejudica diretamente a aprendizagem, a compreensã</w:t>
-      </w:r>
-      <w:bookmarkStart w:id="0" w:name="_GoBack"/>
-      <w:bookmarkEnd w:id="0"/>
-      <w:r>
-        <w:rPr>
-          <w:rFonts w:ascii="Arial" w:eastAsia="Times New Roman" w:hAnsi="Arial" w:cs="Arial"/>
-          <w:sz w:val="24"/>
-          <w:szCs w:val="24"/>
-          <w:lang w:eastAsia="pt-BR"/>
-        </w:rPr>
-        <w:t>o do conteúdo e a participação ativa desses alunos em sala de aula.</w:t>
+        <w:t>Essa lacuna na formação e na infraestrutura pedagógica prejudica diretamente a aprendizagem, a compreensão do conteúdo e a participação ativa desses alunos em sala de aula.</w:t>
       </w:r>
     </w:p>
     <w:p>
@@ -2953,7 +2942,18 @@
           <w:szCs w:val="24"/>
           <w:lang w:eastAsia="pt-BR"/>
         </w:rPr>
-        <w:t xml:space="preserve"> (Desenho Universal para a Aprendizagem) para garantir múltiplos meios de engajamento e representação.</w:t>
+        <w:t xml:space="preserve"> (Desenho Universal para a Aprendizagem) para garantir múltiplos meios de engajamento e r</w:t>
+      </w:r>
+      <w:bookmarkStart w:id="0" w:name="_GoBack"/>
+      <w:bookmarkEnd w:id="0"/>
+      <w:r>
+        <w:rPr>
+          <w:rFonts w:ascii="Arial" w:eastAsia="Times New Roman" w:hAnsi="Arial" w:cs="Arial"/>
+          <w:sz w:val="24"/>
+          <w:szCs w:val="24"/>
+          <w:lang w:eastAsia="pt-BR"/>
+        </w:rPr>
+        <w:t>epresentação.</w:t>
       </w:r>
     </w:p>
     <w:p>
@@ -4828,10 +4828,11 @@
           <w:rFonts w:ascii="Arial" w:hAnsi="Arial" w:cs="Arial"/>
           <w:b/>
           <w:bCs/>
-          <w:sz w:val="24"/>
-          <w:szCs w:val="24"/>
-        </w:rPr>
-        <w:t>análise</w:t>
+          <w:i/>
+          <w:sz w:val="24"/>
+          <w:szCs w:val="24"/>
+        </w:rPr>
+        <w:t>analysis</w:t>
       </w:r>
       <w:r>
         <w:rPr>
@@ -4866,6 +4867,7 @@
           <w:rFonts w:ascii="Arial" w:hAnsi="Arial" w:cs="Arial"/>
           <w:b/>
           <w:bCs/>
+          <w:i/>
           <w:sz w:val="24"/>
           <w:szCs w:val="24"/>
         </w:rPr>
@@ -4904,10 +4906,11 @@
           <w:rFonts w:ascii="Arial" w:hAnsi="Arial" w:cs="Arial"/>
           <w:b/>
           <w:bCs/>
-          <w:sz w:val="24"/>
-          <w:szCs w:val="24"/>
-        </w:rPr>
-        <w:t>desenvolvimento</w:t>
+          <w:i/>
+          <w:sz w:val="24"/>
+          <w:szCs w:val="24"/>
+        </w:rPr>
+        <w:t>development</w:t>
       </w:r>
       <w:r>
         <w:rPr>
@@ -4935,17 +4938,26 @@
           <w:sz w:val="24"/>
           <w:szCs w:val="24"/>
         </w:rPr>
-        <w:t xml:space="preserve">Por fim, na etapa de </w:t>
-      </w:r>
-      <w:r>
-        <w:rPr>
-          <w:rFonts w:ascii="Arial" w:hAnsi="Arial" w:cs="Arial"/>
-          <w:b/>
-          <w:bCs/>
-          <w:sz w:val="24"/>
-          <w:szCs w:val="24"/>
-        </w:rPr>
-        <w:t>implementação</w:t>
+        <w:t>Além disso</w:t>
+      </w:r>
+      <w:r>
+        <w:rPr>
+          <w:rFonts w:ascii="Arial" w:hAnsi="Arial" w:cs="Arial"/>
+          <w:sz w:val="24"/>
+          <w:szCs w:val="24"/>
+        </w:rPr>
+        <w:t xml:space="preserve">, na etapa de </w:t>
+      </w:r>
+      <w:r>
+        <w:rPr>
+          <w:rFonts w:ascii="Arial" w:hAnsi="Arial" w:cs="Arial"/>
+          <w:b/>
+          <w:bCs/>
+          <w:i/>
+          <w:sz w:val="24"/>
+          <w:szCs w:val="24"/>
+        </w:rPr>
+        <w:t>implementation</w:t>
       </w:r>
       <w:r>
         <w:rPr>
@@ -4959,6 +4971,54 @@
     <w:p>
       <w:pPr>
         <w:spacing w:after="0" w:line="360" w:lineRule="auto"/>
+        <w:ind w:firstLine="708"/>
+        <w:jc w:val="both"/>
+        <w:rPr>
+          <w:rFonts w:ascii="Arial" w:hAnsi="Arial" w:cs="Arial"/>
+          <w:sz w:val="24"/>
+          <w:szCs w:val="24"/>
+        </w:rPr>
+      </w:pPr>
+      <w:r>
+        <w:rPr>
+          <w:rFonts w:ascii="Arial" w:hAnsi="Arial" w:cs="Arial"/>
+          <w:sz w:val="24"/>
+          <w:szCs w:val="24"/>
+        </w:rPr>
+        <w:t xml:space="preserve">Por fim, na fase </w:t>
+      </w:r>
+      <w:r>
+        <w:rPr>
+          <w:rFonts w:ascii="Arial" w:hAnsi="Arial" w:cs="Arial"/>
+          <w:b/>
+          <w:i/>
+          <w:sz w:val="24"/>
+          <w:szCs w:val="24"/>
+        </w:rPr>
+        <w:t>evaluation</w:t>
+      </w:r>
+      <w:r>
+        <w:rPr>
+          <w:rFonts w:ascii="Arial" w:hAnsi="Arial" w:cs="Arial"/>
+          <w:b/>
+          <w:i/>
+          <w:sz w:val="24"/>
+          <w:szCs w:val="24"/>
+        </w:rPr>
+        <w:t xml:space="preserve">, </w:t>
+      </w:r>
+      <w:r>
+        <w:rPr>
+          <w:rFonts w:ascii="Arial" w:hAnsi="Arial" w:cs="Arial"/>
+          <w:sz w:val="24"/>
+          <w:szCs w:val="24"/>
+        </w:rPr>
+        <w:t>o professor e os alunos poderão avaliar a qualidade do material e se o conteúdo está coerente e sem ausência de alguma informação</w:t>
+      </w:r>
+    </w:p>
+    <w:p>
+      <w:pPr>
+        <w:spacing w:after="0" w:line="360" w:lineRule="auto"/>
         <w:rPr>
           <w:rFonts w:ascii="Arial" w:hAnsi="Arial" w:cs="Arial"/>
           <w:sz w:val="24"/>
@@ -5013,6 +5073,7 @@
           <w:sz w:val="24"/>
           <w:szCs w:val="24"/>
         </w:rPr>
+        <w:lastRenderedPageBreak/>
         <w:tab/>
         <w:t>F</w:t>
       </w:r>
@@ -5535,6 +5596,7 @@
           <w:sz w:val="24"/>
           <w:szCs w:val="24"/>
         </w:rPr>
+        <w:lastRenderedPageBreak/>
         <w:t>Flexibilidade</w:t>
       </w:r>
       <w:r>
@@ -5619,7 +5681,6 @@
           <w:sz w:val="24"/>
           <w:szCs w:val="24"/>
         </w:rPr>
-        <w:lastRenderedPageBreak/>
         <w:t xml:space="preserve">O DUA é uma forma de pensar a educação que </w:t>
       </w:r>
       <w:r>
@@ -5844,6 +5905,7 @@
           <w:szCs w:val="24"/>
           <w:lang w:eastAsia="pt-BR"/>
         </w:rPr>
+        <w:lastRenderedPageBreak/>
         <w:drawing>
           <wp:inline distT="0" distB="0" distL="0" distR="0" wp14:anchorId="78D5F3F5" wp14:editId="7C333587">
             <wp:extent cx="5760085" cy="2868295"/>
@@ -5912,7 +5974,6 @@
           <w:szCs w:val="24"/>
           <w:lang w:eastAsia="pt-BR"/>
         </w:rPr>
-        <w:lastRenderedPageBreak/>
         <w:drawing>
           <wp:inline distT="0" distB="0" distL="0" distR="0" wp14:anchorId="3FB65342" wp14:editId="039A0047">
             <wp:extent cx="4049346" cy="3429735"/>
@@ -6001,6 +6062,7 @@
           <w:szCs w:val="24"/>
           <w:lang w:eastAsia="pt-BR"/>
         </w:rPr>
+        <w:lastRenderedPageBreak/>
         <w:drawing>
           <wp:inline distT="0" distB="0" distL="0" distR="0" wp14:anchorId="67CE5B31" wp14:editId="3DDCE975">
             <wp:extent cx="1152525" cy="4295775"/>
@@ -6217,6 +6279,7 @@
           <w:sz w:val="24"/>
           <w:szCs w:val="24"/>
         </w:rPr>
+        <w:lastRenderedPageBreak/>
         <w:tab/>
       </w:r>
       <w:r>
@@ -6317,7 +6380,6 @@
           <w:szCs w:val="24"/>
           <w:lang w:eastAsia="pt-BR"/>
         </w:rPr>
-        <w:lastRenderedPageBreak/>
         <w:drawing>
           <wp:inline distT="0" distB="0" distL="0" distR="0" wp14:anchorId="3C9ABAEB" wp14:editId="642F5A81">
             <wp:extent cx="5760085" cy="2739390"/>
@@ -6378,6 +6440,7 @@
           <w:szCs w:val="24"/>
           <w:lang w:eastAsia="pt-BR"/>
         </w:rPr>
+        <w:lastRenderedPageBreak/>
         <w:drawing>
           <wp:inline distT="0" distB="0" distL="0" distR="0" wp14:anchorId="4879C6C9" wp14:editId="3AF500E0">
             <wp:extent cx="5760085" cy="2732405"/>
@@ -6639,6 +6702,7 @@
           <w:sz w:val="24"/>
           <w:szCs w:val="24"/>
         </w:rPr>
+        <w:lastRenderedPageBreak/>
         <w:t>TEACCH</w:t>
       </w:r>
       <w:r>
@@ -12494,7 +12558,7 @@
 </file>
 
 <file path=customXml/itemProps1.xml><?xml version="1.0" encoding="utf-8"?>
-<ds:datastoreItem xmlns:ds="http://schemas.openxmlformats.org/officeDocument/2006/customXml" ds:itemID="{86B05C38-FDFF-4CB8-963F-9F8BFF635788}">
+<ds:datastoreItem xmlns:ds="http://schemas.openxmlformats.org/officeDocument/2006/customXml" ds:itemID="{31ECE4C9-3ED6-442A-8C43-AB1C17993AE0}">
   <ds:schemaRefs>
     <ds:schemaRef ds:uri="http://schemas.openxmlformats.org/officeDocument/2006/bibliography"/>
   </ds:schemaRefs>

</xml_diff>

<commit_message>
feat: adiciona alteração nos requisitos
</commit_message>
<xml_diff>
--- a/Documentacao/Documentacao.docx
+++ b/Documentacao/Documentacao.docx
@@ -2706,7 +2706,6 @@
         <w:spacing w:after="0" w:line="360" w:lineRule="auto"/>
         <w:rPr>
           <w:rFonts w:ascii="Arial" w:eastAsia="Times New Roman" w:hAnsi="Arial" w:cs="Arial"/>
-          <w:b/>
           <w:bCs/>
           <w:sz w:val="24"/>
           <w:szCs w:val="24"/>
@@ -2732,8 +2731,53 @@
           <w:szCs w:val="24"/>
           <w:lang w:eastAsia="pt-BR"/>
         </w:rPr>
-        <w:t>O download do arquivo ficará disponibilizado na tela assim que finalizado com um breve resumo do que foi mudado e melhorado</w:t>
-      </w:r>
+        <w:t>O download do arquivo ficará disponibilizado na tela assim que finalizado com um br</w:t>
+      </w:r>
+      <w:r>
+        <w:rPr>
+          <w:rFonts w:ascii="Arial" w:eastAsia="Times New Roman" w:hAnsi="Arial" w:cs="Arial"/>
+          <w:bCs/>
+          <w:sz w:val="24"/>
+          <w:szCs w:val="24"/>
+          <w:lang w:eastAsia="pt-BR"/>
+        </w:rPr>
+        <w:t>eve resumo do que foi mudado e pronto para visualizar na web</w:t>
+      </w:r>
+      <w:bookmarkStart w:id="0" w:name="_GoBack"/>
+      <w:bookmarkEnd w:id="0"/>
+      <w:r>
+        <w:rPr>
+          <w:rFonts w:ascii="Arial" w:eastAsia="Times New Roman" w:hAnsi="Arial" w:cs="Arial"/>
+          <w:bCs/>
+          <w:sz w:val="24"/>
+          <w:szCs w:val="24"/>
+          <w:lang w:eastAsia="pt-BR"/>
+        </w:rPr>
+        <w:tab/>
+      </w:r>
+      <w:r>
+        <w:rPr>
+          <w:rFonts w:ascii="Arial" w:eastAsia="Times New Roman" w:hAnsi="Arial" w:cs="Arial"/>
+          <w:bCs/>
+          <w:sz w:val="24"/>
+          <w:szCs w:val="24"/>
+          <w:lang w:eastAsia="pt-BR"/>
+        </w:rPr>
+        <w:tab/>
+      </w:r>
+    </w:p>
+    <w:p>
+      <w:pPr>
+        <w:spacing w:after="0" w:line="360" w:lineRule="auto"/>
+        <w:rPr>
+          <w:rFonts w:ascii="Arial" w:eastAsia="Times New Roman" w:hAnsi="Arial" w:cs="Arial"/>
+          <w:b/>
+          <w:bCs/>
+          <w:sz w:val="24"/>
+          <w:szCs w:val="24"/>
+          <w:lang w:eastAsia="pt-BR"/>
+        </w:rPr>
+      </w:pPr>
     </w:p>
     <w:p>
       <w:pPr>
@@ -2942,18 +2986,7 @@
           <w:szCs w:val="24"/>
           <w:lang w:eastAsia="pt-BR"/>
         </w:rPr>
-        <w:t xml:space="preserve"> (Desenho Universal para a Aprendizagem) para garantir múltiplos meios de engajamento e r</w:t>
-      </w:r>
-      <w:bookmarkStart w:id="0" w:name="_GoBack"/>
-      <w:bookmarkEnd w:id="0"/>
-      <w:r>
-        <w:rPr>
-          <w:rFonts w:ascii="Arial" w:eastAsia="Times New Roman" w:hAnsi="Arial" w:cs="Arial"/>
-          <w:sz w:val="24"/>
-          <w:szCs w:val="24"/>
-          <w:lang w:eastAsia="pt-BR"/>
-        </w:rPr>
-        <w:t>epresentação.</w:t>
+        <w:t xml:space="preserve"> (Desenho Universal para a Aprendizagem) para garantir múltiplos meios de engajamento e representação.</w:t>
       </w:r>
     </w:p>
     <w:p>
@@ -3244,7 +3277,6 @@
           <w:sz w:val="24"/>
           <w:szCs w:val="24"/>
         </w:rPr>
-        <w:lastRenderedPageBreak/>
         <w:t>DESENVOLVIMENTO</w:t>
       </w:r>
     </w:p>
@@ -3739,7 +3771,6 @@
           <w:sz w:val="24"/>
           <w:szCs w:val="24"/>
         </w:rPr>
-        <w:lastRenderedPageBreak/>
         <w:t>Análise do Comportamento Aplicada, é uma intervenção científica baseada no reforço positivo para desenvolver habilidades sociais, acadêmicas e de autonomia em autistas</w:t>
       </w:r>
     </w:p>
@@ -4292,7 +4323,7 @@
           <w:szCs w:val="24"/>
           <w:lang w:eastAsia="pt-BR"/>
         </w:rPr>
-        <w:t xml:space="preserve"> é uma condição do desenvolvimento que afeta principalmente a forma como a pessoa se comunica, interage socialmente e organiza seu comportamento. Ele é chamado de “espectro” porque pode se </w:t>
+        <w:t xml:space="preserve"> é uma condição do desenvolvimento que afeta principalmente a forma como a pessoa se comunica, interage socialmente </w:t>
       </w:r>
       <w:r>
         <w:rPr>
@@ -4302,7 +4333,7 @@
           <w:lang w:eastAsia="pt-BR"/>
         </w:rPr>
         <w:lastRenderedPageBreak/>
-        <w:t>manifestar de maneiras muito diferentes em cada indivíduo — alguns têm mais autonomia, outros precisam de apoio constante.</w:t>
+        <w:t>e organiza seu comportamento. Ele é chamado de “espectro” porque pode se manifestar de maneiras muito diferentes em cada indivíduo — alguns têm mais autonomia, outros precisam de apoio constante.</w:t>
       </w:r>
     </w:p>
     <w:p>
@@ -4728,6 +4759,7 @@
           <w:szCs w:val="24"/>
           <w:lang w:eastAsia="pt-BR"/>
         </w:rPr>
+        <w:lastRenderedPageBreak/>
         <w:t>Comportamento adaptativo</w:t>
       </w:r>
       <w:r>
@@ -4759,7 +4791,6 @@
           <w:szCs w:val="24"/>
           <w:lang w:eastAsia="pt-BR"/>
         </w:rPr>
-        <w:lastRenderedPageBreak/>
         <w:t>Em resumo, o TEA mostra como cada pessoa se relaciona com o mundo em termos de comunicação e comportamento, enquanto a DI mostra como ela aprende e aplica o que sabe. Juntas, essas informações ajudam médicos e terapeutas a definir o tipo de apoio necessário para que o indivíduo tenha mais qualidade de vida e autonomia.</w:t>
       </w:r>
     </w:p>
@@ -5073,7 +5104,6 @@
           <w:sz w:val="24"/>
           <w:szCs w:val="24"/>
         </w:rPr>
-        <w:lastRenderedPageBreak/>
         <w:tab/>
         <w:t>F</w:t>
       </w:r>
@@ -5563,6 +5593,7 @@
           <w:sz w:val="24"/>
           <w:szCs w:val="24"/>
         </w:rPr>
+        <w:lastRenderedPageBreak/>
         <w:t>Acessibilidade pedagógica</w:t>
       </w:r>
       <w:r>
@@ -5596,7 +5627,6 @@
           <w:sz w:val="24"/>
           <w:szCs w:val="24"/>
         </w:rPr>
-        <w:lastRenderedPageBreak/>
         <w:t>Flexibilidade</w:t>
       </w:r>
       <w:r>
@@ -12558,7 +12588,7 @@
 </file>
 
 <file path=customXml/itemProps1.xml><?xml version="1.0" encoding="utf-8"?>
-<ds:datastoreItem xmlns:ds="http://schemas.openxmlformats.org/officeDocument/2006/customXml" ds:itemID="{31ECE4C9-3ED6-442A-8C43-AB1C17993AE0}">
+<ds:datastoreItem xmlns:ds="http://schemas.openxmlformats.org/officeDocument/2006/customXml" ds:itemID="{9FAA62CA-4374-49E7-83DC-0053ED463025}">
   <ds:schemaRefs>
     <ds:schemaRef ds:uri="http://schemas.openxmlformats.org/officeDocument/2006/bibliography"/>
   </ds:schemaRefs>

</xml_diff>

<commit_message>
feat: adiciona alteração nos requisitos funcionais
</commit_message>
<xml_diff>
--- a/Documentacao/Documentacao.docx
+++ b/Documentacao/Documentacao.docx
@@ -2547,201 +2547,40 @@
           <w:szCs w:val="24"/>
           <w:lang w:eastAsia="pt-BR"/>
         </w:rPr>
-        <w:t xml:space="preserve">RF01 - </w:t>
-      </w:r>
-      <w:r>
-        <w:rPr>
-          <w:rFonts w:ascii="Arial" w:eastAsia="Times New Roman" w:hAnsi="Arial" w:cs="Arial"/>
-          <w:bCs/>
-          <w:sz w:val="24"/>
-          <w:szCs w:val="24"/>
-          <w:lang w:eastAsia="pt-BR"/>
-        </w:rPr>
-        <w:t xml:space="preserve">Upload de Documentos: O sistema deve permitir o envio de arquivos no </w:t>
-      </w:r>
-      <w:r>
-        <w:rPr>
-          <w:rFonts w:ascii="Arial" w:eastAsia="Times New Roman" w:hAnsi="Arial" w:cs="Arial"/>
-          <w:bCs/>
-          <w:sz w:val="24"/>
-          <w:szCs w:val="24"/>
-          <w:lang w:eastAsia="pt-BR"/>
-        </w:rPr>
-        <w:t>formato .pdf e txt.</w:t>
-      </w:r>
-    </w:p>
-    <w:p>
-      <w:pPr>
-        <w:spacing w:after="0" w:line="360" w:lineRule="auto"/>
-        <w:rPr>
-          <w:rFonts w:ascii="Arial" w:eastAsia="Times New Roman" w:hAnsi="Arial" w:cs="Arial"/>
-          <w:bCs/>
-          <w:sz w:val="24"/>
-          <w:szCs w:val="24"/>
-          <w:lang w:eastAsia="pt-BR"/>
-        </w:rPr>
-      </w:pPr>
-      <w:r>
-        <w:rPr>
-          <w:rFonts w:ascii="Arial" w:eastAsia="Times New Roman" w:hAnsi="Arial" w:cs="Arial"/>
-          <w:b/>
-          <w:bCs/>
-          <w:sz w:val="24"/>
-          <w:szCs w:val="24"/>
-          <w:lang w:eastAsia="pt-BR"/>
-        </w:rPr>
-        <w:t xml:space="preserve">RF02 - </w:t>
-      </w:r>
-      <w:r>
-        <w:rPr>
-          <w:rFonts w:ascii="Arial" w:eastAsia="Times New Roman" w:hAnsi="Arial" w:cs="Arial"/>
-          <w:bCs/>
-          <w:sz w:val="24"/>
-          <w:szCs w:val="24"/>
-          <w:lang w:eastAsia="pt-BR"/>
-        </w:rPr>
-        <w:t>Validação de Entrada: O sistema deve verificar o formato antes de iniciar o processamento.</w:t>
-      </w:r>
-    </w:p>
-    <w:p>
-      <w:pPr>
-        <w:spacing w:after="0" w:line="360" w:lineRule="auto"/>
-        <w:rPr>
-          <w:rFonts w:ascii="Arial" w:eastAsia="Times New Roman" w:hAnsi="Arial" w:cs="Arial"/>
-          <w:b/>
-          <w:bCs/>
-          <w:sz w:val="24"/>
-          <w:szCs w:val="24"/>
-          <w:lang w:eastAsia="pt-BR"/>
-        </w:rPr>
-      </w:pPr>
-      <w:r>
-        <w:rPr>
-          <w:rFonts w:ascii="Arial" w:eastAsia="Times New Roman" w:hAnsi="Arial" w:cs="Arial"/>
-          <w:b/>
-          <w:bCs/>
-          <w:sz w:val="24"/>
-          <w:szCs w:val="24"/>
-          <w:lang w:eastAsia="pt-BR"/>
-        </w:rPr>
-        <w:lastRenderedPageBreak/>
-        <w:t xml:space="preserve">RF03 - </w:t>
-      </w:r>
-      <w:r>
-        <w:rPr>
-          <w:rFonts w:ascii="Arial" w:eastAsia="Times New Roman" w:hAnsi="Arial" w:cs="Arial"/>
-          <w:bCs/>
-          <w:sz w:val="24"/>
-          <w:szCs w:val="24"/>
-          <w:lang w:eastAsia="pt-BR"/>
-        </w:rPr>
-        <w:t xml:space="preserve">Extração de Conteúdo: O sistema deve extrair o </w:t>
-      </w:r>
-      <w:r>
-        <w:rPr>
-          <w:rFonts w:ascii="Arial" w:eastAsia="Times New Roman" w:hAnsi="Arial" w:cs="Arial"/>
-          <w:bCs/>
-          <w:sz w:val="24"/>
-          <w:szCs w:val="24"/>
-          <w:lang w:eastAsia="pt-BR"/>
-        </w:rPr>
-        <w:t>conteúdo e identificar, com o auxílio da IA, as ambiguidades ou possíveis interferências (com base nos parâmetros passados</w:t>
-      </w:r>
-      <w:r>
-        <w:rPr>
-          <w:rFonts w:ascii="Arial" w:eastAsia="Times New Roman" w:hAnsi="Arial" w:cs="Arial"/>
-          <w:bCs/>
-          <w:sz w:val="24"/>
-          <w:szCs w:val="24"/>
-          <w:lang w:eastAsia="pt-BR"/>
-        </w:rPr>
-        <w:t xml:space="preserve"> no prompt</w:t>
-      </w:r>
-      <w:r>
-        <w:rPr>
-          <w:rFonts w:ascii="Arial" w:eastAsia="Times New Roman" w:hAnsi="Arial" w:cs="Arial"/>
-          <w:bCs/>
-          <w:sz w:val="24"/>
-          <w:szCs w:val="24"/>
-          <w:lang w:eastAsia="pt-BR"/>
-        </w:rPr>
-        <w:t>), do arquivo selecionado</w:t>
-      </w:r>
-    </w:p>
-    <w:p>
-      <w:pPr>
-        <w:spacing w:after="0" w:line="360" w:lineRule="auto"/>
-        <w:rPr>
-          <w:rFonts w:ascii="Arial" w:eastAsia="Times New Roman" w:hAnsi="Arial" w:cs="Arial"/>
-          <w:bCs/>
-          <w:sz w:val="24"/>
-          <w:szCs w:val="24"/>
-          <w:lang w:eastAsia="pt-BR"/>
-        </w:rPr>
-      </w:pPr>
-      <w:r>
-        <w:rPr>
-          <w:rFonts w:ascii="Arial" w:eastAsia="Times New Roman" w:hAnsi="Arial" w:cs="Arial"/>
-          <w:b/>
-          <w:bCs/>
-          <w:sz w:val="24"/>
-          <w:szCs w:val="24"/>
-          <w:lang w:eastAsia="pt-BR"/>
-        </w:rPr>
-        <w:t xml:space="preserve">RF04 - </w:t>
-      </w:r>
-      <w:r>
-        <w:rPr>
-          <w:rFonts w:ascii="Arial" w:eastAsia="Times New Roman" w:hAnsi="Arial" w:cs="Arial"/>
-          <w:bCs/>
-          <w:sz w:val="24"/>
-          <w:szCs w:val="24"/>
-          <w:lang w:eastAsia="pt-BR"/>
-        </w:rPr>
-        <w:t>O sistema deve ter um botão para acionar a conversão</w:t>
-      </w:r>
-    </w:p>
-    <w:p>
-      <w:pPr>
-        <w:spacing w:after="0" w:line="360" w:lineRule="auto"/>
-        <w:rPr>
-          <w:rFonts w:ascii="Arial" w:eastAsia="Times New Roman" w:hAnsi="Arial" w:cs="Arial"/>
-          <w:bCs/>
-          <w:sz w:val="24"/>
-          <w:szCs w:val="24"/>
-          <w:lang w:eastAsia="pt-BR"/>
-        </w:rPr>
-      </w:pPr>
-      <w:r>
-        <w:rPr>
-          <w:rFonts w:ascii="Arial" w:eastAsia="Times New Roman" w:hAnsi="Arial" w:cs="Arial"/>
-          <w:b/>
-          <w:bCs/>
-          <w:sz w:val="24"/>
-          <w:szCs w:val="24"/>
-          <w:lang w:eastAsia="pt-BR"/>
-        </w:rPr>
-        <w:t xml:space="preserve">RF05 – </w:t>
-      </w:r>
-      <w:r>
-        <w:rPr>
-          <w:rFonts w:ascii="Arial" w:eastAsia="Times New Roman" w:hAnsi="Arial" w:cs="Arial"/>
-          <w:bCs/>
-          <w:sz w:val="24"/>
-          <w:szCs w:val="24"/>
-          <w:lang w:eastAsia="pt-BR"/>
-        </w:rPr>
-        <w:t>O download do arquivo ficará disponibilizado na tela assim que finalizado com um br</w:t>
-      </w:r>
-      <w:r>
-        <w:rPr>
-          <w:rFonts w:ascii="Arial" w:eastAsia="Times New Roman" w:hAnsi="Arial" w:cs="Arial"/>
-          <w:bCs/>
-          <w:sz w:val="24"/>
-          <w:szCs w:val="24"/>
-          <w:lang w:eastAsia="pt-BR"/>
-        </w:rPr>
-        <w:t>eve resumo do que foi mudado e pronto para visualizar na web</w:t>
+        <w:t xml:space="preserve">Requisito Func – 1: </w:t>
+      </w:r>
+      <w:r>
+        <w:rPr>
+          <w:rFonts w:ascii="Arial" w:eastAsia="Times New Roman" w:hAnsi="Arial" w:cs="Arial"/>
+          <w:bCs/>
+          <w:sz w:val="24"/>
+          <w:szCs w:val="24"/>
+          <w:lang w:eastAsia="pt-BR"/>
+        </w:rPr>
+        <w:t>Upload</w:t>
+      </w:r>
+    </w:p>
+    <w:p>
+      <w:pPr>
+        <w:spacing w:after="0" w:line="360" w:lineRule="auto"/>
+        <w:rPr>
+          <w:rFonts w:ascii="Arial" w:eastAsia="Times New Roman" w:hAnsi="Arial" w:cs="Arial"/>
+          <w:bCs/>
+          <w:sz w:val="24"/>
+          <w:szCs w:val="24"/>
+          <w:lang w:eastAsia="pt-BR"/>
+        </w:rPr>
+      </w:pPr>
+      <w:r>
+        <w:rPr>
+          <w:rFonts w:ascii="Arial" w:eastAsia="Times New Roman" w:hAnsi="Arial" w:cs="Arial"/>
+          <w:b/>
+          <w:bCs/>
+          <w:sz w:val="24"/>
+          <w:szCs w:val="24"/>
+          <w:lang w:eastAsia="pt-BR"/>
+        </w:rPr>
+        <w:t xml:space="preserve">Requisito Func – 2: </w:t>
       </w:r>
       <w:bookmarkStart w:id="0" w:name="_GoBack"/>
       <w:bookmarkEnd w:id="0"/>
@@ -2820,6 +2659,7 @@
           <w:szCs w:val="24"/>
           <w:lang w:eastAsia="pt-BR"/>
         </w:rPr>
+        <w:lastRenderedPageBreak/>
         <w:t>A metodologia deste projeto é de natureza aplicada e qualitativa, estruturada sob os seguintes pilares:</w:t>
       </w:r>
     </w:p>
@@ -3350,6 +3190,7 @@
           <w:szCs w:val="24"/>
           <w:shd w:val="clear" w:color="auto" w:fill="FFFFFF"/>
         </w:rPr>
+        <w:lastRenderedPageBreak/>
         <w:t>Tratamento e Educação para Autistas e Crianças com Déficits Relacionados à Comunicação, é uma abordagem psicoeducacional focada na estruturação física e visual do ambiente para maximizar a autonomia de pessoas com autismo.</w:t>
       </w:r>
     </w:p>
@@ -3857,6 +3698,7 @@
           <w:szCs w:val="24"/>
           <w:lang w:eastAsia="pt-BR"/>
         </w:rPr>
+        <w:lastRenderedPageBreak/>
         <w:t>Reforço Positivo:</w:t>
       </w:r>
       <w:r>
@@ -4323,17 +4165,7 @@
           <w:szCs w:val="24"/>
           <w:lang w:eastAsia="pt-BR"/>
         </w:rPr>
-        <w:t xml:space="preserve"> é uma condição do desenvolvimento que afeta principalmente a forma como a pessoa se comunica, interage socialmente </w:t>
-      </w:r>
-      <w:r>
-        <w:rPr>
-          <w:rFonts w:ascii="Arial" w:eastAsia="Times New Roman" w:hAnsi="Arial" w:cs="Arial"/>
-          <w:sz w:val="24"/>
-          <w:szCs w:val="24"/>
-          <w:lang w:eastAsia="pt-BR"/>
-        </w:rPr>
-        <w:lastRenderedPageBreak/>
-        <w:t>e organiza seu comportamento. Ele é chamado de “espectro” porque pode se manifestar de maneiras muito diferentes em cada indivíduo — alguns têm mais autonomia, outros precisam de apoio constante.</w:t>
+        <w:t xml:space="preserve"> é uma condição do desenvolvimento que afeta principalmente a forma como a pessoa se comunica, interage socialmente e organiza seu comportamento. Ele é chamado de “espectro” porque pode se manifestar de maneiras muito diferentes em cada indivíduo — alguns têm mais autonomia, outros precisam de apoio constante.</w:t>
       </w:r>
     </w:p>
     <w:p>
@@ -4422,6 +4254,7 @@
           <w:szCs w:val="24"/>
           <w:lang w:eastAsia="pt-BR"/>
         </w:rPr>
+        <w:lastRenderedPageBreak/>
         <w:t>Nível 2</w:t>
       </w:r>
       <w:r>
@@ -4759,7 +4592,6 @@
           <w:szCs w:val="24"/>
           <w:lang w:eastAsia="pt-BR"/>
         </w:rPr>
-        <w:lastRenderedPageBreak/>
         <w:t>Comportamento adaptativo</w:t>
       </w:r>
       <w:r>
@@ -4823,6 +4655,7 @@
           <w:sz w:val="24"/>
           <w:szCs w:val="24"/>
         </w:rPr>
+        <w:lastRenderedPageBreak/>
         <w:t>ADDIE</w:t>
       </w:r>
       <w:r>
@@ -5165,6 +4998,7 @@
           <w:sz w:val="24"/>
           <w:szCs w:val="24"/>
         </w:rPr>
+        <w:lastRenderedPageBreak/>
         <w:t>O Desenho Universal da Aprendizagem (DUA) é uma proposta que ajuda a tornar a escola mais acessível e inclusiva, especialmente para estudantes com Transtorno do Espectro Autista (TEA). Ele busca reduzir barreiras na aprendizagem oferecendo diferentes formas de ensinar, aprender e se expressar.</w:t>
       </w:r>
     </w:p>
@@ -5593,7 +5427,6 @@
           <w:sz w:val="24"/>
           <w:szCs w:val="24"/>
         </w:rPr>
-        <w:lastRenderedPageBreak/>
         <w:t>Acessibilidade pedagógica</w:t>
       </w:r>
       <w:r>
@@ -5739,7 +5572,18 @@
           <w:sz w:val="24"/>
           <w:szCs w:val="24"/>
         </w:rPr>
-        <w:t>uma escola mais justa, acessível e inclusiva</w:t>
+        <w:t xml:space="preserve">uma </w:t>
+      </w:r>
+      <w:r>
+        <w:rPr>
+          <w:rFonts w:ascii="Arial" w:hAnsi="Arial" w:cs="Arial"/>
+          <w:b/>
+          <w:bCs/>
+          <w:sz w:val="24"/>
+          <w:szCs w:val="24"/>
+        </w:rPr>
+        <w:lastRenderedPageBreak/>
+        <w:t>escola mais justa, acessível e inclusiva</w:t>
       </w:r>
       <w:r>
         <w:rPr>
@@ -5935,7 +5779,6 @@
           <w:szCs w:val="24"/>
           <w:lang w:eastAsia="pt-BR"/>
         </w:rPr>
-        <w:lastRenderedPageBreak/>
         <w:drawing>
           <wp:inline distT="0" distB="0" distL="0" distR="0" wp14:anchorId="78D5F3F5" wp14:editId="7C333587">
             <wp:extent cx="5760085" cy="2868295"/>
@@ -6004,6 +5847,7 @@
           <w:szCs w:val="24"/>
           <w:lang w:eastAsia="pt-BR"/>
         </w:rPr>
+        <w:lastRenderedPageBreak/>
         <w:drawing>
           <wp:inline distT="0" distB="0" distL="0" distR="0" wp14:anchorId="3FB65342" wp14:editId="039A0047">
             <wp:extent cx="4049346" cy="3429735"/>
@@ -6092,7 +5936,6 @@
           <w:szCs w:val="24"/>
           <w:lang w:eastAsia="pt-BR"/>
         </w:rPr>
-        <w:lastRenderedPageBreak/>
         <w:drawing>
           <wp:inline distT="0" distB="0" distL="0" distR="0" wp14:anchorId="67CE5B31" wp14:editId="3DDCE975">
             <wp:extent cx="1152525" cy="4295775"/>
@@ -6309,7 +6152,6 @@
           <w:sz w:val="24"/>
           <w:szCs w:val="24"/>
         </w:rPr>
-        <w:lastRenderedPageBreak/>
         <w:tab/>
       </w:r>
       <w:r>
@@ -6410,6 +6252,7 @@
           <w:szCs w:val="24"/>
           <w:lang w:eastAsia="pt-BR"/>
         </w:rPr>
+        <w:lastRenderedPageBreak/>
         <w:drawing>
           <wp:inline distT="0" distB="0" distL="0" distR="0" wp14:anchorId="3C9ABAEB" wp14:editId="642F5A81">
             <wp:extent cx="5760085" cy="2739390"/>
@@ -6470,7 +6313,6 @@
           <w:szCs w:val="24"/>
           <w:lang w:eastAsia="pt-BR"/>
         </w:rPr>
-        <w:lastRenderedPageBreak/>
         <w:drawing>
           <wp:inline distT="0" distB="0" distL="0" distR="0" wp14:anchorId="4879C6C9" wp14:editId="3AF500E0">
             <wp:extent cx="5760085" cy="2732405"/>
@@ -6732,7 +6574,6 @@
           <w:sz w:val="24"/>
           <w:szCs w:val="24"/>
         </w:rPr>
-        <w:lastRenderedPageBreak/>
         <w:t>TEACCH</w:t>
       </w:r>
       <w:r>
@@ -12588,7 +12429,7 @@
 </file>
 
 <file path=customXml/itemProps1.xml><?xml version="1.0" encoding="utf-8"?>
-<ds:datastoreItem xmlns:ds="http://schemas.openxmlformats.org/officeDocument/2006/customXml" ds:itemID="{9FAA62CA-4374-49E7-83DC-0053ED463025}">
+<ds:datastoreItem xmlns:ds="http://schemas.openxmlformats.org/officeDocument/2006/customXml" ds:itemID="{31B1AD20-1BF0-46D0-AA57-F8141CF28867}">
   <ds:schemaRefs>
     <ds:schemaRef ds:uri="http://schemas.openxmlformats.org/officeDocument/2006/bibliography"/>
   </ds:schemaRefs>

</xml_diff>

<commit_message>
feat: adiciona arquivo UML, Fluxograma e Caso de Uso à documentação
</commit_message>
<xml_diff>
--- a/Documentacao/Documentacao.docx
+++ b/Documentacao/Documentacao.docx
@@ -2582,8 +2582,49 @@
         </w:rPr>
         <w:t xml:space="preserve">Requisito Func – 2: </w:t>
       </w:r>
-      <w:bookmarkStart w:id="0" w:name="_GoBack"/>
-      <w:bookmarkEnd w:id="0"/>
+      <w:r>
+        <w:rPr>
+          <w:rFonts w:ascii="Arial" w:eastAsia="Times New Roman" w:hAnsi="Arial" w:cs="Arial"/>
+          <w:bCs/>
+          <w:sz w:val="24"/>
+          <w:szCs w:val="24"/>
+          <w:lang w:eastAsia="pt-BR"/>
+        </w:rPr>
+        <w:t>Conversão</w:t>
+      </w:r>
+    </w:p>
+    <w:p>
+      <w:pPr>
+        <w:spacing w:after="0" w:line="360" w:lineRule="auto"/>
+        <w:rPr>
+          <w:rFonts w:ascii="Arial" w:eastAsia="Times New Roman" w:hAnsi="Arial" w:cs="Arial"/>
+          <w:bCs/>
+          <w:sz w:val="24"/>
+          <w:szCs w:val="24"/>
+          <w:lang w:eastAsia="pt-BR"/>
+        </w:rPr>
+      </w:pPr>
+      <w:r>
+        <w:rPr>
+          <w:rFonts w:ascii="Arial" w:eastAsia="Times New Roman" w:hAnsi="Arial" w:cs="Arial"/>
+          <w:b/>
+          <w:bCs/>
+          <w:sz w:val="24"/>
+          <w:szCs w:val="24"/>
+          <w:lang w:eastAsia="pt-BR"/>
+        </w:rPr>
+        <w:t xml:space="preserve">Requisito Func – 3: </w:t>
+      </w:r>
+      <w:r>
+        <w:rPr>
+          <w:rFonts w:ascii="Arial" w:eastAsia="Times New Roman" w:hAnsi="Arial" w:cs="Arial"/>
+          <w:bCs/>
+          <w:sz w:val="24"/>
+          <w:szCs w:val="24"/>
+          <w:lang w:eastAsia="pt-BR"/>
+        </w:rPr>
+        <w:t>Download</w:t>
+      </w:r>
       <w:r>
         <w:rPr>
           <w:rFonts w:ascii="Arial" w:eastAsia="Times New Roman" w:hAnsi="Arial" w:cs="Arial"/>
@@ -2639,6 +2680,7 @@
           <w:szCs w:val="24"/>
           <w:lang w:eastAsia="pt-BR"/>
         </w:rPr>
+        <w:lastRenderedPageBreak/>
         <w:t>4. METODOLOGIA</w:t>
       </w:r>
     </w:p>
@@ -2659,7 +2701,6 @@
           <w:szCs w:val="24"/>
           <w:lang w:eastAsia="pt-BR"/>
         </w:rPr>
-        <w:lastRenderedPageBreak/>
         <w:t>A metodologia deste projeto é de natureza aplicada e qualitativa, estruturada sob os seguintes pilares:</w:t>
       </w:r>
     </w:p>
@@ -5743,6 +5784,8 @@
           <w:szCs w:val="24"/>
         </w:rPr>
       </w:pPr>
+      <w:bookmarkStart w:id="0" w:name="_GoBack"/>
+      <w:bookmarkEnd w:id="0"/>
     </w:p>
     <w:p>
       <w:pPr>
@@ -5780,10 +5823,10 @@
           <w:lang w:eastAsia="pt-BR"/>
         </w:rPr>
         <w:drawing>
-          <wp:inline distT="0" distB="0" distL="0" distR="0" wp14:anchorId="78D5F3F5" wp14:editId="7C333587">
-            <wp:extent cx="5760085" cy="2868295"/>
-            <wp:effectExtent l="0" t="0" r="0" b="8255"/>
-            <wp:docPr id="2" name="Imagem 2"/>
+          <wp:inline distT="0" distB="0" distL="0" distR="0" wp14:anchorId="3829F526" wp14:editId="65B4DE1A">
+            <wp:extent cx="5760085" cy="1601470"/>
+            <wp:effectExtent l="0" t="0" r="0" b="0"/>
+            <wp:docPr id="12" name="Imagem 12"/>
             <wp:cNvGraphicFramePr>
               <a:graphicFrameLocks xmlns:a="http://schemas.openxmlformats.org/drawingml/2006/main" noChangeAspect="1"/>
             </wp:cNvGraphicFramePr>
@@ -5791,11 +5834,11 @@
               <a:graphicData uri="http://schemas.openxmlformats.org/drawingml/2006/picture">
                 <pic:pic xmlns:pic="http://schemas.openxmlformats.org/drawingml/2006/picture">
                   <pic:nvPicPr>
-                    <pic:cNvPr id="2" name="UML-TCC.jpg"/>
+                    <pic:cNvPr id="12" name="UML-TCC.jpg"/>
                     <pic:cNvPicPr/>
                   </pic:nvPicPr>
                   <pic:blipFill>
-                    <a:blip r:embed="rId9">
+                    <a:blip r:embed="rId9" cstate="print">
                       <a:extLst>
                         <a:ext uri="{28A0092B-C50C-407E-A947-70E740481C1C}">
                           <a14:useLocalDpi xmlns:a14="http://schemas.microsoft.com/office/drawing/2010/main" val="0"/>
@@ -5809,7 +5852,7 @@
                   <pic:spPr>
                     <a:xfrm>
                       <a:off x="0" y="0"/>
-                      <a:ext cx="5760085" cy="2868295"/>
+                      <a:ext cx="5760085" cy="1601470"/>
                     </a:xfrm>
                     <a:prstGeom prst="rect">
                       <a:avLst/>
@@ -5821,6 +5864,16 @@
           </wp:inline>
         </w:drawing>
       </w:r>
+    </w:p>
+    <w:p>
+      <w:pPr>
+        <w:spacing w:after="0" w:line="360" w:lineRule="auto"/>
+        <w:rPr>
+          <w:rFonts w:ascii="Arial" w:hAnsi="Arial" w:cs="Arial"/>
+          <w:sz w:val="24"/>
+          <w:szCs w:val="24"/>
+        </w:rPr>
+      </w:pPr>
       <w:r>
         <w:rPr>
           <w:rFonts w:ascii="Arial" w:hAnsi="Arial" w:cs="Arial"/>
@@ -6008,152 +6061,25 @@
           <w:szCs w:val="24"/>
         </w:rPr>
       </w:pPr>
-    </w:p>
-    <w:p>
-      <w:pPr>
-        <w:spacing w:after="0" w:line="360" w:lineRule="auto"/>
-        <w:rPr>
-          <w:rFonts w:ascii="Arial" w:hAnsi="Arial" w:cs="Arial"/>
-          <w:sz w:val="24"/>
-          <w:szCs w:val="24"/>
-        </w:rPr>
-      </w:pPr>
-    </w:p>
-    <w:p>
-      <w:pPr>
-        <w:spacing w:after="0" w:line="360" w:lineRule="auto"/>
-        <w:rPr>
-          <w:rFonts w:ascii="Arial" w:hAnsi="Arial" w:cs="Arial"/>
-          <w:sz w:val="24"/>
-          <w:szCs w:val="24"/>
-        </w:rPr>
-      </w:pPr>
-    </w:p>
-    <w:p>
-      <w:pPr>
-        <w:spacing w:after="0" w:line="360" w:lineRule="auto"/>
-        <w:rPr>
-          <w:rFonts w:ascii="Arial" w:hAnsi="Arial" w:cs="Arial"/>
-          <w:sz w:val="24"/>
-          <w:szCs w:val="24"/>
-        </w:rPr>
-      </w:pPr>
-    </w:p>
-    <w:p>
-      <w:pPr>
-        <w:spacing w:after="0" w:line="360" w:lineRule="auto"/>
-        <w:rPr>
-          <w:rFonts w:ascii="Arial" w:hAnsi="Arial" w:cs="Arial"/>
-          <w:sz w:val="24"/>
-          <w:szCs w:val="24"/>
-        </w:rPr>
-      </w:pPr>
-    </w:p>
-    <w:p>
-      <w:pPr>
-        <w:spacing w:after="0" w:line="360" w:lineRule="auto"/>
-        <w:rPr>
-          <w:rFonts w:ascii="Arial" w:hAnsi="Arial" w:cs="Arial"/>
-          <w:sz w:val="24"/>
-          <w:szCs w:val="24"/>
-        </w:rPr>
-      </w:pPr>
-    </w:p>
-    <w:p>
-      <w:pPr>
-        <w:spacing w:after="0" w:line="360" w:lineRule="auto"/>
-        <w:rPr>
-          <w:rFonts w:ascii="Arial" w:hAnsi="Arial" w:cs="Arial"/>
-          <w:sz w:val="24"/>
-          <w:szCs w:val="24"/>
-        </w:rPr>
-      </w:pPr>
-    </w:p>
-    <w:p>
-      <w:pPr>
-        <w:spacing w:after="0" w:line="360" w:lineRule="auto"/>
-        <w:rPr>
-          <w:rFonts w:ascii="Arial" w:hAnsi="Arial" w:cs="Arial"/>
-          <w:sz w:val="24"/>
-          <w:szCs w:val="24"/>
-        </w:rPr>
-      </w:pPr>
-    </w:p>
-    <w:p>
-      <w:pPr>
-        <w:spacing w:after="0" w:line="360" w:lineRule="auto"/>
-        <w:rPr>
-          <w:rFonts w:ascii="Arial" w:hAnsi="Arial" w:cs="Arial"/>
-          <w:sz w:val="24"/>
-          <w:szCs w:val="24"/>
-        </w:rPr>
-      </w:pPr>
-    </w:p>
-    <w:p>
-      <w:pPr>
-        <w:spacing w:after="0" w:line="360" w:lineRule="auto"/>
-        <w:rPr>
-          <w:rFonts w:ascii="Arial" w:hAnsi="Arial" w:cs="Arial"/>
-          <w:sz w:val="24"/>
-          <w:szCs w:val="24"/>
-        </w:rPr>
-      </w:pPr>
-    </w:p>
-    <w:p>
-      <w:pPr>
-        <w:spacing w:after="0" w:line="360" w:lineRule="auto"/>
-        <w:rPr>
-          <w:rFonts w:ascii="Arial" w:hAnsi="Arial" w:cs="Arial"/>
-          <w:sz w:val="24"/>
-          <w:szCs w:val="24"/>
-        </w:rPr>
-      </w:pPr>
-    </w:p>
-    <w:p>
-      <w:pPr>
-        <w:spacing w:after="0" w:line="360" w:lineRule="auto"/>
-        <w:rPr>
-          <w:rFonts w:ascii="Arial" w:hAnsi="Arial" w:cs="Arial"/>
-          <w:sz w:val="24"/>
-          <w:szCs w:val="24"/>
-        </w:rPr>
-      </w:pPr>
-    </w:p>
-    <w:p>
-      <w:pPr>
-        <w:spacing w:after="0" w:line="360" w:lineRule="auto"/>
-        <w:rPr>
-          <w:rFonts w:ascii="Arial" w:hAnsi="Arial" w:cs="Arial"/>
-          <w:sz w:val="24"/>
-          <w:szCs w:val="24"/>
-        </w:rPr>
-      </w:pPr>
-      <w:r>
-        <w:rPr>
-          <w:rFonts w:ascii="Arial" w:hAnsi="Arial" w:cs="Arial"/>
-          <w:sz w:val="24"/>
-          <w:szCs w:val="24"/>
-        </w:rPr>
-        <w:t>ESTRUTURA DO PROTÓTIPO EM TELAS E EXPLICADO</w:t>
-      </w:r>
-    </w:p>
-    <w:p>
-      <w:pPr>
-        <w:spacing w:after="0" w:line="360" w:lineRule="auto"/>
-        <w:rPr>
-          <w:rFonts w:ascii="Arial" w:hAnsi="Arial" w:cs="Arial"/>
-          <w:sz w:val="24"/>
-          <w:szCs w:val="24"/>
-        </w:rPr>
-      </w:pPr>
-      <w:r>
-        <w:rPr>
-          <w:rFonts w:ascii="Arial" w:hAnsi="Arial" w:cs="Arial"/>
-          <w:sz w:val="24"/>
-          <w:szCs w:val="24"/>
-        </w:rPr>
-        <w:tab/>
-      </w:r>
+      <w:r>
+        <w:rPr>
+          <w:rFonts w:ascii="Arial" w:hAnsi="Arial" w:cs="Arial"/>
+          <w:sz w:val="24"/>
+          <w:szCs w:val="24"/>
+        </w:rPr>
+        <w:lastRenderedPageBreak/>
+        <w:t>CASO DE USO</w:t>
+      </w:r>
+    </w:p>
+    <w:p>
+      <w:pPr>
+        <w:spacing w:after="0" w:line="360" w:lineRule="auto"/>
+        <w:rPr>
+          <w:rFonts w:ascii="Arial" w:hAnsi="Arial" w:cs="Arial"/>
+          <w:sz w:val="24"/>
+          <w:szCs w:val="24"/>
+        </w:rPr>
+      </w:pPr>
       <w:r>
         <w:rPr>
           <w:rFonts w:ascii="Arial" w:hAnsi="Arial" w:cs="Arial"/>
@@ -6163,10 +6089,10 @@
           <w:lang w:eastAsia="pt-BR"/>
         </w:rPr>
         <w:drawing>
-          <wp:inline distT="0" distB="0" distL="0" distR="0" wp14:anchorId="00836F1A" wp14:editId="07AFEB7F">
-            <wp:extent cx="5760085" cy="2721610"/>
-            <wp:effectExtent l="0" t="0" r="0" b="2540"/>
-            <wp:docPr id="3" name="Imagem 3"/>
+          <wp:inline distT="0" distB="0" distL="0" distR="0" wp14:anchorId="1E879A4A" wp14:editId="17C21682">
+            <wp:extent cx="5760085" cy="4335780"/>
+            <wp:effectExtent l="0" t="0" r="0" b="7620"/>
+            <wp:docPr id="8" name="Imagem 8"/>
             <wp:cNvGraphicFramePr>
               <a:graphicFrameLocks xmlns:a="http://schemas.openxmlformats.org/drawingml/2006/main" noChangeAspect="1"/>
             </wp:cNvGraphicFramePr>
@@ -6174,7 +6100,7 @@
               <a:graphicData uri="http://schemas.openxmlformats.org/drawingml/2006/picture">
                 <pic:pic xmlns:pic="http://schemas.openxmlformats.org/drawingml/2006/picture">
                   <pic:nvPicPr>
-                    <pic:cNvPr id="3" name="img-3.jpeg"/>
+                    <pic:cNvPr id="8" name="Untitled Diagram.jpg"/>
                     <pic:cNvPicPr/>
                   </pic:nvPicPr>
                   <pic:blipFill>
@@ -6192,7 +6118,7 @@
                   <pic:spPr>
                     <a:xfrm>
                       <a:off x="0" y="0"/>
-                      <a:ext cx="5760085" cy="2721610"/>
+                      <a:ext cx="5760085" cy="4335780"/>
                     </a:xfrm>
                     <a:prstGeom prst="rect">
                       <a:avLst/>
@@ -6224,16 +6150,14 @@
           <w:szCs w:val="24"/>
         </w:rPr>
       </w:pPr>
-    </w:p>
-    <w:p>
-      <w:pPr>
-        <w:spacing w:after="0" w:line="360" w:lineRule="auto"/>
-        <w:rPr>
-          <w:rFonts w:ascii="Arial" w:hAnsi="Arial" w:cs="Arial"/>
-          <w:sz w:val="24"/>
-          <w:szCs w:val="24"/>
-        </w:rPr>
-      </w:pPr>
+      <w:r>
+        <w:rPr>
+          <w:rFonts w:ascii="Arial" w:hAnsi="Arial" w:cs="Arial"/>
+          <w:sz w:val="24"/>
+          <w:szCs w:val="24"/>
+        </w:rPr>
+        <w:t>Fluxograma</w:t>
+      </w:r>
     </w:p>
     <w:p>
       <w:pPr>
@@ -6252,12 +6176,11 @@
           <w:szCs w:val="24"/>
           <w:lang w:eastAsia="pt-BR"/>
         </w:rPr>
-        <w:lastRenderedPageBreak/>
         <w:drawing>
-          <wp:inline distT="0" distB="0" distL="0" distR="0" wp14:anchorId="3C9ABAEB" wp14:editId="642F5A81">
-            <wp:extent cx="5760085" cy="2739390"/>
+          <wp:inline distT="0" distB="0" distL="0" distR="0" wp14:anchorId="5E535A85" wp14:editId="1CF6D136">
+            <wp:extent cx="4857750" cy="3520542"/>
             <wp:effectExtent l="0" t="0" r="0" b="3810"/>
-            <wp:docPr id="4" name="Imagem 4"/>
+            <wp:docPr id="9" name="Imagem 9"/>
             <wp:cNvGraphicFramePr>
               <a:graphicFrameLocks xmlns:a="http://schemas.openxmlformats.org/drawingml/2006/main" noChangeAspect="1"/>
             </wp:cNvGraphicFramePr>
@@ -6265,7 +6188,7 @@
               <a:graphicData uri="http://schemas.openxmlformats.org/drawingml/2006/picture">
                 <pic:pic xmlns:pic="http://schemas.openxmlformats.org/drawingml/2006/picture">
                   <pic:nvPicPr>
-                    <pic:cNvPr id="4" name="img-4.jpeg"/>
+                    <pic:cNvPr id="9" name="Fluxograma.jpg"/>
                     <pic:cNvPicPr/>
                   </pic:nvPicPr>
                   <pic:blipFill>
@@ -6283,7 +6206,7 @@
                   <pic:spPr>
                     <a:xfrm>
                       <a:off x="0" y="0"/>
-                      <a:ext cx="5760085" cy="2739390"/>
+                      <a:ext cx="4891659" cy="3545117"/>
                     </a:xfrm>
                     <a:prstGeom prst="rect">
                       <a:avLst/>
@@ -6305,65 +6228,215 @@
           <w:szCs w:val="24"/>
         </w:rPr>
       </w:pPr>
-      <w:r>
-        <w:rPr>
-          <w:rFonts w:ascii="Arial" w:hAnsi="Arial" w:cs="Arial"/>
+    </w:p>
+    <w:p>
+      <w:pPr>
+        <w:spacing w:after="0" w:line="360" w:lineRule="auto"/>
+        <w:rPr>
+          <w:rFonts w:ascii="Arial" w:hAnsi="Arial" w:cs="Arial"/>
+          <w:sz w:val="24"/>
+          <w:szCs w:val="24"/>
+        </w:rPr>
+      </w:pPr>
+    </w:p>
+    <w:p>
+      <w:pPr>
+        <w:spacing w:after="0" w:line="360" w:lineRule="auto"/>
+        <w:rPr>
+          <w:rFonts w:ascii="Arial" w:hAnsi="Arial" w:cs="Arial"/>
+          <w:sz w:val="24"/>
+          <w:szCs w:val="24"/>
+        </w:rPr>
+      </w:pPr>
+    </w:p>
+    <w:p>
+      <w:pPr>
+        <w:spacing w:after="0" w:line="360" w:lineRule="auto"/>
+        <w:rPr>
+          <w:rFonts w:ascii="Arial" w:hAnsi="Arial" w:cs="Arial"/>
+          <w:sz w:val="24"/>
+          <w:szCs w:val="24"/>
+        </w:rPr>
+      </w:pPr>
+    </w:p>
+    <w:p>
+      <w:pPr>
+        <w:spacing w:after="0" w:line="360" w:lineRule="auto"/>
+        <w:rPr>
+          <w:rFonts w:ascii="Arial" w:hAnsi="Arial" w:cs="Arial"/>
+          <w:sz w:val="24"/>
+          <w:szCs w:val="24"/>
+        </w:rPr>
+      </w:pPr>
+    </w:p>
+    <w:p>
+      <w:pPr>
+        <w:spacing w:after="0" w:line="360" w:lineRule="auto"/>
+        <w:rPr>
+          <w:rFonts w:ascii="Arial" w:hAnsi="Arial" w:cs="Arial"/>
+          <w:sz w:val="24"/>
+          <w:szCs w:val="24"/>
+        </w:rPr>
+      </w:pPr>
+    </w:p>
+    <w:p>
+      <w:pPr>
+        <w:spacing w:after="0" w:line="360" w:lineRule="auto"/>
+        <w:rPr>
+          <w:rFonts w:ascii="Arial" w:hAnsi="Arial" w:cs="Arial"/>
+          <w:sz w:val="24"/>
+          <w:szCs w:val="24"/>
+        </w:rPr>
+      </w:pPr>
+    </w:p>
+    <w:p>
+      <w:pPr>
+        <w:spacing w:after="0" w:line="360" w:lineRule="auto"/>
+        <w:rPr>
+          <w:rFonts w:ascii="Arial" w:hAnsi="Arial" w:cs="Arial"/>
+          <w:sz w:val="24"/>
+          <w:szCs w:val="24"/>
+        </w:rPr>
+      </w:pPr>
+    </w:p>
+    <w:p>
+      <w:pPr>
+        <w:spacing w:after="0" w:line="360" w:lineRule="auto"/>
+        <w:rPr>
+          <w:rFonts w:ascii="Arial" w:hAnsi="Arial" w:cs="Arial"/>
+          <w:sz w:val="24"/>
+          <w:szCs w:val="24"/>
+        </w:rPr>
+      </w:pPr>
+    </w:p>
+    <w:p>
+      <w:pPr>
+        <w:spacing w:after="0" w:line="360" w:lineRule="auto"/>
+        <w:rPr>
+          <w:rFonts w:ascii="Arial" w:hAnsi="Arial" w:cs="Arial"/>
+          <w:sz w:val="24"/>
+          <w:szCs w:val="24"/>
+        </w:rPr>
+      </w:pPr>
+    </w:p>
+    <w:p>
+      <w:pPr>
+        <w:spacing w:after="0" w:line="360" w:lineRule="auto"/>
+        <w:rPr>
+          <w:rFonts w:ascii="Arial" w:hAnsi="Arial" w:cs="Arial"/>
+          <w:sz w:val="24"/>
+          <w:szCs w:val="24"/>
+        </w:rPr>
+      </w:pPr>
+    </w:p>
+    <w:p>
+      <w:pPr>
+        <w:spacing w:after="0" w:line="360" w:lineRule="auto"/>
+        <w:rPr>
+          <w:rFonts w:ascii="Arial" w:hAnsi="Arial" w:cs="Arial"/>
+          <w:sz w:val="24"/>
+          <w:szCs w:val="24"/>
+        </w:rPr>
+      </w:pPr>
+      <w:r>
+        <w:rPr>
+          <w:rFonts w:ascii="Arial" w:hAnsi="Arial" w:cs="Arial"/>
+          <w:sz w:val="24"/>
+          <w:szCs w:val="24"/>
+        </w:rPr>
+        <w:t>ESTRUTURA DO PROTÓTIPO EM TELAS E EXPLICADO</w:t>
+      </w:r>
+    </w:p>
+    <w:p>
+      <w:pPr>
+        <w:spacing w:after="0" w:line="360" w:lineRule="auto"/>
+        <w:rPr>
+          <w:rFonts w:ascii="Arial" w:hAnsi="Arial" w:cs="Arial"/>
+          <w:sz w:val="24"/>
+          <w:szCs w:val="24"/>
+        </w:rPr>
+      </w:pPr>
+      <w:r>
+        <w:rPr>
+          <w:rFonts w:ascii="Arial" w:hAnsi="Arial" w:cs="Arial"/>
+          <w:sz w:val="24"/>
+          <w:szCs w:val="24"/>
+        </w:rPr>
+        <w:tab/>
+      </w:r>
+    </w:p>
+    <w:p>
+      <w:pPr>
+        <w:spacing w:after="0" w:line="360" w:lineRule="auto"/>
+        <w:rPr>
+          <w:rFonts w:ascii="Arial" w:hAnsi="Arial" w:cs="Arial"/>
+          <w:sz w:val="24"/>
+          <w:szCs w:val="24"/>
+        </w:rPr>
+      </w:pPr>
+    </w:p>
+    <w:p>
+      <w:pPr>
+        <w:spacing w:after="0" w:line="360" w:lineRule="auto"/>
+        <w:rPr>
+          <w:rFonts w:ascii="Arial" w:hAnsi="Arial" w:cs="Arial"/>
+          <w:sz w:val="24"/>
+          <w:szCs w:val="24"/>
+        </w:rPr>
+      </w:pPr>
+    </w:p>
+    <w:p>
+      <w:pPr>
+        <w:spacing w:after="0" w:line="360" w:lineRule="auto"/>
+        <w:rPr>
+          <w:rFonts w:ascii="Arial" w:hAnsi="Arial" w:cs="Arial"/>
+          <w:sz w:val="24"/>
+          <w:szCs w:val="24"/>
+        </w:rPr>
+      </w:pPr>
+    </w:p>
+    <w:p>
+      <w:pPr>
+        <w:spacing w:after="0" w:line="360" w:lineRule="auto"/>
+        <w:rPr>
+          <w:rFonts w:ascii="Arial" w:hAnsi="Arial" w:cs="Arial"/>
+          <w:sz w:val="24"/>
+          <w:szCs w:val="24"/>
+        </w:rPr>
+      </w:pPr>
+    </w:p>
+    <w:p>
+      <w:pPr>
+        <w:spacing w:after="0" w:line="360" w:lineRule="auto"/>
+        <w:rPr>
+          <w:rFonts w:ascii="Arial" w:hAnsi="Arial" w:cs="Arial"/>
+          <w:sz w:val="24"/>
+          <w:szCs w:val="24"/>
+        </w:rPr>
+      </w:pPr>
+    </w:p>
+    <w:p>
+      <w:pPr>
+        <w:spacing w:after="0" w:line="360" w:lineRule="auto"/>
+        <w:rPr>
+          <w:rFonts w:ascii="Arial" w:hAnsi="Arial" w:cs="Arial"/>
+          <w:sz w:val="24"/>
+          <w:szCs w:val="24"/>
+        </w:rPr>
+      </w:pPr>
+    </w:p>
+    <w:p>
+      <w:pPr>
+        <w:spacing w:after="0" w:line="360" w:lineRule="auto"/>
+        <w:jc w:val="both"/>
+        <w:rPr>
+          <w:rFonts w:ascii="Arial" w:hAnsi="Arial" w:cs="Arial"/>
+          <w:b/>
           <w:noProof/>
           <w:sz w:val="24"/>
           <w:szCs w:val="24"/>
           <w:lang w:eastAsia="pt-BR"/>
         </w:rPr>
-        <w:drawing>
-          <wp:inline distT="0" distB="0" distL="0" distR="0" wp14:anchorId="4879C6C9" wp14:editId="3AF500E0">
-            <wp:extent cx="5760085" cy="2732405"/>
-            <wp:effectExtent l="0" t="0" r="0" b="0"/>
-            <wp:docPr id="10" name="Imagem 10"/>
-            <wp:cNvGraphicFramePr>
-              <a:graphicFrameLocks xmlns:a="http://schemas.openxmlformats.org/drawingml/2006/main" noChangeAspect="1"/>
-            </wp:cNvGraphicFramePr>
-            <a:graphic xmlns:a="http://schemas.openxmlformats.org/drawingml/2006/main">
-              <a:graphicData uri="http://schemas.openxmlformats.org/drawingml/2006/picture">
-                <pic:pic xmlns:pic="http://schemas.openxmlformats.org/drawingml/2006/picture">
-                  <pic:nvPicPr>
-                    <pic:cNvPr id="10" name="img-1.jpeg"/>
-                    <pic:cNvPicPr/>
-                  </pic:nvPicPr>
-                  <pic:blipFill>
-                    <a:blip r:embed="rId14" cstate="print">
-                      <a:extLst>
-                        <a:ext uri="{28A0092B-C50C-407E-A947-70E740481C1C}">
-                          <a14:useLocalDpi xmlns:a14="http://schemas.microsoft.com/office/drawing/2010/main" val="0"/>
-                        </a:ext>
-                      </a:extLst>
-                    </a:blip>
-                    <a:stretch>
-                      <a:fillRect/>
-                    </a:stretch>
-                  </pic:blipFill>
-                  <pic:spPr>
-                    <a:xfrm>
-                      <a:off x="0" y="0"/>
-                      <a:ext cx="5760085" cy="2732405"/>
-                    </a:xfrm>
-                    <a:prstGeom prst="rect">
-                      <a:avLst/>
-                    </a:prstGeom>
-                  </pic:spPr>
-                </pic:pic>
-              </a:graphicData>
-            </a:graphic>
-          </wp:inline>
-        </w:drawing>
-      </w:r>
-    </w:p>
-    <w:p>
-      <w:pPr>
-        <w:spacing w:after="0" w:line="360" w:lineRule="auto"/>
-        <w:rPr>
-          <w:rFonts w:ascii="Arial" w:hAnsi="Arial" w:cs="Arial"/>
-          <w:sz w:val="24"/>
-          <w:szCs w:val="24"/>
-        </w:rPr>
       </w:pPr>
     </w:p>
     <w:p>
@@ -6373,61 +6446,12 @@
         <w:rPr>
           <w:rFonts w:ascii="Arial" w:hAnsi="Arial" w:cs="Arial"/>
           <w:b/>
-          <w:sz w:val="24"/>
-          <w:szCs w:val="24"/>
-        </w:rPr>
-      </w:pPr>
-      <w:r>
-        <w:rPr>
-          <w:rFonts w:ascii="Arial" w:hAnsi="Arial" w:cs="Arial"/>
-          <w:b/>
           <w:noProof/>
           <w:sz w:val="24"/>
           <w:szCs w:val="24"/>
           <w:lang w:eastAsia="pt-BR"/>
         </w:rPr>
-        <w:drawing>
-          <wp:inline distT="0" distB="0" distL="0" distR="0" wp14:anchorId="1DA600AD" wp14:editId="041BD632">
-            <wp:extent cx="5760085" cy="2750185"/>
-            <wp:effectExtent l="0" t="0" r="0" b="0"/>
-            <wp:docPr id="11" name="Imagem 11"/>
-            <wp:cNvGraphicFramePr>
-              <a:graphicFrameLocks xmlns:a="http://schemas.openxmlformats.org/drawingml/2006/main" noChangeAspect="1"/>
-            </wp:cNvGraphicFramePr>
-            <a:graphic xmlns:a="http://schemas.openxmlformats.org/drawingml/2006/main">
-              <a:graphicData uri="http://schemas.openxmlformats.org/drawingml/2006/picture">
-                <pic:pic xmlns:pic="http://schemas.openxmlformats.org/drawingml/2006/picture">
-                  <pic:nvPicPr>
-                    <pic:cNvPr id="11" name="img-2.jpeg"/>
-                    <pic:cNvPicPr/>
-                  </pic:nvPicPr>
-                  <pic:blipFill>
-                    <a:blip r:embed="rId15" cstate="print">
-                      <a:extLst>
-                        <a:ext uri="{28A0092B-C50C-407E-A947-70E740481C1C}">
-                          <a14:useLocalDpi xmlns:a14="http://schemas.microsoft.com/office/drawing/2010/main" val="0"/>
-                        </a:ext>
-                      </a:extLst>
-                    </a:blip>
-                    <a:stretch>
-                      <a:fillRect/>
-                    </a:stretch>
-                  </pic:blipFill>
-                  <pic:spPr>
-                    <a:xfrm>
-                      <a:off x="0" y="0"/>
-                      <a:ext cx="5760085" cy="2750185"/>
-                    </a:xfrm>
-                    <a:prstGeom prst="rect">
-                      <a:avLst/>
-                    </a:prstGeom>
-                  </pic:spPr>
-                </pic:pic>
-              </a:graphicData>
-            </a:graphic>
-          </wp:inline>
-        </w:drawing>
-      </w:r>
+      </w:pPr>
     </w:p>
     <w:p>
       <w:pPr>
@@ -6435,8 +6459,11 @@
         <w:jc w:val="both"/>
         <w:rPr>
           <w:rFonts w:ascii="Arial" w:hAnsi="Arial" w:cs="Arial"/>
-          <w:sz w:val="24"/>
-          <w:szCs w:val="24"/>
+          <w:b/>
+          <w:noProof/>
+          <w:sz w:val="24"/>
+          <w:szCs w:val="24"/>
+          <w:lang w:eastAsia="pt-BR"/>
         </w:rPr>
       </w:pPr>
     </w:p>
@@ -6446,116 +6473,151 @@
         <w:jc w:val="both"/>
         <w:rPr>
           <w:rFonts w:ascii="Arial" w:hAnsi="Arial" w:cs="Arial"/>
-          <w:sz w:val="24"/>
-          <w:szCs w:val="24"/>
-        </w:rPr>
-      </w:pPr>
-    </w:p>
-    <w:p>
-      <w:pPr>
-        <w:spacing w:after="0" w:line="360" w:lineRule="auto"/>
-        <w:rPr>
-          <w:rFonts w:ascii="Arial" w:hAnsi="Arial" w:cs="Arial"/>
-          <w:b/>
-          <w:sz w:val="24"/>
-          <w:szCs w:val="24"/>
-        </w:rPr>
-      </w:pPr>
-    </w:p>
-    <w:p>
-      <w:pPr>
-        <w:spacing w:after="0" w:line="360" w:lineRule="auto"/>
-        <w:rPr>
-          <w:rFonts w:ascii="Arial" w:hAnsi="Arial" w:cs="Arial"/>
-          <w:b/>
-          <w:sz w:val="24"/>
-          <w:szCs w:val="24"/>
-        </w:rPr>
-      </w:pPr>
-    </w:p>
-    <w:p>
-      <w:pPr>
-        <w:spacing w:after="0" w:line="360" w:lineRule="auto"/>
-        <w:rPr>
-          <w:rFonts w:ascii="Arial" w:hAnsi="Arial" w:cs="Arial"/>
-          <w:b/>
-          <w:sz w:val="24"/>
-          <w:szCs w:val="24"/>
-        </w:rPr>
-      </w:pPr>
-    </w:p>
-    <w:p>
-      <w:pPr>
-        <w:spacing w:after="0" w:line="360" w:lineRule="auto"/>
-        <w:rPr>
-          <w:rFonts w:ascii="Arial" w:hAnsi="Arial" w:cs="Arial"/>
-          <w:b/>
-          <w:sz w:val="24"/>
-          <w:szCs w:val="24"/>
-        </w:rPr>
-      </w:pPr>
-    </w:p>
-    <w:p>
-      <w:pPr>
-        <w:spacing w:after="0" w:line="360" w:lineRule="auto"/>
-        <w:rPr>
-          <w:rFonts w:ascii="Arial" w:hAnsi="Arial" w:cs="Arial"/>
-          <w:b/>
-          <w:sz w:val="24"/>
-          <w:szCs w:val="24"/>
-        </w:rPr>
-      </w:pPr>
-    </w:p>
-    <w:p>
-      <w:pPr>
-        <w:spacing w:after="0" w:line="360" w:lineRule="auto"/>
-        <w:rPr>
-          <w:rFonts w:ascii="Arial" w:hAnsi="Arial" w:cs="Arial"/>
-          <w:b/>
-          <w:sz w:val="24"/>
-          <w:szCs w:val="24"/>
-        </w:rPr>
-      </w:pPr>
-    </w:p>
-    <w:p>
-      <w:pPr>
-        <w:spacing w:after="0" w:line="360" w:lineRule="auto"/>
-        <w:rPr>
-          <w:rFonts w:ascii="Arial" w:hAnsi="Arial" w:cs="Arial"/>
-          <w:b/>
-          <w:sz w:val="24"/>
-          <w:szCs w:val="24"/>
-        </w:rPr>
-      </w:pPr>
-    </w:p>
-    <w:p>
-      <w:pPr>
-        <w:spacing w:after="0" w:line="360" w:lineRule="auto"/>
-        <w:rPr>
-          <w:rFonts w:ascii="Arial" w:hAnsi="Arial" w:cs="Arial"/>
-          <w:b/>
-          <w:sz w:val="24"/>
-          <w:szCs w:val="24"/>
-        </w:rPr>
-      </w:pPr>
-    </w:p>
-    <w:p>
-      <w:pPr>
-        <w:spacing w:after="0" w:line="360" w:lineRule="auto"/>
-        <w:rPr>
-          <w:rFonts w:ascii="Arial" w:hAnsi="Arial" w:cs="Arial"/>
-          <w:b/>
-          <w:sz w:val="24"/>
-          <w:szCs w:val="24"/>
-        </w:rPr>
-      </w:pPr>
-      <w:r>
-        <w:rPr>
-          <w:rFonts w:ascii="Arial" w:hAnsi="Arial" w:cs="Arial"/>
-          <w:b/>
-          <w:sz w:val="24"/>
-          <w:szCs w:val="24"/>
-        </w:rPr>
+          <w:b/>
+          <w:sz w:val="24"/>
+          <w:szCs w:val="24"/>
+        </w:rPr>
+      </w:pPr>
+    </w:p>
+    <w:p>
+      <w:pPr>
+        <w:spacing w:after="0" w:line="360" w:lineRule="auto"/>
+        <w:jc w:val="both"/>
+        <w:rPr>
+          <w:rFonts w:ascii="Arial" w:hAnsi="Arial" w:cs="Arial"/>
+          <w:sz w:val="24"/>
+          <w:szCs w:val="24"/>
+        </w:rPr>
+      </w:pPr>
+    </w:p>
+    <w:p>
+      <w:pPr>
+        <w:spacing w:after="0" w:line="360" w:lineRule="auto"/>
+        <w:jc w:val="both"/>
+        <w:rPr>
+          <w:rFonts w:ascii="Arial" w:hAnsi="Arial" w:cs="Arial"/>
+          <w:sz w:val="24"/>
+          <w:szCs w:val="24"/>
+        </w:rPr>
+      </w:pPr>
+    </w:p>
+    <w:p>
+      <w:pPr>
+        <w:spacing w:after="0" w:line="360" w:lineRule="auto"/>
+        <w:rPr>
+          <w:rFonts w:ascii="Arial" w:hAnsi="Arial" w:cs="Arial"/>
+          <w:b/>
+          <w:sz w:val="24"/>
+          <w:szCs w:val="24"/>
+        </w:rPr>
+      </w:pPr>
+    </w:p>
+    <w:p>
+      <w:pPr>
+        <w:spacing w:after="0" w:line="360" w:lineRule="auto"/>
+        <w:rPr>
+          <w:rFonts w:ascii="Arial" w:hAnsi="Arial" w:cs="Arial"/>
+          <w:b/>
+          <w:sz w:val="24"/>
+          <w:szCs w:val="24"/>
+        </w:rPr>
+      </w:pPr>
+    </w:p>
+    <w:p>
+      <w:pPr>
+        <w:spacing w:after="0" w:line="360" w:lineRule="auto"/>
+        <w:rPr>
+          <w:rFonts w:ascii="Arial" w:hAnsi="Arial" w:cs="Arial"/>
+          <w:b/>
+          <w:sz w:val="24"/>
+          <w:szCs w:val="24"/>
+        </w:rPr>
+      </w:pPr>
+    </w:p>
+    <w:p>
+      <w:pPr>
+        <w:spacing w:after="0" w:line="360" w:lineRule="auto"/>
+        <w:rPr>
+          <w:rFonts w:ascii="Arial" w:hAnsi="Arial" w:cs="Arial"/>
+          <w:b/>
+          <w:sz w:val="24"/>
+          <w:szCs w:val="24"/>
+        </w:rPr>
+      </w:pPr>
+    </w:p>
+    <w:p>
+      <w:pPr>
+        <w:spacing w:after="0" w:line="360" w:lineRule="auto"/>
+        <w:rPr>
+          <w:rFonts w:ascii="Arial" w:hAnsi="Arial" w:cs="Arial"/>
+          <w:b/>
+          <w:sz w:val="24"/>
+          <w:szCs w:val="24"/>
+        </w:rPr>
+      </w:pPr>
+    </w:p>
+    <w:p>
+      <w:pPr>
+        <w:spacing w:after="0" w:line="360" w:lineRule="auto"/>
+        <w:rPr>
+          <w:rFonts w:ascii="Arial" w:hAnsi="Arial" w:cs="Arial"/>
+          <w:b/>
+          <w:sz w:val="24"/>
+          <w:szCs w:val="24"/>
+        </w:rPr>
+      </w:pPr>
+    </w:p>
+    <w:p>
+      <w:pPr>
+        <w:spacing w:after="0" w:line="360" w:lineRule="auto"/>
+        <w:rPr>
+          <w:rFonts w:ascii="Arial" w:hAnsi="Arial" w:cs="Arial"/>
+          <w:b/>
+          <w:sz w:val="24"/>
+          <w:szCs w:val="24"/>
+        </w:rPr>
+      </w:pPr>
+    </w:p>
+    <w:p>
+      <w:pPr>
+        <w:spacing w:after="0" w:line="360" w:lineRule="auto"/>
+        <w:rPr>
+          <w:rFonts w:ascii="Arial" w:hAnsi="Arial" w:cs="Arial"/>
+          <w:b/>
+          <w:sz w:val="24"/>
+          <w:szCs w:val="24"/>
+        </w:rPr>
+      </w:pPr>
+    </w:p>
+    <w:p>
+      <w:pPr>
+        <w:spacing w:after="0" w:line="360" w:lineRule="auto"/>
+        <w:rPr>
+          <w:rFonts w:ascii="Arial" w:hAnsi="Arial" w:cs="Arial"/>
+          <w:b/>
+          <w:sz w:val="24"/>
+          <w:szCs w:val="24"/>
+        </w:rPr>
+      </w:pPr>
+    </w:p>
+    <w:p>
+      <w:pPr>
+        <w:spacing w:after="0" w:line="360" w:lineRule="auto"/>
+        <w:rPr>
+          <w:rFonts w:ascii="Arial" w:hAnsi="Arial" w:cs="Arial"/>
+          <w:b/>
+          <w:sz w:val="24"/>
+          <w:szCs w:val="24"/>
+        </w:rPr>
+      </w:pPr>
+      <w:r>
+        <w:rPr>
+          <w:rFonts w:ascii="Arial" w:hAnsi="Arial" w:cs="Arial"/>
+          <w:b/>
+          <w:sz w:val="24"/>
+          <w:szCs w:val="24"/>
+        </w:rPr>
+        <w:lastRenderedPageBreak/>
         <w:t>Bibliografia</w:t>
       </w:r>
     </w:p>
@@ -6599,7 +6661,7 @@
           <w:szCs w:val="24"/>
         </w:rPr>
       </w:pPr>
-      <w:hyperlink r:id="rId16" w:history="1">
+      <w:hyperlink r:id="rId14" w:history="1">
         <w:r>
           <w:rPr>
             <w:rStyle w:val="Hyperlink"/>
@@ -6651,7 +6713,7 @@
           <w:szCs w:val="24"/>
         </w:rPr>
       </w:pPr>
-      <w:hyperlink r:id="rId17" w:history="1">
+      <w:hyperlink r:id="rId15" w:history="1">
         <w:r>
           <w:rPr>
             <w:rStyle w:val="Hyperlink"/>
@@ -6685,7 +6747,7 @@
           <w:szCs w:val="24"/>
         </w:rPr>
       </w:pPr>
-      <w:hyperlink r:id="rId18" w:history="1">
+      <w:hyperlink r:id="rId16" w:history="1">
         <w:r>
           <w:rPr>
             <w:rStyle w:val="Hyperlink"/>
@@ -6737,7 +6799,7 @@
           <w:szCs w:val="24"/>
         </w:rPr>
       </w:pPr>
-      <w:hyperlink r:id="rId19" w:history="1">
+      <w:hyperlink r:id="rId17" w:history="1">
         <w:r>
           <w:rPr>
             <w:rStyle w:val="Hyperlink"/>
@@ -6771,7 +6833,7 @@
           <w:szCs w:val="24"/>
         </w:rPr>
       </w:pPr>
-      <w:hyperlink r:id="rId20" w:history="1">
+      <w:hyperlink r:id="rId18" w:history="1">
         <w:r>
           <w:rPr>
             <w:rStyle w:val="Hyperlink"/>
@@ -6823,7 +6885,7 @@
           <w:szCs w:val="24"/>
         </w:rPr>
       </w:pPr>
-      <w:hyperlink r:id="rId21" w:history="1">
+      <w:hyperlink r:id="rId19" w:history="1">
         <w:r>
           <w:rPr>
             <w:rStyle w:val="Hyperlink"/>
@@ -6882,7 +6944,7 @@
         </w:rPr>
         <w:tab/>
       </w:r>
-      <w:hyperlink r:id="rId22" w:history="1">
+      <w:hyperlink r:id="rId20" w:history="1">
         <w:r>
           <w:rPr>
             <w:rStyle w:val="Hyperlink"/>
@@ -6932,7 +6994,7 @@
         </w:rPr>
         <w:t xml:space="preserve">Diagrama de Gantt: </w:t>
       </w:r>
-      <w:hyperlink r:id="rId23" w:history="1">
+      <w:hyperlink r:id="rId21" w:history="1">
         <w:r>
           <w:rPr>
             <w:rStyle w:val="Hyperlink"/>
@@ -6987,7 +7049,7 @@
         </w:rPr>
         <w:t xml:space="preserve">: </w:t>
       </w:r>
-      <w:hyperlink r:id="rId24" w:history="1">
+      <w:hyperlink r:id="rId22" w:history="1">
         <w:r>
           <w:rPr>
             <w:rStyle w:val="Hyperlink"/>
@@ -7052,7 +7114,7 @@
         </w:rPr>
         <w:tab/>
       </w:r>
-      <w:hyperlink r:id="rId25" w:history="1">
+      <w:hyperlink r:id="rId23" w:history="1">
         <w:r>
           <w:rPr>
             <w:rStyle w:val="Hyperlink"/>
@@ -12429,7 +12491,7 @@
 </file>
 
 <file path=customXml/itemProps1.xml><?xml version="1.0" encoding="utf-8"?>
-<ds:datastoreItem xmlns:ds="http://schemas.openxmlformats.org/officeDocument/2006/customXml" ds:itemID="{31B1AD20-1BF0-46D0-AA57-F8141CF28867}">
+<ds:datastoreItem xmlns:ds="http://schemas.openxmlformats.org/officeDocument/2006/customXml" ds:itemID="{8D6623F9-54F3-4866-B9AE-7C20F77A63A6}">
   <ds:schemaRefs>
     <ds:schemaRef ds:uri="http://schemas.openxmlformats.org/officeDocument/2006/bibliography"/>
   </ds:schemaRefs>

</xml_diff>

<commit_message>
feat: adicona diagrama de sequência
</commit_message>
<xml_diff>
--- a/Documentacao/Documentacao.docx
+++ b/Documentacao/Documentacao.docx
@@ -5784,8 +5784,6 @@
           <w:szCs w:val="24"/>
         </w:rPr>
       </w:pPr>
-      <w:bookmarkStart w:id="0" w:name="_GoBack"/>
-      <w:bookmarkEnd w:id="0"/>
     </w:p>
     <w:p>
       <w:pPr>
@@ -5971,6 +5969,8 @@
         </w:rPr>
         <w:t>MER</w:t>
       </w:r>
+      <w:bookmarkStart w:id="0" w:name="_GoBack"/>
+      <w:bookmarkEnd w:id="0"/>
     </w:p>
     <w:p>
       <w:pPr>
@@ -6068,6 +6068,215 @@
           <w:szCs w:val="24"/>
         </w:rPr>
         <w:lastRenderedPageBreak/>
+        <w:t>DIAGRAMA DE SEQUÊNCIA</w:t>
+      </w:r>
+    </w:p>
+    <w:p>
+      <w:pPr>
+        <w:spacing w:after="0" w:line="360" w:lineRule="auto"/>
+        <w:rPr>
+          <w:rFonts w:ascii="Arial" w:hAnsi="Arial" w:cs="Arial"/>
+          <w:sz w:val="24"/>
+          <w:szCs w:val="24"/>
+        </w:rPr>
+      </w:pPr>
+      <w:r>
+        <w:rPr>
+          <w:rFonts w:ascii="Arial" w:hAnsi="Arial" w:cs="Arial"/>
+          <w:noProof/>
+          <w:sz w:val="24"/>
+          <w:szCs w:val="24"/>
+          <w:lang w:eastAsia="pt-BR"/>
+        </w:rPr>
+        <w:drawing>
+          <wp:inline distT="0" distB="0" distL="0" distR="0" wp14:anchorId="1BCC38CD" wp14:editId="0873A75E">
+            <wp:extent cx="5760085" cy="5098415"/>
+            <wp:effectExtent l="0" t="0" r="0" b="6985"/>
+            <wp:docPr id="3" name="Imagem 3"/>
+            <wp:cNvGraphicFramePr>
+              <a:graphicFrameLocks xmlns:a="http://schemas.openxmlformats.org/drawingml/2006/main" noChangeAspect="1"/>
+            </wp:cNvGraphicFramePr>
+            <a:graphic xmlns:a="http://schemas.openxmlformats.org/drawingml/2006/main">
+              <a:graphicData uri="http://schemas.openxmlformats.org/drawingml/2006/picture">
+                <pic:pic xmlns:pic="http://schemas.openxmlformats.org/drawingml/2006/picture">
+                  <pic:nvPicPr>
+                    <pic:cNvPr id="3" name="DiagramaDeSequencia.jpg"/>
+                    <pic:cNvPicPr/>
+                  </pic:nvPicPr>
+                  <pic:blipFill>
+                    <a:blip r:embed="rId12">
+                      <a:extLst>
+                        <a:ext uri="{28A0092B-C50C-407E-A947-70E740481C1C}">
+                          <a14:useLocalDpi xmlns:a14="http://schemas.microsoft.com/office/drawing/2010/main" val="0"/>
+                        </a:ext>
+                      </a:extLst>
+                    </a:blip>
+                    <a:stretch>
+                      <a:fillRect/>
+                    </a:stretch>
+                  </pic:blipFill>
+                  <pic:spPr>
+                    <a:xfrm>
+                      <a:off x="0" y="0"/>
+                      <a:ext cx="5760085" cy="5098415"/>
+                    </a:xfrm>
+                    <a:prstGeom prst="rect">
+                      <a:avLst/>
+                    </a:prstGeom>
+                  </pic:spPr>
+                </pic:pic>
+              </a:graphicData>
+            </a:graphic>
+          </wp:inline>
+        </w:drawing>
+      </w:r>
+    </w:p>
+    <w:p>
+      <w:pPr>
+        <w:spacing w:after="0" w:line="360" w:lineRule="auto"/>
+        <w:rPr>
+          <w:rFonts w:ascii="Arial" w:hAnsi="Arial" w:cs="Arial"/>
+          <w:sz w:val="24"/>
+          <w:szCs w:val="24"/>
+        </w:rPr>
+      </w:pPr>
+    </w:p>
+    <w:p>
+      <w:pPr>
+        <w:spacing w:after="0" w:line="360" w:lineRule="auto"/>
+        <w:rPr>
+          <w:rFonts w:ascii="Arial" w:hAnsi="Arial" w:cs="Arial"/>
+          <w:sz w:val="24"/>
+          <w:szCs w:val="24"/>
+        </w:rPr>
+      </w:pPr>
+    </w:p>
+    <w:p>
+      <w:pPr>
+        <w:spacing w:after="0" w:line="360" w:lineRule="auto"/>
+        <w:rPr>
+          <w:rFonts w:ascii="Arial" w:hAnsi="Arial" w:cs="Arial"/>
+          <w:sz w:val="24"/>
+          <w:szCs w:val="24"/>
+        </w:rPr>
+      </w:pPr>
+    </w:p>
+    <w:p>
+      <w:pPr>
+        <w:spacing w:after="0" w:line="360" w:lineRule="auto"/>
+        <w:rPr>
+          <w:rFonts w:ascii="Arial" w:hAnsi="Arial" w:cs="Arial"/>
+          <w:sz w:val="24"/>
+          <w:szCs w:val="24"/>
+        </w:rPr>
+      </w:pPr>
+    </w:p>
+    <w:p>
+      <w:pPr>
+        <w:spacing w:after="0" w:line="360" w:lineRule="auto"/>
+        <w:rPr>
+          <w:rFonts w:ascii="Arial" w:hAnsi="Arial" w:cs="Arial"/>
+          <w:sz w:val="24"/>
+          <w:szCs w:val="24"/>
+        </w:rPr>
+      </w:pPr>
+    </w:p>
+    <w:p>
+      <w:pPr>
+        <w:spacing w:after="0" w:line="360" w:lineRule="auto"/>
+        <w:rPr>
+          <w:rFonts w:ascii="Arial" w:hAnsi="Arial" w:cs="Arial"/>
+          <w:sz w:val="24"/>
+          <w:szCs w:val="24"/>
+        </w:rPr>
+      </w:pPr>
+    </w:p>
+    <w:p>
+      <w:pPr>
+        <w:spacing w:after="0" w:line="360" w:lineRule="auto"/>
+        <w:rPr>
+          <w:rFonts w:ascii="Arial" w:hAnsi="Arial" w:cs="Arial"/>
+          <w:sz w:val="24"/>
+          <w:szCs w:val="24"/>
+        </w:rPr>
+      </w:pPr>
+    </w:p>
+    <w:p>
+      <w:pPr>
+        <w:spacing w:after="0" w:line="360" w:lineRule="auto"/>
+        <w:rPr>
+          <w:rFonts w:ascii="Arial" w:hAnsi="Arial" w:cs="Arial"/>
+          <w:sz w:val="24"/>
+          <w:szCs w:val="24"/>
+        </w:rPr>
+      </w:pPr>
+    </w:p>
+    <w:p>
+      <w:pPr>
+        <w:spacing w:after="0" w:line="360" w:lineRule="auto"/>
+        <w:rPr>
+          <w:rFonts w:ascii="Arial" w:hAnsi="Arial" w:cs="Arial"/>
+          <w:sz w:val="24"/>
+          <w:szCs w:val="24"/>
+        </w:rPr>
+      </w:pPr>
+    </w:p>
+    <w:p>
+      <w:pPr>
+        <w:spacing w:after="0" w:line="360" w:lineRule="auto"/>
+        <w:rPr>
+          <w:rFonts w:ascii="Arial" w:hAnsi="Arial" w:cs="Arial"/>
+          <w:sz w:val="24"/>
+          <w:szCs w:val="24"/>
+        </w:rPr>
+      </w:pPr>
+    </w:p>
+    <w:p>
+      <w:pPr>
+        <w:spacing w:after="0" w:line="360" w:lineRule="auto"/>
+        <w:rPr>
+          <w:rFonts w:ascii="Arial" w:hAnsi="Arial" w:cs="Arial"/>
+          <w:sz w:val="24"/>
+          <w:szCs w:val="24"/>
+        </w:rPr>
+      </w:pPr>
+    </w:p>
+    <w:p>
+      <w:pPr>
+        <w:spacing w:after="0" w:line="360" w:lineRule="auto"/>
+        <w:rPr>
+          <w:rFonts w:ascii="Arial" w:hAnsi="Arial" w:cs="Arial"/>
+          <w:sz w:val="24"/>
+          <w:szCs w:val="24"/>
+        </w:rPr>
+      </w:pPr>
+    </w:p>
+    <w:p>
+      <w:pPr>
+        <w:spacing w:after="0" w:line="360" w:lineRule="auto"/>
+        <w:rPr>
+          <w:rFonts w:ascii="Arial" w:hAnsi="Arial" w:cs="Arial"/>
+          <w:sz w:val="24"/>
+          <w:szCs w:val="24"/>
+        </w:rPr>
+      </w:pPr>
+    </w:p>
+    <w:p>
+      <w:pPr>
+        <w:spacing w:after="0" w:line="360" w:lineRule="auto"/>
+        <w:rPr>
+          <w:rFonts w:ascii="Arial" w:hAnsi="Arial" w:cs="Arial"/>
+          <w:sz w:val="24"/>
+          <w:szCs w:val="24"/>
+        </w:rPr>
+      </w:pPr>
+      <w:r>
+        <w:rPr>
+          <w:rFonts w:ascii="Arial" w:hAnsi="Arial" w:cs="Arial"/>
+          <w:sz w:val="24"/>
+          <w:szCs w:val="24"/>
+        </w:rPr>
+        <w:lastRenderedPageBreak/>
         <w:t>CASO DE USO</w:t>
       </w:r>
     </w:p>
@@ -6104,7 +6313,7 @@
                     <pic:cNvPicPr/>
                   </pic:nvPicPr>
                   <pic:blipFill>
-                    <a:blip r:embed="rId12" cstate="print">
+                    <a:blip r:embed="rId13" cstate="print">
                       <a:extLst>
                         <a:ext uri="{28A0092B-C50C-407E-A947-70E740481C1C}">
                           <a14:useLocalDpi xmlns:a14="http://schemas.microsoft.com/office/drawing/2010/main" val="0"/>
@@ -6192,7 +6401,7 @@
                     <pic:cNvPicPr/>
                   </pic:nvPicPr>
                   <pic:blipFill>
-                    <a:blip r:embed="rId13" cstate="print">
+                    <a:blip r:embed="rId14" cstate="print">
                       <a:extLst>
                         <a:ext uri="{28A0092B-C50C-407E-A947-70E740481C1C}">
                           <a14:useLocalDpi xmlns:a14="http://schemas.microsoft.com/office/drawing/2010/main" val="0"/>
@@ -6661,7 +6870,7 @@
           <w:szCs w:val="24"/>
         </w:rPr>
       </w:pPr>
-      <w:hyperlink r:id="rId14" w:history="1">
+      <w:hyperlink r:id="rId15" w:history="1">
         <w:r>
           <w:rPr>
             <w:rStyle w:val="Hyperlink"/>
@@ -6713,7 +6922,7 @@
           <w:szCs w:val="24"/>
         </w:rPr>
       </w:pPr>
-      <w:hyperlink r:id="rId15" w:history="1">
+      <w:hyperlink r:id="rId16" w:history="1">
         <w:r>
           <w:rPr>
             <w:rStyle w:val="Hyperlink"/>
@@ -6747,7 +6956,7 @@
           <w:szCs w:val="24"/>
         </w:rPr>
       </w:pPr>
-      <w:hyperlink r:id="rId16" w:history="1">
+      <w:hyperlink r:id="rId17" w:history="1">
         <w:r>
           <w:rPr>
             <w:rStyle w:val="Hyperlink"/>
@@ -6799,7 +7008,7 @@
           <w:szCs w:val="24"/>
         </w:rPr>
       </w:pPr>
-      <w:hyperlink r:id="rId17" w:history="1">
+      <w:hyperlink r:id="rId18" w:history="1">
         <w:r>
           <w:rPr>
             <w:rStyle w:val="Hyperlink"/>
@@ -6833,7 +7042,7 @@
           <w:szCs w:val="24"/>
         </w:rPr>
       </w:pPr>
-      <w:hyperlink r:id="rId18" w:history="1">
+      <w:hyperlink r:id="rId19" w:history="1">
         <w:r>
           <w:rPr>
             <w:rStyle w:val="Hyperlink"/>
@@ -6885,7 +7094,7 @@
           <w:szCs w:val="24"/>
         </w:rPr>
       </w:pPr>
-      <w:hyperlink r:id="rId19" w:history="1">
+      <w:hyperlink r:id="rId20" w:history="1">
         <w:r>
           <w:rPr>
             <w:rStyle w:val="Hyperlink"/>
@@ -6944,7 +7153,7 @@
         </w:rPr>
         <w:tab/>
       </w:r>
-      <w:hyperlink r:id="rId20" w:history="1">
+      <w:hyperlink r:id="rId21" w:history="1">
         <w:r>
           <w:rPr>
             <w:rStyle w:val="Hyperlink"/>
@@ -6994,7 +7203,7 @@
         </w:rPr>
         <w:t xml:space="preserve">Diagrama de Gantt: </w:t>
       </w:r>
-      <w:hyperlink r:id="rId21" w:history="1">
+      <w:hyperlink r:id="rId22" w:history="1">
         <w:r>
           <w:rPr>
             <w:rStyle w:val="Hyperlink"/>
@@ -7049,7 +7258,7 @@
         </w:rPr>
         <w:t xml:space="preserve">: </w:t>
       </w:r>
-      <w:hyperlink r:id="rId22" w:history="1">
+      <w:hyperlink r:id="rId23" w:history="1">
         <w:r>
           <w:rPr>
             <w:rStyle w:val="Hyperlink"/>
@@ -7114,7 +7323,7 @@
         </w:rPr>
         <w:tab/>
       </w:r>
-      <w:hyperlink r:id="rId23" w:history="1">
+      <w:hyperlink r:id="rId24" w:history="1">
         <w:r>
           <w:rPr>
             <w:rStyle w:val="Hyperlink"/>
@@ -12491,7 +12700,7 @@
 </file>
 
 <file path=customXml/itemProps1.xml><?xml version="1.0" encoding="utf-8"?>
-<ds:datastoreItem xmlns:ds="http://schemas.openxmlformats.org/officeDocument/2006/customXml" ds:itemID="{8D6623F9-54F3-4866-B9AE-7C20F77A63A6}">
+<ds:datastoreItem xmlns:ds="http://schemas.openxmlformats.org/officeDocument/2006/customXml" ds:itemID="{1278D1EB-4CE8-4CC7-9013-FFD62297FAF7}">
   <ds:schemaRefs>
     <ds:schemaRef ds:uri="http://schemas.openxmlformats.org/officeDocument/2006/bibliography"/>
   </ds:schemaRefs>

</xml_diff>

<commit_message>
feat: adiciona diagrama MER à documentação
</commit_message>
<xml_diff>
--- a/Documentacao/Documentacao.docx
+++ b/Documentacao/Documentacao.docx
@@ -5898,12 +5898,11 @@
           <w:szCs w:val="24"/>
           <w:lang w:eastAsia="pt-BR"/>
         </w:rPr>
-        <w:lastRenderedPageBreak/>
         <w:drawing>
-          <wp:inline distT="0" distB="0" distL="0" distR="0" wp14:anchorId="3FB65342" wp14:editId="039A0047">
-            <wp:extent cx="4049346" cy="3429735"/>
-            <wp:effectExtent l="0" t="0" r="8890" b="0"/>
-            <wp:docPr id="5" name="Imagem 5"/>
+          <wp:inline distT="0" distB="0" distL="0" distR="0" wp14:anchorId="0F99CCBC" wp14:editId="62173AE4">
+            <wp:extent cx="5760085" cy="1136015"/>
+            <wp:effectExtent l="0" t="0" r="0" b="6985"/>
+            <wp:docPr id="4" name="Imagem 4"/>
             <wp:cNvGraphicFramePr>
               <a:graphicFrameLocks xmlns:a="http://schemas.openxmlformats.org/drawingml/2006/main" noChangeAspect="1"/>
             </wp:cNvGraphicFramePr>
@@ -5911,7 +5910,7 @@
               <a:graphicData uri="http://schemas.openxmlformats.org/drawingml/2006/picture">
                 <pic:pic xmlns:pic="http://schemas.openxmlformats.org/drawingml/2006/picture">
                   <pic:nvPicPr>
-                    <pic:cNvPr id="5" name="DER-TCC.jpeg"/>
+                    <pic:cNvPr id="4" name="ERD.jpg"/>
                     <pic:cNvPicPr/>
                   </pic:nvPicPr>
                   <pic:blipFill>
@@ -5929,7 +5928,7 @@
                   <pic:spPr>
                     <a:xfrm>
                       <a:off x="0" y="0"/>
-                      <a:ext cx="4065147" cy="3443118"/>
+                      <a:ext cx="5760085" cy="1136015"/>
                     </a:xfrm>
                     <a:prstGeom prst="rect">
                       <a:avLst/>
@@ -5961,16 +5960,57 @@
           <w:szCs w:val="24"/>
         </w:rPr>
       </w:pPr>
-      <w:r>
-        <w:rPr>
-          <w:rFonts w:ascii="Arial" w:hAnsi="Arial" w:cs="Arial"/>
-          <w:sz w:val="24"/>
-          <w:szCs w:val="24"/>
-        </w:rPr>
-        <w:t>MER</w:t>
-      </w:r>
+    </w:p>
+    <w:p>
+      <w:pPr>
+        <w:spacing w:after="0" w:line="360" w:lineRule="auto"/>
+        <w:rPr>
+          <w:rFonts w:ascii="Arial" w:hAnsi="Arial" w:cs="Arial"/>
+          <w:sz w:val="24"/>
+          <w:szCs w:val="24"/>
+        </w:rPr>
+      </w:pPr>
+    </w:p>
+    <w:p>
+      <w:pPr>
+        <w:spacing w:after="0" w:line="360" w:lineRule="auto"/>
+        <w:rPr>
+          <w:rFonts w:ascii="Arial" w:hAnsi="Arial" w:cs="Arial"/>
+          <w:sz w:val="24"/>
+          <w:szCs w:val="24"/>
+        </w:rPr>
+      </w:pPr>
+    </w:p>
+    <w:p>
+      <w:pPr>
+        <w:spacing w:after="0" w:line="360" w:lineRule="auto"/>
+        <w:rPr>
+          <w:rFonts w:ascii="Arial" w:hAnsi="Arial" w:cs="Arial"/>
+          <w:sz w:val="24"/>
+          <w:szCs w:val="24"/>
+        </w:rPr>
+      </w:pPr>
+    </w:p>
+    <w:p>
+      <w:pPr>
+        <w:spacing w:after="0" w:line="360" w:lineRule="auto"/>
+        <w:rPr>
+          <w:rFonts w:ascii="Arial" w:hAnsi="Arial" w:cs="Arial"/>
+          <w:sz w:val="24"/>
+          <w:szCs w:val="24"/>
+        </w:rPr>
+      </w:pPr>
       <w:bookmarkStart w:id="0" w:name="_GoBack"/>
       <w:bookmarkEnd w:id="0"/>
+      <w:r>
+        <w:rPr>
+          <w:rFonts w:ascii="Arial" w:hAnsi="Arial" w:cs="Arial"/>
+          <w:sz w:val="24"/>
+          <w:szCs w:val="24"/>
+        </w:rPr>
+        <w:lastRenderedPageBreak/>
+        <w:t>MER</w:t>
+      </w:r>
     </w:p>
     <w:p>
       <w:pPr>
@@ -5990,10 +6030,10 @@
           <w:lang w:eastAsia="pt-BR"/>
         </w:rPr>
         <w:drawing>
-          <wp:inline distT="0" distB="0" distL="0" distR="0" wp14:anchorId="67CE5B31" wp14:editId="3DDCE975">
-            <wp:extent cx="1152525" cy="4295775"/>
-            <wp:effectExtent l="0" t="0" r="9525" b="9525"/>
-            <wp:docPr id="6" name="Imagem 6"/>
+          <wp:inline distT="0" distB="0" distL="0" distR="0" wp14:anchorId="451C36C7" wp14:editId="60466870">
+            <wp:extent cx="5760085" cy="1310640"/>
+            <wp:effectExtent l="0" t="0" r="0" b="3810"/>
+            <wp:docPr id="7" name="Imagem 7"/>
             <wp:cNvGraphicFramePr>
               <a:graphicFrameLocks xmlns:a="http://schemas.openxmlformats.org/drawingml/2006/main" noChangeAspect="1"/>
             </wp:cNvGraphicFramePr>
@@ -6001,7 +6041,7 @@
               <a:graphicData uri="http://schemas.openxmlformats.org/drawingml/2006/picture">
                 <pic:pic xmlns:pic="http://schemas.openxmlformats.org/drawingml/2006/picture">
                   <pic:nvPicPr>
-                    <pic:cNvPr id="6" name="MER-TCC.jpg"/>
+                    <pic:cNvPr id="7" name="MER.jpg"/>
                     <pic:cNvPicPr/>
                   </pic:nvPicPr>
                   <pic:blipFill>
@@ -6019,7 +6059,7 @@
                   <pic:spPr>
                     <a:xfrm>
                       <a:off x="0" y="0"/>
-                      <a:ext cx="1152525" cy="4295775"/>
+                      <a:ext cx="5760085" cy="1310640"/>
                     </a:xfrm>
                     <a:prstGeom prst="rect">
                       <a:avLst/>
@@ -6067,7 +6107,6 @@
           <w:sz w:val="24"/>
           <w:szCs w:val="24"/>
         </w:rPr>
-        <w:lastRenderedPageBreak/>
         <w:t>DIAGRAMA DE SEQUÊNCIA</w:t>
       </w:r>
     </w:p>
@@ -6276,7 +6315,6 @@
           <w:sz w:val="24"/>
           <w:szCs w:val="24"/>
         </w:rPr>
-        <w:lastRenderedPageBreak/>
         <w:t>CASO DE USO</w:t>
       </w:r>
     </w:p>
@@ -6385,6 +6423,7 @@
           <w:szCs w:val="24"/>
           <w:lang w:eastAsia="pt-BR"/>
         </w:rPr>
+        <w:lastRenderedPageBreak/>
         <w:drawing>
           <wp:inline distT="0" distB="0" distL="0" distR="0" wp14:anchorId="5E535A85" wp14:editId="1CF6D136">
             <wp:extent cx="4857750" cy="3520542"/>
@@ -6826,7 +6865,6 @@
           <w:sz w:val="24"/>
           <w:szCs w:val="24"/>
         </w:rPr>
-        <w:lastRenderedPageBreak/>
         <w:t>Bibliografia</w:t>
       </w:r>
     </w:p>
@@ -7201,6 +7239,7 @@
           <w:sz w:val="24"/>
           <w:szCs w:val="24"/>
         </w:rPr>
+        <w:lastRenderedPageBreak/>
         <w:t xml:space="preserve">Diagrama de Gantt: </w:t>
       </w:r>
       <w:hyperlink r:id="rId22" w:history="1">
@@ -12700,7 +12739,7 @@
 </file>
 
 <file path=customXml/itemProps1.xml><?xml version="1.0" encoding="utf-8"?>
-<ds:datastoreItem xmlns:ds="http://schemas.openxmlformats.org/officeDocument/2006/customXml" ds:itemID="{1278D1EB-4CE8-4CC7-9013-FFD62297FAF7}">
+<ds:datastoreItem xmlns:ds="http://schemas.openxmlformats.org/officeDocument/2006/customXml" ds:itemID="{BC61F8E0-3AD7-4E3E-9609-478F3738EE68}">
   <ds:schemaRefs>
     <ds:schemaRef ds:uri="http://schemas.openxmlformats.org/officeDocument/2006/bibliography"/>
   </ds:schemaRefs>

</xml_diff>

<commit_message>
feat: adiciona exemplificação prática sobre a conversão de PDFs durante o processo
</commit_message>
<xml_diff>
--- a/Documentacao/Documentacao.docx
+++ b/Documentacao/Documentacao.docx
@@ -1135,6 +1135,7 @@
           <w:rFonts w:ascii="Arial" w:hAnsi="Arial" w:cs="Arial"/>
           <w:sz w:val="24"/>
           <w:szCs w:val="24"/>
+          <w:lang w:val="en-US"/>
         </w:rPr>
       </w:pPr>
     </w:p>
@@ -1146,6 +1147,7 @@
           <w:rFonts w:ascii="Arial" w:hAnsi="Arial" w:cs="Arial"/>
           <w:sz w:val="24"/>
           <w:szCs w:val="24"/>
+          <w:lang w:val="en-US"/>
         </w:rPr>
       </w:pPr>
     </w:p>
@@ -1157,6 +1159,7 @@
           <w:rFonts w:ascii="Arial" w:hAnsi="Arial" w:cs="Arial"/>
           <w:sz w:val="24"/>
           <w:szCs w:val="24"/>
+          <w:lang w:val="en-US"/>
         </w:rPr>
       </w:pPr>
     </w:p>
@@ -1168,6 +1171,7 @@
           <w:rFonts w:ascii="Arial" w:hAnsi="Arial" w:cs="Arial"/>
           <w:sz w:val="24"/>
           <w:szCs w:val="24"/>
+          <w:lang w:val="en-US"/>
         </w:rPr>
       </w:pPr>
     </w:p>
@@ -1179,6 +1183,7 @@
           <w:rFonts w:ascii="Arial" w:hAnsi="Arial" w:cs="Arial"/>
           <w:sz w:val="24"/>
           <w:szCs w:val="24"/>
+          <w:lang w:val="en-US"/>
         </w:rPr>
       </w:pPr>
     </w:p>
@@ -1190,6 +1195,7 @@
           <w:rFonts w:ascii="Arial" w:hAnsi="Arial" w:cs="Arial"/>
           <w:sz w:val="24"/>
           <w:szCs w:val="24"/>
+          <w:lang w:val="en-US"/>
         </w:rPr>
       </w:pPr>
     </w:p>
@@ -1201,6 +1207,7 @@
           <w:rFonts w:ascii="Arial" w:hAnsi="Arial" w:cs="Arial"/>
           <w:sz w:val="24"/>
           <w:szCs w:val="24"/>
+          <w:lang w:val="en-US"/>
         </w:rPr>
       </w:pPr>
     </w:p>
@@ -1212,6 +1219,7 @@
           <w:rFonts w:ascii="Arial" w:hAnsi="Arial" w:cs="Arial"/>
           <w:sz w:val="24"/>
           <w:szCs w:val="24"/>
+          <w:lang w:val="en-US"/>
         </w:rPr>
       </w:pPr>
     </w:p>
@@ -1223,6 +1231,7 @@
           <w:rFonts w:ascii="Arial" w:hAnsi="Arial" w:cs="Arial"/>
           <w:sz w:val="24"/>
           <w:szCs w:val="24"/>
+          <w:lang w:val="en-US"/>
         </w:rPr>
       </w:pPr>
     </w:p>
@@ -1234,6 +1243,7 @@
           <w:rFonts w:ascii="Arial" w:hAnsi="Arial" w:cs="Arial"/>
           <w:sz w:val="24"/>
           <w:szCs w:val="24"/>
+          <w:lang w:val="en-US"/>
         </w:rPr>
       </w:pPr>
     </w:p>
@@ -1245,6 +1255,7 @@
           <w:rFonts w:ascii="Arial" w:hAnsi="Arial" w:cs="Arial"/>
           <w:sz w:val="24"/>
           <w:szCs w:val="24"/>
+          <w:lang w:val="en-US"/>
         </w:rPr>
       </w:pPr>
     </w:p>
@@ -1256,6 +1267,7 @@
           <w:rFonts w:ascii="Arial" w:hAnsi="Arial" w:cs="Arial"/>
           <w:sz w:val="24"/>
           <w:szCs w:val="24"/>
+          <w:lang w:val="en-US"/>
         </w:rPr>
       </w:pPr>
     </w:p>
@@ -1267,6 +1279,7 @@
           <w:rFonts w:ascii="Arial" w:hAnsi="Arial" w:cs="Arial"/>
           <w:sz w:val="24"/>
           <w:szCs w:val="24"/>
+          <w:lang w:val="en-US"/>
         </w:rPr>
       </w:pPr>
     </w:p>
@@ -1278,6 +1291,7 @@
           <w:rFonts w:ascii="Arial" w:hAnsi="Arial" w:cs="Arial"/>
           <w:sz w:val="24"/>
           <w:szCs w:val="24"/>
+          <w:lang w:val="en-US"/>
         </w:rPr>
       </w:pPr>
     </w:p>
@@ -1289,6 +1303,7 @@
           <w:rFonts w:ascii="Arial" w:hAnsi="Arial" w:cs="Arial"/>
           <w:sz w:val="24"/>
           <w:szCs w:val="24"/>
+          <w:lang w:val="en-US"/>
         </w:rPr>
       </w:pPr>
     </w:p>
@@ -1300,6 +1315,7 @@
           <w:rFonts w:ascii="Arial" w:hAnsi="Arial" w:cs="Arial"/>
           <w:sz w:val="24"/>
           <w:szCs w:val="24"/>
+          <w:lang w:val="en-US"/>
         </w:rPr>
       </w:pPr>
     </w:p>
@@ -1311,6 +1327,7 @@
           <w:rFonts w:ascii="Arial" w:hAnsi="Arial" w:cs="Arial"/>
           <w:sz w:val="24"/>
           <w:szCs w:val="24"/>
+          <w:lang w:val="en-US"/>
         </w:rPr>
       </w:pPr>
     </w:p>
@@ -1322,6 +1339,7 @@
           <w:rFonts w:ascii="Arial" w:hAnsi="Arial" w:cs="Arial"/>
           <w:sz w:val="24"/>
           <w:szCs w:val="24"/>
+          <w:lang w:val="en-US"/>
         </w:rPr>
       </w:pPr>
     </w:p>
@@ -1333,6 +1351,7 @@
           <w:rFonts w:ascii="Arial" w:hAnsi="Arial" w:cs="Arial"/>
           <w:sz w:val="24"/>
           <w:szCs w:val="24"/>
+          <w:lang w:val="en-US"/>
         </w:rPr>
       </w:pPr>
     </w:p>
@@ -1344,6 +1363,7 @@
           <w:rFonts w:ascii="Arial" w:hAnsi="Arial" w:cs="Arial"/>
           <w:sz w:val="24"/>
           <w:szCs w:val="24"/>
+          <w:lang w:val="en-US"/>
         </w:rPr>
       </w:pPr>
     </w:p>
@@ -1355,6 +1375,7 @@
           <w:rFonts w:ascii="Arial" w:hAnsi="Arial" w:cs="Arial"/>
           <w:sz w:val="24"/>
           <w:szCs w:val="24"/>
+          <w:lang w:val="en-US"/>
         </w:rPr>
       </w:pPr>
     </w:p>
@@ -1366,6 +1387,7 @@
           <w:rFonts w:ascii="Arial" w:hAnsi="Arial" w:cs="Arial"/>
           <w:sz w:val="24"/>
           <w:szCs w:val="24"/>
+          <w:lang w:val="en-US"/>
         </w:rPr>
       </w:pPr>
     </w:p>
@@ -1377,6 +1399,7 @@
           <w:rFonts w:ascii="Arial" w:hAnsi="Arial" w:cs="Arial"/>
           <w:sz w:val="24"/>
           <w:szCs w:val="24"/>
+          <w:lang w:val="en-US"/>
         </w:rPr>
       </w:pPr>
     </w:p>
@@ -1388,6 +1411,7 @@
           <w:rFonts w:ascii="Arial" w:hAnsi="Arial" w:cs="Arial"/>
           <w:sz w:val="24"/>
           <w:szCs w:val="24"/>
+          <w:lang w:val="en-US"/>
         </w:rPr>
       </w:pPr>
     </w:p>
@@ -1399,6 +1423,7 @@
           <w:rFonts w:ascii="Arial" w:hAnsi="Arial" w:cs="Arial"/>
           <w:sz w:val="24"/>
           <w:szCs w:val="24"/>
+          <w:lang w:val="en-US"/>
         </w:rPr>
       </w:pPr>
     </w:p>
@@ -3443,11 +3468,664 @@
     <w:p>
       <w:pPr>
         <w:spacing w:after="0" w:line="360" w:lineRule="auto"/>
-        <w:rPr>
-          <w:rFonts w:ascii="Arial" w:eastAsia="Times New Roman" w:hAnsi="Arial" w:cs="Arial"/>
-          <w:b/>
-          <w:bCs/>
-          <w:sz w:val="28"/>
+        <w:jc w:val="both"/>
+        <w:rPr>
+          <w:rFonts w:ascii="Arial" w:eastAsia="Times New Roman" w:hAnsi="Arial" w:cs="Arial"/>
+          <w:sz w:val="24"/>
+          <w:szCs w:val="24"/>
+          <w:lang w:eastAsia="pt-BR"/>
+        </w:rPr>
+      </w:pPr>
+    </w:p>
+    <w:p>
+      <w:pPr>
+        <w:spacing w:after="0" w:line="360" w:lineRule="auto"/>
+        <w:jc w:val="both"/>
+        <w:rPr>
+          <w:rFonts w:ascii="Arial" w:eastAsia="Times New Roman" w:hAnsi="Arial" w:cs="Arial"/>
+          <w:b/>
+          <w:sz w:val="24"/>
+          <w:szCs w:val="24"/>
+          <w:lang w:eastAsia="pt-BR"/>
+        </w:rPr>
+      </w:pPr>
+      <w:r>
+        <w:rPr>
+          <w:rFonts w:ascii="Arial" w:eastAsia="Times New Roman" w:hAnsi="Arial" w:cs="Arial"/>
+          <w:b/>
+          <w:sz w:val="24"/>
+          <w:szCs w:val="24"/>
+          <w:lang w:eastAsia="pt-BR"/>
+        </w:rPr>
+        <w:t>Demonstração prática</w:t>
+      </w:r>
+      <w:r>
+        <w:rPr>
+          <w:rFonts w:ascii="Arial" w:eastAsia="Times New Roman" w:hAnsi="Arial" w:cs="Arial"/>
+          <w:b/>
+          <w:sz w:val="24"/>
+          <w:szCs w:val="24"/>
+          <w:lang w:eastAsia="pt-BR"/>
+        </w:rPr>
+        <w:t>:</w:t>
+      </w:r>
+    </w:p>
+    <w:p>
+      <w:pPr>
+        <w:spacing w:after="0" w:line="360" w:lineRule="auto"/>
+        <w:jc w:val="both"/>
+        <w:rPr>
+          <w:rFonts w:ascii="Arial" w:eastAsia="Times New Roman" w:hAnsi="Arial" w:cs="Arial"/>
+          <w:sz w:val="24"/>
+          <w:szCs w:val="24"/>
+          <w:lang w:eastAsia="pt-BR"/>
+        </w:rPr>
+      </w:pPr>
+    </w:p>
+    <w:p>
+      <w:pPr>
+        <w:spacing w:after="0" w:line="360" w:lineRule="auto"/>
+        <w:jc w:val="both"/>
+        <w:rPr>
+          <w:rFonts w:ascii="Arial" w:eastAsia="Times New Roman" w:hAnsi="Arial" w:cs="Arial"/>
+          <w:sz w:val="24"/>
+          <w:szCs w:val="24"/>
+          <w:lang w:eastAsia="pt-BR"/>
+        </w:rPr>
+      </w:pPr>
+      <w:r>
+        <w:rPr>
+          <w:rFonts w:ascii="Arial" w:eastAsia="Times New Roman" w:hAnsi="Arial" w:cs="Arial"/>
+          <w:sz w:val="24"/>
+          <w:szCs w:val="24"/>
+          <w:lang w:eastAsia="pt-BR"/>
+        </w:rPr>
+        <w:t>- DE X</w:t>
+      </w:r>
+    </w:p>
+    <w:p>
+      <w:pPr>
+        <w:spacing w:after="0" w:line="360" w:lineRule="auto"/>
+        <w:jc w:val="both"/>
+        <w:rPr>
+          <w:rFonts w:ascii="Arial" w:eastAsia="Times New Roman" w:hAnsi="Arial" w:cs="Arial"/>
+          <w:sz w:val="24"/>
+          <w:szCs w:val="24"/>
+          <w:lang w:eastAsia="pt-BR"/>
+        </w:rPr>
+      </w:pPr>
+      <w:r>
+        <w:rPr>
+          <w:rFonts w:ascii="Arial" w:eastAsia="Times New Roman" w:hAnsi="Arial" w:cs="Arial"/>
+          <w:sz w:val="24"/>
+          <w:szCs w:val="24"/>
+          <w:lang w:eastAsia="pt-BR"/>
+        </w:rPr>
+        <w:drawing>
+          <wp:inline distT="0" distB="0" distL="0" distR="0" wp14:anchorId="2233389F" wp14:editId="2ABE9D0C">
+            <wp:extent cx="5760085" cy="2750185"/>
+            <wp:effectExtent l="0" t="0" r="0" b="0"/>
+            <wp:docPr id="2" name="Imagem 2"/>
+            <wp:cNvGraphicFramePr>
+              <a:graphicFrameLocks xmlns:a="http://schemas.openxmlformats.org/drawingml/2006/main" noChangeAspect="1"/>
+            </wp:cNvGraphicFramePr>
+            <a:graphic xmlns:a="http://schemas.openxmlformats.org/drawingml/2006/main">
+              <a:graphicData uri="http://schemas.openxmlformats.org/drawingml/2006/picture">
+                <pic:pic xmlns:pic="http://schemas.openxmlformats.org/drawingml/2006/picture">
+                  <pic:nvPicPr>
+                    <pic:cNvPr id="1" name=""/>
+                    <pic:cNvPicPr/>
+                  </pic:nvPicPr>
+                  <pic:blipFill>
+                    <a:blip r:embed="rId8"/>
+                    <a:stretch>
+                      <a:fillRect/>
+                    </a:stretch>
+                  </pic:blipFill>
+                  <pic:spPr>
+                    <a:xfrm>
+                      <a:off x="0" y="0"/>
+                      <a:ext cx="5760085" cy="2750185"/>
+                    </a:xfrm>
+                    <a:prstGeom prst="rect">
+                      <a:avLst/>
+                    </a:prstGeom>
+                  </pic:spPr>
+                </pic:pic>
+              </a:graphicData>
+            </a:graphic>
+          </wp:inline>
+        </w:drawing>
+      </w:r>
+    </w:p>
+    <w:p>
+      <w:pPr>
+        <w:spacing w:after="0" w:line="360" w:lineRule="auto"/>
+        <w:jc w:val="both"/>
+        <w:rPr>
+          <w:rFonts w:ascii="Arial" w:eastAsia="Times New Roman" w:hAnsi="Arial" w:cs="Arial"/>
+          <w:sz w:val="24"/>
+          <w:szCs w:val="24"/>
+          <w:lang w:eastAsia="pt-BR"/>
+        </w:rPr>
+      </w:pPr>
+      <w:r>
+        <w:rPr>
+          <w:rFonts w:ascii="Arial" w:eastAsia="Times New Roman" w:hAnsi="Arial" w:cs="Arial"/>
+          <w:sz w:val="24"/>
+          <w:szCs w:val="24"/>
+          <w:lang w:eastAsia="pt-BR"/>
+        </w:rPr>
+        <w:lastRenderedPageBreak/>
+        <w:drawing>
+          <wp:inline distT="0" distB="0" distL="0" distR="0" wp14:anchorId="7D2D4554" wp14:editId="565386D0">
+            <wp:extent cx="5760085" cy="2735580"/>
+            <wp:effectExtent l="0" t="0" r="0" b="7620"/>
+            <wp:docPr id="5" name="Imagem 5"/>
+            <wp:cNvGraphicFramePr>
+              <a:graphicFrameLocks xmlns:a="http://schemas.openxmlformats.org/drawingml/2006/main" noChangeAspect="1"/>
+            </wp:cNvGraphicFramePr>
+            <a:graphic xmlns:a="http://schemas.openxmlformats.org/drawingml/2006/main">
+              <a:graphicData uri="http://schemas.openxmlformats.org/drawingml/2006/picture">
+                <pic:pic xmlns:pic="http://schemas.openxmlformats.org/drawingml/2006/picture">
+                  <pic:nvPicPr>
+                    <pic:cNvPr id="1" name=""/>
+                    <pic:cNvPicPr/>
+                  </pic:nvPicPr>
+                  <pic:blipFill>
+                    <a:blip r:embed="rId9"/>
+                    <a:stretch>
+                      <a:fillRect/>
+                    </a:stretch>
+                  </pic:blipFill>
+                  <pic:spPr>
+                    <a:xfrm>
+                      <a:off x="0" y="0"/>
+                      <a:ext cx="5760085" cy="2735580"/>
+                    </a:xfrm>
+                    <a:prstGeom prst="rect">
+                      <a:avLst/>
+                    </a:prstGeom>
+                  </pic:spPr>
+                </pic:pic>
+              </a:graphicData>
+            </a:graphic>
+          </wp:inline>
+        </w:drawing>
+      </w:r>
+    </w:p>
+    <w:p>
+      <w:pPr>
+        <w:spacing w:after="0" w:line="360" w:lineRule="auto"/>
+        <w:jc w:val="both"/>
+        <w:rPr>
+          <w:rFonts w:ascii="Arial" w:eastAsia="Times New Roman" w:hAnsi="Arial" w:cs="Arial"/>
+          <w:sz w:val="24"/>
+          <w:szCs w:val="24"/>
+          <w:lang w:eastAsia="pt-BR"/>
+        </w:rPr>
+      </w:pPr>
+      <w:r>
+        <w:rPr>
+          <w:rFonts w:ascii="Arial" w:eastAsia="Times New Roman" w:hAnsi="Arial" w:cs="Arial"/>
+          <w:sz w:val="24"/>
+          <w:szCs w:val="24"/>
+          <w:lang w:eastAsia="pt-BR"/>
+        </w:rPr>
+        <w:drawing>
+          <wp:inline distT="0" distB="0" distL="0" distR="0" wp14:anchorId="3D4AD5B6" wp14:editId="3E174017">
+            <wp:extent cx="5760085" cy="2733040"/>
+            <wp:effectExtent l="0" t="0" r="0" b="0"/>
+            <wp:docPr id="6" name="Imagem 6"/>
+            <wp:cNvGraphicFramePr>
+              <a:graphicFrameLocks xmlns:a="http://schemas.openxmlformats.org/drawingml/2006/main" noChangeAspect="1"/>
+            </wp:cNvGraphicFramePr>
+            <a:graphic xmlns:a="http://schemas.openxmlformats.org/drawingml/2006/main">
+              <a:graphicData uri="http://schemas.openxmlformats.org/drawingml/2006/picture">
+                <pic:pic xmlns:pic="http://schemas.openxmlformats.org/drawingml/2006/picture">
+                  <pic:nvPicPr>
+                    <pic:cNvPr id="1" name=""/>
+                    <pic:cNvPicPr/>
+                  </pic:nvPicPr>
+                  <pic:blipFill>
+                    <a:blip r:embed="rId10"/>
+                    <a:stretch>
+                      <a:fillRect/>
+                    </a:stretch>
+                  </pic:blipFill>
+                  <pic:spPr>
+                    <a:xfrm>
+                      <a:off x="0" y="0"/>
+                      <a:ext cx="5760085" cy="2733040"/>
+                    </a:xfrm>
+                    <a:prstGeom prst="rect">
+                      <a:avLst/>
+                    </a:prstGeom>
+                  </pic:spPr>
+                </pic:pic>
+              </a:graphicData>
+            </a:graphic>
+          </wp:inline>
+        </w:drawing>
+      </w:r>
+    </w:p>
+    <w:p>
+      <w:pPr>
+        <w:spacing w:after="0" w:line="360" w:lineRule="auto"/>
+        <w:jc w:val="both"/>
+        <w:rPr>
+          <w:rFonts w:ascii="Arial" w:eastAsia="Times New Roman" w:hAnsi="Arial" w:cs="Arial"/>
+          <w:sz w:val="24"/>
+          <w:szCs w:val="24"/>
+          <w:lang w:eastAsia="pt-BR"/>
+        </w:rPr>
+      </w:pPr>
+      <w:r>
+        <w:rPr>
+          <w:rFonts w:ascii="Arial" w:eastAsia="Times New Roman" w:hAnsi="Arial" w:cs="Arial"/>
+          <w:sz w:val="24"/>
+          <w:szCs w:val="24"/>
+          <w:lang w:eastAsia="pt-BR"/>
+        </w:rPr>
+        <w:t xml:space="preserve">Foram identificados: </w:t>
+      </w:r>
+    </w:p>
+    <w:p>
+      <w:pPr>
+        <w:pStyle w:val="PargrafodaLista"/>
+        <w:numPr>
+          <w:ilvl w:val="0"/>
+          <w:numId w:val="45"/>
+        </w:numPr>
+        <w:spacing w:after="0" w:line="360" w:lineRule="auto"/>
+        <w:jc w:val="both"/>
+        <w:rPr>
+          <w:rFonts w:ascii="Arial" w:eastAsia="Times New Roman" w:hAnsi="Arial" w:cs="Arial"/>
+          <w:sz w:val="24"/>
+          <w:szCs w:val="24"/>
+          <w:lang w:eastAsia="pt-BR"/>
+        </w:rPr>
+      </w:pPr>
+      <w:r>
+        <w:rPr>
+          <w:rFonts w:ascii="Arial" w:eastAsia="Times New Roman" w:hAnsi="Arial" w:cs="Arial"/>
+          <w:sz w:val="24"/>
+          <w:szCs w:val="24"/>
+          <w:lang w:eastAsia="pt-BR"/>
+        </w:rPr>
+        <w:t>Textos ambíguos</w:t>
+      </w:r>
+    </w:p>
+    <w:p>
+      <w:pPr>
+        <w:pStyle w:val="PargrafodaLista"/>
+        <w:numPr>
+          <w:ilvl w:val="0"/>
+          <w:numId w:val="45"/>
+        </w:numPr>
+        <w:spacing w:after="0" w:line="360" w:lineRule="auto"/>
+        <w:jc w:val="both"/>
+        <w:rPr>
+          <w:rFonts w:ascii="Arial" w:eastAsia="Times New Roman" w:hAnsi="Arial" w:cs="Arial"/>
+          <w:sz w:val="24"/>
+          <w:szCs w:val="24"/>
+          <w:lang w:eastAsia="pt-BR"/>
+        </w:rPr>
+      </w:pPr>
+      <w:r>
+        <w:rPr>
+          <w:rFonts w:ascii="Arial" w:eastAsia="Times New Roman" w:hAnsi="Arial" w:cs="Arial"/>
+          <w:sz w:val="24"/>
+          <w:szCs w:val="24"/>
+          <w:lang w:eastAsia="pt-BR"/>
+        </w:rPr>
+        <w:t>Textos muito longos</w:t>
+      </w:r>
+    </w:p>
+    <w:p>
+      <w:pPr>
+        <w:pStyle w:val="PargrafodaLista"/>
+        <w:numPr>
+          <w:ilvl w:val="0"/>
+          <w:numId w:val="45"/>
+        </w:numPr>
+        <w:spacing w:after="0" w:line="360" w:lineRule="auto"/>
+        <w:jc w:val="both"/>
+        <w:rPr>
+          <w:rFonts w:ascii="Arial" w:eastAsia="Times New Roman" w:hAnsi="Arial" w:cs="Arial"/>
+          <w:sz w:val="24"/>
+          <w:szCs w:val="24"/>
+          <w:lang w:eastAsia="pt-BR"/>
+        </w:rPr>
+      </w:pPr>
+      <w:r>
+        <w:rPr>
+          <w:rFonts w:ascii="Arial" w:eastAsia="Times New Roman" w:hAnsi="Arial" w:cs="Arial"/>
+          <w:sz w:val="24"/>
+          <w:szCs w:val="24"/>
+          <w:lang w:eastAsia="pt-BR"/>
+        </w:rPr>
+        <w:t>Fora de ordem cronológica</w:t>
+      </w:r>
+    </w:p>
+    <w:p>
+      <w:pPr>
+        <w:spacing w:after="0" w:line="360" w:lineRule="auto"/>
+        <w:jc w:val="both"/>
+        <w:rPr>
+          <w:rFonts w:ascii="Arial" w:eastAsia="Times New Roman" w:hAnsi="Arial" w:cs="Arial"/>
+          <w:sz w:val="24"/>
+          <w:szCs w:val="24"/>
+          <w:lang w:eastAsia="pt-BR"/>
+        </w:rPr>
+      </w:pPr>
+    </w:p>
+    <w:p>
+      <w:pPr>
+        <w:spacing w:after="0" w:line="360" w:lineRule="auto"/>
+        <w:jc w:val="both"/>
+        <w:rPr>
+          <w:rFonts w:ascii="Arial" w:eastAsia="Times New Roman" w:hAnsi="Arial" w:cs="Arial"/>
+          <w:sz w:val="24"/>
+          <w:szCs w:val="24"/>
+          <w:lang w:eastAsia="pt-BR"/>
+        </w:rPr>
+      </w:pPr>
+      <w:r>
+        <w:rPr>
+          <w:rFonts w:ascii="Arial" w:eastAsia="Times New Roman" w:hAnsi="Arial" w:cs="Arial"/>
+          <w:sz w:val="24"/>
+          <w:szCs w:val="24"/>
+          <w:lang w:eastAsia="pt-BR"/>
+        </w:rPr>
+        <w:t>- PARA Y:</w:t>
+      </w:r>
+    </w:p>
+    <w:p>
+      <w:pPr>
+        <w:spacing w:after="0" w:line="360" w:lineRule="auto"/>
+        <w:jc w:val="both"/>
+        <w:rPr>
+          <w:rFonts w:ascii="Arial" w:eastAsia="Times New Roman" w:hAnsi="Arial" w:cs="Arial"/>
+          <w:sz w:val="24"/>
+          <w:szCs w:val="24"/>
+          <w:lang w:eastAsia="pt-BR"/>
+        </w:rPr>
+      </w:pPr>
+      <w:r>
+        <w:rPr>
+          <w:rFonts w:ascii="Arial" w:eastAsia="Times New Roman" w:hAnsi="Arial" w:cs="Arial"/>
+          <w:sz w:val="24"/>
+          <w:szCs w:val="24"/>
+          <w:lang w:eastAsia="pt-BR"/>
+        </w:rPr>
+        <w:lastRenderedPageBreak/>
+        <w:drawing>
+          <wp:inline distT="0" distB="0" distL="0" distR="0" wp14:anchorId="7EBB7979" wp14:editId="793014D5">
+            <wp:extent cx="5572903" cy="7983064"/>
+            <wp:effectExtent l="0" t="0" r="8890" b="0"/>
+            <wp:docPr id="10" name="Imagem 10"/>
+            <wp:cNvGraphicFramePr>
+              <a:graphicFrameLocks xmlns:a="http://schemas.openxmlformats.org/drawingml/2006/main" noChangeAspect="1"/>
+            </wp:cNvGraphicFramePr>
+            <a:graphic xmlns:a="http://schemas.openxmlformats.org/drawingml/2006/main">
+              <a:graphicData uri="http://schemas.openxmlformats.org/drawingml/2006/picture">
+                <pic:pic xmlns:pic="http://schemas.openxmlformats.org/drawingml/2006/picture">
+                  <pic:nvPicPr>
+                    <pic:cNvPr id="1" name=""/>
+                    <pic:cNvPicPr/>
+                  </pic:nvPicPr>
+                  <pic:blipFill>
+                    <a:blip r:embed="rId11"/>
+                    <a:stretch>
+                      <a:fillRect/>
+                    </a:stretch>
+                  </pic:blipFill>
+                  <pic:spPr>
+                    <a:xfrm>
+                      <a:off x="0" y="0"/>
+                      <a:ext cx="5572903" cy="7983064"/>
+                    </a:xfrm>
+                    <a:prstGeom prst="rect">
+                      <a:avLst/>
+                    </a:prstGeom>
+                  </pic:spPr>
+                </pic:pic>
+              </a:graphicData>
+            </a:graphic>
+          </wp:inline>
+        </w:drawing>
+      </w:r>
+    </w:p>
+    <w:p>
+      <w:pPr>
+        <w:spacing w:after="0" w:line="360" w:lineRule="auto"/>
+        <w:jc w:val="both"/>
+        <w:rPr>
+          <w:rFonts w:ascii="Arial" w:eastAsia="Times New Roman" w:hAnsi="Arial" w:cs="Arial"/>
+          <w:sz w:val="24"/>
+          <w:szCs w:val="24"/>
+          <w:lang w:eastAsia="pt-BR"/>
+        </w:rPr>
+      </w:pPr>
+      <w:r>
+        <w:rPr>
+          <w:rFonts w:ascii="Arial" w:eastAsia="Times New Roman" w:hAnsi="Arial" w:cs="Arial"/>
+          <w:sz w:val="24"/>
+          <w:szCs w:val="24"/>
+          <w:lang w:eastAsia="pt-BR"/>
+        </w:rPr>
+        <w:lastRenderedPageBreak/>
+        <w:drawing>
+          <wp:inline distT="0" distB="0" distL="0" distR="0" wp14:anchorId="56546FB6" wp14:editId="004E8385">
+            <wp:extent cx="5582429" cy="7906853"/>
+            <wp:effectExtent l="0" t="0" r="0" b="0"/>
+            <wp:docPr id="11" name="Imagem 11"/>
+            <wp:cNvGraphicFramePr>
+              <a:graphicFrameLocks xmlns:a="http://schemas.openxmlformats.org/drawingml/2006/main" noChangeAspect="1"/>
+            </wp:cNvGraphicFramePr>
+            <a:graphic xmlns:a="http://schemas.openxmlformats.org/drawingml/2006/main">
+              <a:graphicData uri="http://schemas.openxmlformats.org/drawingml/2006/picture">
+                <pic:pic xmlns:pic="http://schemas.openxmlformats.org/drawingml/2006/picture">
+                  <pic:nvPicPr>
+                    <pic:cNvPr id="1" name=""/>
+                    <pic:cNvPicPr/>
+                  </pic:nvPicPr>
+                  <pic:blipFill>
+                    <a:blip r:embed="rId12"/>
+                    <a:stretch>
+                      <a:fillRect/>
+                    </a:stretch>
+                  </pic:blipFill>
+                  <pic:spPr>
+                    <a:xfrm>
+                      <a:off x="0" y="0"/>
+                      <a:ext cx="5582429" cy="7906853"/>
+                    </a:xfrm>
+                    <a:prstGeom prst="rect">
+                      <a:avLst/>
+                    </a:prstGeom>
+                  </pic:spPr>
+                </pic:pic>
+              </a:graphicData>
+            </a:graphic>
+          </wp:inline>
+        </w:drawing>
+      </w:r>
+    </w:p>
+    <w:p>
+      <w:pPr>
+        <w:spacing w:after="0" w:line="360" w:lineRule="auto"/>
+        <w:jc w:val="both"/>
+        <w:rPr>
+          <w:rFonts w:ascii="Arial" w:eastAsia="Times New Roman" w:hAnsi="Arial" w:cs="Arial"/>
+          <w:sz w:val="24"/>
+          <w:szCs w:val="24"/>
+          <w:lang w:eastAsia="pt-BR"/>
+        </w:rPr>
+      </w:pPr>
+      <w:r>
+        <w:rPr>
+          <w:rFonts w:ascii="Arial" w:eastAsia="Times New Roman" w:hAnsi="Arial" w:cs="Arial"/>
+          <w:sz w:val="24"/>
+          <w:szCs w:val="24"/>
+          <w:lang w:eastAsia="pt-BR"/>
+        </w:rPr>
+        <w:lastRenderedPageBreak/>
+        <w:drawing>
+          <wp:inline distT="0" distB="0" distL="0" distR="0" wp14:anchorId="0343B659" wp14:editId="57B72B1A">
+            <wp:extent cx="5591955" cy="7916380"/>
+            <wp:effectExtent l="0" t="0" r="8890" b="8890"/>
+            <wp:docPr id="13" name="Imagem 13"/>
+            <wp:cNvGraphicFramePr>
+              <a:graphicFrameLocks xmlns:a="http://schemas.openxmlformats.org/drawingml/2006/main" noChangeAspect="1"/>
+            </wp:cNvGraphicFramePr>
+            <a:graphic xmlns:a="http://schemas.openxmlformats.org/drawingml/2006/main">
+              <a:graphicData uri="http://schemas.openxmlformats.org/drawingml/2006/picture">
+                <pic:pic xmlns:pic="http://schemas.openxmlformats.org/drawingml/2006/picture">
+                  <pic:nvPicPr>
+                    <pic:cNvPr id="1" name=""/>
+                    <pic:cNvPicPr/>
+                  </pic:nvPicPr>
+                  <pic:blipFill>
+                    <a:blip r:embed="rId13"/>
+                    <a:stretch>
+                      <a:fillRect/>
+                    </a:stretch>
+                  </pic:blipFill>
+                  <pic:spPr>
+                    <a:xfrm>
+                      <a:off x="0" y="0"/>
+                      <a:ext cx="5591955" cy="7916380"/>
+                    </a:xfrm>
+                    <a:prstGeom prst="rect">
+                      <a:avLst/>
+                    </a:prstGeom>
+                  </pic:spPr>
+                </pic:pic>
+              </a:graphicData>
+            </a:graphic>
+          </wp:inline>
+        </w:drawing>
+      </w:r>
+    </w:p>
+    <w:p>
+      <w:pPr>
+        <w:spacing w:after="0" w:line="360" w:lineRule="auto"/>
+        <w:jc w:val="both"/>
+        <w:rPr>
+          <w:rFonts w:ascii="Arial" w:eastAsia="Times New Roman" w:hAnsi="Arial" w:cs="Arial"/>
+          <w:sz w:val="24"/>
+          <w:szCs w:val="24"/>
+          <w:lang w:eastAsia="pt-BR"/>
+        </w:rPr>
+      </w:pPr>
+    </w:p>
+    <w:p>
+      <w:pPr>
+        <w:spacing w:after="0" w:line="360" w:lineRule="auto"/>
+        <w:rPr>
+          <w:rFonts w:ascii="Arial" w:eastAsia="Times New Roman" w:hAnsi="Arial" w:cs="Arial"/>
+          <w:sz w:val="24"/>
+          <w:szCs w:val="24"/>
+          <w:lang w:eastAsia="pt-BR"/>
+        </w:rPr>
+      </w:pPr>
+    </w:p>
+    <w:p>
+      <w:pPr>
+        <w:spacing w:after="0" w:line="360" w:lineRule="auto"/>
+        <w:rPr>
+          <w:rFonts w:ascii="Arial" w:eastAsia="Times New Roman" w:hAnsi="Arial" w:cs="Arial"/>
+          <w:sz w:val="24"/>
+          <w:szCs w:val="24"/>
+          <w:lang w:eastAsia="pt-BR"/>
+        </w:rPr>
+      </w:pPr>
+    </w:p>
+    <w:p>
+      <w:pPr>
+        <w:spacing w:after="0" w:line="360" w:lineRule="auto"/>
+        <w:rPr>
+          <w:rFonts w:ascii="Arial" w:eastAsia="Times New Roman" w:hAnsi="Arial" w:cs="Arial"/>
+          <w:sz w:val="24"/>
+          <w:szCs w:val="24"/>
+          <w:lang w:eastAsia="pt-BR"/>
+        </w:rPr>
+      </w:pPr>
+      <w:r>
+        <w:rPr>
+          <w:rFonts w:ascii="Arial" w:eastAsia="Times New Roman" w:hAnsi="Arial" w:cs="Arial"/>
+          <w:sz w:val="24"/>
+          <w:szCs w:val="24"/>
+          <w:lang w:eastAsia="pt-BR"/>
+        </w:rPr>
+        <w:lastRenderedPageBreak/>
+        <w:t>Resultando em:</w:t>
+      </w:r>
+    </w:p>
+    <w:p>
+      <w:pPr>
+        <w:pStyle w:val="PargrafodaLista"/>
+        <w:numPr>
+          <w:ilvl w:val="0"/>
+          <w:numId w:val="46"/>
+        </w:numPr>
+        <w:spacing w:after="0" w:line="360" w:lineRule="auto"/>
+        <w:rPr>
+          <w:rFonts w:ascii="Arial" w:eastAsia="Times New Roman" w:hAnsi="Arial" w:cs="Arial"/>
+          <w:bCs/>
+          <w:sz w:val="24"/>
+          <w:szCs w:val="24"/>
+          <w:lang w:eastAsia="pt-BR"/>
+        </w:rPr>
+      </w:pPr>
+      <w:r>
+        <w:rPr>
+          <w:rFonts w:ascii="Arial" w:eastAsia="Times New Roman" w:hAnsi="Arial" w:cs="Arial"/>
+          <w:bCs/>
+          <w:sz w:val="24"/>
+          <w:szCs w:val="24"/>
+          <w:lang w:eastAsia="pt-BR"/>
+        </w:rPr>
+        <w:t>Textos mais objetivos</w:t>
+      </w:r>
+    </w:p>
+    <w:p>
+      <w:pPr>
+        <w:pStyle w:val="PargrafodaLista"/>
+        <w:numPr>
+          <w:ilvl w:val="0"/>
+          <w:numId w:val="46"/>
+        </w:numPr>
+        <w:spacing w:after="0" w:line="360" w:lineRule="auto"/>
+        <w:rPr>
+          <w:rFonts w:ascii="Arial" w:eastAsia="Times New Roman" w:hAnsi="Arial" w:cs="Arial"/>
+          <w:bCs/>
+          <w:sz w:val="24"/>
+          <w:szCs w:val="24"/>
+          <w:lang w:eastAsia="pt-BR"/>
+        </w:rPr>
+      </w:pPr>
+      <w:r>
+        <w:rPr>
+          <w:rFonts w:ascii="Arial" w:eastAsia="Times New Roman" w:hAnsi="Arial" w:cs="Arial"/>
+          <w:bCs/>
+          <w:sz w:val="24"/>
+          <w:szCs w:val="24"/>
+          <w:lang w:eastAsia="pt-BR"/>
+        </w:rPr>
+        <w:t>Ordem cronológica correta</w:t>
+      </w:r>
+    </w:p>
+    <w:p>
+      <w:pPr>
+        <w:spacing w:after="0" w:line="360" w:lineRule="auto"/>
+        <w:rPr>
+          <w:rFonts w:ascii="Arial" w:eastAsia="Times New Roman" w:hAnsi="Arial" w:cs="Arial"/>
+          <w:b/>
+          <w:bCs/>
+          <w:sz w:val="24"/>
           <w:szCs w:val="24"/>
           <w:lang w:eastAsia="pt-BR"/>
         </w:rPr>
@@ -3734,7 +4412,6 @@
           <w:szCs w:val="24"/>
           <w:lang w:eastAsia="pt-BR"/>
         </w:rPr>
-        <w:lastRenderedPageBreak/>
         <w:t>Diversificação de</w:t>
       </w:r>
       <w:r>
@@ -3837,7 +4514,18 @@
           <w:szCs w:val="24"/>
           <w:lang w:eastAsia="pt-BR"/>
         </w:rPr>
-        <w:t>Enquanto o escopo atual concentra-se nas fases de Análise, Design, Desenvolvimento e Implementação (ADDI), o projeto global visa a integração plena da fase de Avaliação (Evaluation). Isso envolve a coleta de dados de Learning Analytics para medir, de forma quantitativa e qualitativa, a eficácia das adaptações no desempenho escolar dos alunos, permitindo uma retroalimentação constante do "motor pedagógico" da IA.</w:t>
+        <w:t xml:space="preserve">Enquanto o escopo atual concentra-se nas fases de Análise, Design, Desenvolvimento e Implementação (ADDI), o projeto global visa a integração plena da fase de </w:t>
+      </w:r>
+      <w:r>
+        <w:rPr>
+          <w:rFonts w:ascii="Arial" w:eastAsia="Times New Roman" w:hAnsi="Arial" w:cs="Arial"/>
+          <w:bCs/>
+          <w:sz w:val="24"/>
+          <w:szCs w:val="24"/>
+          <w:lang w:eastAsia="pt-BR"/>
+        </w:rPr>
+        <w:lastRenderedPageBreak/>
+        <w:t>Avaliação (Evaluation). Isso envolve a coleta de dados de Learning Analytics para medir, de forma quantitativa e qualitativa, a eficácia das adaptações no desempenho escolar dos alunos, permitindo uma retroalimentação constante do "motor pedagógico" da IA.</w:t>
       </w:r>
     </w:p>
     <w:p>
@@ -3900,19 +4588,7 @@
           <w:szCs w:val="24"/>
           <w:lang w:eastAsia="pt-BR"/>
         </w:rPr>
-        <w:t>: O projeto prevê, em futuras versões, a expansão do motor pedagógico para suportar disciplinas de Exatas (Matemática, Física e Química). Isso envolverá o desenvolvimento de algoritmos capazes de realizar a adaptaç</w:t>
-      </w:r>
-      <w:bookmarkStart w:id="0" w:name="_GoBack"/>
-      <w:bookmarkEnd w:id="0"/>
-      <w:r>
-        <w:rPr>
-          <w:rFonts w:ascii="Arial" w:eastAsia="Times New Roman" w:hAnsi="Arial" w:cs="Arial"/>
-          <w:bCs/>
-          <w:sz w:val="24"/>
-          <w:szCs w:val="24"/>
-          <w:lang w:eastAsia="pt-BR"/>
-        </w:rPr>
-        <w:t>ão de notações matemáticas, simplificação de fórmulas e acessibilidade para gráficos e equações, garantindo que o suporte do TEA Learn se torne verdadeiramente multidisciplinar.</w:t>
+        <w:t>: O projeto prevê, em futuras versões, a expansão do motor pedagógico para suportar disciplinas de Exatas (Matemática, Física e Química). Isso envolverá o desenvolvimento de algoritmos capazes de realizar a adaptação de notações matemáticas, simplificação de fórmulas e acessibilidade para gráficos e equações, garantindo que o suporte do TEA Learn se torne verdadeiramente multidisciplinar.</w:t>
       </w:r>
     </w:p>
     <w:p>
@@ -4014,18 +4690,7 @@
           <w:szCs w:val="24"/>
           <w:lang w:eastAsia="pt-BR"/>
         </w:rPr>
-        <w:t xml:space="preserve">: A plataforma evoluirá para registrar o histórico de adaptações e o desempenho do aluno em materiais anteriores. Com base nestes dados e nas indicações pedagógicas (oriundas de laudos e observação docente), a IA sugerirá automaticamente ao </w:t>
-      </w:r>
-      <w:r>
-        <w:rPr>
-          <w:rFonts w:ascii="Arial" w:eastAsia="Times New Roman" w:hAnsi="Arial" w:cs="Arial"/>
-          <w:bCs/>
-          <w:sz w:val="24"/>
-          <w:szCs w:val="24"/>
-          <w:lang w:eastAsia="pt-BR"/>
-        </w:rPr>
-        <w:lastRenderedPageBreak/>
-        <w:t>professor quais parâmetros de adaptação serão mais eficazes para aquele aluno, refinando o "motor pedagógico" continuamente.</w:t>
+        <w:t>: A plataforma evoluirá para registrar o histórico de adaptações e o desempenho do aluno em materiais anteriores. Com base nestes dados e nas indicações pedagógicas (oriundas de laudos e observação docente), a IA sugerirá automaticamente ao professor quais parâmetros de adaptação serão mais eficazes para aquele aluno, refinando o "motor pedagógico" continuamente.</w:t>
       </w:r>
     </w:p>
     <w:p>
@@ -4215,6 +4880,7 @@
           <w:szCs w:val="24"/>
           <w:lang w:eastAsia="pt-BR"/>
         </w:rPr>
+        <w:lastRenderedPageBreak/>
         <w:t>Expansão para outros níveis de suporte</w:t>
       </w:r>
       <w:r>
@@ -4568,7 +5234,6 @@
           <w:szCs w:val="24"/>
           <w:lang w:eastAsia="pt-BR"/>
         </w:rPr>
-        <w:lastRenderedPageBreak/>
         <w:t>Regras Pedagógicas:</w:t>
       </w:r>
       <w:r>
@@ -4838,6 +5503,7 @@
           <w:szCs w:val="24"/>
           <w:lang w:eastAsia="pt-BR"/>
         </w:rPr>
+        <w:lastRenderedPageBreak/>
         <w:t>"O TEA Learn automatiza a adaptação de conteúdos para garant</w:t>
       </w:r>
       <w:r>
@@ -5091,7 +5757,6 @@
           <w:sz w:val="24"/>
           <w:szCs w:val="24"/>
         </w:rPr>
-        <w:lastRenderedPageBreak/>
         <w:t>Rotinas e Agendas Visuais</w:t>
       </w:r>
       <w:r>
@@ -5256,6 +5921,7 @@
           <w:sz w:val="24"/>
           <w:szCs w:val="24"/>
         </w:rPr>
+        <w:lastRenderedPageBreak/>
         <w:t>Comunicação</w:t>
       </w:r>
       <w:r>
@@ -5630,7 +6296,6 @@
           <w:szCs w:val="24"/>
           <w:lang w:eastAsia="pt-BR"/>
         </w:rPr>
-        <w:lastRenderedPageBreak/>
         <w:t>Análise Funcional:</w:t>
       </w:r>
       <w:r>
@@ -5850,6 +6515,7 @@
           <w:szCs w:val="24"/>
           <w:lang w:eastAsia="pt-BR"/>
         </w:rPr>
+        <w:lastRenderedPageBreak/>
         <w:t>Habilidades Sociais:</w:t>
       </w:r>
       <w:r>
@@ -6130,7 +6796,6 @@
           <w:szCs w:val="24"/>
           <w:lang w:eastAsia="pt-BR"/>
         </w:rPr>
-        <w:lastRenderedPageBreak/>
         <w:t xml:space="preserve">Esses níveis não medem inteligência, apenas o </w:t>
       </w:r>
       <w:r>
@@ -6291,6 +6956,7 @@
           <w:szCs w:val="24"/>
           <w:lang w:eastAsia="pt-BR"/>
         </w:rPr>
+        <w:lastRenderedPageBreak/>
         <w:t>A DI também é classificada em graus: leve, moderada, grave ou profunda, dependendo do quanto a pessoa consegue aplicar o que sabe na prática (como cuidar da higiene, usar dinheiro ou se locomover com segurança).</w:t>
       </w:r>
     </w:p>
@@ -6512,16 +7178,7 @@
           <w:sz w:val="24"/>
           <w:szCs w:val="24"/>
         </w:rPr>
-        <w:t xml:space="preserve">, o material didático original é examinado para identificar problemas de acessibilidade, como linguagem complexa, excesso de informação ou abstração. Também são consideradas características do </w:t>
-      </w:r>
-      <w:r>
-        <w:rPr>
-          <w:rFonts w:ascii="Arial" w:hAnsi="Arial" w:cs="Arial"/>
-          <w:sz w:val="24"/>
-          <w:szCs w:val="24"/>
-        </w:rPr>
-        <w:lastRenderedPageBreak/>
-        <w:t>TEA nível 1, como a preferência por clareza, dificuldade com ambiguidade e necessidade de estrutura. O resultado dessa fase é uma lista de requisitos de adaptação.</w:t>
+        <w:t>, o material didático original é examinado para identificar problemas de acessibilidade, como linguagem complexa, excesso de informação ou abstração. Também são consideradas características do TEA nível 1, como a preferência por clareza, dificuldade com ambiguidade e necessidade de estrutura. O resultado dessa fase é uma lista de requisitos de adaptação.</w:t>
       </w:r>
     </w:p>
     <w:p>
@@ -6599,7 +7256,16 @@
           <w:sz w:val="24"/>
           <w:szCs w:val="24"/>
         </w:rPr>
-        <w:t>, a inteligência artificial aplica essas regras ao material original. O processamento envolve simplificação de texto, segmentação do conteúdo, reorganização lógica, geração de exemplos e destaque de conceitos-chave. O resultado é o material adaptado.</w:t>
+        <w:t xml:space="preserve">, a inteligência artificial aplica essas regras ao material original. O processamento envolve simplificação de texto, </w:t>
+      </w:r>
+      <w:r>
+        <w:rPr>
+          <w:rFonts w:ascii="Arial" w:hAnsi="Arial" w:cs="Arial"/>
+          <w:sz w:val="24"/>
+          <w:szCs w:val="24"/>
+        </w:rPr>
+        <w:lastRenderedPageBreak/>
+        <w:t>segmentação do conteúdo, reorganização lógica, geração de exemplos e destaque de conceitos-chave. O resultado é o material adaptado.</w:t>
       </w:r>
     </w:p>
     <w:p>
@@ -6894,7 +7560,6 @@
           <w:sz w:val="24"/>
           <w:szCs w:val="24"/>
         </w:rPr>
-        <w:lastRenderedPageBreak/>
         <w:t xml:space="preserve">Seu objetivo é </w:t>
       </w:r>
       <w:r>
@@ -7058,6 +7723,7 @@
           <w:sz w:val="24"/>
           <w:szCs w:val="24"/>
         </w:rPr>
+        <w:lastRenderedPageBreak/>
         <w:t>Relação com o TEA</w:t>
       </w:r>
     </w:p>
@@ -7448,16 +8114,7 @@
           <w:sz w:val="24"/>
           <w:szCs w:val="24"/>
         </w:rPr>
-        <w:t xml:space="preserve">O estudo de Valério e Bigoli (2021) indica que o design de interfaces para pessoas com TEA deve priorizar a redução da sobrecarga sensorial através de layouts </w:t>
-      </w:r>
-      <w:r>
-        <w:rPr>
-          <w:rFonts w:ascii="Arial" w:hAnsi="Arial" w:cs="Arial"/>
-          <w:sz w:val="24"/>
-          <w:szCs w:val="24"/>
-        </w:rPr>
-        <w:lastRenderedPageBreak/>
-        <w:t>limpos, previsíveis e com uso de cores suaves ou tons pastéis. A pesquisa enfatiza a necessidade de evitar contrastes agressivos e animações excessivas, optando por padronização visual para facilitar o foco e a navegação.</w:t>
+        <w:t>O estudo de Valério e Bigoli (2021) indica que o design de interfaces para pessoas com TEA deve priorizar a redução da sobrecarga sensorial através de layouts limpos, previsíveis e com uso de cores suaves ou tons pastéis. A pesquisa enfatiza a necessidade de evitar contrastes agressivos e animações excessivas, optando por padronização visual para facilitar o foco e a navegação.</w:t>
       </w:r>
     </w:p>
     <w:p>
@@ -7522,7 +8179,7 @@
                     <pic:cNvPicPr/>
                   </pic:nvPicPr>
                   <pic:blipFill>
-                    <a:blip r:embed="rId8">
+                    <a:blip r:embed="rId14">
                       <a:extLst>
                         <a:ext uri="{28A0092B-C50C-407E-A947-70E740481C1C}">
                           <a14:useLocalDpi xmlns:a14="http://schemas.microsoft.com/office/drawing/2010/main" val="0"/>
@@ -7594,6 +8251,7 @@
           <w:szCs w:val="24"/>
           <w:lang w:eastAsia="pt-BR"/>
         </w:rPr>
+        <w:lastRenderedPageBreak/>
         <w:drawing>
           <wp:inline distT="0" distB="0" distL="0" distR="0" wp14:anchorId="3829F526" wp14:editId="65B4DE1A">
             <wp:extent cx="5760085" cy="1601470"/>
@@ -7610,7 +8268,7 @@
                     <pic:cNvPicPr/>
                   </pic:nvPicPr>
                   <pic:blipFill>
-                    <a:blip r:embed="rId9" cstate="print">
+                    <a:blip r:embed="rId15" cstate="print">
                       <a:extLst>
                         <a:ext uri="{28A0092B-C50C-407E-A947-70E740481C1C}">
                           <a14:useLocalDpi xmlns:a14="http://schemas.microsoft.com/office/drawing/2010/main" val="0"/>
@@ -7688,7 +8346,7 @@
                     <pic:cNvPicPr/>
                   </pic:nvPicPr>
                   <pic:blipFill>
-                    <a:blip r:embed="rId10">
+                    <a:blip r:embed="rId16">
                       <a:extLst>
                         <a:ext uri="{28A0092B-C50C-407E-A947-70E740481C1C}">
                           <a14:useLocalDpi xmlns:a14="http://schemas.microsoft.com/office/drawing/2010/main" val="0"/>
@@ -7800,7 +8458,6 @@
           <w:szCs w:val="24"/>
           <w:lang w:eastAsia="pt-BR"/>
         </w:rPr>
-        <w:lastRenderedPageBreak/>
         <w:drawing>
           <wp:inline distT="0" distB="0" distL="0" distR="0" wp14:anchorId="451C36C7" wp14:editId="60466870">
             <wp:extent cx="5760085" cy="1310640"/>
@@ -7817,7 +8474,7 @@
                     <pic:cNvPicPr/>
                   </pic:nvPicPr>
                   <pic:blipFill>
-                    <a:blip r:embed="rId11">
+                    <a:blip r:embed="rId17">
                       <a:extLst>
                         <a:ext uri="{28A0092B-C50C-407E-A947-70E740481C1C}">
                           <a14:useLocalDpi xmlns:a14="http://schemas.microsoft.com/office/drawing/2010/main" val="0"/>
@@ -7899,6 +8556,7 @@
           <w:szCs w:val="24"/>
           <w:lang w:eastAsia="pt-BR"/>
         </w:rPr>
+        <w:lastRenderedPageBreak/>
         <w:drawing>
           <wp:inline distT="0" distB="0" distL="0" distR="0" wp14:anchorId="1BCC38CD" wp14:editId="0873A75E">
             <wp:extent cx="5760085" cy="5098415"/>
@@ -7915,7 +8573,7 @@
                     <pic:cNvPicPr/>
                   </pic:nvPicPr>
                   <pic:blipFill>
-                    <a:blip r:embed="rId12">
+                    <a:blip r:embed="rId18">
                       <a:extLst>
                         <a:ext uri="{28A0092B-C50C-407E-A947-70E740481C1C}">
                           <a14:useLocalDpi xmlns:a14="http://schemas.microsoft.com/office/drawing/2010/main" val="0"/>
@@ -8107,6 +8765,7 @@
           <w:szCs w:val="24"/>
           <w:lang w:eastAsia="pt-BR"/>
         </w:rPr>
+        <w:lastRenderedPageBreak/>
         <w:drawing>
           <wp:inline distT="0" distB="0" distL="0" distR="0" wp14:anchorId="1E879A4A" wp14:editId="17C21682">
             <wp:extent cx="5760085" cy="4335780"/>
@@ -8123,7 +8782,7 @@
                     <pic:cNvPicPr/>
                   </pic:nvPicPr>
                   <pic:blipFill>
-                    <a:blip r:embed="rId13" cstate="print">
+                    <a:blip r:embed="rId19" cstate="print">
                       <a:extLst>
                         <a:ext uri="{28A0092B-C50C-407E-A947-70E740481C1C}">
                           <a14:useLocalDpi xmlns:a14="http://schemas.microsoft.com/office/drawing/2010/main" val="0"/>
@@ -8195,7 +8854,6 @@
           <w:szCs w:val="24"/>
           <w:lang w:eastAsia="pt-BR"/>
         </w:rPr>
-        <w:lastRenderedPageBreak/>
         <w:drawing>
           <wp:inline distT="0" distB="0" distL="0" distR="0" wp14:anchorId="5E535A85" wp14:editId="1CF6D136">
             <wp:extent cx="4857750" cy="3520542"/>
@@ -8212,7 +8870,7 @@
                     <pic:cNvPicPr/>
                   </pic:nvPicPr>
                   <pic:blipFill>
-                    <a:blip r:embed="rId14" cstate="print">
+                    <a:blip r:embed="rId20" cstate="print">
                       <a:extLst>
                         <a:ext uri="{28A0092B-C50C-407E-A947-70E740481C1C}">
                           <a14:useLocalDpi xmlns:a14="http://schemas.microsoft.com/office/drawing/2010/main" val="0"/>
@@ -8630,13 +9288,27 @@
           <w:szCs w:val="24"/>
         </w:rPr>
       </w:pPr>
-      <w:r>
-        <w:rPr>
-          <w:rFonts w:ascii="Arial" w:hAnsi="Arial" w:cs="Arial"/>
-          <w:b/>
-          <w:sz w:val="24"/>
-          <w:szCs w:val="24"/>
-        </w:rPr>
+      <w:bookmarkStart w:id="0" w:name="_GoBack"/>
+      <w:bookmarkEnd w:id="0"/>
+    </w:p>
+    <w:p>
+      <w:pPr>
+        <w:spacing w:after="0" w:line="360" w:lineRule="auto"/>
+        <w:rPr>
+          <w:rFonts w:ascii="Arial" w:hAnsi="Arial" w:cs="Arial"/>
+          <w:b/>
+          <w:sz w:val="24"/>
+          <w:szCs w:val="24"/>
+        </w:rPr>
+      </w:pPr>
+      <w:r>
+        <w:rPr>
+          <w:rFonts w:ascii="Arial" w:hAnsi="Arial" w:cs="Arial"/>
+          <w:b/>
+          <w:sz w:val="24"/>
+          <w:szCs w:val="24"/>
+        </w:rPr>
+        <w:lastRenderedPageBreak/>
         <w:t>Bibliografia</w:t>
       </w:r>
     </w:p>
@@ -8680,7 +9352,7 @@
           <w:szCs w:val="24"/>
         </w:rPr>
       </w:pPr>
-      <w:hyperlink r:id="rId15" w:history="1">
+      <w:hyperlink r:id="rId21" w:history="1">
         <w:r>
           <w:rPr>
             <w:rStyle w:val="Hyperlink"/>
@@ -8732,7 +9404,7 @@
           <w:szCs w:val="24"/>
         </w:rPr>
       </w:pPr>
-      <w:hyperlink r:id="rId16" w:history="1">
+      <w:hyperlink r:id="rId22" w:history="1">
         <w:r>
           <w:rPr>
             <w:rStyle w:val="Hyperlink"/>
@@ -8766,7 +9438,7 @@
           <w:szCs w:val="24"/>
         </w:rPr>
       </w:pPr>
-      <w:hyperlink r:id="rId17" w:history="1">
+      <w:hyperlink r:id="rId23" w:history="1">
         <w:r>
           <w:rPr>
             <w:rStyle w:val="Hyperlink"/>
@@ -8818,7 +9490,7 @@
           <w:szCs w:val="24"/>
         </w:rPr>
       </w:pPr>
-      <w:hyperlink r:id="rId18" w:history="1">
+      <w:hyperlink r:id="rId24" w:history="1">
         <w:r>
           <w:rPr>
             <w:rStyle w:val="Hyperlink"/>
@@ -8852,7 +9524,7 @@
           <w:szCs w:val="24"/>
         </w:rPr>
       </w:pPr>
-      <w:hyperlink r:id="rId19" w:history="1">
+      <w:hyperlink r:id="rId25" w:history="1">
         <w:r>
           <w:rPr>
             <w:rStyle w:val="Hyperlink"/>
@@ -8904,7 +9576,7 @@
           <w:szCs w:val="24"/>
         </w:rPr>
       </w:pPr>
-      <w:hyperlink r:id="rId20" w:history="1">
+      <w:hyperlink r:id="rId26" w:history="1">
         <w:r>
           <w:rPr>
             <w:rStyle w:val="Hyperlink"/>
@@ -8963,7 +9635,7 @@
         </w:rPr>
         <w:tab/>
       </w:r>
-      <w:hyperlink r:id="rId21" w:history="1">
+      <w:hyperlink r:id="rId27" w:history="1">
         <w:r>
           <w:rPr>
             <w:rStyle w:val="Hyperlink"/>
@@ -9011,10 +9683,9 @@
           <w:sz w:val="24"/>
           <w:szCs w:val="24"/>
         </w:rPr>
-        <w:lastRenderedPageBreak/>
         <w:t xml:space="preserve">Diagrama de Gantt: </w:t>
       </w:r>
-      <w:hyperlink r:id="rId22" w:history="1">
+      <w:hyperlink r:id="rId28" w:history="1">
         <w:r>
           <w:rPr>
             <w:rStyle w:val="Hyperlink"/>
@@ -9069,7 +9740,7 @@
         </w:rPr>
         <w:t xml:space="preserve">: </w:t>
       </w:r>
-      <w:hyperlink r:id="rId23" w:history="1">
+      <w:hyperlink r:id="rId29" w:history="1">
         <w:r>
           <w:rPr>
             <w:rStyle w:val="Hyperlink"/>
@@ -9134,7 +9805,7 @@
         </w:rPr>
         <w:tab/>
       </w:r>
-      <w:hyperlink r:id="rId24" w:history="1">
+      <w:hyperlink r:id="rId30" w:history="1">
         <w:r>
           <w:rPr>
             <w:rStyle w:val="Hyperlink"/>
@@ -11661,6 +12332,119 @@
     </w:lvl>
   </w:abstractNum>
   <w:abstractNum w:abstractNumId="19" w15:restartNumberingAfterBreak="0">
+    <w:nsid w:val="211319F5"/>
+    <w:multiLevelType w:val="hybridMultilevel"/>
+    <w:tmpl w:val="F8F6BB62"/>
+    <w:lvl w:ilvl="0" w:tplc="04160001">
+      <w:start w:val="1"/>
+      <w:numFmt w:val="bullet"/>
+      <w:lvlText w:val=""/>
+      <w:lvlJc w:val="left"/>
+      <w:pPr>
+        <w:ind w:left="720" w:hanging="360"/>
+      </w:pPr>
+      <w:rPr>
+        <w:rFonts w:ascii="Symbol" w:hAnsi="Symbol" w:hint="default"/>
+      </w:rPr>
+    </w:lvl>
+    <w:lvl w:ilvl="1" w:tplc="04160003" w:tentative="1">
+      <w:start w:val="1"/>
+      <w:numFmt w:val="bullet"/>
+      <w:lvlText w:val="o"/>
+      <w:lvlJc w:val="left"/>
+      <w:pPr>
+        <w:ind w:left="1440" w:hanging="360"/>
+      </w:pPr>
+      <w:rPr>
+        <w:rFonts w:ascii="Courier New" w:hAnsi="Courier New" w:cs="Courier New" w:hint="default"/>
+      </w:rPr>
+    </w:lvl>
+    <w:lvl w:ilvl="2" w:tplc="04160005" w:tentative="1">
+      <w:start w:val="1"/>
+      <w:numFmt w:val="bullet"/>
+      <w:lvlText w:val=""/>
+      <w:lvlJc w:val="left"/>
+      <w:pPr>
+        <w:ind w:left="2160" w:hanging="360"/>
+      </w:pPr>
+      <w:rPr>
+        <w:rFonts w:ascii="Wingdings" w:hAnsi="Wingdings" w:hint="default"/>
+      </w:rPr>
+    </w:lvl>
+    <w:lvl w:ilvl="3" w:tplc="04160001" w:tentative="1">
+      <w:start w:val="1"/>
+      <w:numFmt w:val="bullet"/>
+      <w:lvlText w:val=""/>
+      <w:lvlJc w:val="left"/>
+      <w:pPr>
+        <w:ind w:left="2880" w:hanging="360"/>
+      </w:pPr>
+      <w:rPr>
+        <w:rFonts w:ascii="Symbol" w:hAnsi="Symbol" w:hint="default"/>
+      </w:rPr>
+    </w:lvl>
+    <w:lvl w:ilvl="4" w:tplc="04160003" w:tentative="1">
+      <w:start w:val="1"/>
+      <w:numFmt w:val="bullet"/>
+      <w:lvlText w:val="o"/>
+      <w:lvlJc w:val="left"/>
+      <w:pPr>
+        <w:ind w:left="3600" w:hanging="360"/>
+      </w:pPr>
+      <w:rPr>
+        <w:rFonts w:ascii="Courier New" w:hAnsi="Courier New" w:cs="Courier New" w:hint="default"/>
+      </w:rPr>
+    </w:lvl>
+    <w:lvl w:ilvl="5" w:tplc="04160005" w:tentative="1">
+      <w:start w:val="1"/>
+      <w:numFmt w:val="bullet"/>
+      <w:lvlText w:val=""/>
+      <w:lvlJc w:val="left"/>
+      <w:pPr>
+        <w:ind w:left="4320" w:hanging="360"/>
+      </w:pPr>
+      <w:rPr>
+        <w:rFonts w:ascii="Wingdings" w:hAnsi="Wingdings" w:hint="default"/>
+      </w:rPr>
+    </w:lvl>
+    <w:lvl w:ilvl="6" w:tplc="04160001" w:tentative="1">
+      <w:start w:val="1"/>
+      <w:numFmt w:val="bullet"/>
+      <w:lvlText w:val=""/>
+      <w:lvlJc w:val="left"/>
+      <w:pPr>
+        <w:ind w:left="5040" w:hanging="360"/>
+      </w:pPr>
+      <w:rPr>
+        <w:rFonts w:ascii="Symbol" w:hAnsi="Symbol" w:hint="default"/>
+      </w:rPr>
+    </w:lvl>
+    <w:lvl w:ilvl="7" w:tplc="04160003" w:tentative="1">
+      <w:start w:val="1"/>
+      <w:numFmt w:val="bullet"/>
+      <w:lvlText w:val="o"/>
+      <w:lvlJc w:val="left"/>
+      <w:pPr>
+        <w:ind w:left="5760" w:hanging="360"/>
+      </w:pPr>
+      <w:rPr>
+        <w:rFonts w:ascii="Courier New" w:hAnsi="Courier New" w:cs="Courier New" w:hint="default"/>
+      </w:rPr>
+    </w:lvl>
+    <w:lvl w:ilvl="8" w:tplc="04160005" w:tentative="1">
+      <w:start w:val="1"/>
+      <w:numFmt w:val="bullet"/>
+      <w:lvlText w:val=""/>
+      <w:lvlJc w:val="left"/>
+      <w:pPr>
+        <w:ind w:left="6480" w:hanging="360"/>
+      </w:pPr>
+      <w:rPr>
+        <w:rFonts w:ascii="Wingdings" w:hAnsi="Wingdings" w:hint="default"/>
+      </w:rPr>
+    </w:lvl>
+  </w:abstractNum>
+  <w:abstractNum w:abstractNumId="20" w15:restartNumberingAfterBreak="0">
     <w:nsid w:val="2753510E"/>
     <w:multiLevelType w:val="hybridMultilevel"/>
     <w:tmpl w:val="720E1EBE"/>
@@ -11773,7 +12557,7 @@
       </w:rPr>
     </w:lvl>
   </w:abstractNum>
-  <w:abstractNum w:abstractNumId="20" w15:restartNumberingAfterBreak="0">
+  <w:abstractNum w:abstractNumId="21" w15:restartNumberingAfterBreak="0">
     <w:nsid w:val="2A763742"/>
     <w:multiLevelType w:val="multilevel"/>
     <w:tmpl w:val="429A64DE"/>
@@ -11922,7 +12706,7 @@
       </w:rPr>
     </w:lvl>
   </w:abstractNum>
-  <w:abstractNum w:abstractNumId="21" w15:restartNumberingAfterBreak="0">
+  <w:abstractNum w:abstractNumId="22" w15:restartNumberingAfterBreak="0">
     <w:nsid w:val="2AB93503"/>
     <w:multiLevelType w:val="hybridMultilevel"/>
     <w:tmpl w:val="D47C3932"/>
@@ -12035,7 +12819,7 @@
       </w:rPr>
     </w:lvl>
   </w:abstractNum>
-  <w:abstractNum w:abstractNumId="22" w15:restartNumberingAfterBreak="0">
+  <w:abstractNum w:abstractNumId="23" w15:restartNumberingAfterBreak="0">
     <w:nsid w:val="322C7902"/>
     <w:multiLevelType w:val="hybridMultilevel"/>
     <w:tmpl w:val="20EEC846"/>
@@ -12148,7 +12932,7 @@
       </w:rPr>
     </w:lvl>
   </w:abstractNum>
-  <w:abstractNum w:abstractNumId="23" w15:restartNumberingAfterBreak="0">
+  <w:abstractNum w:abstractNumId="24" w15:restartNumberingAfterBreak="0">
     <w:nsid w:val="329F3BA7"/>
     <w:multiLevelType w:val="hybridMultilevel"/>
     <w:tmpl w:val="77D48C54"/>
@@ -12261,7 +13045,7 @@
       </w:rPr>
     </w:lvl>
   </w:abstractNum>
-  <w:abstractNum w:abstractNumId="24" w15:restartNumberingAfterBreak="0">
+  <w:abstractNum w:abstractNumId="25" w15:restartNumberingAfterBreak="0">
     <w:nsid w:val="34571A1B"/>
     <w:multiLevelType w:val="hybridMultilevel"/>
     <w:tmpl w:val="522E43AC"/>
@@ -12374,7 +13158,7 @@
       </w:rPr>
     </w:lvl>
   </w:abstractNum>
-  <w:abstractNum w:abstractNumId="25" w15:restartNumberingAfterBreak="0">
+  <w:abstractNum w:abstractNumId="26" w15:restartNumberingAfterBreak="0">
     <w:nsid w:val="41DD7F45"/>
     <w:multiLevelType w:val="hybridMultilevel"/>
     <w:tmpl w:val="771CFDAE"/>
@@ -12487,7 +13271,7 @@
       </w:rPr>
     </w:lvl>
   </w:abstractNum>
-  <w:abstractNum w:abstractNumId="26" w15:restartNumberingAfterBreak="0">
+  <w:abstractNum w:abstractNumId="27" w15:restartNumberingAfterBreak="0">
     <w:nsid w:val="481D4233"/>
     <w:multiLevelType w:val="hybridMultilevel"/>
     <w:tmpl w:val="A7305406"/>
@@ -12600,7 +13384,7 @@
       </w:rPr>
     </w:lvl>
   </w:abstractNum>
-  <w:abstractNum w:abstractNumId="27" w15:restartNumberingAfterBreak="0">
+  <w:abstractNum w:abstractNumId="28" w15:restartNumberingAfterBreak="0">
     <w:nsid w:val="52570DF6"/>
     <w:multiLevelType w:val="hybridMultilevel"/>
     <w:tmpl w:val="3D44C326"/>
@@ -12713,7 +13497,7 @@
       </w:rPr>
     </w:lvl>
   </w:abstractNum>
-  <w:abstractNum w:abstractNumId="28" w15:restartNumberingAfterBreak="0">
+  <w:abstractNum w:abstractNumId="29" w15:restartNumberingAfterBreak="0">
     <w:nsid w:val="551F5949"/>
     <w:multiLevelType w:val="hybridMultilevel"/>
     <w:tmpl w:val="2C10AE98"/>
@@ -12826,7 +13610,7 @@
       </w:rPr>
     </w:lvl>
   </w:abstractNum>
-  <w:abstractNum w:abstractNumId="29" w15:restartNumberingAfterBreak="0">
+  <w:abstractNum w:abstractNumId="30" w15:restartNumberingAfterBreak="0">
     <w:nsid w:val="5B661770"/>
     <w:multiLevelType w:val="hybridMultilevel"/>
     <w:tmpl w:val="9C0C26BA"/>
@@ -12939,7 +13723,7 @@
       </w:rPr>
     </w:lvl>
   </w:abstractNum>
-  <w:abstractNum w:abstractNumId="30" w15:restartNumberingAfterBreak="0">
+  <w:abstractNum w:abstractNumId="31" w15:restartNumberingAfterBreak="0">
     <w:nsid w:val="5FC67257"/>
     <w:multiLevelType w:val="hybridMultilevel"/>
     <w:tmpl w:val="85D23EB2"/>
@@ -13052,7 +13836,7 @@
       </w:rPr>
     </w:lvl>
   </w:abstractNum>
-  <w:abstractNum w:abstractNumId="31" w15:restartNumberingAfterBreak="0">
+  <w:abstractNum w:abstractNumId="32" w15:restartNumberingAfterBreak="0">
     <w:nsid w:val="61FF3F26"/>
     <w:multiLevelType w:val="hybridMultilevel"/>
     <w:tmpl w:val="C43CD392"/>
@@ -13165,7 +13949,7 @@
       </w:rPr>
     </w:lvl>
   </w:abstractNum>
-  <w:abstractNum w:abstractNumId="32" w15:restartNumberingAfterBreak="0">
+  <w:abstractNum w:abstractNumId="33" w15:restartNumberingAfterBreak="0">
     <w:nsid w:val="63161AE0"/>
     <w:multiLevelType w:val="hybridMultilevel"/>
     <w:tmpl w:val="93E65638"/>
@@ -13278,7 +14062,7 @@
       </w:rPr>
     </w:lvl>
   </w:abstractNum>
-  <w:abstractNum w:abstractNumId="33" w15:restartNumberingAfterBreak="0">
+  <w:abstractNum w:abstractNumId="34" w15:restartNumberingAfterBreak="0">
     <w:nsid w:val="643505DA"/>
     <w:multiLevelType w:val="multilevel"/>
     <w:tmpl w:val="4A10DBEE"/>
@@ -13427,7 +14211,7 @@
       </w:rPr>
     </w:lvl>
   </w:abstractNum>
-  <w:abstractNum w:abstractNumId="34" w15:restartNumberingAfterBreak="0">
+  <w:abstractNum w:abstractNumId="35" w15:restartNumberingAfterBreak="0">
     <w:nsid w:val="655B2B0E"/>
     <w:multiLevelType w:val="hybridMultilevel"/>
     <w:tmpl w:val="EA2A06A8"/>
@@ -13540,7 +14324,120 @@
       </w:rPr>
     </w:lvl>
   </w:abstractNum>
-  <w:abstractNum w:abstractNumId="35" w15:restartNumberingAfterBreak="0">
+  <w:abstractNum w:abstractNumId="36" w15:restartNumberingAfterBreak="0">
+    <w:nsid w:val="6EE06418"/>
+    <w:multiLevelType w:val="hybridMultilevel"/>
+    <w:tmpl w:val="80501C2E"/>
+    <w:lvl w:ilvl="0" w:tplc="04160001">
+      <w:start w:val="1"/>
+      <w:numFmt w:val="bullet"/>
+      <w:lvlText w:val=""/>
+      <w:lvlJc w:val="left"/>
+      <w:pPr>
+        <w:ind w:left="1426" w:hanging="360"/>
+      </w:pPr>
+      <w:rPr>
+        <w:rFonts w:ascii="Symbol" w:hAnsi="Symbol" w:hint="default"/>
+      </w:rPr>
+    </w:lvl>
+    <w:lvl w:ilvl="1" w:tplc="04160003" w:tentative="1">
+      <w:start w:val="1"/>
+      <w:numFmt w:val="bullet"/>
+      <w:lvlText w:val="o"/>
+      <w:lvlJc w:val="left"/>
+      <w:pPr>
+        <w:ind w:left="2146" w:hanging="360"/>
+      </w:pPr>
+      <w:rPr>
+        <w:rFonts w:ascii="Courier New" w:hAnsi="Courier New" w:cs="Courier New" w:hint="default"/>
+      </w:rPr>
+    </w:lvl>
+    <w:lvl w:ilvl="2" w:tplc="04160005" w:tentative="1">
+      <w:start w:val="1"/>
+      <w:numFmt w:val="bullet"/>
+      <w:lvlText w:val=""/>
+      <w:lvlJc w:val="left"/>
+      <w:pPr>
+        <w:ind w:left="2866" w:hanging="360"/>
+      </w:pPr>
+      <w:rPr>
+        <w:rFonts w:ascii="Wingdings" w:hAnsi="Wingdings" w:hint="default"/>
+      </w:rPr>
+    </w:lvl>
+    <w:lvl w:ilvl="3" w:tplc="04160001" w:tentative="1">
+      <w:start w:val="1"/>
+      <w:numFmt w:val="bullet"/>
+      <w:lvlText w:val=""/>
+      <w:lvlJc w:val="left"/>
+      <w:pPr>
+        <w:ind w:left="3586" w:hanging="360"/>
+      </w:pPr>
+      <w:rPr>
+        <w:rFonts w:ascii="Symbol" w:hAnsi="Symbol" w:hint="default"/>
+      </w:rPr>
+    </w:lvl>
+    <w:lvl w:ilvl="4" w:tplc="04160003" w:tentative="1">
+      <w:start w:val="1"/>
+      <w:numFmt w:val="bullet"/>
+      <w:lvlText w:val="o"/>
+      <w:lvlJc w:val="left"/>
+      <w:pPr>
+        <w:ind w:left="4306" w:hanging="360"/>
+      </w:pPr>
+      <w:rPr>
+        <w:rFonts w:ascii="Courier New" w:hAnsi="Courier New" w:cs="Courier New" w:hint="default"/>
+      </w:rPr>
+    </w:lvl>
+    <w:lvl w:ilvl="5" w:tplc="04160005" w:tentative="1">
+      <w:start w:val="1"/>
+      <w:numFmt w:val="bullet"/>
+      <w:lvlText w:val=""/>
+      <w:lvlJc w:val="left"/>
+      <w:pPr>
+        <w:ind w:left="5026" w:hanging="360"/>
+      </w:pPr>
+      <w:rPr>
+        <w:rFonts w:ascii="Wingdings" w:hAnsi="Wingdings" w:hint="default"/>
+      </w:rPr>
+    </w:lvl>
+    <w:lvl w:ilvl="6" w:tplc="04160001" w:tentative="1">
+      <w:start w:val="1"/>
+      <w:numFmt w:val="bullet"/>
+      <w:lvlText w:val=""/>
+      <w:lvlJc w:val="left"/>
+      <w:pPr>
+        <w:ind w:left="5746" w:hanging="360"/>
+      </w:pPr>
+      <w:rPr>
+        <w:rFonts w:ascii="Symbol" w:hAnsi="Symbol" w:hint="default"/>
+      </w:rPr>
+    </w:lvl>
+    <w:lvl w:ilvl="7" w:tplc="04160003" w:tentative="1">
+      <w:start w:val="1"/>
+      <w:numFmt w:val="bullet"/>
+      <w:lvlText w:val="o"/>
+      <w:lvlJc w:val="left"/>
+      <w:pPr>
+        <w:ind w:left="6466" w:hanging="360"/>
+      </w:pPr>
+      <w:rPr>
+        <w:rFonts w:ascii="Courier New" w:hAnsi="Courier New" w:cs="Courier New" w:hint="default"/>
+      </w:rPr>
+    </w:lvl>
+    <w:lvl w:ilvl="8" w:tplc="04160005" w:tentative="1">
+      <w:start w:val="1"/>
+      <w:numFmt w:val="bullet"/>
+      <w:lvlText w:val=""/>
+      <w:lvlJc w:val="left"/>
+      <w:pPr>
+        <w:ind w:left="7186" w:hanging="360"/>
+      </w:pPr>
+      <w:rPr>
+        <w:rFonts w:ascii="Wingdings" w:hAnsi="Wingdings" w:hint="default"/>
+      </w:rPr>
+    </w:lvl>
+  </w:abstractNum>
+  <w:abstractNum w:abstractNumId="37" w15:restartNumberingAfterBreak="0">
     <w:nsid w:val="71CD1D6C"/>
     <w:multiLevelType w:val="hybridMultilevel"/>
     <w:tmpl w:val="88E4FDAA"/>
@@ -13653,7 +14550,7 @@
       </w:rPr>
     </w:lvl>
   </w:abstractNum>
-  <w:abstractNum w:abstractNumId="36" w15:restartNumberingAfterBreak="0">
+  <w:abstractNum w:abstractNumId="38" w15:restartNumberingAfterBreak="0">
     <w:nsid w:val="73321FF8"/>
     <w:multiLevelType w:val="hybridMultilevel"/>
     <w:tmpl w:val="47F04FE0"/>
@@ -13766,7 +14663,7 @@
       </w:rPr>
     </w:lvl>
   </w:abstractNum>
-  <w:abstractNum w:abstractNumId="37" w15:restartNumberingAfterBreak="0">
+  <w:abstractNum w:abstractNumId="39" w15:restartNumberingAfterBreak="0">
     <w:nsid w:val="75D25163"/>
     <w:multiLevelType w:val="hybridMultilevel"/>
     <w:tmpl w:val="017AEA76"/>
@@ -13879,7 +14776,7 @@
       </w:rPr>
     </w:lvl>
   </w:abstractNum>
-  <w:abstractNum w:abstractNumId="38" w15:restartNumberingAfterBreak="0">
+  <w:abstractNum w:abstractNumId="40" w15:restartNumberingAfterBreak="0">
     <w:nsid w:val="7761227D"/>
     <w:multiLevelType w:val="hybridMultilevel"/>
     <w:tmpl w:val="9D6E2AA6"/>
@@ -13992,7 +14889,7 @@
       </w:rPr>
     </w:lvl>
   </w:abstractNum>
-  <w:abstractNum w:abstractNumId="39" w15:restartNumberingAfterBreak="0">
+  <w:abstractNum w:abstractNumId="41" w15:restartNumberingAfterBreak="0">
     <w:nsid w:val="785A7388"/>
     <w:multiLevelType w:val="hybridMultilevel"/>
     <w:tmpl w:val="89841A76"/>
@@ -14105,7 +15002,7 @@
       </w:rPr>
     </w:lvl>
   </w:abstractNum>
-  <w:abstractNum w:abstractNumId="40" w15:restartNumberingAfterBreak="0">
+  <w:abstractNum w:abstractNumId="42" w15:restartNumberingAfterBreak="0">
     <w:nsid w:val="79AB66AE"/>
     <w:multiLevelType w:val="multilevel"/>
     <w:tmpl w:val="B810ED4E"/>
@@ -14254,7 +15151,7 @@
       </w:rPr>
     </w:lvl>
   </w:abstractNum>
-  <w:abstractNum w:abstractNumId="41" w15:restartNumberingAfterBreak="0">
+  <w:abstractNum w:abstractNumId="43" w15:restartNumberingAfterBreak="0">
     <w:nsid w:val="7C522888"/>
     <w:multiLevelType w:val="hybridMultilevel"/>
     <w:tmpl w:val="51AEF66A"/>
@@ -14367,10 +15264,123 @@
       </w:rPr>
     </w:lvl>
   </w:abstractNum>
-  <w:abstractNum w:abstractNumId="42" w15:restartNumberingAfterBreak="0">
+  <w:abstractNum w:abstractNumId="44" w15:restartNumberingAfterBreak="0">
     <w:nsid w:val="7CBF0BF1"/>
     <w:multiLevelType w:val="hybridMultilevel"/>
     <w:tmpl w:val="BF6C48BE"/>
+    <w:lvl w:ilvl="0" w:tplc="04160001">
+      <w:start w:val="1"/>
+      <w:numFmt w:val="bullet"/>
+      <w:lvlText w:val=""/>
+      <w:lvlJc w:val="left"/>
+      <w:pPr>
+        <w:ind w:left="720" w:hanging="360"/>
+      </w:pPr>
+      <w:rPr>
+        <w:rFonts w:ascii="Symbol" w:hAnsi="Symbol" w:hint="default"/>
+      </w:rPr>
+    </w:lvl>
+    <w:lvl w:ilvl="1" w:tplc="04160003" w:tentative="1">
+      <w:start w:val="1"/>
+      <w:numFmt w:val="bullet"/>
+      <w:lvlText w:val="o"/>
+      <w:lvlJc w:val="left"/>
+      <w:pPr>
+        <w:ind w:left="1440" w:hanging="360"/>
+      </w:pPr>
+      <w:rPr>
+        <w:rFonts w:ascii="Courier New" w:hAnsi="Courier New" w:cs="Courier New" w:hint="default"/>
+      </w:rPr>
+    </w:lvl>
+    <w:lvl w:ilvl="2" w:tplc="04160005" w:tentative="1">
+      <w:start w:val="1"/>
+      <w:numFmt w:val="bullet"/>
+      <w:lvlText w:val=""/>
+      <w:lvlJc w:val="left"/>
+      <w:pPr>
+        <w:ind w:left="2160" w:hanging="360"/>
+      </w:pPr>
+      <w:rPr>
+        <w:rFonts w:ascii="Wingdings" w:hAnsi="Wingdings" w:hint="default"/>
+      </w:rPr>
+    </w:lvl>
+    <w:lvl w:ilvl="3" w:tplc="04160001" w:tentative="1">
+      <w:start w:val="1"/>
+      <w:numFmt w:val="bullet"/>
+      <w:lvlText w:val=""/>
+      <w:lvlJc w:val="left"/>
+      <w:pPr>
+        <w:ind w:left="2880" w:hanging="360"/>
+      </w:pPr>
+      <w:rPr>
+        <w:rFonts w:ascii="Symbol" w:hAnsi="Symbol" w:hint="default"/>
+      </w:rPr>
+    </w:lvl>
+    <w:lvl w:ilvl="4" w:tplc="04160003" w:tentative="1">
+      <w:start w:val="1"/>
+      <w:numFmt w:val="bullet"/>
+      <w:lvlText w:val="o"/>
+      <w:lvlJc w:val="left"/>
+      <w:pPr>
+        <w:ind w:left="3600" w:hanging="360"/>
+      </w:pPr>
+      <w:rPr>
+        <w:rFonts w:ascii="Courier New" w:hAnsi="Courier New" w:cs="Courier New" w:hint="default"/>
+      </w:rPr>
+    </w:lvl>
+    <w:lvl w:ilvl="5" w:tplc="04160005" w:tentative="1">
+      <w:start w:val="1"/>
+      <w:numFmt w:val="bullet"/>
+      <w:lvlText w:val=""/>
+      <w:lvlJc w:val="left"/>
+      <w:pPr>
+        <w:ind w:left="4320" w:hanging="360"/>
+      </w:pPr>
+      <w:rPr>
+        <w:rFonts w:ascii="Wingdings" w:hAnsi="Wingdings" w:hint="default"/>
+      </w:rPr>
+    </w:lvl>
+    <w:lvl w:ilvl="6" w:tplc="04160001" w:tentative="1">
+      <w:start w:val="1"/>
+      <w:numFmt w:val="bullet"/>
+      <w:lvlText w:val=""/>
+      <w:lvlJc w:val="left"/>
+      <w:pPr>
+        <w:ind w:left="5040" w:hanging="360"/>
+      </w:pPr>
+      <w:rPr>
+        <w:rFonts w:ascii="Symbol" w:hAnsi="Symbol" w:hint="default"/>
+      </w:rPr>
+    </w:lvl>
+    <w:lvl w:ilvl="7" w:tplc="04160003" w:tentative="1">
+      <w:start w:val="1"/>
+      <w:numFmt w:val="bullet"/>
+      <w:lvlText w:val="o"/>
+      <w:lvlJc w:val="left"/>
+      <w:pPr>
+        <w:ind w:left="5760" w:hanging="360"/>
+      </w:pPr>
+      <w:rPr>
+        <w:rFonts w:ascii="Courier New" w:hAnsi="Courier New" w:cs="Courier New" w:hint="default"/>
+      </w:rPr>
+    </w:lvl>
+    <w:lvl w:ilvl="8" w:tplc="04160005" w:tentative="1">
+      <w:start w:val="1"/>
+      <w:numFmt w:val="bullet"/>
+      <w:lvlText w:val=""/>
+      <w:lvlJc w:val="left"/>
+      <w:pPr>
+        <w:ind w:left="6480" w:hanging="360"/>
+      </w:pPr>
+      <w:rPr>
+        <w:rFonts w:ascii="Wingdings" w:hAnsi="Wingdings" w:hint="default"/>
+      </w:rPr>
+    </w:lvl>
+  </w:abstractNum>
+  <w:abstractNum w:abstractNumId="45" w15:restartNumberingAfterBreak="0">
+    <w:nsid w:val="7D4D4E3A"/>
+    <w:multiLevelType w:val="hybridMultilevel"/>
+    <w:tmpl w:val="94980BE0"/>
     <w:lvl w:ilvl="0" w:tplc="04160001">
       <w:start w:val="1"/>
       <w:numFmt w:val="bullet"/>
@@ -14487,31 +15497,31 @@
     <w:abstractNumId w:val="12"/>
   </w:num>
   <w:num w:numId="3">
-    <w:abstractNumId w:val="19"/>
+    <w:abstractNumId w:val="20"/>
   </w:num>
   <w:num w:numId="4">
-    <w:abstractNumId w:val="23"/>
+    <w:abstractNumId w:val="24"/>
   </w:num>
   <w:num w:numId="5">
     <w:abstractNumId w:val="6"/>
   </w:num>
   <w:num w:numId="6">
-    <w:abstractNumId w:val="24"/>
+    <w:abstractNumId w:val="25"/>
   </w:num>
   <w:num w:numId="7">
-    <w:abstractNumId w:val="21"/>
+    <w:abstractNumId w:val="22"/>
   </w:num>
   <w:num w:numId="8">
     <w:abstractNumId w:val="17"/>
   </w:num>
   <w:num w:numId="9">
-    <w:abstractNumId w:val="41"/>
+    <w:abstractNumId w:val="43"/>
   </w:num>
   <w:num w:numId="10">
-    <w:abstractNumId w:val="32"/>
+    <w:abstractNumId w:val="33"/>
   </w:num>
   <w:num w:numId="11">
-    <w:abstractNumId w:val="28"/>
+    <w:abstractNumId w:val="29"/>
   </w:num>
   <w:num w:numId="12">
     <w:abstractNumId w:val="13"/>
@@ -14520,19 +15530,19 @@
     <w:abstractNumId w:val="16"/>
   </w:num>
   <w:num w:numId="14">
-    <w:abstractNumId w:val="31"/>
+    <w:abstractNumId w:val="32"/>
   </w:num>
   <w:num w:numId="15">
     <w:abstractNumId w:val="2"/>
   </w:num>
   <w:num w:numId="16">
-    <w:abstractNumId w:val="35"/>
+    <w:abstractNumId w:val="37"/>
   </w:num>
   <w:num w:numId="17">
     <w:abstractNumId w:val="10"/>
   </w:num>
   <w:num w:numId="18">
-    <w:abstractNumId w:val="36"/>
+    <w:abstractNumId w:val="38"/>
   </w:num>
   <w:num w:numId="19">
     <w:abstractNumId w:val="18"/>
@@ -14541,19 +15551,19 @@
     <w:abstractNumId w:val="11"/>
   </w:num>
   <w:num w:numId="21">
-    <w:abstractNumId w:val="29"/>
+    <w:abstractNumId w:val="30"/>
   </w:num>
   <w:num w:numId="22">
-    <w:abstractNumId w:val="34"/>
+    <w:abstractNumId w:val="35"/>
   </w:num>
   <w:num w:numId="23">
-    <w:abstractNumId w:val="22"/>
+    <w:abstractNumId w:val="23"/>
   </w:num>
   <w:num w:numId="24">
-    <w:abstractNumId w:val="26"/>
+    <w:abstractNumId w:val="27"/>
   </w:num>
   <w:num w:numId="25">
-    <w:abstractNumId w:val="38"/>
+    <w:abstractNumId w:val="40"/>
   </w:num>
   <w:num w:numId="26">
     <w:abstractNumId w:val="8"/>
@@ -14568,16 +15578,16 @@
     <w:abstractNumId w:val="15"/>
   </w:num>
   <w:num w:numId="30">
-    <w:abstractNumId w:val="20"/>
+    <w:abstractNumId w:val="21"/>
   </w:num>
   <w:num w:numId="31">
     <w:abstractNumId w:val="3"/>
   </w:num>
   <w:num w:numId="32">
-    <w:abstractNumId w:val="40"/>
+    <w:abstractNumId w:val="42"/>
   </w:num>
   <w:num w:numId="33">
-    <w:abstractNumId w:val="33"/>
+    <w:abstractNumId w:val="34"/>
   </w:num>
   <w:num w:numId="34">
     <w:abstractNumId w:val="0"/>
@@ -14586,7 +15596,7 @@
     <w:abstractNumId w:val="4"/>
   </w:num>
   <w:num w:numId="36">
-    <w:abstractNumId w:val="27"/>
+    <w:abstractNumId w:val="28"/>
   </w:num>
   <w:num w:numId="37">
     <w:abstractNumId w:val="14"/>
@@ -14595,19 +15605,28 @@
     <w:abstractNumId w:val="9"/>
   </w:num>
   <w:num w:numId="39">
-    <w:abstractNumId w:val="30"/>
+    <w:abstractNumId w:val="31"/>
   </w:num>
   <w:num w:numId="40">
-    <w:abstractNumId w:val="42"/>
+    <w:abstractNumId w:val="44"/>
   </w:num>
   <w:num w:numId="41">
-    <w:abstractNumId w:val="25"/>
+    <w:abstractNumId w:val="26"/>
   </w:num>
   <w:num w:numId="42">
-    <w:abstractNumId w:val="37"/>
+    <w:abstractNumId w:val="39"/>
   </w:num>
   <w:num w:numId="43">
-    <w:abstractNumId w:val="39"/>
+    <w:abstractNumId w:val="41"/>
+  </w:num>
+  <w:num w:numId="44">
+    <w:abstractNumId w:val="45"/>
+  </w:num>
+  <w:num w:numId="45">
+    <w:abstractNumId w:val="36"/>
+  </w:num>
+  <w:num w:numId="46">
+    <w:abstractNumId w:val="19"/>
   </w:num>
 </w:numbering>
 </file>
@@ -15680,7 +16699,7 @@
 </file>
 
 <file path=customXml/itemProps1.xml><?xml version="1.0" encoding="utf-8"?>
-<ds:datastoreItem xmlns:ds="http://schemas.openxmlformats.org/officeDocument/2006/customXml" ds:itemID="{E932CDC9-3D63-4028-9DA9-7569882CD331}">
+<ds:datastoreItem xmlns:ds="http://schemas.openxmlformats.org/officeDocument/2006/customXml" ds:itemID="{9CD07E49-B5CE-45F4-B931-164BC906B0CE}">
   <ds:schemaRefs>
     <ds:schemaRef ds:uri="http://schemas.openxmlformats.org/officeDocument/2006/bibliography"/>
   </ds:schemaRefs>

</xml_diff>

<commit_message>
feat: altera a documentação para que a parte destinada ao escopo da documentacao
</commit_message>
<xml_diff>
--- a/Documentacao/Documentacao.docx
+++ b/Documentacao/Documentacao.docx
@@ -1,6 +1,6 @@
 
 <file path=word/document.xml><?xml version="1.0" encoding="utf-8"?>
-<w:document xmlns:wpc="http://schemas.microsoft.com/office/word/2010/wordprocessingCanvas" xmlns:cx="http://schemas.microsoft.com/office/drawing/2014/chartex" xmlns:mc="http://schemas.openxmlformats.org/markup-compatibility/2006" xmlns:o="urn:schemas-microsoft-com:office:office" xmlns:r="http://schemas.openxmlformats.org/officeDocument/2006/relationships" xmlns:m="http://schemas.openxmlformats.org/officeDocument/2006/math" xmlns:v="urn:schemas-microsoft-com:vml" xmlns:wp14="http://schemas.microsoft.com/office/word/2010/wordprocessingDrawing" xmlns:wp="http://schemas.openxmlformats.org/drawingml/2006/wordprocessingDrawing" xmlns:w10="urn:schemas-microsoft-com:office:word" xmlns:w="http://schemas.openxmlformats.org/wordprocessingml/2006/main" xmlns:w14="http://schemas.microsoft.com/office/word/2010/wordml" xmlns:w15="http://schemas.microsoft.com/office/word/2012/wordml" xmlns:w16se="http://schemas.microsoft.com/office/word/2015/wordml/symex" xmlns:wpg="http://schemas.microsoft.com/office/word/2010/wordprocessingGroup" xmlns:wpi="http://schemas.microsoft.com/office/word/2010/wordprocessingInk" xmlns:wne="http://schemas.microsoft.com/office/word/2006/wordml" xmlns:wps="http://schemas.microsoft.com/office/word/2010/wordprocessingShape" mc:Ignorable="w14 w15 w16se wp14">
+<w:document xmlns:wpc="http://schemas.microsoft.com/office/word/2010/wordprocessingCanvas" xmlns:cx="http://schemas.microsoft.com/office/drawing/2014/chartex" xmlns:cx1="http://schemas.microsoft.com/office/drawing/2015/9/8/chartex" xmlns:cx2="http://schemas.microsoft.com/office/drawing/2015/10/21/chartex" xmlns:cx3="http://schemas.microsoft.com/office/drawing/2016/5/9/chartex" xmlns:cx4="http://schemas.microsoft.com/office/drawing/2016/5/10/chartex" xmlns:cx5="http://schemas.microsoft.com/office/drawing/2016/5/11/chartex" xmlns:cx6="http://schemas.microsoft.com/office/drawing/2016/5/12/chartex" xmlns:cx7="http://schemas.microsoft.com/office/drawing/2016/5/13/chartex" xmlns:cx8="http://schemas.microsoft.com/office/drawing/2016/5/14/chartex" xmlns:mc="http://schemas.openxmlformats.org/markup-compatibility/2006" xmlns:aink="http://schemas.microsoft.com/office/drawing/2016/ink" xmlns:am3d="http://schemas.microsoft.com/office/drawing/2017/model3d" xmlns:o="urn:schemas-microsoft-com:office:office" xmlns:r="http://schemas.openxmlformats.org/officeDocument/2006/relationships" xmlns:m="http://schemas.openxmlformats.org/officeDocument/2006/math" xmlns:v="urn:schemas-microsoft-com:vml" xmlns:wp14="http://schemas.microsoft.com/office/word/2010/wordprocessingDrawing" xmlns:wp="http://schemas.openxmlformats.org/drawingml/2006/wordprocessingDrawing" xmlns:w10="urn:schemas-microsoft-com:office:word" xmlns:w="http://schemas.openxmlformats.org/wordprocessingml/2006/main" xmlns:w14="http://schemas.microsoft.com/office/word/2010/wordml" xmlns:w15="http://schemas.microsoft.com/office/word/2012/wordml" xmlns:w16cid="http://schemas.microsoft.com/office/word/2016/wordml/cid" xmlns:w16se="http://schemas.microsoft.com/office/word/2015/wordml/symex" xmlns:wpg="http://schemas.microsoft.com/office/word/2010/wordprocessingGroup" xmlns:wpi="http://schemas.microsoft.com/office/word/2010/wordprocessingInk" xmlns:wne="http://schemas.microsoft.com/office/word/2006/wordml" xmlns:wps="http://schemas.microsoft.com/office/word/2010/wordprocessingShape" mc:Ignorable="w14 w15 w16se w16cid wp14">
   <w:body>
     <w:p>
       <w:pPr>
@@ -161,8 +161,9 @@
           <w:sz w:val="28"/>
           <w:szCs w:val="24"/>
         </w:rPr>
-        <w:t>Bryan Diego Vino Lustri</w:t>
-      </w:r>
+        <w:t xml:space="preserve">Bryan Diego </w:t>
+      </w:r>
+      <w:proofErr w:type="spellStart"/>
       <w:r>
         <w:rPr>
           <w:rFonts w:ascii="Arial" w:hAnsi="Arial" w:cs="Arial"/>
@@ -171,6 +172,39 @@
           <w:sz w:val="28"/>
           <w:szCs w:val="24"/>
         </w:rPr>
+        <w:t>Vino</w:t>
+      </w:r>
+      <w:proofErr w:type="spellEnd"/>
+      <w:r>
+        <w:rPr>
+          <w:rFonts w:ascii="Arial" w:hAnsi="Arial" w:cs="Arial"/>
+          <w:b/>
+          <w:bCs/>
+          <w:sz w:val="28"/>
+          <w:szCs w:val="24"/>
+        </w:rPr>
+        <w:t xml:space="preserve"> </w:t>
+      </w:r>
+      <w:proofErr w:type="spellStart"/>
+      <w:r>
+        <w:rPr>
+          <w:rFonts w:ascii="Arial" w:hAnsi="Arial" w:cs="Arial"/>
+          <w:b/>
+          <w:bCs/>
+          <w:sz w:val="28"/>
+          <w:szCs w:val="24"/>
+        </w:rPr>
+        <w:t>Lustri</w:t>
+      </w:r>
+      <w:proofErr w:type="spellEnd"/>
+      <w:r>
+        <w:rPr>
+          <w:rFonts w:ascii="Arial" w:hAnsi="Arial" w:cs="Arial"/>
+          <w:b/>
+          <w:bCs/>
+          <w:sz w:val="28"/>
+          <w:szCs w:val="24"/>
+        </w:rPr>
         <w:br/>
       </w:r>
       <w:r>
@@ -231,8 +265,9 @@
           <w:sz w:val="28"/>
           <w:szCs w:val="24"/>
         </w:rPr>
-        <w:t>Fernando Fiani de Pina Saraiva</w:t>
-      </w:r>
+        <w:t xml:space="preserve">Fernando </w:t>
+      </w:r>
+      <w:proofErr w:type="spellStart"/>
       <w:r>
         <w:rPr>
           <w:rFonts w:ascii="Arial" w:hAnsi="Arial" w:cs="Arial"/>
@@ -241,6 +276,27 @@
           <w:sz w:val="28"/>
           <w:szCs w:val="24"/>
         </w:rPr>
+        <w:t>Fiani</w:t>
+      </w:r>
+      <w:proofErr w:type="spellEnd"/>
+      <w:r>
+        <w:rPr>
+          <w:rFonts w:ascii="Arial" w:hAnsi="Arial" w:cs="Arial"/>
+          <w:b/>
+          <w:bCs/>
+          <w:sz w:val="28"/>
+          <w:szCs w:val="24"/>
+        </w:rPr>
+        <w:t xml:space="preserve"> de Pina Saraiva</w:t>
+      </w:r>
+      <w:r>
+        <w:rPr>
+          <w:rFonts w:ascii="Arial" w:hAnsi="Arial" w:cs="Arial"/>
+          <w:b/>
+          <w:bCs/>
+          <w:sz w:val="28"/>
+          <w:szCs w:val="24"/>
+        </w:rPr>
         <w:t xml:space="preserve"> </w:t>
       </w:r>
       <w:r>
@@ -281,7 +337,29 @@
           <w:sz w:val="28"/>
           <w:szCs w:val="24"/>
         </w:rPr>
-        <w:t xml:space="preserve">Leonardo Buso de Sousa </w:t>
+        <w:t xml:space="preserve">Leonardo </w:t>
+      </w:r>
+      <w:proofErr w:type="spellStart"/>
+      <w:r>
+        <w:rPr>
+          <w:rFonts w:ascii="Arial" w:hAnsi="Arial" w:cs="Arial"/>
+          <w:b/>
+          <w:bCs/>
+          <w:sz w:val="28"/>
+          <w:szCs w:val="24"/>
+        </w:rPr>
+        <w:t>Buso</w:t>
+      </w:r>
+      <w:proofErr w:type="spellEnd"/>
+      <w:r>
+        <w:rPr>
+          <w:rFonts w:ascii="Arial" w:hAnsi="Arial" w:cs="Arial"/>
+          <w:b/>
+          <w:bCs/>
+          <w:sz w:val="28"/>
+          <w:szCs w:val="24"/>
+        </w:rPr>
+        <w:t xml:space="preserve"> de Sousa </w:t>
       </w:r>
       <w:r>
         <w:rPr>
@@ -548,8 +626,42 @@
           <w:szCs w:val="24"/>
         </w:rPr>
         <w:lastRenderedPageBreak/>
-        <w:t>Bryan Diego Vino Lustri</w:t>
-      </w:r>
+        <w:t xml:space="preserve">Bryan Diego </w:t>
+      </w:r>
+      <w:proofErr w:type="spellStart"/>
+      <w:r>
+        <w:rPr>
+          <w:rFonts w:ascii="Arial" w:hAnsi="Arial" w:cs="Arial"/>
+          <w:b/>
+          <w:bCs/>
+          <w:sz w:val="28"/>
+          <w:szCs w:val="24"/>
+        </w:rPr>
+        <w:t>Vino</w:t>
+      </w:r>
+      <w:proofErr w:type="spellEnd"/>
+      <w:r>
+        <w:rPr>
+          <w:rFonts w:ascii="Arial" w:hAnsi="Arial" w:cs="Arial"/>
+          <w:b/>
+          <w:bCs/>
+          <w:sz w:val="28"/>
+          <w:szCs w:val="24"/>
+        </w:rPr>
+        <w:t xml:space="preserve"> </w:t>
+      </w:r>
+      <w:proofErr w:type="spellStart"/>
+      <w:r>
+        <w:rPr>
+          <w:rFonts w:ascii="Arial" w:hAnsi="Arial" w:cs="Arial"/>
+          <w:b/>
+          <w:bCs/>
+          <w:sz w:val="28"/>
+          <w:szCs w:val="24"/>
+        </w:rPr>
+        <w:t>Lustri</w:t>
+      </w:r>
+      <w:proofErr w:type="spellEnd"/>
       <w:r>
         <w:rPr>
           <w:rFonts w:ascii="Arial" w:hAnsi="Arial" w:cs="Arial"/>
@@ -581,7 +693,29 @@
           <w:szCs w:val="24"/>
         </w:rPr>
         <w:br/>
-        <w:t xml:space="preserve">Fernando Fiani de Pina Saraiva </w:t>
+        <w:t xml:space="preserve">Fernando </w:t>
+      </w:r>
+      <w:proofErr w:type="spellStart"/>
+      <w:r>
+        <w:rPr>
+          <w:rFonts w:ascii="Arial" w:hAnsi="Arial" w:cs="Arial"/>
+          <w:b/>
+          <w:bCs/>
+          <w:sz w:val="28"/>
+          <w:szCs w:val="24"/>
+        </w:rPr>
+        <w:t>Fiani</w:t>
+      </w:r>
+      <w:proofErr w:type="spellEnd"/>
+      <w:r>
+        <w:rPr>
+          <w:rFonts w:ascii="Arial" w:hAnsi="Arial" w:cs="Arial"/>
+          <w:b/>
+          <w:bCs/>
+          <w:sz w:val="28"/>
+          <w:szCs w:val="24"/>
+        </w:rPr>
+        <w:t xml:space="preserve"> de Pina Saraiva </w:t>
       </w:r>
       <w:r>
         <w:rPr>
@@ -603,7 +737,29 @@
           <w:szCs w:val="24"/>
         </w:rPr>
         <w:br/>
-        <w:t>Leonardo Buso de Sousa</w:t>
+        <w:t xml:space="preserve">Leonardo </w:t>
+      </w:r>
+      <w:proofErr w:type="spellStart"/>
+      <w:r>
+        <w:rPr>
+          <w:rFonts w:ascii="Arial" w:hAnsi="Arial" w:cs="Arial"/>
+          <w:b/>
+          <w:bCs/>
+          <w:sz w:val="28"/>
+          <w:szCs w:val="24"/>
+        </w:rPr>
+        <w:t>Buso</w:t>
+      </w:r>
+      <w:proofErr w:type="spellEnd"/>
+      <w:r>
+        <w:rPr>
+          <w:rFonts w:ascii="Arial" w:hAnsi="Arial" w:cs="Arial"/>
+          <w:b/>
+          <w:bCs/>
+          <w:sz w:val="28"/>
+          <w:szCs w:val="24"/>
+        </w:rPr>
+        <w:t xml:space="preserve"> de Sousa</w:t>
       </w:r>
     </w:p>
     <w:p>
@@ -1016,7 +1172,25 @@
           <w:sz w:val="24"/>
           <w:szCs w:val="24"/>
         </w:rPr>
-        <w:t>Este trabalho de conclusão de curso propõe uma análise das dificuldades enfrentadas pelos professores da ETEC Professor Camargo Aranha ao lecionar para alunos verbais com Transtorno do Espectro Autista (TEA) de Nível 1. Por meio de uma abordagem de pesquisa qualitativa, os principais obstáculos foram investigados utilizando entrevistas individuais e registros fornecidos pelo corpo docente. Como resultado, foram identificados os seguintes gargalos: a dificuldade em criar materiais didáticos adaptados e genuinamente inclusivos, além de garantir a compreensão do conteúdo por parte desses alunos. Em resposta a esses desafios, o TEA Learn foi desenvolvido com o objetivo de mitigar essas barreiras e auxiliar os educadores por meio da aplicação da Inteligência Artificial.</w:t>
+        <w:t xml:space="preserve">Este trabalho de conclusão de curso propõe uma análise das dificuldades enfrentadas pelos professores da ETEC Professor Camargo Aranha ao lecionar para alunos verbais com Transtorno do Espectro Autista (TEA) de Nível 1. Por meio de uma abordagem de pesquisa qualitativa, os principais obstáculos foram investigados utilizando entrevistas individuais e registros fornecidos pelo corpo docente. Como resultado, foram identificados os seguintes gargalos: a dificuldade em criar materiais didáticos adaptados e genuinamente inclusivos, além de garantir a compreensão do conteúdo por parte desses alunos. Em resposta a esses desafios, o TEA </w:t>
+      </w:r>
+      <w:proofErr w:type="spellStart"/>
+      <w:r>
+        <w:rPr>
+          <w:rFonts w:ascii="Arial" w:hAnsi="Arial" w:cs="Arial"/>
+          <w:sz w:val="24"/>
+          <w:szCs w:val="24"/>
+        </w:rPr>
+        <w:t>Learn</w:t>
+      </w:r>
+      <w:proofErr w:type="spellEnd"/>
+      <w:r>
+        <w:rPr>
+          <w:rFonts w:ascii="Arial" w:hAnsi="Arial" w:cs="Arial"/>
+          <w:sz w:val="24"/>
+          <w:szCs w:val="24"/>
+        </w:rPr>
+        <w:t xml:space="preserve"> foi desenvolvido com o objetivo de mitigar essas barreiras e auxiliar os educadores por meio da aplicação da Inteligência Artificial.</w:t>
       </w:r>
     </w:p>
     <w:p>
@@ -1087,6 +1261,7 @@
         </w:rPr>
         <w:t xml:space="preserve"> </w:t>
       </w:r>
+      <w:proofErr w:type="spellStart"/>
       <w:r>
         <w:rPr>
           <w:rFonts w:ascii="Arial" w:hAnsi="Arial" w:cs="Arial"/>
@@ -1105,6 +1280,7 @@
         </w:rPr>
         <w:t>clusão</w:t>
       </w:r>
+      <w:proofErr w:type="spellEnd"/>
       <w:r>
         <w:rPr>
           <w:rFonts w:ascii="Arial" w:hAnsi="Arial" w:cs="Arial"/>
@@ -1467,27 +1643,47 @@
           <w:szCs w:val="24"/>
           <w:lang w:val="en-US"/>
         </w:rPr>
-        <w:t>This undergraduate thesis proposes an analysis of the difficulties faced by teachers at ETEC Professor Camargo Aranha when teaching verbal students with Level 1 Autism Spectrum Disorder (ASD). Through a qualitative research approach, the main obstacles were investigated using individual interviews and records provided by the faculty. As a result, the following bottlenecks were identified: the difficulty in creating adapted and genuinely inclusive learning materials, alongside ensuring these students' comprehension of the content. In response to these challenges, TEA Learn was developed with the objective of mitigating these barriers and assisting educators through the application of Artificial Intelligence.</w:t>
-      </w:r>
-    </w:p>
-    <w:p>
-      <w:pPr>
-        <w:spacing w:after="0" w:line="360" w:lineRule="auto"/>
-        <w:rPr>
-          <w:rFonts w:ascii="Arial" w:hAnsi="Arial" w:cs="Arial"/>
-          <w:sz w:val="24"/>
-          <w:szCs w:val="24"/>
-        </w:rPr>
-      </w:pPr>
-      <w:r>
-        <w:rPr>
-          <w:rFonts w:ascii="Arial" w:hAnsi="Arial" w:cs="Arial"/>
-          <w:b/>
-          <w:bCs/>
+        <w:t xml:space="preserve">This undergraduate thesis proposes an analysis of the difficulties faced by teachers at ETEC Professor Camargo </w:t>
+      </w:r>
+      <w:proofErr w:type="spellStart"/>
+      <w:r>
+        <w:rPr>
+          <w:rFonts w:ascii="Arial" w:hAnsi="Arial" w:cs="Arial"/>
           <w:sz w:val="24"/>
           <w:szCs w:val="24"/>
           <w:lang w:val="en-US"/>
         </w:rPr>
+        <w:t>Aranha</w:t>
+      </w:r>
+      <w:proofErr w:type="spellEnd"/>
+      <w:r>
+        <w:rPr>
+          <w:rFonts w:ascii="Arial" w:hAnsi="Arial" w:cs="Arial"/>
+          <w:sz w:val="24"/>
+          <w:szCs w:val="24"/>
+          <w:lang w:val="en-US"/>
+        </w:rPr>
+        <w:t xml:space="preserve"> when teaching verbal students with Level 1 Autism Spectrum Disorder (ASD). Through a qualitative research approach, the main obstacles were investigated using individual interviews and records provided by the faculty. As a result, the following bottlenecks were identified: the difficulty in creating adapted and genuinely inclusive learning materials, alongside ensuring these students' comprehension of the content. In response to these challenges, TEA Learn was developed with the objective of mitigating these barriers and assisting educators through the application of Artificial Intelligence.</w:t>
+      </w:r>
+    </w:p>
+    <w:p>
+      <w:pPr>
+        <w:spacing w:after="0" w:line="360" w:lineRule="auto"/>
+        <w:rPr>
+          <w:rFonts w:ascii="Arial" w:hAnsi="Arial" w:cs="Arial"/>
+          <w:sz w:val="24"/>
+          <w:szCs w:val="24"/>
+        </w:rPr>
+      </w:pPr>
+      <w:r>
+        <w:rPr>
+          <w:rFonts w:ascii="Arial" w:hAnsi="Arial" w:cs="Arial"/>
+          <w:b/>
+          <w:bCs/>
+          <w:sz w:val="24"/>
+          <w:szCs w:val="24"/>
+          <w:lang w:val="en-US"/>
+        </w:rPr>
         <w:t>Keywords</w:t>
       </w:r>
       <w:r>
@@ -1499,13 +1695,23 @@
         </w:rPr>
         <w:t xml:space="preserve">: Adapted materials. Artificial Intelligence. </w:t>
       </w:r>
-      <w:r>
-        <w:rPr>
-          <w:rFonts w:ascii="Arial" w:hAnsi="Arial" w:cs="Arial"/>
-          <w:sz w:val="24"/>
-          <w:szCs w:val="24"/>
-        </w:rPr>
-        <w:t>Inclusion.</w:t>
+      <w:proofErr w:type="spellStart"/>
+      <w:r>
+        <w:rPr>
+          <w:rFonts w:ascii="Arial" w:hAnsi="Arial" w:cs="Arial"/>
+          <w:sz w:val="24"/>
+          <w:szCs w:val="24"/>
+        </w:rPr>
+        <w:t>Inclusion</w:t>
+      </w:r>
+      <w:proofErr w:type="spellEnd"/>
+      <w:r>
+        <w:rPr>
+          <w:rFonts w:ascii="Arial" w:hAnsi="Arial" w:cs="Arial"/>
+          <w:sz w:val="24"/>
+          <w:szCs w:val="24"/>
+        </w:rPr>
+        <w:t>.</w:t>
       </w:r>
     </w:p>
     <w:p>
@@ -2209,7 +2415,45 @@
           <w:szCs w:val="24"/>
           <w:lang w:eastAsia="pt-BR"/>
         </w:rPr>
-        <w:t>Com base em pesquisas de campo realizadas com o corpo docente da ETEC Professor Camargo Aranha e com especialistas da Clínica Movthera, identificou-se que, embora as diretrizes educacionais busquem a inclusão, estudantes com Transtorno do Espectro Autista (TEA) nível 1 enfrentam barreiras severas no uso de materiais didáticos tradicionais. Esta realidade tornou-se ainda mais evidente com a abertura de vagas afirmativas para alunos com TEA no processo seletivo (vestibulinho) da instituição para o ano letivo de 2026.</w:t>
+        <w:t xml:space="preserve">Com base em pesquisas de campo realizadas com o corpo docente da ETEC Professor Camargo Aranha e com especialistas da Clínica </w:t>
+      </w:r>
+      <w:proofErr w:type="spellStart"/>
+      <w:r>
+        <w:rPr>
+          <w:rFonts w:ascii="Arial" w:eastAsia="Times New Roman" w:hAnsi="Arial" w:cs="Arial"/>
+          <w:sz w:val="24"/>
+          <w:szCs w:val="24"/>
+          <w:lang w:eastAsia="pt-BR"/>
+        </w:rPr>
+        <w:t>Movthera</w:t>
+      </w:r>
+      <w:proofErr w:type="spellEnd"/>
+      <w:r>
+        <w:rPr>
+          <w:rFonts w:ascii="Arial" w:eastAsia="Times New Roman" w:hAnsi="Arial" w:cs="Arial"/>
+          <w:sz w:val="24"/>
+          <w:szCs w:val="24"/>
+          <w:lang w:eastAsia="pt-BR"/>
+        </w:rPr>
+        <w:t>, identificou-se que, embora as diretrizes educacionais busquem a inclusão, estudantes com Transtorno do Espectro Autista (TEA) nível 1 enfrentam barreiras severas no uso de materiais didáticos tradicionais. Esta realidade tornou-se ainda mais evidente com a abertura de vagas afirmativas para alunos com TEA no processo seletivo (</w:t>
+      </w:r>
+      <w:r>
+        <w:rPr>
+          <w:rFonts w:ascii="Arial" w:eastAsia="Times New Roman" w:hAnsi="Arial" w:cs="Arial"/>
+          <w:sz w:val="24"/>
+          <w:szCs w:val="24"/>
+          <w:lang w:eastAsia="pt-BR"/>
+        </w:rPr>
+        <w:t>Vestibulinho</w:t>
+      </w:r>
+      <w:r>
+        <w:rPr>
+          <w:rFonts w:ascii="Arial" w:eastAsia="Times New Roman" w:hAnsi="Arial" w:cs="Arial"/>
+          <w:sz w:val="24"/>
+          <w:szCs w:val="24"/>
+          <w:lang w:eastAsia="pt-BR"/>
+        </w:rPr>
+        <w:t>) da instituição para o ano letivo de 2026.</w:t>
       </w:r>
       <w:r>
         <w:rPr>
@@ -2365,7 +2609,27 @@
           <w:szCs w:val="24"/>
           <w:lang w:eastAsia="pt-BR"/>
         </w:rPr>
-        <w:t xml:space="preserve"> Professores que não receberam treinamento ou capacitação específica para a transformação de conteúdos, além da escassez de tempo hábil para adaptar materiais manualmente para turmas numerosas.</w:t>
+        <w:t xml:space="preserve"> Professores que não receberam treinamento ou capacitação específica para a transformação de </w:t>
+      </w:r>
+      <w:proofErr w:type="spellStart"/>
+      <w:r>
+        <w:rPr>
+          <w:rFonts w:ascii="Arial" w:eastAsia="Times New Roman" w:hAnsi="Arial" w:cs="Arial"/>
+          <w:sz w:val="24"/>
+          <w:szCs w:val="24"/>
+          <w:lang w:eastAsia="pt-BR"/>
+        </w:rPr>
+        <w:t>conteúdos</w:t>
+      </w:r>
+      <w:proofErr w:type="spellEnd"/>
+      <w:r>
+        <w:rPr>
+          <w:rFonts w:ascii="Arial" w:eastAsia="Times New Roman" w:hAnsi="Arial" w:cs="Arial"/>
+          <w:sz w:val="24"/>
+          <w:szCs w:val="24"/>
+          <w:lang w:eastAsia="pt-BR"/>
+        </w:rPr>
+        <w:t>, além da escassez de tempo hábil para adaptar materiais manualmente para turmas numerosas.</w:t>
       </w:r>
     </w:p>
     <w:p>
@@ -2498,8 +2762,21 @@
           <w:szCs w:val="24"/>
           <w:lang w:eastAsia="pt-BR"/>
         </w:rPr>
-        <w:t>TEA Learn</w:t>
-      </w:r>
+        <w:t xml:space="preserve">TEA </w:t>
+      </w:r>
+      <w:proofErr w:type="spellStart"/>
+      <w:r>
+        <w:rPr>
+          <w:rFonts w:ascii="Arial" w:eastAsia="Times New Roman" w:hAnsi="Arial" w:cs="Arial"/>
+          <w:b/>
+          <w:bCs/>
+          <w:sz w:val="24"/>
+          <w:szCs w:val="24"/>
+          <w:lang w:eastAsia="pt-BR"/>
+        </w:rPr>
+        <w:t>Learn</w:t>
+      </w:r>
+      <w:proofErr w:type="spellEnd"/>
       <w:r>
         <w:rPr>
           <w:rFonts w:ascii="Arial" w:eastAsia="Times New Roman" w:hAnsi="Arial" w:cs="Arial"/>
@@ -2552,8 +2829,19 @@
           <w:szCs w:val="24"/>
           <w:lang w:eastAsia="pt-BR"/>
         </w:rPr>
-        <w:t>eriais pedagógicos (PDFs</w:t>
-      </w:r>
+        <w:t>eriais pedagógicos (</w:t>
+      </w:r>
+      <w:proofErr w:type="spellStart"/>
+      <w:r>
+        <w:rPr>
+          <w:rFonts w:ascii="Arial" w:eastAsia="Times New Roman" w:hAnsi="Arial" w:cs="Arial"/>
+          <w:sz w:val="24"/>
+          <w:szCs w:val="24"/>
+          <w:lang w:eastAsia="pt-BR"/>
+        </w:rPr>
+        <w:t>PDFs</w:t>
+      </w:r>
+      <w:proofErr w:type="spellEnd"/>
       <w:r>
         <w:rPr>
           <w:rFonts w:ascii="Arial" w:eastAsia="Times New Roman" w:hAnsi="Arial" w:cs="Arial"/>
@@ -2639,7 +2927,31 @@
           <w:szCs w:val="24"/>
           <w:lang w:eastAsia="pt-BR"/>
         </w:rPr>
-        <w:t xml:space="preserve">Requisito Func – 1: </w:t>
+        <w:t xml:space="preserve">Requisito </w:t>
+      </w:r>
+      <w:proofErr w:type="spellStart"/>
+      <w:r>
+        <w:rPr>
+          <w:rFonts w:ascii="Arial" w:eastAsia="Times New Roman" w:hAnsi="Arial" w:cs="Arial"/>
+          <w:b/>
+          <w:bCs/>
+          <w:sz w:val="24"/>
+          <w:szCs w:val="24"/>
+          <w:lang w:eastAsia="pt-BR"/>
+        </w:rPr>
+        <w:t>Func</w:t>
+      </w:r>
+      <w:proofErr w:type="spellEnd"/>
+      <w:r>
+        <w:rPr>
+          <w:rFonts w:ascii="Arial" w:eastAsia="Times New Roman" w:hAnsi="Arial" w:cs="Arial"/>
+          <w:b/>
+          <w:bCs/>
+          <w:sz w:val="24"/>
+          <w:szCs w:val="24"/>
+          <w:lang w:eastAsia="pt-BR"/>
+        </w:rPr>
+        <w:t xml:space="preserve"> – 1: </w:t>
       </w:r>
       <w:r>
         <w:rPr>
@@ -2672,7 +2984,31 @@
           <w:szCs w:val="24"/>
           <w:lang w:eastAsia="pt-BR"/>
         </w:rPr>
-        <w:t xml:space="preserve">Requisito Func – 2: </w:t>
+        <w:t xml:space="preserve">Requisito </w:t>
+      </w:r>
+      <w:proofErr w:type="spellStart"/>
+      <w:r>
+        <w:rPr>
+          <w:rFonts w:ascii="Arial" w:eastAsia="Times New Roman" w:hAnsi="Arial" w:cs="Arial"/>
+          <w:b/>
+          <w:bCs/>
+          <w:sz w:val="24"/>
+          <w:szCs w:val="24"/>
+          <w:lang w:eastAsia="pt-BR"/>
+        </w:rPr>
+        <w:t>Func</w:t>
+      </w:r>
+      <w:proofErr w:type="spellEnd"/>
+      <w:r>
+        <w:rPr>
+          <w:rFonts w:ascii="Arial" w:eastAsia="Times New Roman" w:hAnsi="Arial" w:cs="Arial"/>
+          <w:b/>
+          <w:bCs/>
+          <w:sz w:val="24"/>
+          <w:szCs w:val="24"/>
+          <w:lang w:eastAsia="pt-BR"/>
+        </w:rPr>
+        <w:t xml:space="preserve"> – 2: </w:t>
       </w:r>
       <w:r>
         <w:rPr>
@@ -2705,7 +3041,31 @@
           <w:szCs w:val="24"/>
           <w:lang w:eastAsia="pt-BR"/>
         </w:rPr>
-        <w:t xml:space="preserve">Requisito Func – 3: </w:t>
+        <w:t xml:space="preserve">Requisito </w:t>
+      </w:r>
+      <w:proofErr w:type="spellStart"/>
+      <w:r>
+        <w:rPr>
+          <w:rFonts w:ascii="Arial" w:eastAsia="Times New Roman" w:hAnsi="Arial" w:cs="Arial"/>
+          <w:b/>
+          <w:bCs/>
+          <w:sz w:val="24"/>
+          <w:szCs w:val="24"/>
+          <w:lang w:eastAsia="pt-BR"/>
+        </w:rPr>
+        <w:t>Func</w:t>
+      </w:r>
+      <w:proofErr w:type="spellEnd"/>
+      <w:r>
+        <w:rPr>
+          <w:rFonts w:ascii="Arial" w:eastAsia="Times New Roman" w:hAnsi="Arial" w:cs="Arial"/>
+          <w:b/>
+          <w:bCs/>
+          <w:sz w:val="24"/>
+          <w:szCs w:val="24"/>
+          <w:lang w:eastAsia="pt-BR"/>
+        </w:rPr>
+        <w:t xml:space="preserve"> – 3: </w:t>
       </w:r>
       <w:r>
         <w:rPr>
@@ -2805,7 +3165,27 @@
           <w:szCs w:val="24"/>
           <w:lang w:eastAsia="pt-BR"/>
         </w:rPr>
-        <w:t>Este capítulo define as fronteiras de atuação do sistema TEA Learn, especificando as funcionalidades que compõem o produto final entregue neste Trabalho de Conclusão de Curso, bem como as delimitações técnicas que definem o que não faz parte do escopo atual do desenvolvimento.</w:t>
+        <w:t xml:space="preserve">Este capítulo define as fronteiras de atuação do sistema TEA </w:t>
+      </w:r>
+      <w:proofErr w:type="spellStart"/>
+      <w:r>
+        <w:rPr>
+          <w:rFonts w:ascii="Arial" w:eastAsia="Times New Roman" w:hAnsi="Arial" w:cs="Arial"/>
+          <w:sz w:val="24"/>
+          <w:szCs w:val="24"/>
+          <w:lang w:eastAsia="pt-BR"/>
+        </w:rPr>
+        <w:t>Learn</w:t>
+      </w:r>
+      <w:proofErr w:type="spellEnd"/>
+      <w:r>
+        <w:rPr>
+          <w:rFonts w:ascii="Arial" w:eastAsia="Times New Roman" w:hAnsi="Arial" w:cs="Arial"/>
+          <w:sz w:val="24"/>
+          <w:szCs w:val="24"/>
+          <w:lang w:eastAsia="pt-BR"/>
+        </w:rPr>
+        <w:t>, especificando as funcionalidades que compõem o produto final entregue neste Trabalho de Conclusão de Curso, bem como as delimitações técnicas que definem o que não faz parte do escopo atual do desenvolvimento.</w:t>
       </w:r>
     </w:p>
     <w:p>
@@ -2863,7 +3243,63 @@
           <w:szCs w:val="24"/>
           <w:lang w:eastAsia="pt-BR"/>
         </w:rPr>
-        <w:t xml:space="preserve">O TEA Learn consiste em uma plataforma web de apoio docente, desenvolvida para ser </w:t>
+        <w:t xml:space="preserve">O TEA </w:t>
+      </w:r>
+      <w:proofErr w:type="spellStart"/>
+      <w:r>
+        <w:rPr>
+          <w:rFonts w:ascii="Arial" w:eastAsia="Times New Roman" w:hAnsi="Arial" w:cs="Arial"/>
+          <w:sz w:val="24"/>
+          <w:szCs w:val="24"/>
+          <w:lang w:eastAsia="pt-BR"/>
+        </w:rPr>
+        <w:t>Learn</w:t>
+      </w:r>
+      <w:proofErr w:type="spellEnd"/>
+      <w:r>
+        <w:rPr>
+          <w:rFonts w:ascii="Arial" w:eastAsia="Times New Roman" w:hAnsi="Arial" w:cs="Arial"/>
+          <w:sz w:val="24"/>
+          <w:szCs w:val="24"/>
+          <w:lang w:eastAsia="pt-BR"/>
+        </w:rPr>
+        <w:t xml:space="preserve"> consist</w:t>
+      </w:r>
+      <w:r>
+        <w:rPr>
+          <w:rFonts w:ascii="Arial" w:eastAsia="Times New Roman" w:hAnsi="Arial" w:cs="Arial"/>
+          <w:sz w:val="24"/>
+          <w:szCs w:val="24"/>
+          <w:lang w:eastAsia="pt-BR"/>
+        </w:rPr>
+        <w:t>irá</w:t>
+      </w:r>
+      <w:r>
+        <w:rPr>
+          <w:rFonts w:ascii="Arial" w:eastAsia="Times New Roman" w:hAnsi="Arial" w:cs="Arial"/>
+          <w:sz w:val="24"/>
+          <w:szCs w:val="24"/>
+          <w:lang w:eastAsia="pt-BR"/>
+        </w:rPr>
+        <w:t xml:space="preserve"> em uma plataforma web de apoio docente, desenvolvida para </w:t>
+      </w:r>
+      <w:r>
+        <w:rPr>
+          <w:rFonts w:ascii="Arial" w:eastAsia="Times New Roman" w:hAnsi="Arial" w:cs="Arial"/>
+          <w:sz w:val="24"/>
+          <w:szCs w:val="24"/>
+          <w:lang w:eastAsia="pt-BR"/>
+        </w:rPr>
+        <w:t xml:space="preserve">que possa </w:t>
+      </w:r>
+      <w:r>
+        <w:rPr>
+          <w:rFonts w:ascii="Arial" w:eastAsia="Times New Roman" w:hAnsi="Arial" w:cs="Arial"/>
+          <w:sz w:val="24"/>
+          <w:szCs w:val="24"/>
+          <w:lang w:eastAsia="pt-BR"/>
+        </w:rPr>
+        <w:t xml:space="preserve">ser </w:t>
       </w:r>
       <w:r>
         <w:rPr>
@@ -2882,16 +3318,70 @@
           <w:szCs w:val="24"/>
           <w:lang w:eastAsia="pt-BR"/>
         </w:rPr>
-        <w:t xml:space="preserve"> da ETEC Professor Camargo Aranha.</w:t>
-      </w:r>
-      <w:r>
-        <w:rPr>
-          <w:rFonts w:ascii="Arial" w:eastAsia="Times New Roman" w:hAnsi="Arial" w:cs="Arial"/>
-          <w:sz w:val="24"/>
-          <w:szCs w:val="24"/>
-          <w:lang w:eastAsia="pt-BR"/>
-        </w:rPr>
-        <w:t xml:space="preserve"> Além disso, os materiais adaptados serão utilizados pelos alunos com </w:t>
+        <w:t xml:space="preserve"> da ETEC Professor Camargo Aranha</w:t>
+      </w:r>
+      <w:r>
+        <w:rPr>
+          <w:rFonts w:ascii="Arial" w:eastAsia="Times New Roman" w:hAnsi="Arial" w:cs="Arial"/>
+          <w:sz w:val="24"/>
+          <w:szCs w:val="24"/>
+          <w:lang w:eastAsia="pt-BR"/>
+        </w:rPr>
+        <w:t>,</w:t>
+      </w:r>
+      <w:r>
+        <w:rPr>
+          <w:rFonts w:ascii="Arial" w:eastAsia="Times New Roman" w:hAnsi="Arial" w:cs="Arial"/>
+          <w:sz w:val="24"/>
+          <w:szCs w:val="24"/>
+          <w:lang w:eastAsia="pt-BR"/>
+        </w:rPr>
+        <w:t xml:space="preserve"> de forma com que</w:t>
+      </w:r>
+      <w:r>
+        <w:rPr>
+          <w:rFonts w:ascii="Arial" w:eastAsia="Times New Roman" w:hAnsi="Arial" w:cs="Arial"/>
+          <w:sz w:val="24"/>
+          <w:szCs w:val="24"/>
+          <w:lang w:eastAsia="pt-BR"/>
+        </w:rPr>
+        <w:t xml:space="preserve"> os materiais adaptados </w:t>
+      </w:r>
+      <w:r>
+        <w:rPr>
+          <w:rFonts w:ascii="Arial" w:eastAsia="Times New Roman" w:hAnsi="Arial" w:cs="Arial"/>
+          <w:sz w:val="24"/>
+          <w:szCs w:val="24"/>
+          <w:lang w:eastAsia="pt-BR"/>
+        </w:rPr>
+        <w:t>po</w:t>
+      </w:r>
+      <w:r>
+        <w:rPr>
+          <w:rFonts w:ascii="Arial" w:eastAsia="Times New Roman" w:hAnsi="Arial" w:cs="Arial"/>
+          <w:sz w:val="24"/>
+          <w:szCs w:val="24"/>
+          <w:lang w:eastAsia="pt-BR"/>
+        </w:rPr>
+        <w:t>ssam eventualmente</w:t>
+      </w:r>
+      <w:r>
+        <w:rPr>
+          <w:rFonts w:ascii="Arial" w:eastAsia="Times New Roman" w:hAnsi="Arial" w:cs="Arial"/>
+          <w:sz w:val="24"/>
+          <w:szCs w:val="24"/>
+          <w:lang w:eastAsia="pt-BR"/>
+        </w:rPr>
+        <w:t xml:space="preserve"> ser utilizados</w:t>
+      </w:r>
+      <w:r>
+        <w:rPr>
+          <w:rFonts w:ascii="Arial" w:eastAsia="Times New Roman" w:hAnsi="Arial" w:cs="Arial"/>
+          <w:sz w:val="24"/>
+          <w:szCs w:val="24"/>
+          <w:lang w:eastAsia="pt-BR"/>
+        </w:rPr>
+        <w:t xml:space="preserve"> pelos alunos com </w:t>
       </w:r>
       <w:r>
         <w:rPr>
@@ -2947,16 +3437,54 @@
           <w:szCs w:val="24"/>
           <w:lang w:eastAsia="pt-BR"/>
         </w:rPr>
-        <w:t xml:space="preserve">, onde o motor pedagógico da IA está calibrado para lidar com textos discursivos, interpretação e organização lógica </w:t>
-      </w:r>
-      <w:r>
-        <w:rPr>
-          <w:rFonts w:ascii="Arial" w:eastAsia="Times New Roman" w:hAnsi="Arial" w:cs="Arial"/>
-          <w:sz w:val="24"/>
-          <w:szCs w:val="24"/>
-          <w:lang w:eastAsia="pt-BR"/>
-        </w:rPr>
-        <w:t>de conteúdos.</w:t>
+        <w:t>, onde o motor pedagógico da IA est</w:t>
+      </w:r>
+      <w:r>
+        <w:rPr>
+          <w:rFonts w:ascii="Arial" w:eastAsia="Times New Roman" w:hAnsi="Arial" w:cs="Arial"/>
+          <w:sz w:val="24"/>
+          <w:szCs w:val="24"/>
+          <w:lang w:eastAsia="pt-BR"/>
+        </w:rPr>
+        <w:t>ará</w:t>
+      </w:r>
+      <w:r>
+        <w:rPr>
+          <w:rFonts w:ascii="Arial" w:eastAsia="Times New Roman" w:hAnsi="Arial" w:cs="Arial"/>
+          <w:sz w:val="24"/>
+          <w:szCs w:val="24"/>
+          <w:lang w:eastAsia="pt-BR"/>
+        </w:rPr>
+        <w:t xml:space="preserve"> calibrado para lidar com textos discursivos, interpretação e organização lógica </w:t>
+      </w:r>
+      <w:r>
+        <w:rPr>
+          <w:rFonts w:ascii="Arial" w:eastAsia="Times New Roman" w:hAnsi="Arial" w:cs="Arial"/>
+          <w:sz w:val="24"/>
+          <w:szCs w:val="24"/>
+          <w:lang w:eastAsia="pt-BR"/>
+        </w:rPr>
+        <w:t xml:space="preserve">de </w:t>
+      </w:r>
+      <w:proofErr w:type="spellStart"/>
+      <w:r>
+        <w:rPr>
+          <w:rFonts w:ascii="Arial" w:eastAsia="Times New Roman" w:hAnsi="Arial" w:cs="Arial"/>
+          <w:sz w:val="24"/>
+          <w:szCs w:val="24"/>
+          <w:lang w:eastAsia="pt-BR"/>
+        </w:rPr>
+        <w:t>conteúdos</w:t>
+      </w:r>
+      <w:proofErr w:type="spellEnd"/>
+      <w:r>
+        <w:rPr>
+          <w:rFonts w:ascii="Arial" w:eastAsia="Times New Roman" w:hAnsi="Arial" w:cs="Arial"/>
+          <w:sz w:val="24"/>
+          <w:szCs w:val="24"/>
+          <w:lang w:eastAsia="pt-BR"/>
+        </w:rPr>
+        <w:t>.</w:t>
       </w:r>
     </w:p>
     <w:p>
@@ -2989,7 +3517,25 @@
           <w:szCs w:val="24"/>
           <w:lang w:eastAsia="pt-BR"/>
         </w:rPr>
-        <w:t xml:space="preserve">O fluxo geral do sistema segue a metodologia ADDIE junto ao Desenho Universal da Aprendizagem (DUA): </w:t>
+        <w:t>O fluxo geral do sistema segu</w:t>
+      </w:r>
+      <w:r>
+        <w:rPr>
+          <w:rFonts w:ascii="Arial" w:eastAsia="Times New Roman" w:hAnsi="Arial" w:cs="Arial"/>
+          <w:sz w:val="24"/>
+          <w:szCs w:val="24"/>
+          <w:lang w:eastAsia="pt-BR"/>
+        </w:rPr>
+        <w:t xml:space="preserve">irá </w:t>
+      </w:r>
+      <w:r>
+        <w:rPr>
+          <w:rFonts w:ascii="Arial" w:eastAsia="Times New Roman" w:hAnsi="Arial" w:cs="Arial"/>
+          <w:sz w:val="24"/>
+          <w:szCs w:val="24"/>
+          <w:lang w:eastAsia="pt-BR"/>
+        </w:rPr>
+        <w:t xml:space="preserve">a metodologia ADDIE junto ao Desenho Universal da Aprendizagem (DUA): </w:t>
       </w:r>
     </w:p>
     <w:p>
@@ -3016,16 +3562,56 @@
           <w:szCs w:val="24"/>
           <w:lang w:eastAsia="pt-BR"/>
         </w:rPr>
-        <w:t>Etapa de Análise (Analysis)</w:t>
-      </w:r>
-      <w:r>
-        <w:rPr>
-          <w:rFonts w:ascii="Arial" w:eastAsia="Times New Roman" w:hAnsi="Arial" w:cs="Arial"/>
-          <w:sz w:val="24"/>
-          <w:szCs w:val="24"/>
-          <w:lang w:eastAsia="pt-BR"/>
-        </w:rPr>
-        <w:t xml:space="preserve">: O material didático original é examinado para identificar problemas de acessibilidade, como linguagem complexa, </w:t>
+        <w:t>Etapa de Análise (</w:t>
+      </w:r>
+      <w:proofErr w:type="spellStart"/>
+      <w:r>
+        <w:rPr>
+          <w:rFonts w:ascii="Arial" w:eastAsia="Times New Roman" w:hAnsi="Arial" w:cs="Arial"/>
+          <w:b/>
+          <w:sz w:val="24"/>
+          <w:szCs w:val="24"/>
+          <w:lang w:eastAsia="pt-BR"/>
+        </w:rPr>
+        <w:t>Analysis</w:t>
+      </w:r>
+      <w:proofErr w:type="spellEnd"/>
+      <w:r>
+        <w:rPr>
+          <w:rFonts w:ascii="Arial" w:eastAsia="Times New Roman" w:hAnsi="Arial" w:cs="Arial"/>
+          <w:b/>
+          <w:sz w:val="24"/>
+          <w:szCs w:val="24"/>
+          <w:lang w:eastAsia="pt-BR"/>
+        </w:rPr>
+        <w:t>)</w:t>
+      </w:r>
+      <w:r>
+        <w:rPr>
+          <w:rFonts w:ascii="Arial" w:eastAsia="Times New Roman" w:hAnsi="Arial" w:cs="Arial"/>
+          <w:sz w:val="24"/>
+          <w:szCs w:val="24"/>
+          <w:lang w:eastAsia="pt-BR"/>
+        </w:rPr>
+        <w:t xml:space="preserve">: O material didático original </w:t>
+      </w:r>
+      <w:r>
+        <w:rPr>
+          <w:rFonts w:ascii="Arial" w:eastAsia="Times New Roman" w:hAnsi="Arial" w:cs="Arial"/>
+          <w:sz w:val="24"/>
+          <w:szCs w:val="24"/>
+          <w:lang w:eastAsia="pt-BR"/>
+        </w:rPr>
+        <w:t>será</w:t>
+      </w:r>
+      <w:r>
+        <w:rPr>
+          <w:rFonts w:ascii="Arial" w:eastAsia="Times New Roman" w:hAnsi="Arial" w:cs="Arial"/>
+          <w:sz w:val="24"/>
+          <w:szCs w:val="24"/>
+          <w:lang w:eastAsia="pt-BR"/>
+        </w:rPr>
+        <w:t xml:space="preserve"> examinado para identificar problemas de acessibilidade, como linguagem complexa, </w:t>
       </w:r>
       <w:r>
         <w:rPr>
@@ -3044,7 +3630,25 @@
           <w:szCs w:val="24"/>
           <w:lang w:eastAsia="pt-BR"/>
         </w:rPr>
-        <w:t xml:space="preserve"> ou abstração. Também são consideradas características do TEA nível 1, como a preferência por clareza, dificuldade com </w:t>
+        <w:t xml:space="preserve"> ou abstração. Também s</w:t>
+      </w:r>
+      <w:r>
+        <w:rPr>
+          <w:rFonts w:ascii="Arial" w:eastAsia="Times New Roman" w:hAnsi="Arial" w:cs="Arial"/>
+          <w:sz w:val="24"/>
+          <w:szCs w:val="24"/>
+          <w:lang w:eastAsia="pt-BR"/>
+        </w:rPr>
+        <w:t>erão</w:t>
+      </w:r>
+      <w:r>
+        <w:rPr>
+          <w:rFonts w:ascii="Arial" w:eastAsia="Times New Roman" w:hAnsi="Arial" w:cs="Arial"/>
+          <w:sz w:val="24"/>
+          <w:szCs w:val="24"/>
+          <w:lang w:eastAsia="pt-BR"/>
+        </w:rPr>
+        <w:t xml:space="preserve"> consideradas características do TEA nível 1, como a preferência por clareza, dificuldade com </w:t>
       </w:r>
       <w:r>
         <w:rPr>
@@ -3063,7 +3667,25 @@
           <w:szCs w:val="24"/>
           <w:lang w:eastAsia="pt-BR"/>
         </w:rPr>
-        <w:t xml:space="preserve"> e necessidade de estrutura. O resultado dessa fase é uma lista de requisitos de adaptação. </w:t>
+        <w:t xml:space="preserve"> e necessidade de estrutura. </w:t>
+      </w:r>
+      <w:r>
+        <w:rPr>
+          <w:rFonts w:ascii="Arial" w:eastAsia="Times New Roman" w:hAnsi="Arial" w:cs="Arial"/>
+          <w:sz w:val="24"/>
+          <w:szCs w:val="24"/>
+          <w:lang w:eastAsia="pt-BR"/>
+        </w:rPr>
+        <w:t>Essa fase resultará em</w:t>
+      </w:r>
+      <w:r>
+        <w:rPr>
+          <w:rFonts w:ascii="Arial" w:eastAsia="Times New Roman" w:hAnsi="Arial" w:cs="Arial"/>
+          <w:sz w:val="24"/>
+          <w:szCs w:val="24"/>
+          <w:lang w:eastAsia="pt-BR"/>
+        </w:rPr>
+        <w:t xml:space="preserve"> uma lista de requisitos de adaptação. </w:t>
       </w:r>
     </w:p>
     <w:p>
@@ -3099,7 +3721,25 @@
           <w:szCs w:val="24"/>
           <w:lang w:eastAsia="pt-BR"/>
         </w:rPr>
-        <w:t xml:space="preserve">: Esses requisitos são transformados em regras pedagógicas </w:t>
+        <w:t xml:space="preserve">: Esses requisitos </w:t>
+      </w:r>
+      <w:r>
+        <w:rPr>
+          <w:rFonts w:ascii="Arial" w:eastAsia="Times New Roman" w:hAnsi="Arial" w:cs="Arial"/>
+          <w:sz w:val="24"/>
+          <w:szCs w:val="24"/>
+          <w:lang w:eastAsia="pt-BR"/>
+        </w:rPr>
+        <w:t>seriam</w:t>
+      </w:r>
+      <w:r>
+        <w:rPr>
+          <w:rFonts w:ascii="Arial" w:eastAsia="Times New Roman" w:hAnsi="Arial" w:cs="Arial"/>
+          <w:sz w:val="24"/>
+          <w:szCs w:val="24"/>
+          <w:lang w:eastAsia="pt-BR"/>
+        </w:rPr>
+        <w:t xml:space="preserve"> transformados em regras pedagógicas </w:t>
       </w:r>
       <w:r>
         <w:rPr>
@@ -3118,7 +3758,25 @@
           <w:szCs w:val="24"/>
           <w:lang w:eastAsia="pt-BR"/>
         </w:rPr>
-        <w:t xml:space="preserve">. Isso inclui múltiplas formas de representação, como </w:t>
+        <w:t>. Isso inclui</w:t>
+      </w:r>
+      <w:r>
+        <w:rPr>
+          <w:rFonts w:ascii="Arial" w:eastAsia="Times New Roman" w:hAnsi="Arial" w:cs="Arial"/>
+          <w:sz w:val="24"/>
+          <w:szCs w:val="24"/>
+          <w:lang w:eastAsia="pt-BR"/>
+        </w:rPr>
+        <w:t>ria</w:t>
+      </w:r>
+      <w:r>
+        <w:rPr>
+          <w:rFonts w:ascii="Arial" w:eastAsia="Times New Roman" w:hAnsi="Arial" w:cs="Arial"/>
+          <w:sz w:val="24"/>
+          <w:szCs w:val="24"/>
+          <w:lang w:eastAsia="pt-BR"/>
+        </w:rPr>
+        <w:t xml:space="preserve"> múltiplas formas de representação, como </w:t>
       </w:r>
       <w:r>
         <w:rPr>
@@ -3137,7 +3795,43 @@
           <w:szCs w:val="24"/>
           <w:lang w:eastAsia="pt-BR"/>
         </w:rPr>
-        <w:t xml:space="preserve">, organização do conteúdo em etapas e tópicos, além da eliminação de ambiguidades e destaque de palavras-chave. O resultado é um conjunto de regras de adaptação que funciona como o “motor pedagógico” do sistema. </w:t>
+        <w:t xml:space="preserve">, organização do conteúdo em etapas e tópicos, além da eliminação de ambiguidades e destaque de palavras-chave. O resultado </w:t>
+      </w:r>
+      <w:r>
+        <w:rPr>
+          <w:rFonts w:ascii="Arial" w:eastAsia="Times New Roman" w:hAnsi="Arial" w:cs="Arial"/>
+          <w:sz w:val="24"/>
+          <w:szCs w:val="24"/>
+          <w:lang w:eastAsia="pt-BR"/>
+        </w:rPr>
+        <w:t>seria</w:t>
+      </w:r>
+      <w:r>
+        <w:rPr>
+          <w:rFonts w:ascii="Arial" w:eastAsia="Times New Roman" w:hAnsi="Arial" w:cs="Arial"/>
+          <w:sz w:val="24"/>
+          <w:szCs w:val="24"/>
+          <w:lang w:eastAsia="pt-BR"/>
+        </w:rPr>
+        <w:t xml:space="preserve"> um conjunto de regras de adaptação que funciona</w:t>
+      </w:r>
+      <w:r>
+        <w:rPr>
+          <w:rFonts w:ascii="Arial" w:eastAsia="Times New Roman" w:hAnsi="Arial" w:cs="Arial"/>
+          <w:sz w:val="24"/>
+          <w:szCs w:val="24"/>
+          <w:lang w:eastAsia="pt-BR"/>
+        </w:rPr>
+        <w:t>ria</w:t>
+      </w:r>
+      <w:r>
+        <w:rPr>
+          <w:rFonts w:ascii="Arial" w:eastAsia="Times New Roman" w:hAnsi="Arial" w:cs="Arial"/>
+          <w:sz w:val="24"/>
+          <w:szCs w:val="24"/>
+          <w:lang w:eastAsia="pt-BR"/>
+        </w:rPr>
+        <w:t xml:space="preserve"> como o “motor pedagógico” do sistema. </w:t>
       </w:r>
     </w:p>
     <w:p>
@@ -3164,16 +3858,92 @@
           <w:szCs w:val="24"/>
           <w:lang w:eastAsia="pt-BR"/>
         </w:rPr>
-        <w:t>Etapa de Desenvolvimento (Development)</w:t>
-      </w:r>
-      <w:r>
-        <w:rPr>
-          <w:rFonts w:ascii="Arial" w:eastAsia="Times New Roman" w:hAnsi="Arial" w:cs="Arial"/>
-          <w:sz w:val="24"/>
-          <w:szCs w:val="24"/>
-          <w:lang w:eastAsia="pt-BR"/>
-        </w:rPr>
-        <w:t xml:space="preserve">: A inteligência artificial aplica essas regras ao material original. O processamento envolve simplificação de texto, segmentação do conteúdo, reorganização lógica, geração de exemplos e destaque de conceitos-chave. O resultado é o material adaptado. </w:t>
+        <w:t>Etapa de Desenvolvimento (</w:t>
+      </w:r>
+      <w:proofErr w:type="spellStart"/>
+      <w:r>
+        <w:rPr>
+          <w:rFonts w:ascii="Arial" w:eastAsia="Times New Roman" w:hAnsi="Arial" w:cs="Arial"/>
+          <w:b/>
+          <w:sz w:val="24"/>
+          <w:szCs w:val="24"/>
+          <w:lang w:eastAsia="pt-BR"/>
+        </w:rPr>
+        <w:t>Development</w:t>
+      </w:r>
+      <w:proofErr w:type="spellEnd"/>
+      <w:r>
+        <w:rPr>
+          <w:rFonts w:ascii="Arial" w:eastAsia="Times New Roman" w:hAnsi="Arial" w:cs="Arial"/>
+          <w:b/>
+          <w:sz w:val="24"/>
+          <w:szCs w:val="24"/>
+          <w:lang w:eastAsia="pt-BR"/>
+        </w:rPr>
+        <w:t>)</w:t>
+      </w:r>
+      <w:r>
+        <w:rPr>
+          <w:rFonts w:ascii="Arial" w:eastAsia="Times New Roman" w:hAnsi="Arial" w:cs="Arial"/>
+          <w:sz w:val="24"/>
+          <w:szCs w:val="24"/>
+          <w:lang w:eastAsia="pt-BR"/>
+        </w:rPr>
+        <w:t>: A inteligência artificial aplica</w:t>
+      </w:r>
+      <w:r>
+        <w:rPr>
+          <w:rFonts w:ascii="Arial" w:eastAsia="Times New Roman" w:hAnsi="Arial" w:cs="Arial"/>
+          <w:sz w:val="24"/>
+          <w:szCs w:val="24"/>
+          <w:lang w:eastAsia="pt-BR"/>
+        </w:rPr>
+        <w:t>ria</w:t>
+      </w:r>
+      <w:r>
+        <w:rPr>
+          <w:rFonts w:ascii="Arial" w:eastAsia="Times New Roman" w:hAnsi="Arial" w:cs="Arial"/>
+          <w:sz w:val="24"/>
+          <w:szCs w:val="24"/>
+          <w:lang w:eastAsia="pt-BR"/>
+        </w:rPr>
+        <w:t xml:space="preserve"> essas regras ao material original. O processamento envolve</w:t>
+      </w:r>
+      <w:r>
+        <w:rPr>
+          <w:rFonts w:ascii="Arial" w:eastAsia="Times New Roman" w:hAnsi="Arial" w:cs="Arial"/>
+          <w:sz w:val="24"/>
+          <w:szCs w:val="24"/>
+          <w:lang w:eastAsia="pt-BR"/>
+        </w:rPr>
+        <w:t>ria</w:t>
+      </w:r>
+      <w:r>
+        <w:rPr>
+          <w:rFonts w:ascii="Arial" w:eastAsia="Times New Roman" w:hAnsi="Arial" w:cs="Arial"/>
+          <w:sz w:val="24"/>
+          <w:szCs w:val="24"/>
+          <w:lang w:eastAsia="pt-BR"/>
+        </w:rPr>
+        <w:t xml:space="preserve"> simplificação de texto, segmentação do conteúdo, reorganização lógica, geração de exemplos e destaque de conceitos-chave. O resultado </w:t>
+      </w:r>
+      <w:r>
+        <w:rPr>
+          <w:rFonts w:ascii="Arial" w:eastAsia="Times New Roman" w:hAnsi="Arial" w:cs="Arial"/>
+          <w:sz w:val="24"/>
+          <w:szCs w:val="24"/>
+          <w:lang w:eastAsia="pt-BR"/>
+        </w:rPr>
+        <w:t xml:space="preserve">seria </w:t>
+      </w:r>
+      <w:r>
+        <w:rPr>
+          <w:rFonts w:ascii="Arial" w:eastAsia="Times New Roman" w:hAnsi="Arial" w:cs="Arial"/>
+          <w:sz w:val="24"/>
+          <w:szCs w:val="24"/>
+          <w:lang w:eastAsia="pt-BR"/>
+        </w:rPr>
+        <w:t xml:space="preserve">o material adaptado. </w:t>
       </w:r>
     </w:p>
     <w:p>
@@ -3201,16 +3971,74 @@
           <w:lang w:eastAsia="pt-BR"/>
         </w:rPr>
         <w:lastRenderedPageBreak/>
-        <w:t>Etapa de Implementação (Implementation)</w:t>
-      </w:r>
-      <w:r>
-        <w:rPr>
-          <w:rFonts w:ascii="Arial" w:eastAsia="Times New Roman" w:hAnsi="Arial" w:cs="Arial"/>
-          <w:sz w:val="24"/>
-          <w:szCs w:val="24"/>
-          <w:lang w:eastAsia="pt-BR"/>
-        </w:rPr>
-        <w:t xml:space="preserve">: Esse material adaptado é disponibilizado na plataforma para uso por professores e alunos, garantindo que o conteúdo seja acessível e aplicado de forma inclusiva. </w:t>
+        <w:t>Etapa de Implementação (</w:t>
+      </w:r>
+      <w:proofErr w:type="spellStart"/>
+      <w:r>
+        <w:rPr>
+          <w:rFonts w:ascii="Arial" w:eastAsia="Times New Roman" w:hAnsi="Arial" w:cs="Arial"/>
+          <w:b/>
+          <w:sz w:val="24"/>
+          <w:szCs w:val="24"/>
+          <w:lang w:eastAsia="pt-BR"/>
+        </w:rPr>
+        <w:t>Implementation</w:t>
+      </w:r>
+      <w:proofErr w:type="spellEnd"/>
+      <w:r>
+        <w:rPr>
+          <w:rFonts w:ascii="Arial" w:eastAsia="Times New Roman" w:hAnsi="Arial" w:cs="Arial"/>
+          <w:b/>
+          <w:sz w:val="24"/>
+          <w:szCs w:val="24"/>
+          <w:lang w:eastAsia="pt-BR"/>
+        </w:rPr>
+        <w:t>)</w:t>
+      </w:r>
+      <w:r>
+        <w:rPr>
+          <w:rFonts w:ascii="Arial" w:eastAsia="Times New Roman" w:hAnsi="Arial" w:cs="Arial"/>
+          <w:sz w:val="24"/>
+          <w:szCs w:val="24"/>
+          <w:lang w:eastAsia="pt-BR"/>
+        </w:rPr>
+        <w:t xml:space="preserve">: Esse material adaptado </w:t>
+      </w:r>
+      <w:r>
+        <w:rPr>
+          <w:rFonts w:ascii="Arial" w:eastAsia="Times New Roman" w:hAnsi="Arial" w:cs="Arial"/>
+          <w:sz w:val="24"/>
+          <w:szCs w:val="24"/>
+          <w:lang w:eastAsia="pt-BR"/>
+        </w:rPr>
+        <w:t>seria</w:t>
+      </w:r>
+      <w:r>
+        <w:rPr>
+          <w:rFonts w:ascii="Arial" w:eastAsia="Times New Roman" w:hAnsi="Arial" w:cs="Arial"/>
+          <w:sz w:val="24"/>
+          <w:szCs w:val="24"/>
+          <w:lang w:eastAsia="pt-BR"/>
+        </w:rPr>
+        <w:t xml:space="preserve"> disponibilizado na plataforma para uso por professores e alunos, </w:t>
+      </w:r>
+      <w:r>
+        <w:rPr>
+          <w:rFonts w:ascii="Arial" w:eastAsia="Times New Roman" w:hAnsi="Arial" w:cs="Arial"/>
+          <w:sz w:val="24"/>
+          <w:szCs w:val="24"/>
+          <w:lang w:eastAsia="pt-BR"/>
+        </w:rPr>
+        <w:t>de forma que garantiria</w:t>
+      </w:r>
+      <w:r>
+        <w:rPr>
+          <w:rFonts w:ascii="Arial" w:eastAsia="Times New Roman" w:hAnsi="Arial" w:cs="Arial"/>
+          <w:sz w:val="24"/>
+          <w:szCs w:val="24"/>
+          <w:lang w:eastAsia="pt-BR"/>
+        </w:rPr>
+        <w:t xml:space="preserve"> que o conteúdo seja acessível e aplicado de forma inclusiva. </w:t>
       </w:r>
     </w:p>
     <w:p>
@@ -3261,7 +4089,25 @@
           <w:szCs w:val="24"/>
           <w:lang w:eastAsia="pt-BR"/>
         </w:rPr>
-        <w:t>, o escopo do projeto abrange as seguintes funcionalidades técnicas</w:t>
+        <w:t xml:space="preserve">, o escopo do projeto </w:t>
+      </w:r>
+      <w:r>
+        <w:rPr>
+          <w:rFonts w:ascii="Arial" w:eastAsia="Times New Roman" w:hAnsi="Arial" w:cs="Arial"/>
+          <w:sz w:val="24"/>
+          <w:szCs w:val="24"/>
+          <w:lang w:eastAsia="pt-BR"/>
+        </w:rPr>
+        <w:t>busca abranger</w:t>
+      </w:r>
+      <w:r>
+        <w:rPr>
+          <w:rFonts w:ascii="Arial" w:eastAsia="Times New Roman" w:hAnsi="Arial" w:cs="Arial"/>
+          <w:sz w:val="24"/>
+          <w:szCs w:val="24"/>
+          <w:lang w:eastAsia="pt-BR"/>
+        </w:rPr>
+        <w:t xml:space="preserve"> as seguintes funcionalidades técnicas</w:t>
       </w:r>
       <w:r>
         <w:rPr>
@@ -3557,6 +4403,7 @@
       <w:r>
         <w:rPr>
           <w:rFonts w:ascii="Arial" w:eastAsia="Times New Roman" w:hAnsi="Arial" w:cs="Arial"/>
+          <w:noProof/>
           <w:sz w:val="24"/>
           <w:szCs w:val="24"/>
           <w:lang w:eastAsia="pt-BR"/>
@@ -3612,6 +4459,7 @@
       <w:r>
         <w:rPr>
           <w:rFonts w:ascii="Arial" w:eastAsia="Times New Roman" w:hAnsi="Arial" w:cs="Arial"/>
+          <w:noProof/>
           <w:sz w:val="24"/>
           <w:szCs w:val="24"/>
           <w:lang w:eastAsia="pt-BR"/>
@@ -3668,6 +4516,7 @@
       <w:r>
         <w:rPr>
           <w:rFonts w:ascii="Arial" w:eastAsia="Times New Roman" w:hAnsi="Arial" w:cs="Arial"/>
+          <w:noProof/>
           <w:sz w:val="24"/>
           <w:szCs w:val="24"/>
           <w:lang w:eastAsia="pt-BR"/>
@@ -3855,6 +4704,7 @@
       <w:r>
         <w:rPr>
           <w:rFonts w:ascii="Arial" w:eastAsia="Times New Roman" w:hAnsi="Arial" w:cs="Arial"/>
+          <w:noProof/>
           <w:sz w:val="24"/>
           <w:szCs w:val="24"/>
           <w:lang w:eastAsia="pt-BR"/>
@@ -3911,6 +4761,7 @@
       <w:r>
         <w:rPr>
           <w:rFonts w:ascii="Arial" w:eastAsia="Times New Roman" w:hAnsi="Arial" w:cs="Arial"/>
+          <w:noProof/>
           <w:sz w:val="24"/>
           <w:szCs w:val="24"/>
           <w:lang w:eastAsia="pt-BR"/>
@@ -3967,6 +4818,7 @@
       <w:r>
         <w:rPr>
           <w:rFonts w:ascii="Arial" w:eastAsia="Times New Roman" w:hAnsi="Arial" w:cs="Arial"/>
+          <w:noProof/>
           <w:sz w:val="24"/>
           <w:szCs w:val="24"/>
           <w:lang w:eastAsia="pt-BR"/>
@@ -4229,7 +5081,109 @@
           <w:szCs w:val="24"/>
           <w:lang w:eastAsia="pt-BR"/>
         </w:rPr>
-        <w:t>Embora o presente trabalho de conclusão de curso foque no desenvolvimento de um Produto Mínimo Viável (MVP), delimitado pela adaptação de textos em formato PDF para alunos com TEA Nível 1, o escopo global do projeto TEA Learn prevê a maturação e a escalabilidade da plataforma como um ecossistema educacional inclusivo. A visão de longo prazo contempla as seguintes frentes de evolução:</w:t>
+        <w:t xml:space="preserve">Embora o presente trabalho de conclusão de curso </w:t>
+      </w:r>
+      <w:r>
+        <w:rPr>
+          <w:rFonts w:ascii="Arial" w:eastAsia="Times New Roman" w:hAnsi="Arial" w:cs="Arial"/>
+          <w:bCs/>
+          <w:sz w:val="24"/>
+          <w:szCs w:val="24"/>
+          <w:lang w:eastAsia="pt-BR"/>
+        </w:rPr>
+        <w:t>busque desenvolver</w:t>
+      </w:r>
+      <w:r>
+        <w:rPr>
+          <w:rFonts w:ascii="Arial" w:eastAsia="Times New Roman" w:hAnsi="Arial" w:cs="Arial"/>
+          <w:bCs/>
+          <w:sz w:val="24"/>
+          <w:szCs w:val="24"/>
+          <w:lang w:eastAsia="pt-BR"/>
+        </w:rPr>
+        <w:t xml:space="preserve"> um Produto Mínimo Viável (MVP), delimitado pela adaptação de textos em formato PDF para alunos com TEA Nível 1, o escopo global do projeto TEA </w:t>
+      </w:r>
+      <w:proofErr w:type="spellStart"/>
+      <w:r>
+        <w:rPr>
+          <w:rFonts w:ascii="Arial" w:eastAsia="Times New Roman" w:hAnsi="Arial" w:cs="Arial"/>
+          <w:bCs/>
+          <w:sz w:val="24"/>
+          <w:szCs w:val="24"/>
+          <w:lang w:eastAsia="pt-BR"/>
+        </w:rPr>
+        <w:t>Learn</w:t>
+      </w:r>
+      <w:proofErr w:type="spellEnd"/>
+      <w:r>
+        <w:rPr>
+          <w:rFonts w:ascii="Arial" w:eastAsia="Times New Roman" w:hAnsi="Arial" w:cs="Arial"/>
+          <w:bCs/>
+          <w:sz w:val="24"/>
+          <w:szCs w:val="24"/>
+          <w:lang w:eastAsia="pt-BR"/>
+        </w:rPr>
+        <w:t xml:space="preserve"> </w:t>
+      </w:r>
+      <w:r>
+        <w:rPr>
+          <w:rFonts w:ascii="Arial" w:eastAsia="Times New Roman" w:hAnsi="Arial" w:cs="Arial"/>
+          <w:bCs/>
+          <w:sz w:val="24"/>
+          <w:szCs w:val="24"/>
+          <w:lang w:eastAsia="pt-BR"/>
+        </w:rPr>
+        <w:t xml:space="preserve">espera alcançar </w:t>
+      </w:r>
+      <w:r>
+        <w:rPr>
+          <w:rFonts w:ascii="Arial" w:eastAsia="Times New Roman" w:hAnsi="Arial" w:cs="Arial"/>
+          <w:bCs/>
+          <w:sz w:val="24"/>
+          <w:szCs w:val="24"/>
+          <w:lang w:eastAsia="pt-BR"/>
+        </w:rPr>
+        <w:t>a maturação e a escalabilidade da plataforma</w:t>
+      </w:r>
+      <w:r>
+        <w:rPr>
+          <w:rFonts w:ascii="Arial" w:eastAsia="Times New Roman" w:hAnsi="Arial" w:cs="Arial"/>
+          <w:bCs/>
+          <w:sz w:val="24"/>
+          <w:szCs w:val="24"/>
+          <w:lang w:eastAsia="pt-BR"/>
+        </w:rPr>
+        <w:t>,</w:t>
+      </w:r>
+      <w:r>
+        <w:rPr>
+          <w:rFonts w:ascii="Arial" w:eastAsia="Times New Roman" w:hAnsi="Arial" w:cs="Arial"/>
+          <w:bCs/>
+          <w:sz w:val="24"/>
+          <w:szCs w:val="24"/>
+          <w:lang w:eastAsia="pt-BR"/>
+        </w:rPr>
+        <w:t xml:space="preserve"> </w:t>
+      </w:r>
+      <w:r>
+        <w:rPr>
+          <w:rFonts w:ascii="Arial" w:eastAsia="Times New Roman" w:hAnsi="Arial" w:cs="Arial"/>
+          <w:bCs/>
+          <w:sz w:val="24"/>
+          <w:szCs w:val="24"/>
+          <w:lang w:eastAsia="pt-BR"/>
+        </w:rPr>
+        <w:t>tornando-se assim</w:t>
+      </w:r>
+      <w:r>
+        <w:rPr>
+          <w:rFonts w:ascii="Arial" w:eastAsia="Times New Roman" w:hAnsi="Arial" w:cs="Arial"/>
+          <w:bCs/>
+          <w:sz w:val="24"/>
+          <w:szCs w:val="24"/>
+          <w:lang w:eastAsia="pt-BR"/>
+        </w:rPr>
+        <w:t xml:space="preserve"> um ecossistema educacional inclusivo. A visão de longo prazo contempla as seguintes frentes de evolução:</w:t>
       </w:r>
     </w:p>
     <w:p>
@@ -4300,7 +5254,37 @@
           <w:szCs w:val="24"/>
           <w:lang w:eastAsia="pt-BR"/>
         </w:rPr>
-        <w:t>A evolução do sistema visa a superação da limitação atual de formatos de arquivo. O escopo global integra a capacidade de processamento de imagens, vídeos e áudios. O objetivo é que qualquer material didático, independentemente da sua fonte ou formato original, possa ser adaptado para o público-alvo.</w:t>
+        <w:t>a</w:t>
+      </w:r>
+      <w:r>
+        <w:rPr>
+          <w:rFonts w:ascii="Arial" w:eastAsia="Times New Roman" w:hAnsi="Arial" w:cs="Arial"/>
+          <w:bCs/>
+          <w:sz w:val="24"/>
+          <w:szCs w:val="24"/>
+          <w:lang w:eastAsia="pt-BR"/>
+        </w:rPr>
+        <w:t xml:space="preserve"> evolução do sistema visa </w:t>
+      </w:r>
+      <w:r>
+        <w:rPr>
+          <w:rFonts w:ascii="Arial" w:eastAsia="Times New Roman" w:hAnsi="Arial" w:cs="Arial"/>
+          <w:bCs/>
+          <w:sz w:val="24"/>
+          <w:szCs w:val="24"/>
+          <w:lang w:eastAsia="pt-BR"/>
+        </w:rPr>
+        <w:t>à</w:t>
+      </w:r>
+      <w:r>
+        <w:rPr>
+          <w:rFonts w:ascii="Arial" w:eastAsia="Times New Roman" w:hAnsi="Arial" w:cs="Arial"/>
+          <w:bCs/>
+          <w:sz w:val="24"/>
+          <w:szCs w:val="24"/>
+          <w:lang w:eastAsia="pt-BR"/>
+        </w:rPr>
+        <w:t xml:space="preserve"> superação da limitação atual de formatos de arquivo. O escopo global integra a capacidade de processamento de imagens, vídeos e áudios. O objetivo é que qualquer material didático, independentemente da sua fonte ou formato original, possa ser adaptado para o público-alvo.</w:t>
       </w:r>
     </w:p>
     <w:p>
@@ -4341,7 +5325,7 @@
           <w:szCs w:val="24"/>
           <w:lang w:eastAsia="pt-BR"/>
         </w:rPr>
-        <w:t>Amplitudade de Sup</w:t>
+        <w:t>Amplitude de Sup</w:t>
       </w:r>
       <w:r>
         <w:rPr>
@@ -4372,7 +5356,29 @@
           <w:szCs w:val="24"/>
           <w:lang w:eastAsia="pt-BR"/>
         </w:rPr>
-        <w:t>O TEA Learn projeta o aprimoramento de seus algoritmos para contemplar os níveis 2 e 3 de suporte do espectro autista, bem como alunos não verbais. Isso incluirá a adaptação do motor pedagógico para suportes mais substanciais e estruturados, respeitando as singularidades de cada perfil.</w:t>
+        <w:t xml:space="preserve">O TEA </w:t>
+      </w:r>
+      <w:proofErr w:type="spellStart"/>
+      <w:r>
+        <w:rPr>
+          <w:rFonts w:ascii="Arial" w:eastAsia="Times New Roman" w:hAnsi="Arial" w:cs="Arial"/>
+          <w:bCs/>
+          <w:sz w:val="24"/>
+          <w:szCs w:val="24"/>
+          <w:lang w:eastAsia="pt-BR"/>
+        </w:rPr>
+        <w:t>Learn</w:t>
+      </w:r>
+      <w:proofErr w:type="spellEnd"/>
+      <w:r>
+        <w:rPr>
+          <w:rFonts w:ascii="Arial" w:eastAsia="Times New Roman" w:hAnsi="Arial" w:cs="Arial"/>
+          <w:bCs/>
+          <w:sz w:val="24"/>
+          <w:szCs w:val="24"/>
+          <w:lang w:eastAsia="pt-BR"/>
+        </w:rPr>
+        <w:t xml:space="preserve"> projeta o aprimoramento de seus algoritmos para contemplar os níveis 2 e 3 de suporte do espectro autista, bem como alunos não verbais. Isso incluirá a adaptação do motor pedagógico para suportes mais substanciais e estruturados, respeitando as singularidades de cada perfil.</w:t>
       </w:r>
     </w:p>
     <w:p>
@@ -4443,7 +5449,61 @@
           <w:szCs w:val="24"/>
           <w:lang w:eastAsia="pt-BR"/>
         </w:rPr>
-        <w:t>Para além do formato PDF, o escopo global prevê que a plataforma automatize a criação de outros recursos didáticos essenciais para a inclusão, como a geração de mapas mentais, apresentações de slides (PPT), documentos editáveis (.docx) e blocos de notas organizados visualmente, ampliando as possibilidades pedagógicas do docente.</w:t>
+        <w:t xml:space="preserve">Para além do formato PDF, o escopo global </w:t>
+      </w:r>
+      <w:r>
+        <w:rPr>
+          <w:rFonts w:ascii="Arial" w:eastAsia="Times New Roman" w:hAnsi="Arial" w:cs="Arial"/>
+          <w:bCs/>
+          <w:sz w:val="24"/>
+          <w:szCs w:val="24"/>
+          <w:lang w:eastAsia="pt-BR"/>
+        </w:rPr>
+        <w:t>espera</w:t>
+      </w:r>
+      <w:r>
+        <w:rPr>
+          <w:rFonts w:ascii="Arial" w:eastAsia="Times New Roman" w:hAnsi="Arial" w:cs="Arial"/>
+          <w:bCs/>
+          <w:sz w:val="24"/>
+          <w:szCs w:val="24"/>
+          <w:lang w:eastAsia="pt-BR"/>
+        </w:rPr>
+        <w:t xml:space="preserve"> que a plataforma automatize a criação de outros recursos didáticos essenciais para a inclusão, como a geração de mapas mentais, apresentações de slides (PPT), documentos editáveis (.</w:t>
+      </w:r>
+      <w:proofErr w:type="spellStart"/>
+      <w:r>
+        <w:rPr>
+          <w:rFonts w:ascii="Arial" w:eastAsia="Times New Roman" w:hAnsi="Arial" w:cs="Arial"/>
+          <w:bCs/>
+          <w:sz w:val="24"/>
+          <w:szCs w:val="24"/>
+          <w:lang w:eastAsia="pt-BR"/>
+        </w:rPr>
+        <w:t>docx</w:t>
+      </w:r>
+      <w:proofErr w:type="spellEnd"/>
+      <w:r>
+        <w:rPr>
+          <w:rFonts w:ascii="Arial" w:eastAsia="Times New Roman" w:hAnsi="Arial" w:cs="Arial"/>
+          <w:bCs/>
+          <w:sz w:val="24"/>
+          <w:szCs w:val="24"/>
+          <w:lang w:eastAsia="pt-BR"/>
+        </w:rPr>
+        <w:t>) e blocos de notas organizados visualmente, ampliando</w:t>
+      </w:r>
+      <w:bookmarkStart w:id="0" w:name="_GoBack"/>
+      <w:bookmarkEnd w:id="0"/>
+      <w:r>
+        <w:rPr>
+          <w:rFonts w:ascii="Arial" w:eastAsia="Times New Roman" w:hAnsi="Arial" w:cs="Arial"/>
+          <w:bCs/>
+          <w:sz w:val="24"/>
+          <w:szCs w:val="24"/>
+          <w:lang w:eastAsia="pt-BR"/>
+        </w:rPr>
+        <w:t xml:space="preserve"> as possibilidades pedagógicas do docente.</w:t>
       </w:r>
     </w:p>
     <w:p>
@@ -4514,7 +5574,7 @@
           <w:szCs w:val="24"/>
           <w:lang w:eastAsia="pt-BR"/>
         </w:rPr>
-        <w:t xml:space="preserve">Enquanto o escopo atual concentra-se nas fases de Análise, Design, Desenvolvimento e Implementação (ADDI), o projeto global visa a integração plena da fase de </w:t>
+        <w:t xml:space="preserve">Enquanto o escopo atual concentra-se nas fases de Análise, Design, Desenvolvimento e </w:t>
       </w:r>
       <w:r>
         <w:rPr>
@@ -4525,7 +5585,51 @@
           <w:lang w:eastAsia="pt-BR"/>
         </w:rPr>
         <w:lastRenderedPageBreak/>
-        <w:t>Avaliação (Evaluation). Isso envolve a coleta de dados de Learning Analytics para medir, de forma quantitativa e qualitativa, a eficácia das adaptações no desempenho escolar dos alunos, permitindo uma retroalimentação constante do "motor pedagógico" da IA.</w:t>
+        <w:t>Implementação (ADDI), o projeto global visa a integração plena da fase de Avaliação (</w:t>
+      </w:r>
+      <w:proofErr w:type="spellStart"/>
+      <w:r>
+        <w:rPr>
+          <w:rFonts w:ascii="Arial" w:eastAsia="Times New Roman" w:hAnsi="Arial" w:cs="Arial"/>
+          <w:bCs/>
+          <w:sz w:val="24"/>
+          <w:szCs w:val="24"/>
+          <w:lang w:eastAsia="pt-BR"/>
+        </w:rPr>
+        <w:t>Evaluation</w:t>
+      </w:r>
+      <w:proofErr w:type="spellEnd"/>
+      <w:r>
+        <w:rPr>
+          <w:rFonts w:ascii="Arial" w:eastAsia="Times New Roman" w:hAnsi="Arial" w:cs="Arial"/>
+          <w:bCs/>
+          <w:sz w:val="24"/>
+          <w:szCs w:val="24"/>
+          <w:lang w:eastAsia="pt-BR"/>
+        </w:rPr>
+        <w:t xml:space="preserve">). Isso envolve a coleta de dados de Learning </w:t>
+      </w:r>
+      <w:proofErr w:type="spellStart"/>
+      <w:r>
+        <w:rPr>
+          <w:rFonts w:ascii="Arial" w:eastAsia="Times New Roman" w:hAnsi="Arial" w:cs="Arial"/>
+          <w:bCs/>
+          <w:sz w:val="24"/>
+          <w:szCs w:val="24"/>
+          <w:lang w:eastAsia="pt-BR"/>
+        </w:rPr>
+        <w:t>Analytics</w:t>
+      </w:r>
+      <w:proofErr w:type="spellEnd"/>
+      <w:r>
+        <w:rPr>
+          <w:rFonts w:ascii="Arial" w:eastAsia="Times New Roman" w:hAnsi="Arial" w:cs="Arial"/>
+          <w:bCs/>
+          <w:sz w:val="24"/>
+          <w:szCs w:val="24"/>
+          <w:lang w:eastAsia="pt-BR"/>
+        </w:rPr>
+        <w:t xml:space="preserve"> para medir, de forma quantitativa e qualitativa, a eficácia das adaptações no desempenho escolar dos alunos, permitindo uma retroalimentação constante do "motor pedagógico" da IA.</w:t>
       </w:r>
     </w:p>
     <w:p>
@@ -4588,7 +5692,51 @@
           <w:szCs w:val="24"/>
           <w:lang w:eastAsia="pt-BR"/>
         </w:rPr>
-        <w:t>: O projeto prevê, em futuras versões, a expansão do motor pedagógico para suportar disciplinas de Exatas (Matemática, Física e Química). Isso envolverá o desenvolvimento de algoritmos capazes de realizar a adaptação de notações matemáticas, simplificação de fórmulas e acessibilidade para gráficos e equações, garantindo que o suporte do TEA Learn se torne verdadeiramente multidisciplinar.</w:t>
+        <w:t xml:space="preserve">: O projeto prevê, em futuras versões, a expansão do motor pedagógico para suportar disciplinas </w:t>
+      </w:r>
+      <w:proofErr w:type="gramStart"/>
+      <w:r>
+        <w:rPr>
+          <w:rFonts w:ascii="Arial" w:eastAsia="Times New Roman" w:hAnsi="Arial" w:cs="Arial"/>
+          <w:bCs/>
+          <w:sz w:val="24"/>
+          <w:szCs w:val="24"/>
+          <w:lang w:eastAsia="pt-BR"/>
+        </w:rPr>
+        <w:t>de Exatas</w:t>
+      </w:r>
+      <w:proofErr w:type="gramEnd"/>
+      <w:r>
+        <w:rPr>
+          <w:rFonts w:ascii="Arial" w:eastAsia="Times New Roman" w:hAnsi="Arial" w:cs="Arial"/>
+          <w:bCs/>
+          <w:sz w:val="24"/>
+          <w:szCs w:val="24"/>
+          <w:lang w:eastAsia="pt-BR"/>
+        </w:rPr>
+        <w:t xml:space="preserve"> (Matemática, Física e Química). Isso envolverá o desenvolvimento de algoritmos capazes de realizar a adaptação de notações matemáticas, simplificação de fórmulas e acessibilidade para gráficos e equações, garantindo que o suporte do TEA </w:t>
+      </w:r>
+      <w:proofErr w:type="spellStart"/>
+      <w:r>
+        <w:rPr>
+          <w:rFonts w:ascii="Arial" w:eastAsia="Times New Roman" w:hAnsi="Arial" w:cs="Arial"/>
+          <w:bCs/>
+          <w:sz w:val="24"/>
+          <w:szCs w:val="24"/>
+          <w:lang w:eastAsia="pt-BR"/>
+        </w:rPr>
+        <w:t>Learn</w:t>
+      </w:r>
+      <w:proofErr w:type="spellEnd"/>
+      <w:r>
+        <w:rPr>
+          <w:rFonts w:ascii="Arial" w:eastAsia="Times New Roman" w:hAnsi="Arial" w:cs="Arial"/>
+          <w:bCs/>
+          <w:sz w:val="24"/>
+          <w:szCs w:val="24"/>
+          <w:lang w:eastAsia="pt-BR"/>
+        </w:rPr>
+        <w:t xml:space="preserve"> se torne verdadeiramente multidisciplinar.</w:t>
       </w:r>
     </w:p>
     <w:p>
@@ -4851,7 +5999,51 @@
           <w:szCs w:val="24"/>
           <w:lang w:eastAsia="pt-BR"/>
         </w:rPr>
-        <w:t>ão com imagens, vídeos, áudios e arquivos (txt, docs).</w:t>
+        <w:t>ão com imagens, vídeos, áudios e arquivos (</w:t>
+      </w:r>
+      <w:proofErr w:type="spellStart"/>
+      <w:r>
+        <w:rPr>
+          <w:rFonts w:ascii="Arial" w:eastAsia="Times New Roman" w:hAnsi="Arial" w:cs="Arial"/>
+          <w:bCs/>
+          <w:sz w:val="24"/>
+          <w:szCs w:val="24"/>
+          <w:lang w:eastAsia="pt-BR"/>
+        </w:rPr>
+        <w:t>txt</w:t>
+      </w:r>
+      <w:proofErr w:type="spellEnd"/>
+      <w:r>
+        <w:rPr>
+          <w:rFonts w:ascii="Arial" w:eastAsia="Times New Roman" w:hAnsi="Arial" w:cs="Arial"/>
+          <w:bCs/>
+          <w:sz w:val="24"/>
+          <w:szCs w:val="24"/>
+          <w:lang w:eastAsia="pt-BR"/>
+        </w:rPr>
+        <w:t xml:space="preserve">, </w:t>
+      </w:r>
+      <w:proofErr w:type="spellStart"/>
+      <w:r>
+        <w:rPr>
+          <w:rFonts w:ascii="Arial" w:eastAsia="Times New Roman" w:hAnsi="Arial" w:cs="Arial"/>
+          <w:bCs/>
+          <w:sz w:val="24"/>
+          <w:szCs w:val="24"/>
+          <w:lang w:eastAsia="pt-BR"/>
+        </w:rPr>
+        <w:t>docs</w:t>
+      </w:r>
+      <w:proofErr w:type="spellEnd"/>
+      <w:r>
+        <w:rPr>
+          <w:rFonts w:ascii="Arial" w:eastAsia="Times New Roman" w:hAnsi="Arial" w:cs="Arial"/>
+          <w:bCs/>
+          <w:sz w:val="24"/>
+          <w:szCs w:val="24"/>
+          <w:lang w:eastAsia="pt-BR"/>
+        </w:rPr>
+        <w:t>).</w:t>
       </w:r>
     </w:p>
     <w:p>
@@ -4940,7 +6132,41 @@
           <w:szCs w:val="24"/>
           <w:lang w:eastAsia="pt-BR"/>
         </w:rPr>
-        <w:t>A plataforma não consegue criar nenhum outro tipo de arquivo além do PDF, como mapas mentais, .docs, blocos de notas, slides e etc.</w:t>
+        <w:t>A plataforma não consegue criar nenhum outro tipo de arquivo além do PDF, como mapas mentais</w:t>
+      </w:r>
+      <w:proofErr w:type="gramStart"/>
+      <w:r>
+        <w:rPr>
+          <w:rFonts w:ascii="Arial" w:eastAsia="Times New Roman" w:hAnsi="Arial" w:cs="Arial"/>
+          <w:bCs/>
+          <w:sz w:val="24"/>
+          <w:szCs w:val="24"/>
+          <w:lang w:eastAsia="pt-BR"/>
+        </w:rPr>
+        <w:t>, .</w:t>
+      </w:r>
+      <w:proofErr w:type="spellStart"/>
+      <w:r>
+        <w:rPr>
+          <w:rFonts w:ascii="Arial" w:eastAsia="Times New Roman" w:hAnsi="Arial" w:cs="Arial"/>
+          <w:bCs/>
+          <w:sz w:val="24"/>
+          <w:szCs w:val="24"/>
+          <w:lang w:eastAsia="pt-BR"/>
+        </w:rPr>
+        <w:t>docs</w:t>
+      </w:r>
+      <w:proofErr w:type="spellEnd"/>
+      <w:proofErr w:type="gramEnd"/>
+      <w:r>
+        <w:rPr>
+          <w:rFonts w:ascii="Arial" w:eastAsia="Times New Roman" w:hAnsi="Arial" w:cs="Arial"/>
+          <w:bCs/>
+          <w:sz w:val="24"/>
+          <w:szCs w:val="24"/>
+          <w:lang w:eastAsia="pt-BR"/>
+        </w:rPr>
+        <w:t>, blocos de notas, slides e etc.</w:t>
       </w:r>
     </w:p>
     <w:p>
@@ -4979,8 +6205,42 @@
           <w:szCs w:val="24"/>
           <w:lang w:eastAsia="pt-BR"/>
         </w:rPr>
-        <w:t>O suporte da plataforma é apenas para as matérias da parte de Humanas, deixando de fora a parte de Exatas, como Matemática, Física, Química, etc</w:t>
-      </w:r>
+        <w:t xml:space="preserve">O suporte da plataforma é apenas para as matérias da parte de Humanas, deixando de fora a parte </w:t>
+      </w:r>
+      <w:proofErr w:type="gramStart"/>
+      <w:r>
+        <w:rPr>
+          <w:rFonts w:ascii="Arial" w:eastAsia="Times New Roman" w:hAnsi="Arial" w:cs="Arial"/>
+          <w:bCs/>
+          <w:sz w:val="24"/>
+          <w:szCs w:val="24"/>
+          <w:lang w:eastAsia="pt-BR"/>
+        </w:rPr>
+        <w:t>de Exatas</w:t>
+      </w:r>
+      <w:proofErr w:type="gramEnd"/>
+      <w:r>
+        <w:rPr>
+          <w:rFonts w:ascii="Arial" w:eastAsia="Times New Roman" w:hAnsi="Arial" w:cs="Arial"/>
+          <w:bCs/>
+          <w:sz w:val="24"/>
+          <w:szCs w:val="24"/>
+          <w:lang w:eastAsia="pt-BR"/>
+        </w:rPr>
+        <w:t xml:space="preserve">, como Matemática, Física, Química, </w:t>
+      </w:r>
+      <w:proofErr w:type="spellStart"/>
+      <w:r>
+        <w:rPr>
+          <w:rFonts w:ascii="Arial" w:eastAsia="Times New Roman" w:hAnsi="Arial" w:cs="Arial"/>
+          <w:bCs/>
+          <w:sz w:val="24"/>
+          <w:szCs w:val="24"/>
+          <w:lang w:eastAsia="pt-BR"/>
+        </w:rPr>
+        <w:t>etc</w:t>
+      </w:r>
+      <w:proofErr w:type="spellEnd"/>
     </w:p>
     <w:p>
       <w:pPr>
@@ -5017,7 +6277,18 @@
           <w:szCs w:val="24"/>
           <w:lang w:eastAsia="pt-BR"/>
         </w:rPr>
-        <w:t xml:space="preserve">: A plataforma não permite o cadastro ou a seleção de alunos individualizados. O motor de adaptação é genérico para o perfil TEA Nível </w:t>
+        <w:t xml:space="preserve">: A plataforma não permite o cadastro ou a seleção de alunos individualizados. O motor de adaptação é genérico para o perfil TEA </w:t>
+      </w:r>
+      <w:proofErr w:type="gramStart"/>
+      <w:r>
+        <w:rPr>
+          <w:rFonts w:ascii="Arial" w:eastAsia="Times New Roman" w:hAnsi="Arial" w:cs="Arial"/>
+          <w:bCs/>
+          <w:sz w:val="24"/>
+          <w:szCs w:val="24"/>
+          <w:lang w:eastAsia="pt-BR"/>
+        </w:rPr>
+        <w:t xml:space="preserve">Nível </w:t>
       </w:r>
       <w:r>
         <w:rPr>
@@ -5037,7 +6308,18 @@
           <w:szCs w:val="24"/>
           <w:lang w:eastAsia="pt-BR"/>
         </w:rPr>
-        <w:t>1, não havendo personalização específica por estudante, suas facilidades, preferências ou histórico de aprendizado.</w:t>
+        <w:t>1</w:t>
+      </w:r>
+      <w:proofErr w:type="gramEnd"/>
+      <w:r>
+        <w:rPr>
+          <w:rFonts w:ascii="Arial" w:eastAsia="Times New Roman" w:hAnsi="Arial" w:cs="Arial"/>
+          <w:bCs/>
+          <w:sz w:val="24"/>
+          <w:szCs w:val="24"/>
+          <w:lang w:eastAsia="pt-BR"/>
+        </w:rPr>
+        <w:t>, não havendo personalização específica por estudante, suas facilidades, preferências ou histórico de aprendizado.</w:t>
       </w:r>
     </w:p>
     <w:p>
@@ -5145,6 +6427,7 @@
           <w:lang w:val="en-US" w:eastAsia="pt-BR"/>
         </w:rPr>
       </w:pPr>
+      <w:proofErr w:type="spellStart"/>
       <w:r>
         <w:rPr>
           <w:rFonts w:ascii="Arial" w:eastAsia="Times New Roman" w:hAnsi="Arial" w:cs="Arial"/>
@@ -5153,15 +6436,48 @@
           <w:szCs w:val="24"/>
           <w:lang w:val="en-US" w:eastAsia="pt-BR"/>
         </w:rPr>
-        <w:t>Tecnologias Utilizadas:</w:t>
-      </w:r>
-      <w:r>
-        <w:rPr>
-          <w:rFonts w:ascii="Arial" w:eastAsia="Times New Roman" w:hAnsi="Arial" w:cs="Arial"/>
+        <w:t>Tecnologias</w:t>
+      </w:r>
+      <w:proofErr w:type="spellEnd"/>
+      <w:r>
+        <w:rPr>
+          <w:rFonts w:ascii="Arial" w:eastAsia="Times New Roman" w:hAnsi="Arial" w:cs="Arial"/>
+          <w:b/>
           <w:sz w:val="24"/>
           <w:szCs w:val="24"/>
           <w:lang w:val="en-US" w:eastAsia="pt-BR"/>
         </w:rPr>
+        <w:t xml:space="preserve"> </w:t>
+      </w:r>
+      <w:proofErr w:type="spellStart"/>
+      <w:r>
+        <w:rPr>
+          <w:rFonts w:ascii="Arial" w:eastAsia="Times New Roman" w:hAnsi="Arial" w:cs="Arial"/>
+          <w:b/>
+          <w:sz w:val="24"/>
+          <w:szCs w:val="24"/>
+          <w:lang w:val="en-US" w:eastAsia="pt-BR"/>
+        </w:rPr>
+        <w:t>Utilizadas</w:t>
+      </w:r>
+      <w:proofErr w:type="spellEnd"/>
+      <w:r>
+        <w:rPr>
+          <w:rFonts w:ascii="Arial" w:eastAsia="Times New Roman" w:hAnsi="Arial" w:cs="Arial"/>
+          <w:b/>
+          <w:sz w:val="24"/>
+          <w:szCs w:val="24"/>
+          <w:lang w:val="en-US" w:eastAsia="pt-BR"/>
+        </w:rPr>
+        <w:t>:</w:t>
+      </w:r>
+      <w:r>
+        <w:rPr>
+          <w:rFonts w:ascii="Arial" w:eastAsia="Times New Roman" w:hAnsi="Arial" w:cs="Arial"/>
+          <w:sz w:val="24"/>
+          <w:szCs w:val="24"/>
+          <w:lang w:val="en-US" w:eastAsia="pt-BR"/>
+        </w:rPr>
         <w:t xml:space="preserve"> Java, Spring Boot, Spring Security, JWT Au</w:t>
       </w:r>
       <w:r>
@@ -5180,8 +6496,9 @@
           <w:szCs w:val="24"/>
           <w:lang w:val="en-US" w:eastAsia="pt-BR"/>
         </w:rPr>
-        <w:t xml:space="preserve">cation, Spring Data JPA, Maven, Lombok, Flyway, REST API, PostgreSQL, Spring AI, OpenAI API, Docker, React, CSS, </w:t>
-      </w:r>
+        <w:t xml:space="preserve">cation, Spring Data JPA, Maven, Lombok, Flyway, REST API, PostgreSQL, Spring AI, </w:t>
+      </w:r>
+      <w:proofErr w:type="spellStart"/>
       <w:r>
         <w:rPr>
           <w:rFonts w:ascii="Arial" w:eastAsia="Times New Roman" w:hAnsi="Arial" w:cs="Arial"/>
@@ -5189,6 +6506,25 @@
           <w:szCs w:val="24"/>
           <w:lang w:val="en-US" w:eastAsia="pt-BR"/>
         </w:rPr>
+        <w:t>OpenAI</w:t>
+      </w:r>
+      <w:proofErr w:type="spellEnd"/>
+      <w:r>
+        <w:rPr>
+          <w:rFonts w:ascii="Arial" w:eastAsia="Times New Roman" w:hAnsi="Arial" w:cs="Arial"/>
+          <w:sz w:val="24"/>
+          <w:szCs w:val="24"/>
+          <w:lang w:val="en-US" w:eastAsia="pt-BR"/>
+        </w:rPr>
+        <w:t xml:space="preserve"> API, Docker, React, CSS, </w:t>
+      </w:r>
+      <w:r>
+        <w:rPr>
+          <w:rFonts w:ascii="Arial" w:eastAsia="Times New Roman" w:hAnsi="Arial" w:cs="Arial"/>
+          <w:sz w:val="24"/>
+          <w:szCs w:val="24"/>
+          <w:lang w:val="en-US" w:eastAsia="pt-BR"/>
+        </w:rPr>
         <w:t>TypeScript</w:t>
       </w:r>
       <w:r>
@@ -5207,7 +6543,47 @@
           <w:szCs w:val="24"/>
           <w:lang w:val="en-US" w:eastAsia="pt-BR"/>
         </w:rPr>
-        <w:t>, Taillwind, Swagger, JUnit, Apache PDFbox, Bucket4j e Spring Validation.</w:t>
+        <w:t xml:space="preserve">, </w:t>
+      </w:r>
+      <w:proofErr w:type="spellStart"/>
+      <w:r>
+        <w:rPr>
+          <w:rFonts w:ascii="Arial" w:eastAsia="Times New Roman" w:hAnsi="Arial" w:cs="Arial"/>
+          <w:sz w:val="24"/>
+          <w:szCs w:val="24"/>
+          <w:lang w:val="en-US" w:eastAsia="pt-BR"/>
+        </w:rPr>
+        <w:t>Taillwind</w:t>
+      </w:r>
+      <w:proofErr w:type="spellEnd"/>
+      <w:r>
+        <w:rPr>
+          <w:rFonts w:ascii="Arial" w:eastAsia="Times New Roman" w:hAnsi="Arial" w:cs="Arial"/>
+          <w:sz w:val="24"/>
+          <w:szCs w:val="24"/>
+          <w:lang w:val="en-US" w:eastAsia="pt-BR"/>
+        </w:rPr>
+        <w:t xml:space="preserve">, Swagger, JUnit, Apache </w:t>
+      </w:r>
+      <w:proofErr w:type="spellStart"/>
+      <w:r>
+        <w:rPr>
+          <w:rFonts w:ascii="Arial" w:eastAsia="Times New Roman" w:hAnsi="Arial" w:cs="Arial"/>
+          <w:sz w:val="24"/>
+          <w:szCs w:val="24"/>
+          <w:lang w:val="en-US" w:eastAsia="pt-BR"/>
+        </w:rPr>
+        <w:t>PDFbox</w:t>
+      </w:r>
+      <w:proofErr w:type="spellEnd"/>
+      <w:r>
+        <w:rPr>
+          <w:rFonts w:ascii="Arial" w:eastAsia="Times New Roman" w:hAnsi="Arial" w:cs="Arial"/>
+          <w:sz w:val="24"/>
+          <w:szCs w:val="24"/>
+          <w:lang w:val="en-US" w:eastAsia="pt-BR"/>
+        </w:rPr>
+        <w:t>, Bucket4j e Spring Validation.</w:t>
       </w:r>
     </w:p>
     <w:p>
@@ -5338,6 +6714,7 @@
         </w:rPr>
         <w:t xml:space="preserve">com profissionais da clínica de intervenção comportamental </w:t>
       </w:r>
+      <w:proofErr w:type="spellStart"/>
       <w:r>
         <w:rPr>
           <w:rFonts w:ascii="Arial" w:eastAsia="Times New Roman" w:hAnsi="Arial" w:cs="Arial"/>
@@ -5349,6 +6726,7 @@
         </w:rPr>
         <w:t>Movthera</w:t>
       </w:r>
+      <w:proofErr w:type="spellEnd"/>
       <w:r>
         <w:rPr>
           <w:rFonts w:ascii="Arial" w:eastAsia="Times New Roman" w:hAnsi="Arial" w:cs="Arial"/>
@@ -5504,7 +6882,27 @@
           <w:lang w:eastAsia="pt-BR"/>
         </w:rPr>
         <w:lastRenderedPageBreak/>
-        <w:t>"O TEA Learn automatiza a adaptação de conteúdos para garant</w:t>
+        <w:t xml:space="preserve">"O TEA </w:t>
+      </w:r>
+      <w:proofErr w:type="spellStart"/>
+      <w:r>
+        <w:rPr>
+          <w:rFonts w:ascii="Arial" w:eastAsia="Times New Roman" w:hAnsi="Arial" w:cs="Arial"/>
+          <w:sz w:val="24"/>
+          <w:szCs w:val="24"/>
+          <w:lang w:eastAsia="pt-BR"/>
+        </w:rPr>
+        <w:t>Learn</w:t>
+      </w:r>
+      <w:proofErr w:type="spellEnd"/>
+      <w:r>
+        <w:rPr>
+          <w:rFonts w:ascii="Arial" w:eastAsia="Times New Roman" w:hAnsi="Arial" w:cs="Arial"/>
+          <w:sz w:val="24"/>
+          <w:szCs w:val="24"/>
+          <w:lang w:eastAsia="pt-BR"/>
+        </w:rPr>
+        <w:t xml:space="preserve"> automatiza a adaptação de conteúdos para garant</w:t>
       </w:r>
       <w:r>
         <w:rPr>
@@ -5665,7 +7063,29 @@
           <w:szCs w:val="24"/>
           <w:shd w:val="clear" w:color="auto" w:fill="FFFFFF"/>
         </w:rPr>
-        <w:t>Tratamento e Educação para Autistas e Crianças com Déficits Relacionados à Comunicação, é uma abordagem psicoeducacional focada na estruturação física e visual do ambiente para maximizar a autonomia de pessoas com autismo.</w:t>
+        <w:t xml:space="preserve">Tratamento e Educação para Autistas e Crianças com Déficits Relacionados à Comunicação, é uma abordagem </w:t>
+      </w:r>
+      <w:proofErr w:type="spellStart"/>
+      <w:r>
+        <w:rPr>
+          <w:rFonts w:ascii="Arial" w:hAnsi="Arial" w:cs="Arial"/>
+          <w:color w:val="0A0A0A"/>
+          <w:sz w:val="24"/>
+          <w:szCs w:val="24"/>
+          <w:shd w:val="clear" w:color="auto" w:fill="FFFFFF"/>
+        </w:rPr>
+        <w:t>psicoeducacional</w:t>
+      </w:r>
+      <w:proofErr w:type="spellEnd"/>
+      <w:r>
+        <w:rPr>
+          <w:rFonts w:ascii="Arial" w:hAnsi="Arial" w:cs="Arial"/>
+          <w:color w:val="0A0A0A"/>
+          <w:sz w:val="24"/>
+          <w:szCs w:val="24"/>
+          <w:shd w:val="clear" w:color="auto" w:fill="FFFFFF"/>
+        </w:rPr>
+        <w:t xml:space="preserve"> focada na estruturação física e visual do ambiente para maximizar a autonomia de pessoas com autismo.</w:t>
       </w:r>
     </w:p>
     <w:p>
@@ -5765,7 +7185,25 @@
           <w:sz w:val="24"/>
           <w:szCs w:val="24"/>
         </w:rPr>
-        <w:t>: Uso de imagens, símbolos ou textos para antecipar atividades (ex: "primeiro... depois..."), o que reduz ansiedade.</w:t>
+        <w:t>: Uso de imagens, símbolos ou textos para antecipar atividades (</w:t>
+      </w:r>
+      <w:proofErr w:type="spellStart"/>
+      <w:r>
+        <w:rPr>
+          <w:rFonts w:ascii="Arial" w:hAnsi="Arial" w:cs="Arial"/>
+          <w:sz w:val="24"/>
+          <w:szCs w:val="24"/>
+        </w:rPr>
+        <w:t>ex</w:t>
+      </w:r>
+      <w:proofErr w:type="spellEnd"/>
+      <w:r>
+        <w:rPr>
+          <w:rFonts w:ascii="Arial" w:hAnsi="Arial" w:cs="Arial"/>
+          <w:sz w:val="24"/>
+          <w:szCs w:val="24"/>
+        </w:rPr>
+        <w:t>: "primeiro... depois..."), o que reduz ansiedade.</w:t>
       </w:r>
     </w:p>
     <w:p>
@@ -6035,7 +7473,25 @@
           <w:sz w:val="24"/>
           <w:szCs w:val="24"/>
         </w:rPr>
-        <w:t>: Perfil Psicoeducacional Revisado, usado para avaliar os pontos fracos e fortes do aluno. Através desse exame, um cronograma/método individual é criado.</w:t>
+        <w:t xml:space="preserve">: Perfil </w:t>
+      </w:r>
+      <w:proofErr w:type="spellStart"/>
+      <w:r>
+        <w:rPr>
+          <w:rFonts w:ascii="Arial" w:hAnsi="Arial" w:cs="Arial"/>
+          <w:sz w:val="24"/>
+          <w:szCs w:val="24"/>
+        </w:rPr>
+        <w:t>Psicoeducacional</w:t>
+      </w:r>
+      <w:proofErr w:type="spellEnd"/>
+      <w:r>
+        <w:rPr>
+          <w:rFonts w:ascii="Arial" w:hAnsi="Arial" w:cs="Arial"/>
+          <w:sz w:val="24"/>
+          <w:szCs w:val="24"/>
+        </w:rPr>
+        <w:t xml:space="preserve"> Revisado, usado para avaliar os pontos fracos e fortes do aluno. Através desse exame, um cronograma/método individual é criado.</w:t>
       </w:r>
     </w:p>
     <w:p>
@@ -7161,6 +8617,7 @@
         </w:rPr>
         <w:t xml:space="preserve">O fluxo geral do sistema segue a metodologia ADDIE junto ao Desenho Universal da Aprendizagem (DUA). Na etapa de </w:t>
       </w:r>
+      <w:proofErr w:type="spellStart"/>
       <w:r>
         <w:rPr>
           <w:rFonts w:ascii="Arial" w:hAnsi="Arial" w:cs="Arial"/>
@@ -7172,6 +8629,7 @@
         </w:rPr>
         <w:t>analysis</w:t>
       </w:r>
+      <w:proofErr w:type="spellEnd"/>
       <w:r>
         <w:rPr>
           <w:rFonts w:ascii="Arial" w:hAnsi="Arial" w:cs="Arial"/>
@@ -7239,6 +8697,7 @@
         </w:rPr>
         <w:t xml:space="preserve">Em seguida, na fase de </w:t>
       </w:r>
+      <w:proofErr w:type="spellStart"/>
       <w:r>
         <w:rPr>
           <w:rFonts w:ascii="Arial" w:hAnsi="Arial" w:cs="Arial"/>
@@ -7250,6 +8709,7 @@
         </w:rPr>
         <w:t>development</w:t>
       </w:r>
+      <w:proofErr w:type="spellEnd"/>
       <w:r>
         <w:rPr>
           <w:rFonts w:ascii="Arial" w:hAnsi="Arial" w:cs="Arial"/>
@@ -7295,6 +8755,7 @@
         </w:rPr>
         <w:t xml:space="preserve">, na etapa de </w:t>
       </w:r>
+      <w:proofErr w:type="spellStart"/>
       <w:r>
         <w:rPr>
           <w:rFonts w:ascii="Arial" w:hAnsi="Arial" w:cs="Arial"/>
@@ -7306,6 +8767,7 @@
         </w:rPr>
         <w:t>implementation</w:t>
       </w:r>
+      <w:proofErr w:type="spellEnd"/>
       <w:r>
         <w:rPr>
           <w:rFonts w:ascii="Arial" w:hAnsi="Arial" w:cs="Arial"/>
@@ -7334,6 +8796,7 @@
         </w:rPr>
         <w:t xml:space="preserve">Por fim, na fase </w:t>
       </w:r>
+      <w:proofErr w:type="spellStart"/>
       <w:r>
         <w:rPr>
           <w:rFonts w:ascii="Arial" w:hAnsi="Arial" w:cs="Arial"/>
@@ -7344,6 +8807,7 @@
         </w:rPr>
         <w:t>evaluation</w:t>
       </w:r>
+      <w:proofErr w:type="spellEnd"/>
       <w:r>
         <w:rPr>
           <w:rFonts w:ascii="Arial" w:hAnsi="Arial" w:cs="Arial"/>
@@ -8114,7 +9578,25 @@
           <w:sz w:val="24"/>
           <w:szCs w:val="24"/>
         </w:rPr>
-        <w:t>O estudo de Valério e Bigoli (2021) indica que o design de interfaces para pessoas com TEA deve priorizar a redução da sobrecarga sensorial através de layouts limpos, previsíveis e com uso de cores suaves ou tons pastéis. A pesquisa enfatiza a necessidade de evitar contrastes agressivos e animações excessivas, optando por padronização visual para facilitar o foco e a navegação.</w:t>
+        <w:t xml:space="preserve">O estudo de Valério e </w:t>
+      </w:r>
+      <w:proofErr w:type="spellStart"/>
+      <w:r>
+        <w:rPr>
+          <w:rFonts w:ascii="Arial" w:hAnsi="Arial" w:cs="Arial"/>
+          <w:sz w:val="24"/>
+          <w:szCs w:val="24"/>
+        </w:rPr>
+        <w:t>Bigoli</w:t>
+      </w:r>
+      <w:proofErr w:type="spellEnd"/>
+      <w:r>
+        <w:rPr>
+          <w:rFonts w:ascii="Arial" w:hAnsi="Arial" w:cs="Arial"/>
+          <w:sz w:val="24"/>
+          <w:szCs w:val="24"/>
+        </w:rPr>
+        <w:t xml:space="preserve"> (2021) indica que o design de interfaces para pessoas com TEA deve priorizar a redução da sobrecarga sensorial através de layouts limpos, previsíveis e com uso de cores suaves ou tons pastéis. A pesquisa enfatiza a necessidade de evitar contrastes agressivos e animações excessivas, optando por padronização visual para facilitar o foco e a navegação.</w:t>
       </w:r>
     </w:p>
     <w:p>
@@ -9288,8 +10770,6 @@
           <w:szCs w:val="24"/>
         </w:rPr>
       </w:pPr>
-      <w:bookmarkStart w:id="0" w:name="_GoBack"/>
-      <w:bookmarkEnd w:id="0"/>
     </w:p>
     <w:p>
       <w:pPr>
@@ -9683,7 +11163,25 @@
           <w:sz w:val="24"/>
           <w:szCs w:val="24"/>
         </w:rPr>
-        <w:t xml:space="preserve">Diagrama de Gantt: </w:t>
+        <w:t xml:space="preserve">Diagrama de </w:t>
+      </w:r>
+      <w:proofErr w:type="spellStart"/>
+      <w:r>
+        <w:rPr>
+          <w:rFonts w:ascii="Arial" w:hAnsi="Arial" w:cs="Arial"/>
+          <w:sz w:val="24"/>
+          <w:szCs w:val="24"/>
+        </w:rPr>
+        <w:t>Gantt</w:t>
+      </w:r>
+      <w:proofErr w:type="spellEnd"/>
+      <w:r>
+        <w:rPr>
+          <w:rFonts w:ascii="Arial" w:hAnsi="Arial" w:cs="Arial"/>
+          <w:sz w:val="24"/>
+          <w:szCs w:val="24"/>
+        </w:rPr>
+        <w:t xml:space="preserve">: </w:t>
       </w:r>
       <w:hyperlink r:id="rId28" w:history="1">
         <w:r>
@@ -9785,7 +11283,25 @@
           <w:sz w:val="24"/>
           <w:szCs w:val="24"/>
         </w:rPr>
-        <w:t>Cores do Front-End:</w:t>
+        <w:t>Cores do Front-</w:t>
+      </w:r>
+      <w:proofErr w:type="spellStart"/>
+      <w:r>
+        <w:rPr>
+          <w:rFonts w:ascii="Arial" w:hAnsi="Arial" w:cs="Arial"/>
+          <w:sz w:val="24"/>
+          <w:szCs w:val="24"/>
+        </w:rPr>
+        <w:t>End</w:t>
+      </w:r>
+      <w:proofErr w:type="spellEnd"/>
+      <w:r>
+        <w:rPr>
+          <w:rFonts w:ascii="Arial" w:hAnsi="Arial" w:cs="Arial"/>
+          <w:sz w:val="24"/>
+          <w:szCs w:val="24"/>
+        </w:rPr>
+        <w:t>:</w:t>
       </w:r>
     </w:p>
     <w:p>
@@ -9836,7 +11352,7 @@
 </file>
 
 <file path=word/endnotes.xml><?xml version="1.0" encoding="utf-8"?>
-<w:endnotes xmlns:wpc="http://schemas.microsoft.com/office/word/2010/wordprocessingCanvas" xmlns:cx="http://schemas.microsoft.com/office/drawing/2014/chartex" xmlns:mc="http://schemas.openxmlformats.org/markup-compatibility/2006" xmlns:o="urn:schemas-microsoft-com:office:office" xmlns:r="http://schemas.openxmlformats.org/officeDocument/2006/relationships" xmlns:m="http://schemas.openxmlformats.org/officeDocument/2006/math" xmlns:v="urn:schemas-microsoft-com:vml" xmlns:wp14="http://schemas.microsoft.com/office/word/2010/wordprocessingDrawing" xmlns:wp="http://schemas.openxmlformats.org/drawingml/2006/wordprocessingDrawing" xmlns:w10="urn:schemas-microsoft-com:office:word" xmlns:w="http://schemas.openxmlformats.org/wordprocessingml/2006/main" xmlns:w14="http://schemas.microsoft.com/office/word/2010/wordml" xmlns:w15="http://schemas.microsoft.com/office/word/2012/wordml" xmlns:w16se="http://schemas.microsoft.com/office/word/2015/wordml/symex" xmlns:wpg="http://schemas.microsoft.com/office/word/2010/wordprocessingGroup" xmlns:wpi="http://schemas.microsoft.com/office/word/2010/wordprocessingInk" xmlns:wne="http://schemas.microsoft.com/office/word/2006/wordml" xmlns:wps="http://schemas.microsoft.com/office/word/2010/wordprocessingShape" mc:Ignorable="w14 w15 w16se wp14">
+<w:endnotes xmlns:wpc="http://schemas.microsoft.com/office/word/2010/wordprocessingCanvas" xmlns:cx="http://schemas.microsoft.com/office/drawing/2014/chartex" xmlns:cx1="http://schemas.microsoft.com/office/drawing/2015/9/8/chartex" xmlns:cx2="http://schemas.microsoft.com/office/drawing/2015/10/21/chartex" xmlns:cx3="http://schemas.microsoft.com/office/drawing/2016/5/9/chartex" xmlns:cx4="http://schemas.microsoft.com/office/drawing/2016/5/10/chartex" xmlns:cx5="http://schemas.microsoft.com/office/drawing/2016/5/11/chartex" xmlns:cx6="http://schemas.microsoft.com/office/drawing/2016/5/12/chartex" xmlns:cx7="http://schemas.microsoft.com/office/drawing/2016/5/13/chartex" xmlns:cx8="http://schemas.microsoft.com/office/drawing/2016/5/14/chartex" xmlns:mc="http://schemas.openxmlformats.org/markup-compatibility/2006" xmlns:aink="http://schemas.microsoft.com/office/drawing/2016/ink" xmlns:am3d="http://schemas.microsoft.com/office/drawing/2017/model3d" xmlns:o="urn:schemas-microsoft-com:office:office" xmlns:r="http://schemas.openxmlformats.org/officeDocument/2006/relationships" xmlns:m="http://schemas.openxmlformats.org/officeDocument/2006/math" xmlns:v="urn:schemas-microsoft-com:vml" xmlns:wp14="http://schemas.microsoft.com/office/word/2010/wordprocessingDrawing" xmlns:wp="http://schemas.openxmlformats.org/drawingml/2006/wordprocessingDrawing" xmlns:w10="urn:schemas-microsoft-com:office:word" xmlns:w="http://schemas.openxmlformats.org/wordprocessingml/2006/main" xmlns:w14="http://schemas.microsoft.com/office/word/2010/wordml" xmlns:w15="http://schemas.microsoft.com/office/word/2012/wordml" xmlns:w16cid="http://schemas.microsoft.com/office/word/2016/wordml/cid" xmlns:w16se="http://schemas.microsoft.com/office/word/2015/wordml/symex" xmlns:wpg="http://schemas.microsoft.com/office/word/2010/wordprocessingGroup" xmlns:wpi="http://schemas.microsoft.com/office/word/2010/wordprocessingInk" xmlns:wne="http://schemas.microsoft.com/office/word/2006/wordml" xmlns:wps="http://schemas.microsoft.com/office/word/2010/wordprocessingShape" mc:Ignorable="w14 w15 w16se w16cid wp14">
   <w:endnote w:type="separator" w:id="-1">
     <w:p>
       <w:pPr>
@@ -9861,7 +11377,7 @@
 </file>
 
 <file path=word/footnotes.xml><?xml version="1.0" encoding="utf-8"?>
-<w:footnotes xmlns:wpc="http://schemas.microsoft.com/office/word/2010/wordprocessingCanvas" xmlns:cx="http://schemas.microsoft.com/office/drawing/2014/chartex" xmlns:mc="http://schemas.openxmlformats.org/markup-compatibility/2006" xmlns:o="urn:schemas-microsoft-com:office:office" xmlns:r="http://schemas.openxmlformats.org/officeDocument/2006/relationships" xmlns:m="http://schemas.openxmlformats.org/officeDocument/2006/math" xmlns:v="urn:schemas-microsoft-com:vml" xmlns:wp14="http://schemas.microsoft.com/office/word/2010/wordprocessingDrawing" xmlns:wp="http://schemas.openxmlformats.org/drawingml/2006/wordprocessingDrawing" xmlns:w10="urn:schemas-microsoft-com:office:word" xmlns:w="http://schemas.openxmlformats.org/wordprocessingml/2006/main" xmlns:w14="http://schemas.microsoft.com/office/word/2010/wordml" xmlns:w15="http://schemas.microsoft.com/office/word/2012/wordml" xmlns:w16se="http://schemas.microsoft.com/office/word/2015/wordml/symex" xmlns:wpg="http://schemas.microsoft.com/office/word/2010/wordprocessingGroup" xmlns:wpi="http://schemas.microsoft.com/office/word/2010/wordprocessingInk" xmlns:wne="http://schemas.microsoft.com/office/word/2006/wordml" xmlns:wps="http://schemas.microsoft.com/office/word/2010/wordprocessingShape" mc:Ignorable="w14 w15 w16se wp14">
+<w:footnotes xmlns:wpc="http://schemas.microsoft.com/office/word/2010/wordprocessingCanvas" xmlns:cx="http://schemas.microsoft.com/office/drawing/2014/chartex" xmlns:cx1="http://schemas.microsoft.com/office/drawing/2015/9/8/chartex" xmlns:cx2="http://schemas.microsoft.com/office/drawing/2015/10/21/chartex" xmlns:cx3="http://schemas.microsoft.com/office/drawing/2016/5/9/chartex" xmlns:cx4="http://schemas.microsoft.com/office/drawing/2016/5/10/chartex" xmlns:cx5="http://schemas.microsoft.com/office/drawing/2016/5/11/chartex" xmlns:cx6="http://schemas.microsoft.com/office/drawing/2016/5/12/chartex" xmlns:cx7="http://schemas.microsoft.com/office/drawing/2016/5/13/chartex" xmlns:cx8="http://schemas.microsoft.com/office/drawing/2016/5/14/chartex" xmlns:mc="http://schemas.openxmlformats.org/markup-compatibility/2006" xmlns:aink="http://schemas.microsoft.com/office/drawing/2016/ink" xmlns:am3d="http://schemas.microsoft.com/office/drawing/2017/model3d" xmlns:o="urn:schemas-microsoft-com:office:office" xmlns:r="http://schemas.openxmlformats.org/officeDocument/2006/relationships" xmlns:m="http://schemas.openxmlformats.org/officeDocument/2006/math" xmlns:v="urn:schemas-microsoft-com:vml" xmlns:wp14="http://schemas.microsoft.com/office/word/2010/wordprocessingDrawing" xmlns:wp="http://schemas.openxmlformats.org/drawingml/2006/wordprocessingDrawing" xmlns:w10="urn:schemas-microsoft-com:office:word" xmlns:w="http://schemas.openxmlformats.org/wordprocessingml/2006/main" xmlns:w14="http://schemas.microsoft.com/office/word/2010/wordml" xmlns:w15="http://schemas.microsoft.com/office/word/2012/wordml" xmlns:w16cid="http://schemas.microsoft.com/office/word/2016/wordml/cid" xmlns:w16se="http://schemas.microsoft.com/office/word/2015/wordml/symex" xmlns:wpg="http://schemas.microsoft.com/office/word/2010/wordprocessingGroup" xmlns:wpi="http://schemas.microsoft.com/office/word/2010/wordprocessingInk" xmlns:wne="http://schemas.microsoft.com/office/word/2006/wordml" xmlns:wps="http://schemas.microsoft.com/office/word/2010/wordprocessingShape" mc:Ignorable="w14 w15 w16se w16cid wp14">
   <w:footnote w:type="separator" w:id="-1">
     <w:p>
       <w:pPr>
@@ -9886,7 +11402,7 @@
 </file>
 
 <file path=word/numbering.xml><?xml version="1.0" encoding="utf-8"?>
-<w:numbering xmlns:wpc="http://schemas.microsoft.com/office/word/2010/wordprocessingCanvas" xmlns:cx="http://schemas.microsoft.com/office/drawing/2014/chartex" xmlns:mc="http://schemas.openxmlformats.org/markup-compatibility/2006" xmlns:o="urn:schemas-microsoft-com:office:office" xmlns:r="http://schemas.openxmlformats.org/officeDocument/2006/relationships" xmlns:m="http://schemas.openxmlformats.org/officeDocument/2006/math" xmlns:v="urn:schemas-microsoft-com:vml" xmlns:wp14="http://schemas.microsoft.com/office/word/2010/wordprocessingDrawing" xmlns:wp="http://schemas.openxmlformats.org/drawingml/2006/wordprocessingDrawing" xmlns:w10="urn:schemas-microsoft-com:office:word" xmlns:w="http://schemas.openxmlformats.org/wordprocessingml/2006/main" xmlns:w14="http://schemas.microsoft.com/office/word/2010/wordml" xmlns:w15="http://schemas.microsoft.com/office/word/2012/wordml" xmlns:w16se="http://schemas.microsoft.com/office/word/2015/wordml/symex" xmlns:wpg="http://schemas.microsoft.com/office/word/2010/wordprocessingGroup" xmlns:wpi="http://schemas.microsoft.com/office/word/2010/wordprocessingInk" xmlns:wne="http://schemas.microsoft.com/office/word/2006/wordml" xmlns:wps="http://schemas.microsoft.com/office/word/2010/wordprocessingShape" mc:Ignorable="w14 w15 w16se wp14">
+<w:numbering xmlns:wpc="http://schemas.microsoft.com/office/word/2010/wordprocessingCanvas" xmlns:cx="http://schemas.microsoft.com/office/drawing/2014/chartex" xmlns:cx1="http://schemas.microsoft.com/office/drawing/2015/9/8/chartex" xmlns:cx2="http://schemas.microsoft.com/office/drawing/2015/10/21/chartex" xmlns:cx3="http://schemas.microsoft.com/office/drawing/2016/5/9/chartex" xmlns:cx4="http://schemas.microsoft.com/office/drawing/2016/5/10/chartex" xmlns:cx5="http://schemas.microsoft.com/office/drawing/2016/5/11/chartex" xmlns:cx6="http://schemas.microsoft.com/office/drawing/2016/5/12/chartex" xmlns:cx7="http://schemas.microsoft.com/office/drawing/2016/5/13/chartex" xmlns:cx8="http://schemas.microsoft.com/office/drawing/2016/5/14/chartex" xmlns:mc="http://schemas.openxmlformats.org/markup-compatibility/2006" xmlns:aink="http://schemas.microsoft.com/office/drawing/2016/ink" xmlns:am3d="http://schemas.microsoft.com/office/drawing/2017/model3d" xmlns:o="urn:schemas-microsoft-com:office:office" xmlns:r="http://schemas.openxmlformats.org/officeDocument/2006/relationships" xmlns:m="http://schemas.openxmlformats.org/officeDocument/2006/math" xmlns:v="urn:schemas-microsoft-com:vml" xmlns:wp14="http://schemas.microsoft.com/office/word/2010/wordprocessingDrawing" xmlns:wp="http://schemas.openxmlformats.org/drawingml/2006/wordprocessingDrawing" xmlns:w10="urn:schemas-microsoft-com:office:word" xmlns:w="http://schemas.openxmlformats.org/wordprocessingml/2006/main" xmlns:w14="http://schemas.microsoft.com/office/word/2010/wordml" xmlns:w15="http://schemas.microsoft.com/office/word/2012/wordml" xmlns:w16cid="http://schemas.microsoft.com/office/word/2016/wordml/cid" xmlns:w16se="http://schemas.microsoft.com/office/word/2015/wordml/symex" xmlns:wpg="http://schemas.microsoft.com/office/word/2010/wordprocessingGroup" xmlns:wpi="http://schemas.microsoft.com/office/word/2010/wordprocessingInk" xmlns:wne="http://schemas.microsoft.com/office/word/2006/wordml" xmlns:wps="http://schemas.microsoft.com/office/word/2010/wordprocessingShape" mc:Ignorable="w14 w15 w16se w16cid wp14">
   <w:abstractNum w:abstractNumId="0" w15:restartNumberingAfterBreak="0">
     <w:nsid w:val="02313346"/>
     <w:multiLevelType w:val="multilevel"/>
@@ -15632,7 +17148,7 @@
 </file>
 
 <file path=word/styles.xml><?xml version="1.0" encoding="utf-8"?>
-<w:styles xmlns:mc="http://schemas.openxmlformats.org/markup-compatibility/2006" xmlns:r="http://schemas.openxmlformats.org/officeDocument/2006/relationships" xmlns:w="http://schemas.openxmlformats.org/wordprocessingml/2006/main" xmlns:w14="http://schemas.microsoft.com/office/word/2010/wordml" xmlns:w15="http://schemas.microsoft.com/office/word/2012/wordml" xmlns:w16se="http://schemas.microsoft.com/office/word/2015/wordml/symex" mc:Ignorable="w14 w15 w16se">
+<w:styles xmlns:mc="http://schemas.openxmlformats.org/markup-compatibility/2006" xmlns:r="http://schemas.openxmlformats.org/officeDocument/2006/relationships" xmlns:w="http://schemas.openxmlformats.org/wordprocessingml/2006/main" xmlns:w14="http://schemas.microsoft.com/office/word/2010/wordml" xmlns:w15="http://schemas.microsoft.com/office/word/2012/wordml" xmlns:w16cid="http://schemas.microsoft.com/office/word/2016/wordml/cid" xmlns:w16se="http://schemas.microsoft.com/office/word/2015/wordml/symex" mc:Ignorable="w14 w15 w16se w16cid">
   <w:docDefaults>
     <w:rPrDefault>
       <w:rPr>
@@ -15648,7 +17164,7 @@
       </w:pPr>
     </w:pPrDefault>
   </w:docDefaults>
-  <w:latentStyles w:defLockedState="0" w:defUIPriority="99" w:defSemiHidden="0" w:defUnhideWhenUsed="0" w:defQFormat="0" w:count="371">
+  <w:latentStyles w:defLockedState="0" w:defUIPriority="99" w:defSemiHidden="0" w:defUnhideWhenUsed="0" w:defQFormat="0" w:count="375">
     <w:lsdException w:name="Normal" w:uiPriority="0" w:qFormat="1"/>
     <w:lsdException w:name="heading 1" w:uiPriority="9" w:qFormat="1"/>
     <w:lsdException w:name="heading 2" w:semiHidden="1" w:uiPriority="9" w:unhideWhenUsed="1" w:qFormat="1"/>
@@ -15754,7 +17270,6 @@
     <w:lsdException w:name="HTML Sample" w:semiHidden="1" w:unhideWhenUsed="1"/>
     <w:lsdException w:name="HTML Typewriter" w:semiHidden="1" w:unhideWhenUsed="1"/>
     <w:lsdException w:name="HTML Variable" w:semiHidden="1" w:unhideWhenUsed="1"/>
-    <w:lsdException w:name="Normal Table" w:semiHidden="1" w:unhideWhenUsed="1"/>
     <w:lsdException w:name="annotation subject" w:semiHidden="1" w:unhideWhenUsed="1"/>
     <w:lsdException w:name="No List" w:semiHidden="1" w:unhideWhenUsed="1"/>
     <w:lsdException w:name="Outline List 1" w:semiHidden="1" w:unhideWhenUsed="1"/>
@@ -15798,10 +17313,8 @@
     <w:lsdException w:name="Table Elegant" w:semiHidden="1" w:unhideWhenUsed="1"/>
     <w:lsdException w:name="Table Professional" w:semiHidden="1" w:unhideWhenUsed="1"/>
     <w:lsdException w:name="Table Subtle 1" w:semiHidden="1" w:unhideWhenUsed="1"/>
-    <w:lsdException w:name="Table Subtle 2" w:semiHidden="1" w:unhideWhenUsed="1"/>
     <w:lsdException w:name="Table Web 1" w:semiHidden="1" w:unhideWhenUsed="1"/>
     <w:lsdException w:name="Table Web 2" w:semiHidden="1" w:unhideWhenUsed="1"/>
-    <w:lsdException w:name="Table Web 3" w:semiHidden="1" w:unhideWhenUsed="1"/>
     <w:lsdException w:name="Balloon Text" w:semiHidden="1" w:unhideWhenUsed="1"/>
     <w:lsdException w:name="Table Grid" w:uiPriority="39"/>
     <w:lsdException w:name="Table Theme" w:semiHidden="1" w:unhideWhenUsed="1"/>
@@ -16020,6 +17533,10 @@
     <w:lsdException w:name="List Table 5 Dark Accent 6" w:uiPriority="50"/>
     <w:lsdException w:name="List Table 6 Colorful Accent 6" w:uiPriority="51"/>
     <w:lsdException w:name="List Table 7 Colorful Accent 6" w:uiPriority="52"/>
+    <w:lsdException w:name="Mention" w:semiHidden="1" w:unhideWhenUsed="1"/>
+    <w:lsdException w:name="Smart Hyperlink" w:semiHidden="1" w:unhideWhenUsed="1"/>
+    <w:lsdException w:name="Hashtag" w:semiHidden="1" w:unhideWhenUsed="1"/>
+    <w:lsdException w:name="Unresolved Mention" w:semiHidden="1" w:unhideWhenUsed="1"/>
   </w:latentStyles>
   <w:style w:type="paragraph" w:default="1" w:styleId="Normal">
     <w:name w:val="Normal"/>
@@ -16699,7 +18216,7 @@
 </file>
 
 <file path=customXml/itemProps1.xml><?xml version="1.0" encoding="utf-8"?>
-<ds:datastoreItem xmlns:ds="http://schemas.openxmlformats.org/officeDocument/2006/customXml" ds:itemID="{9CD07E49-B5CE-45F4-B931-164BC906B0CE}">
+<ds:datastoreItem xmlns:ds="http://schemas.openxmlformats.org/officeDocument/2006/customXml" ds:itemID="{815C8068-6D60-44FF-8428-946D1B849830}">
   <ds:schemaRefs>
     <ds:schemaRef ds:uri="http://schemas.openxmlformats.org/officeDocument/2006/bibliography"/>
   </ds:schemaRefs>

</xml_diff>

<commit_message>
feat: adiciona versão finalizada do caso de uso e a formatação dos demais textos que faltavam
</commit_message>
<xml_diff>
--- a/Documentacao/Documentacao.docx
+++ b/Documentacao/Documentacao.docx
@@ -1,6 +1,6 @@
 
 <file path=word/document.xml><?xml version="1.0" encoding="utf-8"?>
-<w:document xmlns:wpc="http://schemas.microsoft.com/office/word/2010/wordprocessingCanvas" xmlns:cx="http://schemas.microsoft.com/office/drawing/2014/chartex" xmlns:cx1="http://schemas.microsoft.com/office/drawing/2015/9/8/chartex" xmlns:cx2="http://schemas.microsoft.com/office/drawing/2015/10/21/chartex" xmlns:cx3="http://schemas.microsoft.com/office/drawing/2016/5/9/chartex" xmlns:cx4="http://schemas.microsoft.com/office/drawing/2016/5/10/chartex" xmlns:cx5="http://schemas.microsoft.com/office/drawing/2016/5/11/chartex" xmlns:cx6="http://schemas.microsoft.com/office/drawing/2016/5/12/chartex" xmlns:cx7="http://schemas.microsoft.com/office/drawing/2016/5/13/chartex" xmlns:cx8="http://schemas.microsoft.com/office/drawing/2016/5/14/chartex" xmlns:mc="http://schemas.openxmlformats.org/markup-compatibility/2006" xmlns:aink="http://schemas.microsoft.com/office/drawing/2016/ink" xmlns:am3d="http://schemas.microsoft.com/office/drawing/2017/model3d" xmlns:o="urn:schemas-microsoft-com:office:office" xmlns:r="http://schemas.openxmlformats.org/officeDocument/2006/relationships" xmlns:m="http://schemas.openxmlformats.org/officeDocument/2006/math" xmlns:v="urn:schemas-microsoft-com:vml" xmlns:wp14="http://schemas.microsoft.com/office/word/2010/wordprocessingDrawing" xmlns:wp="http://schemas.openxmlformats.org/drawingml/2006/wordprocessingDrawing" xmlns:w10="urn:schemas-microsoft-com:office:word" xmlns:w="http://schemas.openxmlformats.org/wordprocessingml/2006/main" xmlns:w14="http://schemas.microsoft.com/office/word/2010/wordml" xmlns:w15="http://schemas.microsoft.com/office/word/2012/wordml" xmlns:w16cid="http://schemas.microsoft.com/office/word/2016/wordml/cid" xmlns:w16se="http://schemas.microsoft.com/office/word/2015/wordml/symex" xmlns:wpg="http://schemas.microsoft.com/office/word/2010/wordprocessingGroup" xmlns:wpi="http://schemas.microsoft.com/office/word/2010/wordprocessingInk" xmlns:wne="http://schemas.microsoft.com/office/word/2006/wordml" xmlns:wps="http://schemas.microsoft.com/office/word/2010/wordprocessingShape" mc:Ignorable="w14 w15 w16se w16cid wp14">
+<w:document xmlns:wpc="http://schemas.microsoft.com/office/word/2010/wordprocessingCanvas" xmlns:cx="http://schemas.microsoft.com/office/drawing/2014/chartex" xmlns:mc="http://schemas.openxmlformats.org/markup-compatibility/2006" xmlns:o="urn:schemas-microsoft-com:office:office" xmlns:r="http://schemas.openxmlformats.org/officeDocument/2006/relationships" xmlns:m="http://schemas.openxmlformats.org/officeDocument/2006/math" xmlns:v="urn:schemas-microsoft-com:vml" xmlns:wp14="http://schemas.microsoft.com/office/word/2010/wordprocessingDrawing" xmlns:wp="http://schemas.openxmlformats.org/drawingml/2006/wordprocessingDrawing" xmlns:w10="urn:schemas-microsoft-com:office:word" xmlns:w="http://schemas.openxmlformats.org/wordprocessingml/2006/main" xmlns:w14="http://schemas.microsoft.com/office/word/2010/wordml" xmlns:w15="http://schemas.microsoft.com/office/word/2012/wordml" xmlns:w16se="http://schemas.microsoft.com/office/word/2015/wordml/symex" xmlns:wpg="http://schemas.microsoft.com/office/word/2010/wordprocessingGroup" xmlns:wpi="http://schemas.microsoft.com/office/word/2010/wordprocessingInk" xmlns:wne="http://schemas.microsoft.com/office/word/2006/wordml" xmlns:wps="http://schemas.microsoft.com/office/word/2010/wordprocessingShape" mc:Ignorable="w14 w15 w16se wp14">
   <w:body>
     <w:p>
       <w:pPr>
@@ -2685,8 +2685,61 @@
           <w:szCs w:val="24"/>
           <w:lang w:eastAsia="pt-BR"/>
         </w:rPr>
-        <w:t>2. OBJETIVOS DO PROJETO</w:t>
-      </w:r>
+        <w:t>2</w:t>
+      </w:r>
+      <w:r>
+        <w:rPr>
+          <w:rFonts w:ascii="Arial" w:eastAsia="Times New Roman" w:hAnsi="Arial" w:cs="Arial"/>
+          <w:b/>
+          <w:bCs/>
+          <w:sz w:val="24"/>
+          <w:szCs w:val="24"/>
+          <w:lang w:eastAsia="pt-BR"/>
+        </w:rPr>
+        <w:t xml:space="preserve">. </w:t>
+      </w:r>
+      <w:r>
+        <w:rPr>
+          <w:rFonts w:ascii="Arial" w:eastAsia="Times New Roman" w:hAnsi="Arial" w:cs="Arial"/>
+          <w:b/>
+          <w:bCs/>
+          <w:sz w:val="24"/>
+          <w:szCs w:val="24"/>
+          <w:lang w:eastAsia="pt-BR"/>
+        </w:rPr>
+        <w:t>DESENVOLVIMENTO</w:t>
+      </w:r>
+    </w:p>
+    <w:p>
+      <w:pPr>
+        <w:spacing w:after="0" w:line="360" w:lineRule="auto"/>
+        <w:rPr>
+          <w:rFonts w:ascii="Arial" w:hAnsi="Arial" w:cs="Arial"/>
+          <w:sz w:val="24"/>
+          <w:szCs w:val="24"/>
+        </w:rPr>
+      </w:pPr>
+      <w:r>
+        <w:rPr>
+          <w:rFonts w:ascii="Arial" w:hAnsi="Arial" w:cs="Arial"/>
+          <w:sz w:val="24"/>
+          <w:szCs w:val="24"/>
+        </w:rPr>
+        <w:t>Após uma série de pesquisas, alguns modelos e métodos foram adotados e aprendidos por nós durante o desenvolvimento desse projeto. Além disso, realizamos resumos para estudo e facilitação da implementação no projeto, como:</w:t>
+      </w:r>
+    </w:p>
+    <w:p>
+      <w:pPr>
+        <w:spacing w:after="0" w:line="360" w:lineRule="auto"/>
+        <w:rPr>
+          <w:rFonts w:ascii="Arial" w:eastAsia="Times New Roman" w:hAnsi="Arial" w:cs="Arial"/>
+          <w:b/>
+          <w:bCs/>
+          <w:sz w:val="24"/>
+          <w:szCs w:val="24"/>
+          <w:lang w:eastAsia="pt-BR"/>
+        </w:rPr>
+      </w:pPr>
     </w:p>
     <w:p>
       <w:pPr>
@@ -3041,6 +3094,7 @@
           <w:szCs w:val="24"/>
           <w:lang w:eastAsia="pt-BR"/>
         </w:rPr>
+        <w:lastRenderedPageBreak/>
         <w:t xml:space="preserve">Requisito </w:t>
       </w:r>
       <w:proofErr w:type="spellStart"/>
@@ -3134,7 +3188,6 @@
           <w:szCs w:val="24"/>
           <w:lang w:eastAsia="pt-BR"/>
         </w:rPr>
-        <w:lastRenderedPageBreak/>
         <w:t>2.3. ESCOPOS</w:t>
       </w:r>
       <w:r>
@@ -3925,7 +3978,17 @@
           <w:szCs w:val="24"/>
           <w:lang w:eastAsia="pt-BR"/>
         </w:rPr>
-        <w:t xml:space="preserve"> simplificação de texto, segmentação do conteúdo, reorganização lógica, geração de exemplos e destaque de conceitos-chave. O resultado </w:t>
+        <w:t xml:space="preserve"> simplificação de </w:t>
+      </w:r>
+      <w:r>
+        <w:rPr>
+          <w:rFonts w:ascii="Arial" w:eastAsia="Times New Roman" w:hAnsi="Arial" w:cs="Arial"/>
+          <w:sz w:val="24"/>
+          <w:szCs w:val="24"/>
+          <w:lang w:eastAsia="pt-BR"/>
+        </w:rPr>
+        <w:lastRenderedPageBreak/>
+        <w:t xml:space="preserve">texto, segmentação do conteúdo, reorganização lógica, geração de exemplos e destaque de conceitos-chave. O resultado </w:t>
       </w:r>
       <w:r>
         <w:rPr>
@@ -3970,7 +4033,6 @@
           <w:szCs w:val="24"/>
           <w:lang w:eastAsia="pt-BR"/>
         </w:rPr>
-        <w:lastRenderedPageBreak/>
         <w:t>Etapa de Implementação (</w:t>
       </w:r>
       <w:proofErr w:type="spellStart"/>
@@ -5491,19 +5553,7 @@
           <w:szCs w:val="24"/>
           <w:lang w:eastAsia="pt-BR"/>
         </w:rPr>
-        <w:t>) e blocos de notas organizados visualmente, ampliando</w:t>
-      </w:r>
-      <w:bookmarkStart w:id="0" w:name="_GoBack"/>
-      <w:bookmarkEnd w:id="0"/>
-      <w:r>
-        <w:rPr>
-          <w:rFonts w:ascii="Arial" w:eastAsia="Times New Roman" w:hAnsi="Arial" w:cs="Arial"/>
-          <w:bCs/>
-          <w:sz w:val="24"/>
-          <w:szCs w:val="24"/>
-          <w:lang w:eastAsia="pt-BR"/>
-        </w:rPr>
-        <w:t xml:space="preserve"> as possibilidades pedagógicas do docente.</w:t>
+        <w:t>) e blocos de notas organizados visualmente, ampliando as possibilidades pedagógicas do docente.</w:t>
       </w:r>
     </w:p>
     <w:p>
@@ -5682,28 +5732,19 @@
           <w:szCs w:val="24"/>
           <w:lang w:eastAsia="pt-BR"/>
         </w:rPr>
-        <w:t>Interdisciplinaridade e Expansão para Exatas</w:t>
-      </w:r>
-      <w:r>
-        <w:rPr>
-          <w:rFonts w:ascii="Arial" w:eastAsia="Times New Roman" w:hAnsi="Arial" w:cs="Arial"/>
-          <w:bCs/>
-          <w:sz w:val="24"/>
-          <w:szCs w:val="24"/>
-          <w:lang w:eastAsia="pt-BR"/>
-        </w:rPr>
-        <w:t xml:space="preserve">: O projeto prevê, em futuras versões, a expansão do motor pedagógico para suportar disciplinas </w:t>
+        <w:t xml:space="preserve">Interdisciplinaridade e Expansão </w:t>
       </w:r>
       <w:proofErr w:type="gramStart"/>
       <w:r>
         <w:rPr>
           <w:rFonts w:ascii="Arial" w:eastAsia="Times New Roman" w:hAnsi="Arial" w:cs="Arial"/>
-          <w:bCs/>
-          <w:sz w:val="24"/>
-          <w:szCs w:val="24"/>
-          <w:lang w:eastAsia="pt-BR"/>
-        </w:rPr>
-        <w:t>de Exatas</w:t>
+          <w:b/>
+          <w:bCs/>
+          <w:sz w:val="24"/>
+          <w:szCs w:val="24"/>
+          <w:lang w:eastAsia="pt-BR"/>
+        </w:rPr>
+        <w:t>para Exatas</w:t>
       </w:r>
       <w:proofErr w:type="gramEnd"/>
       <w:r>
@@ -5714,7 +5755,7 @@
           <w:szCs w:val="24"/>
           <w:lang w:eastAsia="pt-BR"/>
         </w:rPr>
-        <w:t xml:space="preserve"> (Matemática, Física e Química). Isso envolverá o desenvolvimento de algoritmos capazes de realizar a adaptação de notações matemáticas, simplificação de fórmulas e acessibilidade para gráficos e equações, garantindo que o suporte do TEA </w:t>
+        <w:t xml:space="preserve">: O projeto prevê, em futuras versões, a expansão do motor pedagógico para suportar disciplinas de Exatas (Matemática, Física e Química). Isso envolverá o desenvolvimento de algoritmos capazes de realizar a adaptação de notações matemáticas, simplificação de fórmulas e acessibilidade para gráficos e equações, garantindo que o suporte do TEA </w:t>
       </w:r>
       <w:proofErr w:type="spellStart"/>
       <w:r>
@@ -6378,7 +6419,29 @@
           <w:szCs w:val="24"/>
           <w:lang w:eastAsia="pt-BR"/>
         </w:rPr>
-        <w:t>4. METODOLOGIA</w:t>
+        <w:t>2.4.</w:t>
+      </w:r>
+      <w:r>
+        <w:rPr>
+          <w:rFonts w:ascii="Arial" w:eastAsia="Times New Roman" w:hAnsi="Arial" w:cs="Arial"/>
+          <w:b/>
+          <w:bCs/>
+          <w:sz w:val="24"/>
+          <w:szCs w:val="24"/>
+          <w:lang w:eastAsia="pt-BR"/>
+        </w:rPr>
+        <w:t xml:space="preserve"> METODOLOGIA</w:t>
+      </w:r>
+      <w:r>
+        <w:rPr>
+          <w:rFonts w:ascii="Arial" w:eastAsia="Times New Roman" w:hAnsi="Arial" w:cs="Arial"/>
+          <w:b/>
+          <w:bCs/>
+          <w:sz w:val="24"/>
+          <w:szCs w:val="24"/>
+          <w:lang w:eastAsia="pt-BR"/>
+        </w:rPr>
+        <w:t>S E TECNOLOGIAS</w:t>
       </w:r>
     </w:p>
     <w:p>
@@ -6518,6 +6581,7 @@
         </w:rPr>
         <w:t xml:space="preserve"> API, Docker, React, CSS, </w:t>
       </w:r>
+      <w:proofErr w:type="spellStart"/>
       <w:r>
         <w:rPr>
           <w:rFonts w:ascii="Arial" w:eastAsia="Times New Roman" w:hAnsi="Arial" w:cs="Arial"/>
@@ -6527,6 +6591,7 @@
         </w:rPr>
         <w:t>TypeScript</w:t>
       </w:r>
+      <w:proofErr w:type="spellEnd"/>
       <w:r>
         <w:rPr>
           <w:rFonts w:ascii="Arial" w:eastAsia="Times New Roman" w:hAnsi="Arial" w:cs="Arial"/>
@@ -6658,7 +6723,44 @@
           <w:szCs w:val="24"/>
           <w:lang w:eastAsia="pt-BR"/>
         </w:rPr>
-        <w:t xml:space="preserve"> (Desenho Universal para a Aprendizagem) para garantir múltiplos meios de engajamento e representação.</w:t>
+        <w:t xml:space="preserve"> (Desenho Universal para a Aprendizagem) </w:t>
+      </w:r>
+      <w:r>
+        <w:rPr>
+          <w:rFonts w:ascii="Arial" w:eastAsia="Times New Roman" w:hAnsi="Arial" w:cs="Arial"/>
+          <w:sz w:val="24"/>
+          <w:szCs w:val="24"/>
+          <w:lang w:eastAsia="pt-BR"/>
+        </w:rPr>
+        <w:t xml:space="preserve">e do modelo </w:t>
+      </w:r>
+      <w:r>
+        <w:rPr>
+          <w:rFonts w:ascii="Arial" w:eastAsia="Times New Roman" w:hAnsi="Arial" w:cs="Arial"/>
+          <w:b/>
+          <w:sz w:val="24"/>
+          <w:szCs w:val="24"/>
+          <w:lang w:eastAsia="pt-BR"/>
+        </w:rPr>
+        <w:t>ADDIE</w:t>
+      </w:r>
+      <w:r>
+        <w:rPr>
+          <w:rFonts w:ascii="Arial" w:eastAsia="Times New Roman" w:hAnsi="Arial" w:cs="Arial"/>
+          <w:sz w:val="24"/>
+          <w:szCs w:val="24"/>
+          <w:lang w:eastAsia="pt-BR"/>
+        </w:rPr>
+        <w:t xml:space="preserve"> </w:t>
+      </w:r>
+      <w:r>
+        <w:rPr>
+          <w:rFonts w:ascii="Arial" w:eastAsia="Times New Roman" w:hAnsi="Arial" w:cs="Arial"/>
+          <w:sz w:val="24"/>
+          <w:szCs w:val="24"/>
+          <w:lang w:eastAsia="pt-BR"/>
+        </w:rPr>
+        <w:t>para garantir múltiplos meios de engajamento e representação.</w:t>
       </w:r>
     </w:p>
     <w:p>
@@ -6845,186 +6947,46 @@
         <w:spacing w:after="0" w:line="360" w:lineRule="auto"/>
         <w:rPr>
           <w:rFonts w:ascii="Arial" w:eastAsia="Times New Roman" w:hAnsi="Arial" w:cs="Arial"/>
-          <w:b/>
-          <w:bCs/>
-          <w:sz w:val="24"/>
-          <w:szCs w:val="24"/>
-          <w:lang w:eastAsia="pt-BR"/>
-        </w:rPr>
-      </w:pPr>
-      <w:r>
-        <w:rPr>
-          <w:rFonts w:ascii="Arial" w:eastAsia="Times New Roman" w:hAnsi="Arial" w:cs="Arial"/>
-          <w:b/>
-          <w:bCs/>
-          <w:sz w:val="24"/>
-          <w:szCs w:val="24"/>
-          <w:lang w:eastAsia="pt-BR"/>
-        </w:rPr>
-        <w:t>5. SOLUÇÃO</w:t>
-      </w:r>
-    </w:p>
-    <w:p>
-      <w:pPr>
-        <w:spacing w:after="0" w:line="360" w:lineRule="auto"/>
-        <w:rPr>
-          <w:rFonts w:ascii="Arial" w:eastAsia="Times New Roman" w:hAnsi="Arial" w:cs="Arial"/>
-          <w:sz w:val="24"/>
-          <w:szCs w:val="24"/>
-          <w:lang w:eastAsia="pt-BR"/>
-        </w:rPr>
-      </w:pPr>
-      <w:r>
-        <w:rPr>
-          <w:rFonts w:ascii="Arial" w:eastAsia="Times New Roman" w:hAnsi="Arial" w:cs="Arial"/>
-          <w:sz w:val="24"/>
-          <w:szCs w:val="24"/>
-          <w:lang w:eastAsia="pt-BR"/>
-        </w:rPr>
-        <w:lastRenderedPageBreak/>
-        <w:t xml:space="preserve">"O TEA </w:t>
-      </w:r>
-      <w:proofErr w:type="spellStart"/>
-      <w:r>
-        <w:rPr>
-          <w:rFonts w:ascii="Arial" w:eastAsia="Times New Roman" w:hAnsi="Arial" w:cs="Arial"/>
-          <w:sz w:val="24"/>
-          <w:szCs w:val="24"/>
-          <w:lang w:eastAsia="pt-BR"/>
-        </w:rPr>
-        <w:t>Learn</w:t>
-      </w:r>
-      <w:proofErr w:type="spellEnd"/>
-      <w:r>
-        <w:rPr>
-          <w:rFonts w:ascii="Arial" w:eastAsia="Times New Roman" w:hAnsi="Arial" w:cs="Arial"/>
-          <w:sz w:val="24"/>
-          <w:szCs w:val="24"/>
-          <w:lang w:eastAsia="pt-BR"/>
-        </w:rPr>
-        <w:t xml:space="preserve"> automatiza a adaptação de conteúdos para garant</w:t>
-      </w:r>
-      <w:r>
-        <w:rPr>
-          <w:rFonts w:ascii="Arial" w:eastAsia="Times New Roman" w:hAnsi="Arial" w:cs="Arial"/>
-          <w:sz w:val="24"/>
-          <w:szCs w:val="24"/>
-          <w:lang w:eastAsia="pt-BR"/>
-        </w:rPr>
-        <w:t>ir a inclusão de alunos com TEA (Transtorno do Espectro Autista)</w:t>
-      </w:r>
-      <w:r>
-        <w:rPr>
-          <w:rFonts w:ascii="Arial" w:eastAsia="Times New Roman" w:hAnsi="Arial" w:cs="Arial"/>
-          <w:sz w:val="24"/>
-          <w:szCs w:val="24"/>
-          <w:lang w:eastAsia="pt-BR"/>
-        </w:rPr>
-        <w:t xml:space="preserve">." </w:t>
-      </w:r>
-      <w:r>
-        <w:rPr>
-          <w:rFonts w:ascii="Arial" w:eastAsia="Times New Roman" w:hAnsi="Arial" w:cs="Arial"/>
-          <w:sz w:val="24"/>
-          <w:szCs w:val="24"/>
-          <w:lang w:eastAsia="pt-BR"/>
-        </w:rPr>
-        <w:t>O professor insere o material didático padrão na plataforma, e a IA reestrutura o conteúdo instantaneamente</w:t>
-      </w:r>
-      <w:r>
-        <w:rPr>
-          <w:rFonts w:ascii="Arial" w:eastAsia="Times New Roman" w:hAnsi="Arial" w:cs="Arial"/>
-          <w:sz w:val="24"/>
-          <w:szCs w:val="24"/>
-          <w:lang w:eastAsia="pt-BR"/>
-        </w:rPr>
-        <w:t xml:space="preserve"> com base nas regras de adaptação</w:t>
-      </w:r>
-      <w:r>
-        <w:rPr>
-          <w:rFonts w:ascii="Arial" w:eastAsia="Times New Roman" w:hAnsi="Arial" w:cs="Arial"/>
-          <w:sz w:val="24"/>
-          <w:szCs w:val="24"/>
-          <w:lang w:eastAsia="pt-BR"/>
-        </w:rPr>
-        <w:t>. O sistema entrega um material reformulado com frases curtas, organização em tópicos, divisão em etapas sequenciais e uma estrutura visual limpa e simplificada. Dessa forma, reduz-se a carga de trabalho do docente e garante-se a autonomia e a inclusão real do estudante com TEA nível 1 no ambiente escolar.</w:t>
-      </w:r>
-    </w:p>
-    <w:p>
-      <w:pPr>
-        <w:spacing w:after="0" w:line="360" w:lineRule="auto"/>
-        <w:jc w:val="both"/>
-        <w:rPr>
-          <w:rFonts w:ascii="Arial" w:hAnsi="Arial" w:cs="Arial"/>
-          <w:sz w:val="24"/>
-          <w:szCs w:val="24"/>
-        </w:rPr>
-      </w:pPr>
-    </w:p>
-    <w:p>
-      <w:pPr>
-        <w:spacing w:after="0" w:line="360" w:lineRule="auto"/>
-        <w:jc w:val="both"/>
-        <w:rPr>
-          <w:rFonts w:ascii="Arial" w:hAnsi="Arial" w:cs="Arial"/>
-          <w:sz w:val="24"/>
-          <w:szCs w:val="24"/>
-        </w:rPr>
-      </w:pPr>
-    </w:p>
-    <w:p>
-      <w:pPr>
-        <w:spacing w:after="0" w:line="360" w:lineRule="auto"/>
-        <w:jc w:val="center"/>
-        <w:rPr>
-          <w:rFonts w:ascii="Arial" w:hAnsi="Arial" w:cs="Arial"/>
-          <w:b/>
-          <w:sz w:val="24"/>
-          <w:szCs w:val="24"/>
-        </w:rPr>
-      </w:pPr>
-      <w:r>
-        <w:rPr>
-          <w:rFonts w:ascii="Arial" w:hAnsi="Arial" w:cs="Arial"/>
-          <w:b/>
-          <w:sz w:val="24"/>
-          <w:szCs w:val="24"/>
-        </w:rPr>
-        <w:t>DESENVOLVIMENTO</w:t>
-      </w:r>
-    </w:p>
-    <w:p>
-      <w:pPr>
-        <w:spacing w:after="0" w:line="360" w:lineRule="auto"/>
-        <w:rPr>
-          <w:rFonts w:ascii="Arial" w:hAnsi="Arial" w:cs="Arial"/>
-          <w:sz w:val="24"/>
-          <w:szCs w:val="24"/>
-        </w:rPr>
-      </w:pPr>
-      <w:r>
-        <w:rPr>
-          <w:rFonts w:ascii="Arial" w:hAnsi="Arial" w:cs="Arial"/>
-          <w:sz w:val="24"/>
-          <w:szCs w:val="24"/>
-        </w:rPr>
-        <w:t>Após uma série de pesquisas, alguns modelos e métodos foram adotados e aprendidos por nós durante o desenvolvimento desse projeto. Além disso, realizamos resumos para estudo e facilitação da implementação no projeto, como:</w:t>
-      </w:r>
-    </w:p>
-    <w:p>
-      <w:pPr>
-        <w:spacing w:after="0" w:line="360" w:lineRule="auto"/>
-        <w:rPr>
-          <w:rFonts w:ascii="Arial" w:hAnsi="Arial" w:cs="Arial"/>
-          <w:sz w:val="24"/>
-          <w:szCs w:val="24"/>
-        </w:rPr>
-      </w:pPr>
-    </w:p>
-    <w:p>
-      <w:pPr>
-        <w:spacing w:after="0" w:line="360" w:lineRule="auto"/>
-        <w:jc w:val="center"/>
+          <w:sz w:val="24"/>
+          <w:szCs w:val="24"/>
+          <w:lang w:eastAsia="pt-BR"/>
+        </w:rPr>
+      </w:pPr>
+    </w:p>
+    <w:p>
+      <w:pPr>
+        <w:spacing w:after="0" w:line="360" w:lineRule="auto"/>
+        <w:rPr>
+          <w:rFonts w:ascii="Arial" w:eastAsia="Times New Roman" w:hAnsi="Arial" w:cs="Arial"/>
+          <w:sz w:val="24"/>
+          <w:szCs w:val="24"/>
+          <w:lang w:eastAsia="pt-BR"/>
+        </w:rPr>
+      </w:pPr>
+    </w:p>
+    <w:p>
+      <w:pPr>
+        <w:spacing w:after="0" w:line="360" w:lineRule="auto"/>
+        <w:rPr>
+          <w:rFonts w:ascii="Arial" w:hAnsi="Arial" w:cs="Arial"/>
+          <w:sz w:val="24"/>
+          <w:szCs w:val="24"/>
+        </w:rPr>
+      </w:pPr>
+    </w:p>
+    <w:p>
+      <w:pPr>
+        <w:spacing w:after="0" w:line="360" w:lineRule="auto"/>
+        <w:rPr>
+          <w:rFonts w:ascii="Arial" w:hAnsi="Arial" w:cs="Arial"/>
+          <w:sz w:val="24"/>
+          <w:szCs w:val="24"/>
+        </w:rPr>
+      </w:pPr>
+    </w:p>
+    <w:p>
+      <w:pPr>
+        <w:spacing w:after="0" w:line="360" w:lineRule="auto"/>
         <w:rPr>
           <w:rFonts w:ascii="Arial" w:hAnsi="Arial" w:cs="Arial"/>
           <w:b/>
@@ -7359,7 +7321,6 @@
           <w:sz w:val="24"/>
           <w:szCs w:val="24"/>
         </w:rPr>
-        <w:lastRenderedPageBreak/>
         <w:t>Comunicação</w:t>
       </w:r>
       <w:r>
@@ -7508,21 +7469,54 @@
     <w:p>
       <w:pPr>
         <w:spacing w:after="0" w:line="360" w:lineRule="auto"/>
-        <w:jc w:val="center"/>
-        <w:rPr>
-          <w:rFonts w:ascii="Arial" w:hAnsi="Arial" w:cs="Arial"/>
-          <w:b/>
-          <w:sz w:val="24"/>
-          <w:szCs w:val="24"/>
-        </w:rPr>
-      </w:pPr>
-      <w:r>
-        <w:rPr>
-          <w:rFonts w:ascii="Arial" w:hAnsi="Arial" w:cs="Arial"/>
-          <w:b/>
-          <w:sz w:val="24"/>
-          <w:szCs w:val="24"/>
-        </w:rPr>
+        <w:jc w:val="both"/>
+        <w:rPr>
+          <w:rFonts w:ascii="Arial" w:hAnsi="Arial" w:cs="Arial"/>
+          <w:sz w:val="24"/>
+          <w:szCs w:val="24"/>
+        </w:rPr>
+      </w:pPr>
+    </w:p>
+    <w:p>
+      <w:pPr>
+        <w:spacing w:after="0" w:line="360" w:lineRule="auto"/>
+        <w:jc w:val="both"/>
+        <w:rPr>
+          <w:rFonts w:ascii="Arial" w:hAnsi="Arial" w:cs="Arial"/>
+          <w:sz w:val="24"/>
+          <w:szCs w:val="24"/>
+        </w:rPr>
+      </w:pPr>
+    </w:p>
+    <w:p>
+      <w:pPr>
+        <w:spacing w:after="0" w:line="360" w:lineRule="auto"/>
+        <w:jc w:val="both"/>
+        <w:rPr>
+          <w:rFonts w:ascii="Arial" w:hAnsi="Arial" w:cs="Arial"/>
+          <w:sz w:val="24"/>
+          <w:szCs w:val="24"/>
+        </w:rPr>
+      </w:pPr>
+    </w:p>
+    <w:p>
+      <w:pPr>
+        <w:spacing w:after="0" w:line="360" w:lineRule="auto"/>
+        <w:rPr>
+          <w:rFonts w:ascii="Arial" w:hAnsi="Arial" w:cs="Arial"/>
+          <w:b/>
+          <w:sz w:val="24"/>
+          <w:szCs w:val="24"/>
+        </w:rPr>
+      </w:pPr>
+      <w:r>
+        <w:rPr>
+          <w:rFonts w:ascii="Arial" w:hAnsi="Arial" w:cs="Arial"/>
+          <w:b/>
+          <w:sz w:val="24"/>
+          <w:szCs w:val="24"/>
+        </w:rPr>
+        <w:lastRenderedPageBreak/>
         <w:t>ABA</w:t>
       </w:r>
     </w:p>
@@ -7971,7 +7965,6 @@
           <w:szCs w:val="24"/>
           <w:lang w:eastAsia="pt-BR"/>
         </w:rPr>
-        <w:lastRenderedPageBreak/>
         <w:t>Habilidades Sociais:</w:t>
       </w:r>
       <w:r>
@@ -8039,7 +8032,6 @@
     <w:p>
       <w:pPr>
         <w:spacing w:after="0" w:line="360" w:lineRule="auto"/>
-        <w:jc w:val="center"/>
         <w:rPr>
           <w:rFonts w:ascii="Arial" w:hAnsi="Arial" w:cs="Arial"/>
           <w:b/>
@@ -8096,7 +8088,17 @@
           <w:szCs w:val="24"/>
           <w:lang w:eastAsia="pt-BR"/>
         </w:rPr>
-        <w:t xml:space="preserve"> é uma condição do desenvolvimento que afeta principalmente a forma como a pessoa se comunica, interage socialmente e organiza seu comportamento. Ele é chamado de “espectro” porque pode se manifestar de maneiras muito diferentes em cada indivíduo — alguns têm mais autonomia, outros precisam de apoio constante.</w:t>
+        <w:t xml:space="preserve"> é uma condição do desenvolvimento que afeta principalmente a forma como a pessoa se comunica, interage socialmente e organiza seu comportamento. Ele é chamado de “espectro” porque pode se </w:t>
+      </w:r>
+      <w:r>
+        <w:rPr>
+          <w:rFonts w:ascii="Arial" w:eastAsia="Times New Roman" w:hAnsi="Arial" w:cs="Arial"/>
+          <w:sz w:val="24"/>
+          <w:szCs w:val="24"/>
+          <w:lang w:eastAsia="pt-BR"/>
+        </w:rPr>
+        <w:lastRenderedPageBreak/>
+        <w:t>manifestar de maneiras muito diferentes em cada indivíduo — alguns têm mais autonomia, outros precisam de apoio constante.</w:t>
       </w:r>
     </w:p>
     <w:p>
@@ -8412,7 +8414,6 @@
           <w:szCs w:val="24"/>
           <w:lang w:eastAsia="pt-BR"/>
         </w:rPr>
-        <w:lastRenderedPageBreak/>
         <w:t>A DI também é classificada em graus: leve, moderada, grave ou profunda, dependendo do quanto a pessoa consegue aplicar o que sabe na prática (como cuidar da higiene, usar dinheiro ou se locomover com segurança).</w:t>
       </w:r>
     </w:p>
@@ -8554,6 +8555,7 @@
           <w:szCs w:val="24"/>
           <w:lang w:eastAsia="pt-BR"/>
         </w:rPr>
+        <w:lastRenderedPageBreak/>
         <w:t>Em resumo, o TEA mostra como cada pessoa se relaciona com o mundo em termos de comunicação e comportamento, enquanto a DI mostra como ela aprende e aplica o que sabe. Juntas, essas informações ajudam médicos e terapeutas a definir o tipo de apoio necessário para que o indivíduo tenha mais qualidade de vida e autonomia.</w:t>
       </w:r>
     </w:p>
@@ -8571,7 +8573,6 @@
     <w:p>
       <w:pPr>
         <w:spacing w:after="0" w:line="360" w:lineRule="auto"/>
-        <w:jc w:val="center"/>
         <w:rPr>
           <w:rFonts w:ascii="Arial" w:hAnsi="Arial" w:cs="Arial"/>
           <w:b/>
@@ -8587,15 +8588,6 @@
           <w:szCs w:val="24"/>
         </w:rPr>
         <w:t>ADDIE</w:t>
-      </w:r>
-      <w:r>
-        <w:rPr>
-          <w:rFonts w:ascii="Arial" w:hAnsi="Arial" w:cs="Arial"/>
-          <w:b/>
-          <w:sz w:val="24"/>
-          <w:szCs w:val="24"/>
-        </w:rPr>
-        <w:t>:</w:t>
       </w:r>
     </w:p>
     <w:p>
@@ -8716,16 +8708,7 @@
           <w:sz w:val="24"/>
           <w:szCs w:val="24"/>
         </w:rPr>
-        <w:t xml:space="preserve">, a inteligência artificial aplica essas regras ao material original. O processamento envolve simplificação de texto, </w:t>
-      </w:r>
-      <w:r>
-        <w:rPr>
-          <w:rFonts w:ascii="Arial" w:hAnsi="Arial" w:cs="Arial"/>
-          <w:sz w:val="24"/>
-          <w:szCs w:val="24"/>
-        </w:rPr>
-        <w:lastRenderedPageBreak/>
-        <w:t>segmentação do conteúdo, reorganização lógica, geração de exemplos e destaque de conceitos-chave. O resultado é o material adaptado.</w:t>
+        <w:t>, a inteligência artificial aplica essas regras ao material original. O processamento envolve simplificação de texto, segmentação do conteúdo, reorganização lógica, geração de exemplos e destaque de conceitos-chave. O resultado é o material adaptado.</w:t>
       </w:r>
     </w:p>
     <w:p>
@@ -8850,80 +8833,41 @@
     <w:p>
       <w:pPr>
         <w:spacing w:after="0" w:line="360" w:lineRule="auto"/>
-        <w:jc w:val="center"/>
-        <w:rPr>
-          <w:rFonts w:ascii="Arial" w:hAnsi="Arial" w:cs="Arial"/>
-          <w:b/>
-          <w:sz w:val="24"/>
-          <w:szCs w:val="24"/>
-        </w:rPr>
-      </w:pPr>
-      <w:r>
-        <w:rPr>
-          <w:rFonts w:ascii="Arial" w:hAnsi="Arial" w:cs="Arial"/>
-          <w:b/>
-          <w:sz w:val="24"/>
-          <w:szCs w:val="24"/>
-        </w:rPr>
-        <w:t>DIAGRAMA DE GANTT</w:t>
-      </w:r>
-    </w:p>
-    <w:p>
-      <w:pPr>
-        <w:spacing w:after="0" w:line="360" w:lineRule="auto"/>
-        <w:jc w:val="both"/>
-        <w:rPr>
-          <w:rFonts w:ascii="Arial" w:hAnsi="Arial" w:cs="Arial"/>
-          <w:sz w:val="24"/>
-          <w:szCs w:val="24"/>
-        </w:rPr>
-      </w:pPr>
-      <w:r>
-        <w:rPr>
-          <w:rFonts w:ascii="Arial" w:hAnsi="Arial" w:cs="Arial"/>
-          <w:sz w:val="24"/>
-          <w:szCs w:val="24"/>
-        </w:rPr>
-        <w:tab/>
-        <w:t>F</w:t>
-      </w:r>
-      <w:r>
-        <w:rPr>
-          <w:rFonts w:ascii="Arial" w:hAnsi="Arial" w:cs="Arial"/>
-          <w:sz w:val="24"/>
-          <w:szCs w:val="24"/>
-        </w:rPr>
-        <w:t>erramenta visual de gestão de projetos com foco em simplificar datas de entrega, quais as tarefas foram e serão feitas e quanto tempo cada uma levou. A mecânica de estruturação é feita com base na adição de tarefas de forma vertical e os períodos de realização ou prazos de forma horizontal.</w:t>
-      </w:r>
-    </w:p>
-    <w:p>
-      <w:pPr>
-        <w:spacing w:after="0" w:line="360" w:lineRule="auto"/>
-        <w:rPr>
-          <w:rFonts w:ascii="Arial" w:hAnsi="Arial" w:cs="Arial"/>
-          <w:sz w:val="24"/>
-          <w:szCs w:val="24"/>
-        </w:rPr>
-      </w:pPr>
-    </w:p>
-    <w:p>
-      <w:pPr>
-        <w:spacing w:after="0" w:line="360" w:lineRule="auto"/>
-        <w:jc w:val="center"/>
-        <w:rPr>
-          <w:rFonts w:ascii="Arial" w:hAnsi="Arial" w:cs="Arial"/>
-          <w:b/>
-          <w:sz w:val="24"/>
-          <w:szCs w:val="24"/>
-        </w:rPr>
-      </w:pPr>
-      <w:r>
-        <w:rPr>
-          <w:rFonts w:ascii="Arial" w:hAnsi="Arial" w:cs="Arial"/>
-          <w:b/>
-          <w:sz w:val="24"/>
-          <w:szCs w:val="24"/>
-        </w:rPr>
+        <w:rPr>
+          <w:rFonts w:ascii="Arial" w:hAnsi="Arial" w:cs="Arial"/>
+          <w:sz w:val="24"/>
+          <w:szCs w:val="24"/>
+        </w:rPr>
+      </w:pPr>
+    </w:p>
+    <w:p>
+      <w:pPr>
+        <w:spacing w:after="0" w:line="360" w:lineRule="auto"/>
+        <w:rPr>
+          <w:rFonts w:ascii="Arial" w:hAnsi="Arial" w:cs="Arial"/>
+          <w:sz w:val="24"/>
+          <w:szCs w:val="24"/>
+        </w:rPr>
+      </w:pPr>
+    </w:p>
+    <w:p>
+      <w:pPr>
+        <w:spacing w:after="0" w:line="360" w:lineRule="auto"/>
+        <w:rPr>
+          <w:rFonts w:ascii="Arial" w:hAnsi="Arial" w:cs="Arial"/>
+          <w:b/>
+          <w:sz w:val="24"/>
+          <w:szCs w:val="24"/>
+        </w:rPr>
+      </w:pPr>
+      <w:r>
+        <w:rPr>
+          <w:rFonts w:ascii="Arial" w:hAnsi="Arial" w:cs="Arial"/>
+          <w:b/>
+          <w:sz w:val="24"/>
+          <w:szCs w:val="24"/>
+        </w:rPr>
+        <w:lastRenderedPageBreak/>
         <w:t>DUA</w:t>
       </w:r>
     </w:p>
@@ -9187,7 +9131,6 @@
           <w:sz w:val="24"/>
           <w:szCs w:val="24"/>
         </w:rPr>
-        <w:lastRenderedPageBreak/>
         <w:t>Relação com o TEA</w:t>
       </w:r>
     </w:p>
@@ -9457,21 +9400,44 @@
         <w:jc w:val="both"/>
         <w:rPr>
           <w:rFonts w:ascii="Arial" w:hAnsi="Arial" w:cs="Arial"/>
-          <w:b/>
-          <w:bCs/>
-          <w:sz w:val="24"/>
-          <w:szCs w:val="24"/>
-        </w:rPr>
-      </w:pPr>
-      <w:r>
-        <w:rPr>
-          <w:rFonts w:ascii="Arial" w:hAnsi="Arial" w:cs="Arial"/>
-          <w:b/>
-          <w:bCs/>
-          <w:sz w:val="24"/>
-          <w:szCs w:val="24"/>
-        </w:rPr>
-        <w:t>Conclusão</w:t>
+          <w:sz w:val="24"/>
+          <w:szCs w:val="24"/>
+        </w:rPr>
+      </w:pPr>
+    </w:p>
+    <w:p>
+      <w:pPr>
+        <w:spacing w:after="0" w:line="360" w:lineRule="auto"/>
+        <w:jc w:val="both"/>
+        <w:rPr>
+          <w:rFonts w:ascii="Arial" w:hAnsi="Arial" w:cs="Arial"/>
+          <w:sz w:val="24"/>
+          <w:szCs w:val="24"/>
+        </w:rPr>
+      </w:pPr>
+    </w:p>
+    <w:p>
+      <w:pPr>
+        <w:spacing w:after="0" w:line="360" w:lineRule="auto"/>
+        <w:jc w:val="both"/>
+        <w:rPr>
+          <w:rFonts w:ascii="Arial" w:hAnsi="Arial" w:cs="Arial"/>
+          <w:b/>
+          <w:bCs/>
+          <w:sz w:val="24"/>
+          <w:szCs w:val="24"/>
+        </w:rPr>
+      </w:pPr>
+      <w:r>
+        <w:rPr>
+          <w:rFonts w:ascii="Arial" w:hAnsi="Arial" w:cs="Arial"/>
+          <w:b/>
+          <w:bCs/>
+          <w:sz w:val="24"/>
+          <w:szCs w:val="24"/>
+        </w:rPr>
+        <w:lastRenderedPageBreak/>
+        <w:t>Resumo</w:t>
       </w:r>
     </w:p>
     <w:p>
@@ -9543,7 +9509,64 @@
     <w:p>
       <w:pPr>
         <w:spacing w:after="0" w:line="360" w:lineRule="auto"/>
-        <w:jc w:val="center"/>
+        <w:rPr>
+          <w:rFonts w:ascii="Arial" w:hAnsi="Arial" w:cs="Arial"/>
+          <w:b/>
+          <w:sz w:val="24"/>
+          <w:szCs w:val="24"/>
+        </w:rPr>
+      </w:pPr>
+      <w:r>
+        <w:rPr>
+          <w:rFonts w:ascii="Arial" w:hAnsi="Arial" w:cs="Arial"/>
+          <w:b/>
+          <w:sz w:val="24"/>
+          <w:szCs w:val="24"/>
+        </w:rPr>
+        <w:t>DIAGRAMA DE GANTT</w:t>
+      </w:r>
+    </w:p>
+    <w:p>
+      <w:pPr>
+        <w:spacing w:after="0" w:line="360" w:lineRule="auto"/>
+        <w:jc w:val="both"/>
+        <w:rPr>
+          <w:rFonts w:ascii="Arial" w:hAnsi="Arial" w:cs="Arial"/>
+          <w:sz w:val="24"/>
+          <w:szCs w:val="24"/>
+        </w:rPr>
+      </w:pPr>
+      <w:r>
+        <w:rPr>
+          <w:rFonts w:ascii="Arial" w:hAnsi="Arial" w:cs="Arial"/>
+          <w:sz w:val="24"/>
+          <w:szCs w:val="24"/>
+        </w:rPr>
+        <w:tab/>
+        <w:t>F</w:t>
+      </w:r>
+      <w:r>
+        <w:rPr>
+          <w:rFonts w:ascii="Arial" w:hAnsi="Arial" w:cs="Arial"/>
+          <w:sz w:val="24"/>
+          <w:szCs w:val="24"/>
+        </w:rPr>
+        <w:t>erramenta visual de gestão de projetos com foco em simplificar datas de entrega, quais as tarefas foram e serão feitas e quanto tempo cada uma levou. A mecânica de estruturação é feita com base na adição de tarefas de forma vertical e os períodos de realização ou prazos de forma horizontal.</w:t>
+      </w:r>
+    </w:p>
+    <w:p>
+      <w:pPr>
+        <w:spacing w:after="0" w:line="360" w:lineRule="auto"/>
+        <w:rPr>
+          <w:rFonts w:ascii="Arial" w:hAnsi="Arial" w:cs="Arial"/>
+          <w:sz w:val="24"/>
+          <w:szCs w:val="24"/>
+        </w:rPr>
+      </w:pPr>
+    </w:p>
+    <w:p>
+      <w:pPr>
+        <w:spacing w:after="0" w:line="360" w:lineRule="auto"/>
         <w:rPr>
           <w:rFonts w:ascii="Arial" w:hAnsi="Arial" w:cs="Arial"/>
           <w:b/>
@@ -9602,30 +9625,118 @@
     <w:p>
       <w:pPr>
         <w:spacing w:after="0" w:line="360" w:lineRule="auto"/>
-        <w:jc w:val="center"/>
-        <w:rPr>
-          <w:rFonts w:ascii="Arial" w:hAnsi="Arial" w:cs="Arial"/>
-          <w:sz w:val="24"/>
-          <w:szCs w:val="24"/>
-        </w:rPr>
-      </w:pPr>
-    </w:p>
-    <w:p>
-      <w:pPr>
-        <w:spacing w:after="0" w:line="360" w:lineRule="auto"/>
-        <w:rPr>
-          <w:rFonts w:ascii="Arial" w:hAnsi="Arial" w:cs="Arial"/>
-          <w:sz w:val="24"/>
-          <w:szCs w:val="24"/>
-        </w:rPr>
-      </w:pPr>
-      <w:r>
-        <w:rPr>
-          <w:rFonts w:ascii="Arial" w:hAnsi="Arial" w:cs="Arial"/>
-          <w:sz w:val="24"/>
-          <w:szCs w:val="24"/>
-        </w:rPr>
-        <w:t>DIAGRAMA DE GANTT</w:t>
+        <w:ind w:firstLine="708"/>
+        <w:jc w:val="both"/>
+        <w:rPr>
+          <w:rFonts w:ascii="Arial" w:hAnsi="Arial" w:cs="Arial"/>
+          <w:sz w:val="24"/>
+          <w:szCs w:val="24"/>
+        </w:rPr>
+      </w:pPr>
+    </w:p>
+    <w:p>
+      <w:pPr>
+        <w:spacing w:after="0" w:line="360" w:lineRule="auto"/>
+        <w:rPr>
+          <w:rFonts w:ascii="Arial" w:eastAsia="Times New Roman" w:hAnsi="Arial" w:cs="Arial"/>
+          <w:b/>
+          <w:bCs/>
+          <w:sz w:val="24"/>
+          <w:szCs w:val="24"/>
+          <w:lang w:eastAsia="pt-BR"/>
+        </w:rPr>
+      </w:pPr>
+      <w:r>
+        <w:rPr>
+          <w:rFonts w:ascii="Arial" w:eastAsia="Times New Roman" w:hAnsi="Arial" w:cs="Arial"/>
+          <w:b/>
+          <w:bCs/>
+          <w:sz w:val="24"/>
+          <w:szCs w:val="24"/>
+          <w:lang w:eastAsia="pt-BR"/>
+        </w:rPr>
+        <w:t>3</w:t>
+      </w:r>
+      <w:r>
+        <w:rPr>
+          <w:rFonts w:ascii="Arial" w:eastAsia="Times New Roman" w:hAnsi="Arial" w:cs="Arial"/>
+          <w:b/>
+          <w:bCs/>
+          <w:sz w:val="24"/>
+          <w:szCs w:val="24"/>
+          <w:lang w:eastAsia="pt-BR"/>
+        </w:rPr>
+        <w:t>.</w:t>
+      </w:r>
+      <w:r>
+        <w:rPr>
+          <w:rFonts w:ascii="Arial" w:eastAsia="Times New Roman" w:hAnsi="Arial" w:cs="Arial"/>
+          <w:b/>
+          <w:bCs/>
+          <w:sz w:val="24"/>
+          <w:szCs w:val="24"/>
+          <w:lang w:eastAsia="pt-BR"/>
+        </w:rPr>
+        <w:t xml:space="preserve"> </w:t>
+      </w:r>
+      <w:r>
+        <w:rPr>
+          <w:rFonts w:ascii="Arial" w:eastAsia="Times New Roman" w:hAnsi="Arial" w:cs="Arial"/>
+          <w:b/>
+          <w:bCs/>
+          <w:sz w:val="24"/>
+          <w:szCs w:val="24"/>
+          <w:lang w:eastAsia="pt-BR"/>
+        </w:rPr>
+        <w:t>SOLUÇÃO</w:t>
+      </w:r>
+      <w:bookmarkStart w:id="0" w:name="_GoBack"/>
+      <w:bookmarkEnd w:id="0"/>
+    </w:p>
+    <w:p>
+      <w:pPr>
+        <w:spacing w:after="0" w:line="360" w:lineRule="auto"/>
+        <w:rPr>
+          <w:rFonts w:ascii="Arial" w:hAnsi="Arial" w:cs="Arial"/>
+          <w:sz w:val="24"/>
+          <w:szCs w:val="24"/>
+        </w:rPr>
+      </w:pPr>
+      <w:r>
+        <w:rPr>
+          <w:rFonts w:ascii="Arial" w:hAnsi="Arial" w:cs="Arial"/>
+          <w:sz w:val="24"/>
+          <w:szCs w:val="24"/>
+        </w:rPr>
+        <w:t>TEXTO CONCLUSIVO SOBRE O NOSSO PROJETO (Após a identificação dos problemas, com o objetivo de ajudar os professores e através da conversão utilizando o ADDIE, concluímos que funciona ou não)</w:t>
+      </w:r>
+    </w:p>
+    <w:p>
+      <w:pPr>
+        <w:spacing w:after="0" w:line="360" w:lineRule="auto"/>
+        <w:rPr>
+          <w:rFonts w:ascii="Arial" w:hAnsi="Arial" w:cs="Arial"/>
+          <w:sz w:val="24"/>
+          <w:szCs w:val="24"/>
+        </w:rPr>
+      </w:pPr>
+    </w:p>
+    <w:p>
+      <w:pPr>
+        <w:spacing w:after="0" w:line="360" w:lineRule="auto"/>
+        <w:rPr>
+          <w:rFonts w:ascii="Arial" w:hAnsi="Arial" w:cs="Arial"/>
+          <w:sz w:val="24"/>
+          <w:szCs w:val="24"/>
+        </w:rPr>
+      </w:pPr>
+      <w:r>
+        <w:rPr>
+          <w:rFonts w:ascii="Arial" w:hAnsi="Arial" w:cs="Arial"/>
+          <w:sz w:val="24"/>
+          <w:szCs w:val="24"/>
+        </w:rPr>
+        <w:t>MER</w:t>
       </w:r>
     </w:p>
     <w:p>
@@ -9646,10 +9757,10 @@
           <w:lang w:eastAsia="pt-BR"/>
         </w:rPr>
         <w:drawing>
-          <wp:inline distT="0" distB="0" distL="0" distR="0" wp14:anchorId="5C7599E5" wp14:editId="76EC532C">
-            <wp:extent cx="5760085" cy="902335"/>
-            <wp:effectExtent l="0" t="0" r="0" b="0"/>
-            <wp:docPr id="1" name="Imagem 1"/>
+          <wp:inline distT="0" distB="0" distL="0" distR="0" wp14:anchorId="451C36C7" wp14:editId="60466870">
+            <wp:extent cx="5760085" cy="1310640"/>
+            <wp:effectExtent l="0" t="0" r="0" b="3810"/>
+            <wp:docPr id="7" name="Imagem 7"/>
             <wp:cNvGraphicFramePr>
               <a:graphicFrameLocks xmlns:a="http://schemas.openxmlformats.org/drawingml/2006/main" noChangeAspect="1"/>
             </wp:cNvGraphicFramePr>
@@ -9657,7 +9768,7 @@
               <a:graphicData uri="http://schemas.openxmlformats.org/drawingml/2006/picture">
                 <pic:pic xmlns:pic="http://schemas.openxmlformats.org/drawingml/2006/picture">
                   <pic:nvPicPr>
-                    <pic:cNvPr id="1" name="DiagramaGanttTCC.jpg"/>
+                    <pic:cNvPr id="7" name="MER.jpg"/>
                     <pic:cNvPicPr/>
                   </pic:nvPicPr>
                   <pic:blipFill>
@@ -9675,7 +9786,7 @@
                   <pic:spPr>
                     <a:xfrm>
                       <a:off x="0" y="0"/>
-                      <a:ext cx="5760085" cy="902335"/>
+                      <a:ext cx="5760085" cy="1310640"/>
                     </a:xfrm>
                     <a:prstGeom prst="rect">
                       <a:avLst/>
@@ -9707,13 +9818,34 @@
           <w:szCs w:val="24"/>
         </w:rPr>
       </w:pPr>
-      <w:r>
-        <w:rPr>
-          <w:rFonts w:ascii="Arial" w:hAnsi="Arial" w:cs="Arial"/>
-          <w:sz w:val="24"/>
-          <w:szCs w:val="24"/>
-        </w:rPr>
-        <w:t>UML</w:t>
+    </w:p>
+    <w:p>
+      <w:pPr>
+        <w:spacing w:after="0" w:line="360" w:lineRule="auto"/>
+        <w:rPr>
+          <w:rFonts w:ascii="Arial" w:hAnsi="Arial" w:cs="Arial"/>
+          <w:sz w:val="24"/>
+          <w:szCs w:val="24"/>
+        </w:rPr>
+      </w:pPr>
+    </w:p>
+    <w:p>
+      <w:pPr>
+        <w:spacing w:after="0" w:line="360" w:lineRule="auto"/>
+        <w:rPr>
+          <w:rFonts w:ascii="Arial" w:hAnsi="Arial" w:cs="Arial"/>
+          <w:sz w:val="24"/>
+          <w:szCs w:val="24"/>
+        </w:rPr>
+      </w:pPr>
+      <w:r>
+        <w:rPr>
+          <w:rFonts w:ascii="Arial" w:hAnsi="Arial" w:cs="Arial"/>
+          <w:sz w:val="24"/>
+          <w:szCs w:val="24"/>
+        </w:rPr>
+        <w:lastRenderedPageBreak/>
+        <w:t>DER</w:t>
       </w:r>
     </w:p>
     <w:p>
@@ -9733,87 +9865,8 @@
           <w:szCs w:val="24"/>
           <w:lang w:eastAsia="pt-BR"/>
         </w:rPr>
-        <w:lastRenderedPageBreak/>
         <w:drawing>
-          <wp:inline distT="0" distB="0" distL="0" distR="0" wp14:anchorId="3829F526" wp14:editId="65B4DE1A">
-            <wp:extent cx="5760085" cy="1601470"/>
-            <wp:effectExtent l="0" t="0" r="0" b="0"/>
-            <wp:docPr id="12" name="Imagem 12"/>
-            <wp:cNvGraphicFramePr>
-              <a:graphicFrameLocks xmlns:a="http://schemas.openxmlformats.org/drawingml/2006/main" noChangeAspect="1"/>
-            </wp:cNvGraphicFramePr>
-            <a:graphic xmlns:a="http://schemas.openxmlformats.org/drawingml/2006/main">
-              <a:graphicData uri="http://schemas.openxmlformats.org/drawingml/2006/picture">
-                <pic:pic xmlns:pic="http://schemas.openxmlformats.org/drawingml/2006/picture">
-                  <pic:nvPicPr>
-                    <pic:cNvPr id="12" name="UML-TCC.jpg"/>
-                    <pic:cNvPicPr/>
-                  </pic:nvPicPr>
-                  <pic:blipFill>
-                    <a:blip r:embed="rId15" cstate="print">
-                      <a:extLst>
-                        <a:ext uri="{28A0092B-C50C-407E-A947-70E740481C1C}">
-                          <a14:useLocalDpi xmlns:a14="http://schemas.microsoft.com/office/drawing/2010/main" val="0"/>
-                        </a:ext>
-                      </a:extLst>
-                    </a:blip>
-                    <a:stretch>
-                      <a:fillRect/>
-                    </a:stretch>
-                  </pic:blipFill>
-                  <pic:spPr>
-                    <a:xfrm>
-                      <a:off x="0" y="0"/>
-                      <a:ext cx="5760085" cy="1601470"/>
-                    </a:xfrm>
-                    <a:prstGeom prst="rect">
-                      <a:avLst/>
-                    </a:prstGeom>
-                  </pic:spPr>
-                </pic:pic>
-              </a:graphicData>
-            </a:graphic>
-          </wp:inline>
-        </w:drawing>
-      </w:r>
-    </w:p>
-    <w:p>
-      <w:pPr>
-        <w:spacing w:after="0" w:line="360" w:lineRule="auto"/>
-        <w:rPr>
-          <w:rFonts w:ascii="Arial" w:hAnsi="Arial" w:cs="Arial"/>
-          <w:sz w:val="24"/>
-          <w:szCs w:val="24"/>
-        </w:rPr>
-      </w:pPr>
-      <w:r>
-        <w:rPr>
-          <w:rFonts w:ascii="Arial" w:hAnsi="Arial" w:cs="Arial"/>
-          <w:sz w:val="24"/>
-          <w:szCs w:val="24"/>
-        </w:rPr>
-        <w:t>DER</w:t>
-      </w:r>
-    </w:p>
-    <w:p>
-      <w:pPr>
-        <w:spacing w:after="0" w:line="360" w:lineRule="auto"/>
-        <w:rPr>
-          <w:rFonts w:ascii="Arial" w:hAnsi="Arial" w:cs="Arial"/>
-          <w:sz w:val="24"/>
-          <w:szCs w:val="24"/>
-        </w:rPr>
-      </w:pPr>
-      <w:r>
-        <w:rPr>
-          <w:rFonts w:ascii="Arial" w:hAnsi="Arial" w:cs="Arial"/>
-          <w:noProof/>
-          <w:sz w:val="24"/>
-          <w:szCs w:val="24"/>
-          <w:lang w:eastAsia="pt-BR"/>
-        </w:rPr>
-        <w:drawing>
-          <wp:inline distT="0" distB="0" distL="0" distR="0" wp14:anchorId="0F99CCBC" wp14:editId="62173AE4">
+          <wp:inline distT="0" distB="0" distL="0" distR="0" wp14:anchorId="178743D9" wp14:editId="369F3DC4">
             <wp:extent cx="5760085" cy="1136015"/>
             <wp:effectExtent l="0" t="0" r="0" b="6985"/>
             <wp:docPr id="4" name="Imagem 4"/>
@@ -9828,7 +9881,7 @@
                     <pic:cNvPicPr/>
                   </pic:nvPicPr>
                   <pic:blipFill>
-                    <a:blip r:embed="rId16">
+                    <a:blip r:embed="rId15">
                       <a:extLst>
                         <a:ext uri="{28A0092B-C50C-407E-A947-70E740481C1C}">
                           <a14:useLocalDpi xmlns:a14="http://schemas.microsoft.com/office/drawing/2010/main" val="0"/>
@@ -9884,43 +9937,13 @@
           <w:szCs w:val="24"/>
         </w:rPr>
       </w:pPr>
-    </w:p>
-    <w:p>
-      <w:pPr>
-        <w:spacing w:after="0" w:line="360" w:lineRule="auto"/>
-        <w:rPr>
-          <w:rFonts w:ascii="Arial" w:hAnsi="Arial" w:cs="Arial"/>
-          <w:sz w:val="24"/>
-          <w:szCs w:val="24"/>
-        </w:rPr>
-      </w:pPr>
-    </w:p>
-    <w:p>
-      <w:pPr>
-        <w:spacing w:after="0" w:line="360" w:lineRule="auto"/>
-        <w:rPr>
-          <w:rFonts w:ascii="Arial" w:hAnsi="Arial" w:cs="Arial"/>
-          <w:sz w:val="24"/>
-          <w:szCs w:val="24"/>
-        </w:rPr>
-      </w:pPr>
-    </w:p>
-    <w:p>
-      <w:pPr>
-        <w:spacing w:after="0" w:line="360" w:lineRule="auto"/>
-        <w:rPr>
-          <w:rFonts w:ascii="Arial" w:hAnsi="Arial" w:cs="Arial"/>
-          <w:sz w:val="24"/>
-          <w:szCs w:val="24"/>
-        </w:rPr>
-      </w:pPr>
-      <w:r>
-        <w:rPr>
-          <w:rFonts w:ascii="Arial" w:hAnsi="Arial" w:cs="Arial"/>
-          <w:sz w:val="24"/>
-          <w:szCs w:val="24"/>
-        </w:rPr>
-        <w:t>MER</w:t>
+      <w:r>
+        <w:rPr>
+          <w:rFonts w:ascii="Arial" w:hAnsi="Arial" w:cs="Arial"/>
+          <w:sz w:val="24"/>
+          <w:szCs w:val="24"/>
+        </w:rPr>
+        <w:t>CASO DE USO</w:t>
       </w:r>
     </w:p>
     <w:p>
@@ -9941,10 +9964,10 @@
           <w:lang w:eastAsia="pt-BR"/>
         </w:rPr>
         <w:drawing>
-          <wp:inline distT="0" distB="0" distL="0" distR="0" wp14:anchorId="451C36C7" wp14:editId="60466870">
-            <wp:extent cx="5760085" cy="1310640"/>
-            <wp:effectExtent l="0" t="0" r="0" b="3810"/>
-            <wp:docPr id="7" name="Imagem 7"/>
+          <wp:inline distT="0" distB="0" distL="0" distR="0" wp14:anchorId="539E504E" wp14:editId="1ECACB01">
+            <wp:extent cx="5760085" cy="4323080"/>
+            <wp:effectExtent l="0" t="0" r="0" b="1270"/>
+            <wp:docPr id="18" name="Imagem 18"/>
             <wp:cNvGraphicFramePr>
               <a:graphicFrameLocks xmlns:a="http://schemas.openxmlformats.org/drawingml/2006/main" noChangeAspect="1"/>
             </wp:cNvGraphicFramePr>
@@ -9952,11 +9975,11 @@
               <a:graphicData uri="http://schemas.openxmlformats.org/drawingml/2006/picture">
                 <pic:pic xmlns:pic="http://schemas.openxmlformats.org/drawingml/2006/picture">
                   <pic:nvPicPr>
-                    <pic:cNvPr id="7" name="MER.jpg"/>
+                    <pic:cNvPr id="18" name="CASO-DE-USO.jpg"/>
                     <pic:cNvPicPr/>
                   </pic:nvPicPr>
                   <pic:blipFill>
-                    <a:blip r:embed="rId17">
+                    <a:blip r:embed="rId16" cstate="print">
                       <a:extLst>
                         <a:ext uri="{28A0092B-C50C-407E-A947-70E740481C1C}">
                           <a14:useLocalDpi xmlns:a14="http://schemas.microsoft.com/office/drawing/2010/main" val="0"/>
@@ -9970,7 +9993,7 @@
                   <pic:spPr>
                     <a:xfrm>
                       <a:off x="0" y="0"/>
-                      <a:ext cx="5760085" cy="1310640"/>
+                      <a:ext cx="5760085" cy="4323080"/>
                     </a:xfrm>
                     <a:prstGeom prst="rect">
                       <a:avLst/>
@@ -10012,13 +10035,74 @@
           <w:szCs w:val="24"/>
         </w:rPr>
       </w:pPr>
-      <w:r>
-        <w:rPr>
-          <w:rFonts w:ascii="Arial" w:hAnsi="Arial" w:cs="Arial"/>
-          <w:sz w:val="24"/>
-          <w:szCs w:val="24"/>
-        </w:rPr>
-        <w:t>DIAGRAMA DE SEQUÊNCIA</w:t>
+    </w:p>
+    <w:p>
+      <w:pPr>
+        <w:spacing w:after="0" w:line="360" w:lineRule="auto"/>
+        <w:rPr>
+          <w:rFonts w:ascii="Arial" w:hAnsi="Arial" w:cs="Arial"/>
+          <w:sz w:val="24"/>
+          <w:szCs w:val="24"/>
+        </w:rPr>
+      </w:pPr>
+    </w:p>
+    <w:p>
+      <w:pPr>
+        <w:spacing w:after="0" w:line="360" w:lineRule="auto"/>
+        <w:rPr>
+          <w:rFonts w:ascii="Arial" w:hAnsi="Arial" w:cs="Arial"/>
+          <w:sz w:val="24"/>
+          <w:szCs w:val="24"/>
+        </w:rPr>
+      </w:pPr>
+    </w:p>
+    <w:p>
+      <w:pPr>
+        <w:spacing w:after="0" w:line="360" w:lineRule="auto"/>
+        <w:rPr>
+          <w:rFonts w:ascii="Arial" w:hAnsi="Arial" w:cs="Arial"/>
+          <w:sz w:val="24"/>
+          <w:szCs w:val="24"/>
+        </w:rPr>
+      </w:pPr>
+    </w:p>
+    <w:p>
+      <w:pPr>
+        <w:spacing w:after="0" w:line="360" w:lineRule="auto"/>
+        <w:rPr>
+          <w:rFonts w:ascii="Arial" w:hAnsi="Arial" w:cs="Arial"/>
+          <w:sz w:val="24"/>
+          <w:szCs w:val="24"/>
+        </w:rPr>
+      </w:pPr>
+    </w:p>
+    <w:p>
+      <w:pPr>
+        <w:spacing w:after="0" w:line="360" w:lineRule="auto"/>
+        <w:rPr>
+          <w:rFonts w:ascii="Arial" w:hAnsi="Arial" w:cs="Arial"/>
+          <w:sz w:val="24"/>
+          <w:szCs w:val="24"/>
+        </w:rPr>
+      </w:pPr>
+    </w:p>
+    <w:p>
+      <w:pPr>
+        <w:spacing w:after="0" w:line="360" w:lineRule="auto"/>
+        <w:rPr>
+          <w:rFonts w:ascii="Arial" w:hAnsi="Arial" w:cs="Arial"/>
+          <w:sz w:val="24"/>
+          <w:szCs w:val="24"/>
+        </w:rPr>
+      </w:pPr>
+      <w:r>
+        <w:rPr>
+          <w:rFonts w:ascii="Arial" w:hAnsi="Arial" w:cs="Arial"/>
+          <w:sz w:val="24"/>
+          <w:szCs w:val="24"/>
+        </w:rPr>
+        <w:lastRenderedPageBreak/>
+        <w:t>ESBOÇO DO FLUXOGRAMA</w:t>
       </w:r>
     </w:p>
     <w:p>
@@ -10038,12 +10122,99 @@
           <w:szCs w:val="24"/>
           <w:lang w:eastAsia="pt-BR"/>
         </w:rPr>
-        <w:lastRenderedPageBreak/>
         <w:drawing>
-          <wp:inline distT="0" distB="0" distL="0" distR="0" wp14:anchorId="1BCC38CD" wp14:editId="0873A75E">
-            <wp:extent cx="5760085" cy="5098415"/>
-            <wp:effectExtent l="0" t="0" r="0" b="6985"/>
-            <wp:docPr id="3" name="Imagem 3"/>
+          <wp:inline distT="0" distB="0" distL="0" distR="0" wp14:anchorId="07827DCE" wp14:editId="34210AD3">
+            <wp:extent cx="4769510" cy="2844458"/>
+            <wp:effectExtent l="0" t="0" r="0" b="0"/>
+            <wp:docPr id="16" name="Imagem 16"/>
+            <wp:cNvGraphicFramePr>
+              <a:graphicFrameLocks xmlns:a="http://schemas.openxmlformats.org/drawingml/2006/main" noChangeAspect="1"/>
+            </wp:cNvGraphicFramePr>
+            <a:graphic xmlns:a="http://schemas.openxmlformats.org/drawingml/2006/main">
+              <a:graphicData uri="http://schemas.openxmlformats.org/drawingml/2006/picture">
+                <pic:pic xmlns:pic="http://schemas.openxmlformats.org/drawingml/2006/picture">
+                  <pic:nvPicPr>
+                    <pic:cNvPr id="9" name="Fluxograma.jpg"/>
+                    <pic:cNvPicPr/>
+                  </pic:nvPicPr>
+                  <pic:blipFill>
+                    <a:blip r:embed="rId17" cstate="print">
+                      <a:extLst>
+                        <a:ext uri="{28A0092B-C50C-407E-A947-70E740481C1C}">
+                          <a14:useLocalDpi xmlns:a14="http://schemas.microsoft.com/office/drawing/2010/main" val="0"/>
+                        </a:ext>
+                      </a:extLst>
+                    </a:blip>
+                    <a:stretch>
+                      <a:fillRect/>
+                    </a:stretch>
+                  </pic:blipFill>
+                  <pic:spPr>
+                    <a:xfrm>
+                      <a:off x="0" y="0"/>
+                      <a:ext cx="4769510" cy="2844458"/>
+                    </a:xfrm>
+                    <a:prstGeom prst="rect">
+                      <a:avLst/>
+                    </a:prstGeom>
+                  </pic:spPr>
+                </pic:pic>
+              </a:graphicData>
+            </a:graphic>
+          </wp:inline>
+        </w:drawing>
+      </w:r>
+    </w:p>
+    <w:p>
+      <w:pPr>
+        <w:spacing w:after="0" w:line="360" w:lineRule="auto"/>
+        <w:rPr>
+          <w:rFonts w:ascii="Arial" w:hAnsi="Arial" w:cs="Arial"/>
+          <w:sz w:val="24"/>
+          <w:szCs w:val="24"/>
+        </w:rPr>
+      </w:pPr>
+    </w:p>
+    <w:p>
+      <w:pPr>
+        <w:spacing w:after="0" w:line="360" w:lineRule="auto"/>
+        <w:rPr>
+          <w:rFonts w:ascii="Arial" w:hAnsi="Arial" w:cs="Arial"/>
+          <w:sz w:val="24"/>
+          <w:szCs w:val="24"/>
+        </w:rPr>
+      </w:pPr>
+      <w:r>
+        <w:rPr>
+          <w:rFonts w:ascii="Arial" w:hAnsi="Arial" w:cs="Arial"/>
+          <w:sz w:val="24"/>
+          <w:szCs w:val="24"/>
+        </w:rPr>
+        <w:t>ESBOÇO DO DIAGRAMA DE SEQUÊNCIA</w:t>
+      </w:r>
+    </w:p>
+    <w:p>
+      <w:pPr>
+        <w:spacing w:after="0" w:line="360" w:lineRule="auto"/>
+        <w:rPr>
+          <w:rFonts w:ascii="Arial" w:hAnsi="Arial" w:cs="Arial"/>
+          <w:sz w:val="24"/>
+          <w:szCs w:val="24"/>
+        </w:rPr>
+      </w:pPr>
+      <w:r>
+        <w:rPr>
+          <w:rFonts w:ascii="Arial" w:hAnsi="Arial" w:cs="Arial"/>
+          <w:noProof/>
+          <w:sz w:val="24"/>
+          <w:szCs w:val="24"/>
+          <w:lang w:eastAsia="pt-BR"/>
+        </w:rPr>
+        <w:drawing>
+          <wp:inline distT="0" distB="0" distL="0" distR="0" wp14:anchorId="7C97AFA6" wp14:editId="623A621F">
+            <wp:extent cx="5396760" cy="4776826"/>
+            <wp:effectExtent l="0" t="0" r="0" b="5080"/>
+            <wp:docPr id="15" name="Imagem 15"/>
             <wp:cNvGraphicFramePr>
               <a:graphicFrameLocks xmlns:a="http://schemas.openxmlformats.org/drawingml/2006/main" noChangeAspect="1"/>
             </wp:cNvGraphicFramePr>
@@ -10069,7 +10240,7 @@
                   <pic:spPr>
                     <a:xfrm>
                       <a:off x="0" y="0"/>
-                      <a:ext cx="5760085" cy="5098415"/>
+                      <a:ext cx="5401012" cy="4780590"/>
                     </a:xfrm>
                     <a:prstGeom prst="rect">
                       <a:avLst/>
@@ -10101,133 +10272,14 @@
           <w:szCs w:val="24"/>
         </w:rPr>
       </w:pPr>
-    </w:p>
-    <w:p>
-      <w:pPr>
-        <w:spacing w:after="0" w:line="360" w:lineRule="auto"/>
-        <w:rPr>
-          <w:rFonts w:ascii="Arial" w:hAnsi="Arial" w:cs="Arial"/>
-          <w:sz w:val="24"/>
-          <w:szCs w:val="24"/>
-        </w:rPr>
-      </w:pPr>
-    </w:p>
-    <w:p>
-      <w:pPr>
-        <w:spacing w:after="0" w:line="360" w:lineRule="auto"/>
-        <w:rPr>
-          <w:rFonts w:ascii="Arial" w:hAnsi="Arial" w:cs="Arial"/>
-          <w:sz w:val="24"/>
-          <w:szCs w:val="24"/>
-        </w:rPr>
-      </w:pPr>
-    </w:p>
-    <w:p>
-      <w:pPr>
-        <w:spacing w:after="0" w:line="360" w:lineRule="auto"/>
-        <w:rPr>
-          <w:rFonts w:ascii="Arial" w:hAnsi="Arial" w:cs="Arial"/>
-          <w:sz w:val="24"/>
-          <w:szCs w:val="24"/>
-        </w:rPr>
-      </w:pPr>
-    </w:p>
-    <w:p>
-      <w:pPr>
-        <w:spacing w:after="0" w:line="360" w:lineRule="auto"/>
-        <w:rPr>
-          <w:rFonts w:ascii="Arial" w:hAnsi="Arial" w:cs="Arial"/>
-          <w:sz w:val="24"/>
-          <w:szCs w:val="24"/>
-        </w:rPr>
-      </w:pPr>
-    </w:p>
-    <w:p>
-      <w:pPr>
-        <w:spacing w:after="0" w:line="360" w:lineRule="auto"/>
-        <w:rPr>
-          <w:rFonts w:ascii="Arial" w:hAnsi="Arial" w:cs="Arial"/>
-          <w:sz w:val="24"/>
-          <w:szCs w:val="24"/>
-        </w:rPr>
-      </w:pPr>
-    </w:p>
-    <w:p>
-      <w:pPr>
-        <w:spacing w:after="0" w:line="360" w:lineRule="auto"/>
-        <w:rPr>
-          <w:rFonts w:ascii="Arial" w:hAnsi="Arial" w:cs="Arial"/>
-          <w:sz w:val="24"/>
-          <w:szCs w:val="24"/>
-        </w:rPr>
-      </w:pPr>
-    </w:p>
-    <w:p>
-      <w:pPr>
-        <w:spacing w:after="0" w:line="360" w:lineRule="auto"/>
-        <w:rPr>
-          <w:rFonts w:ascii="Arial" w:hAnsi="Arial" w:cs="Arial"/>
-          <w:sz w:val="24"/>
-          <w:szCs w:val="24"/>
-        </w:rPr>
-      </w:pPr>
-    </w:p>
-    <w:p>
-      <w:pPr>
-        <w:spacing w:after="0" w:line="360" w:lineRule="auto"/>
-        <w:rPr>
-          <w:rFonts w:ascii="Arial" w:hAnsi="Arial" w:cs="Arial"/>
-          <w:sz w:val="24"/>
-          <w:szCs w:val="24"/>
-        </w:rPr>
-      </w:pPr>
-    </w:p>
-    <w:p>
-      <w:pPr>
-        <w:spacing w:after="0" w:line="360" w:lineRule="auto"/>
-        <w:rPr>
-          <w:rFonts w:ascii="Arial" w:hAnsi="Arial" w:cs="Arial"/>
-          <w:sz w:val="24"/>
-          <w:szCs w:val="24"/>
-        </w:rPr>
-      </w:pPr>
-    </w:p>
-    <w:p>
-      <w:pPr>
-        <w:spacing w:after="0" w:line="360" w:lineRule="auto"/>
-        <w:rPr>
-          <w:rFonts w:ascii="Arial" w:hAnsi="Arial" w:cs="Arial"/>
-          <w:sz w:val="24"/>
-          <w:szCs w:val="24"/>
-        </w:rPr>
-      </w:pPr>
-    </w:p>
-    <w:p>
-      <w:pPr>
-        <w:spacing w:after="0" w:line="360" w:lineRule="auto"/>
-        <w:rPr>
-          <w:rFonts w:ascii="Arial" w:hAnsi="Arial" w:cs="Arial"/>
-          <w:sz w:val="24"/>
-          <w:szCs w:val="24"/>
-        </w:rPr>
-      </w:pPr>
-    </w:p>
-    <w:p>
-      <w:pPr>
-        <w:spacing w:after="0" w:line="360" w:lineRule="auto"/>
-        <w:rPr>
-          <w:rFonts w:ascii="Arial" w:hAnsi="Arial" w:cs="Arial"/>
-          <w:sz w:val="24"/>
-          <w:szCs w:val="24"/>
-        </w:rPr>
-      </w:pPr>
-      <w:r>
-        <w:rPr>
-          <w:rFonts w:ascii="Arial" w:hAnsi="Arial" w:cs="Arial"/>
-          <w:sz w:val="24"/>
-          <w:szCs w:val="24"/>
-        </w:rPr>
-        <w:t>CASO DE USO</w:t>
+      <w:r>
+        <w:rPr>
+          <w:rFonts w:ascii="Arial" w:hAnsi="Arial" w:cs="Arial"/>
+          <w:sz w:val="24"/>
+          <w:szCs w:val="24"/>
+        </w:rPr>
+        <w:lastRenderedPageBreak/>
+        <w:t>UML</w:t>
       </w:r>
     </w:p>
     <w:p>
@@ -10247,12 +10299,11 @@
           <w:szCs w:val="24"/>
           <w:lang w:eastAsia="pt-BR"/>
         </w:rPr>
-        <w:lastRenderedPageBreak/>
         <w:drawing>
-          <wp:inline distT="0" distB="0" distL="0" distR="0" wp14:anchorId="1E879A4A" wp14:editId="17C21682">
-            <wp:extent cx="5760085" cy="4335780"/>
-            <wp:effectExtent l="0" t="0" r="0" b="7620"/>
-            <wp:docPr id="8" name="Imagem 8"/>
+          <wp:inline distT="0" distB="0" distL="0" distR="0" wp14:anchorId="455F761D" wp14:editId="55508834">
+            <wp:extent cx="5760085" cy="1601470"/>
+            <wp:effectExtent l="0" t="0" r="0" b="0"/>
+            <wp:docPr id="12" name="Imagem 12"/>
             <wp:cNvGraphicFramePr>
               <a:graphicFrameLocks xmlns:a="http://schemas.openxmlformats.org/drawingml/2006/main" noChangeAspect="1"/>
             </wp:cNvGraphicFramePr>
@@ -10260,7 +10311,7 @@
               <a:graphicData uri="http://schemas.openxmlformats.org/drawingml/2006/picture">
                 <pic:pic xmlns:pic="http://schemas.openxmlformats.org/drawingml/2006/picture">
                   <pic:nvPicPr>
-                    <pic:cNvPr id="8" name="Untitled Diagram.jpg"/>
+                    <pic:cNvPr id="12" name="UML-TCC.jpg"/>
                     <pic:cNvPicPr/>
                   </pic:nvPicPr>
                   <pic:blipFill>
@@ -10278,7 +10329,7 @@
                   <pic:spPr>
                     <a:xfrm>
                       <a:off x="0" y="0"/>
-                      <a:ext cx="5760085" cy="4335780"/>
+                      <a:ext cx="5760085" cy="1601470"/>
                     </a:xfrm>
                     <a:prstGeom prst="rect">
                       <a:avLst/>
@@ -10316,7 +10367,7 @@
           <w:sz w:val="24"/>
           <w:szCs w:val="24"/>
         </w:rPr>
-        <w:t>Fluxograma</w:t>
+        <w:t>DIAGRAMA DE GANTT</w:t>
       </w:r>
     </w:p>
     <w:p>
@@ -10337,10 +10388,10 @@
           <w:lang w:eastAsia="pt-BR"/>
         </w:rPr>
         <w:drawing>
-          <wp:inline distT="0" distB="0" distL="0" distR="0" wp14:anchorId="5E535A85" wp14:editId="1CF6D136">
-            <wp:extent cx="4857750" cy="3520542"/>
-            <wp:effectExtent l="0" t="0" r="0" b="3810"/>
-            <wp:docPr id="9" name="Imagem 9"/>
+          <wp:inline distT="0" distB="0" distL="0" distR="0" wp14:anchorId="2A7BC1DB" wp14:editId="351D274F">
+            <wp:extent cx="5760085" cy="902335"/>
+            <wp:effectExtent l="0" t="0" r="0" b="0"/>
+            <wp:docPr id="20" name="Imagem 20"/>
             <wp:cNvGraphicFramePr>
               <a:graphicFrameLocks xmlns:a="http://schemas.openxmlformats.org/drawingml/2006/main" noChangeAspect="1"/>
             </wp:cNvGraphicFramePr>
@@ -10348,11 +10399,11 @@
               <a:graphicData uri="http://schemas.openxmlformats.org/drawingml/2006/picture">
                 <pic:pic xmlns:pic="http://schemas.openxmlformats.org/drawingml/2006/picture">
                   <pic:nvPicPr>
-                    <pic:cNvPr id="9" name="Fluxograma.jpg"/>
+                    <pic:cNvPr id="20" name="DiagramaGanttTCC.jpg"/>
                     <pic:cNvPicPr/>
                   </pic:nvPicPr>
                   <pic:blipFill>
-                    <a:blip r:embed="rId20" cstate="print">
+                    <a:blip r:embed="rId20">
                       <a:extLst>
                         <a:ext uri="{28A0092B-C50C-407E-A947-70E740481C1C}">
                           <a14:useLocalDpi xmlns:a14="http://schemas.microsoft.com/office/drawing/2010/main" val="0"/>
@@ -10366,7 +10417,7 @@
                   <pic:spPr>
                     <a:xfrm>
                       <a:off x="0" y="0"/>
-                      <a:ext cx="4891659" cy="3545117"/>
+                      <a:ext cx="5760085" cy="902335"/>
                     </a:xfrm>
                     <a:prstGeom prst="rect">
                       <a:avLst/>
@@ -10398,106 +10449,6 @@
           <w:szCs w:val="24"/>
         </w:rPr>
       </w:pPr>
-    </w:p>
-    <w:p>
-      <w:pPr>
-        <w:spacing w:after="0" w:line="360" w:lineRule="auto"/>
-        <w:rPr>
-          <w:rFonts w:ascii="Arial" w:hAnsi="Arial" w:cs="Arial"/>
-          <w:sz w:val="24"/>
-          <w:szCs w:val="24"/>
-        </w:rPr>
-      </w:pPr>
-    </w:p>
-    <w:p>
-      <w:pPr>
-        <w:spacing w:after="0" w:line="360" w:lineRule="auto"/>
-        <w:rPr>
-          <w:rFonts w:ascii="Arial" w:hAnsi="Arial" w:cs="Arial"/>
-          <w:sz w:val="24"/>
-          <w:szCs w:val="24"/>
-        </w:rPr>
-      </w:pPr>
-    </w:p>
-    <w:p>
-      <w:pPr>
-        <w:spacing w:after="0" w:line="360" w:lineRule="auto"/>
-        <w:rPr>
-          <w:rFonts w:ascii="Arial" w:hAnsi="Arial" w:cs="Arial"/>
-          <w:sz w:val="24"/>
-          <w:szCs w:val="24"/>
-        </w:rPr>
-      </w:pPr>
-    </w:p>
-    <w:p>
-      <w:pPr>
-        <w:spacing w:after="0" w:line="360" w:lineRule="auto"/>
-        <w:rPr>
-          <w:rFonts w:ascii="Arial" w:hAnsi="Arial" w:cs="Arial"/>
-          <w:sz w:val="24"/>
-          <w:szCs w:val="24"/>
-        </w:rPr>
-      </w:pPr>
-    </w:p>
-    <w:p>
-      <w:pPr>
-        <w:spacing w:after="0" w:line="360" w:lineRule="auto"/>
-        <w:rPr>
-          <w:rFonts w:ascii="Arial" w:hAnsi="Arial" w:cs="Arial"/>
-          <w:sz w:val="24"/>
-          <w:szCs w:val="24"/>
-        </w:rPr>
-      </w:pPr>
-    </w:p>
-    <w:p>
-      <w:pPr>
-        <w:spacing w:after="0" w:line="360" w:lineRule="auto"/>
-        <w:rPr>
-          <w:rFonts w:ascii="Arial" w:hAnsi="Arial" w:cs="Arial"/>
-          <w:sz w:val="24"/>
-          <w:szCs w:val="24"/>
-        </w:rPr>
-      </w:pPr>
-    </w:p>
-    <w:p>
-      <w:pPr>
-        <w:spacing w:after="0" w:line="360" w:lineRule="auto"/>
-        <w:rPr>
-          <w:rFonts w:ascii="Arial" w:hAnsi="Arial" w:cs="Arial"/>
-          <w:sz w:val="24"/>
-          <w:szCs w:val="24"/>
-        </w:rPr>
-      </w:pPr>
-    </w:p>
-    <w:p>
-      <w:pPr>
-        <w:spacing w:after="0" w:line="360" w:lineRule="auto"/>
-        <w:rPr>
-          <w:rFonts w:ascii="Arial" w:hAnsi="Arial" w:cs="Arial"/>
-          <w:sz w:val="24"/>
-          <w:szCs w:val="24"/>
-        </w:rPr>
-      </w:pPr>
-    </w:p>
-    <w:p>
-      <w:pPr>
-        <w:spacing w:after="0" w:line="360" w:lineRule="auto"/>
-        <w:rPr>
-          <w:rFonts w:ascii="Arial" w:hAnsi="Arial" w:cs="Arial"/>
-          <w:sz w:val="24"/>
-          <w:szCs w:val="24"/>
-        </w:rPr>
-      </w:pPr>
-    </w:p>
-    <w:p>
-      <w:pPr>
-        <w:spacing w:after="0" w:line="360" w:lineRule="auto"/>
-        <w:rPr>
-          <w:rFonts w:ascii="Arial" w:hAnsi="Arial" w:cs="Arial"/>
-          <w:sz w:val="24"/>
-          <w:szCs w:val="24"/>
-        </w:rPr>
-      </w:pPr>
       <w:r>
         <w:rPr>
           <w:rFonts w:ascii="Arial" w:hAnsi="Arial" w:cs="Arial"/>
@@ -10781,14 +10732,112 @@
           <w:szCs w:val="24"/>
         </w:rPr>
       </w:pPr>
-      <w:r>
-        <w:rPr>
-          <w:rFonts w:ascii="Arial" w:hAnsi="Arial" w:cs="Arial"/>
-          <w:b/>
-          <w:sz w:val="24"/>
-          <w:szCs w:val="24"/>
-        </w:rPr>
-        <w:lastRenderedPageBreak/>
+    </w:p>
+    <w:p>
+      <w:pPr>
+        <w:spacing w:after="0" w:line="360" w:lineRule="auto"/>
+        <w:rPr>
+          <w:rFonts w:ascii="Arial" w:hAnsi="Arial" w:cs="Arial"/>
+          <w:b/>
+          <w:sz w:val="24"/>
+          <w:szCs w:val="24"/>
+        </w:rPr>
+      </w:pPr>
+    </w:p>
+    <w:p>
+      <w:pPr>
+        <w:spacing w:after="0" w:line="360" w:lineRule="auto"/>
+        <w:rPr>
+          <w:rFonts w:ascii="Arial" w:hAnsi="Arial" w:cs="Arial"/>
+          <w:b/>
+          <w:sz w:val="24"/>
+          <w:szCs w:val="24"/>
+        </w:rPr>
+      </w:pPr>
+    </w:p>
+    <w:p>
+      <w:pPr>
+        <w:spacing w:after="0" w:line="360" w:lineRule="auto"/>
+        <w:rPr>
+          <w:rFonts w:ascii="Arial" w:hAnsi="Arial" w:cs="Arial"/>
+          <w:b/>
+          <w:sz w:val="24"/>
+          <w:szCs w:val="24"/>
+        </w:rPr>
+      </w:pPr>
+    </w:p>
+    <w:p>
+      <w:pPr>
+        <w:spacing w:after="0" w:line="360" w:lineRule="auto"/>
+        <w:rPr>
+          <w:rFonts w:ascii="Arial" w:hAnsi="Arial" w:cs="Arial"/>
+          <w:b/>
+          <w:sz w:val="24"/>
+          <w:szCs w:val="24"/>
+        </w:rPr>
+      </w:pPr>
+    </w:p>
+    <w:p>
+      <w:pPr>
+        <w:spacing w:after="0" w:line="360" w:lineRule="auto"/>
+        <w:rPr>
+          <w:rFonts w:ascii="Arial" w:hAnsi="Arial" w:cs="Arial"/>
+          <w:b/>
+          <w:sz w:val="24"/>
+          <w:szCs w:val="24"/>
+        </w:rPr>
+      </w:pPr>
+    </w:p>
+    <w:p>
+      <w:pPr>
+        <w:spacing w:after="0" w:line="360" w:lineRule="auto"/>
+        <w:rPr>
+          <w:rFonts w:ascii="Arial" w:hAnsi="Arial" w:cs="Arial"/>
+          <w:b/>
+          <w:sz w:val="24"/>
+          <w:szCs w:val="24"/>
+        </w:rPr>
+      </w:pPr>
+    </w:p>
+    <w:p>
+      <w:pPr>
+        <w:spacing w:after="0" w:line="360" w:lineRule="auto"/>
+        <w:rPr>
+          <w:rFonts w:ascii="Arial" w:hAnsi="Arial" w:cs="Arial"/>
+          <w:b/>
+          <w:sz w:val="24"/>
+          <w:szCs w:val="24"/>
+        </w:rPr>
+      </w:pPr>
+    </w:p>
+    <w:p>
+      <w:pPr>
+        <w:spacing w:after="0" w:line="360" w:lineRule="auto"/>
+        <w:rPr>
+          <w:rFonts w:ascii="Arial" w:hAnsi="Arial" w:cs="Arial"/>
+          <w:b/>
+          <w:sz w:val="24"/>
+          <w:szCs w:val="24"/>
+        </w:rPr>
+      </w:pPr>
+    </w:p>
+    <w:p>
+      <w:pPr>
+        <w:spacing w:after="0" w:line="360" w:lineRule="auto"/>
+        <w:rPr>
+          <w:rFonts w:ascii="Arial" w:hAnsi="Arial" w:cs="Arial"/>
+          <w:b/>
+          <w:sz w:val="24"/>
+          <w:szCs w:val="24"/>
+        </w:rPr>
+      </w:pPr>
+      <w:r>
+        <w:rPr>
+          <w:rFonts w:ascii="Arial" w:hAnsi="Arial" w:cs="Arial"/>
+          <w:b/>
+          <w:sz w:val="24"/>
+          <w:szCs w:val="24"/>
+        </w:rPr>
         <w:t>Bibliografia</w:t>
       </w:r>
     </w:p>
@@ -11163,6 +11212,7 @@
           <w:sz w:val="24"/>
           <w:szCs w:val="24"/>
         </w:rPr>
+        <w:lastRenderedPageBreak/>
         <w:t xml:space="preserve">Diagrama de </w:t>
       </w:r>
       <w:proofErr w:type="spellStart"/>
@@ -11352,7 +11402,7 @@
 </file>
 
 <file path=word/endnotes.xml><?xml version="1.0" encoding="utf-8"?>
-<w:endnotes xmlns:wpc="http://schemas.microsoft.com/office/word/2010/wordprocessingCanvas" xmlns:cx="http://schemas.microsoft.com/office/drawing/2014/chartex" xmlns:cx1="http://schemas.microsoft.com/office/drawing/2015/9/8/chartex" xmlns:cx2="http://schemas.microsoft.com/office/drawing/2015/10/21/chartex" xmlns:cx3="http://schemas.microsoft.com/office/drawing/2016/5/9/chartex" xmlns:cx4="http://schemas.microsoft.com/office/drawing/2016/5/10/chartex" xmlns:cx5="http://schemas.microsoft.com/office/drawing/2016/5/11/chartex" xmlns:cx6="http://schemas.microsoft.com/office/drawing/2016/5/12/chartex" xmlns:cx7="http://schemas.microsoft.com/office/drawing/2016/5/13/chartex" xmlns:cx8="http://schemas.microsoft.com/office/drawing/2016/5/14/chartex" xmlns:mc="http://schemas.openxmlformats.org/markup-compatibility/2006" xmlns:aink="http://schemas.microsoft.com/office/drawing/2016/ink" xmlns:am3d="http://schemas.microsoft.com/office/drawing/2017/model3d" xmlns:o="urn:schemas-microsoft-com:office:office" xmlns:r="http://schemas.openxmlformats.org/officeDocument/2006/relationships" xmlns:m="http://schemas.openxmlformats.org/officeDocument/2006/math" xmlns:v="urn:schemas-microsoft-com:vml" xmlns:wp14="http://schemas.microsoft.com/office/word/2010/wordprocessingDrawing" xmlns:wp="http://schemas.openxmlformats.org/drawingml/2006/wordprocessingDrawing" xmlns:w10="urn:schemas-microsoft-com:office:word" xmlns:w="http://schemas.openxmlformats.org/wordprocessingml/2006/main" xmlns:w14="http://schemas.microsoft.com/office/word/2010/wordml" xmlns:w15="http://schemas.microsoft.com/office/word/2012/wordml" xmlns:w16cid="http://schemas.microsoft.com/office/word/2016/wordml/cid" xmlns:w16se="http://schemas.microsoft.com/office/word/2015/wordml/symex" xmlns:wpg="http://schemas.microsoft.com/office/word/2010/wordprocessingGroup" xmlns:wpi="http://schemas.microsoft.com/office/word/2010/wordprocessingInk" xmlns:wne="http://schemas.microsoft.com/office/word/2006/wordml" xmlns:wps="http://schemas.microsoft.com/office/word/2010/wordprocessingShape" mc:Ignorable="w14 w15 w16se w16cid wp14">
+<w:endnotes xmlns:wpc="http://schemas.microsoft.com/office/word/2010/wordprocessingCanvas" xmlns:cx="http://schemas.microsoft.com/office/drawing/2014/chartex" xmlns:mc="http://schemas.openxmlformats.org/markup-compatibility/2006" xmlns:o="urn:schemas-microsoft-com:office:office" xmlns:r="http://schemas.openxmlformats.org/officeDocument/2006/relationships" xmlns:m="http://schemas.openxmlformats.org/officeDocument/2006/math" xmlns:v="urn:schemas-microsoft-com:vml" xmlns:wp14="http://schemas.microsoft.com/office/word/2010/wordprocessingDrawing" xmlns:wp="http://schemas.openxmlformats.org/drawingml/2006/wordprocessingDrawing" xmlns:w10="urn:schemas-microsoft-com:office:word" xmlns:w="http://schemas.openxmlformats.org/wordprocessingml/2006/main" xmlns:w14="http://schemas.microsoft.com/office/word/2010/wordml" xmlns:w15="http://schemas.microsoft.com/office/word/2012/wordml" xmlns:w16se="http://schemas.microsoft.com/office/word/2015/wordml/symex" xmlns:wpg="http://schemas.microsoft.com/office/word/2010/wordprocessingGroup" xmlns:wpi="http://schemas.microsoft.com/office/word/2010/wordprocessingInk" xmlns:wne="http://schemas.microsoft.com/office/word/2006/wordml" xmlns:wps="http://schemas.microsoft.com/office/word/2010/wordprocessingShape" mc:Ignorable="w14 w15 w16se wp14">
   <w:endnote w:type="separator" w:id="-1">
     <w:p>
       <w:pPr>
@@ -11377,7 +11427,7 @@
 </file>
 
 <file path=word/footnotes.xml><?xml version="1.0" encoding="utf-8"?>
-<w:footnotes xmlns:wpc="http://schemas.microsoft.com/office/word/2010/wordprocessingCanvas" xmlns:cx="http://schemas.microsoft.com/office/drawing/2014/chartex" xmlns:cx1="http://schemas.microsoft.com/office/drawing/2015/9/8/chartex" xmlns:cx2="http://schemas.microsoft.com/office/drawing/2015/10/21/chartex" xmlns:cx3="http://schemas.microsoft.com/office/drawing/2016/5/9/chartex" xmlns:cx4="http://schemas.microsoft.com/office/drawing/2016/5/10/chartex" xmlns:cx5="http://schemas.microsoft.com/office/drawing/2016/5/11/chartex" xmlns:cx6="http://schemas.microsoft.com/office/drawing/2016/5/12/chartex" xmlns:cx7="http://schemas.microsoft.com/office/drawing/2016/5/13/chartex" xmlns:cx8="http://schemas.microsoft.com/office/drawing/2016/5/14/chartex" xmlns:mc="http://schemas.openxmlformats.org/markup-compatibility/2006" xmlns:aink="http://schemas.microsoft.com/office/drawing/2016/ink" xmlns:am3d="http://schemas.microsoft.com/office/drawing/2017/model3d" xmlns:o="urn:schemas-microsoft-com:office:office" xmlns:r="http://schemas.openxmlformats.org/officeDocument/2006/relationships" xmlns:m="http://schemas.openxmlformats.org/officeDocument/2006/math" xmlns:v="urn:schemas-microsoft-com:vml" xmlns:wp14="http://schemas.microsoft.com/office/word/2010/wordprocessingDrawing" xmlns:wp="http://schemas.openxmlformats.org/drawingml/2006/wordprocessingDrawing" xmlns:w10="urn:schemas-microsoft-com:office:word" xmlns:w="http://schemas.openxmlformats.org/wordprocessingml/2006/main" xmlns:w14="http://schemas.microsoft.com/office/word/2010/wordml" xmlns:w15="http://schemas.microsoft.com/office/word/2012/wordml" xmlns:w16cid="http://schemas.microsoft.com/office/word/2016/wordml/cid" xmlns:w16se="http://schemas.microsoft.com/office/word/2015/wordml/symex" xmlns:wpg="http://schemas.microsoft.com/office/word/2010/wordprocessingGroup" xmlns:wpi="http://schemas.microsoft.com/office/word/2010/wordprocessingInk" xmlns:wne="http://schemas.microsoft.com/office/word/2006/wordml" xmlns:wps="http://schemas.microsoft.com/office/word/2010/wordprocessingShape" mc:Ignorable="w14 w15 w16se w16cid wp14">
+<w:footnotes xmlns:wpc="http://schemas.microsoft.com/office/word/2010/wordprocessingCanvas" xmlns:cx="http://schemas.microsoft.com/office/drawing/2014/chartex" xmlns:mc="http://schemas.openxmlformats.org/markup-compatibility/2006" xmlns:o="urn:schemas-microsoft-com:office:office" xmlns:r="http://schemas.openxmlformats.org/officeDocument/2006/relationships" xmlns:m="http://schemas.openxmlformats.org/officeDocument/2006/math" xmlns:v="urn:schemas-microsoft-com:vml" xmlns:wp14="http://schemas.microsoft.com/office/word/2010/wordprocessingDrawing" xmlns:wp="http://schemas.openxmlformats.org/drawingml/2006/wordprocessingDrawing" xmlns:w10="urn:schemas-microsoft-com:office:word" xmlns:w="http://schemas.openxmlformats.org/wordprocessingml/2006/main" xmlns:w14="http://schemas.microsoft.com/office/word/2010/wordml" xmlns:w15="http://schemas.microsoft.com/office/word/2012/wordml" xmlns:w16se="http://schemas.microsoft.com/office/word/2015/wordml/symex" xmlns:wpg="http://schemas.microsoft.com/office/word/2010/wordprocessingGroup" xmlns:wpi="http://schemas.microsoft.com/office/word/2010/wordprocessingInk" xmlns:wne="http://schemas.microsoft.com/office/word/2006/wordml" xmlns:wps="http://schemas.microsoft.com/office/word/2010/wordprocessingShape" mc:Ignorable="w14 w15 w16se wp14">
   <w:footnote w:type="separator" w:id="-1">
     <w:p>
       <w:pPr>
@@ -11402,7 +11452,7 @@
 </file>
 
 <file path=word/numbering.xml><?xml version="1.0" encoding="utf-8"?>
-<w:numbering xmlns:wpc="http://schemas.microsoft.com/office/word/2010/wordprocessingCanvas" xmlns:cx="http://schemas.microsoft.com/office/drawing/2014/chartex" xmlns:cx1="http://schemas.microsoft.com/office/drawing/2015/9/8/chartex" xmlns:cx2="http://schemas.microsoft.com/office/drawing/2015/10/21/chartex" xmlns:cx3="http://schemas.microsoft.com/office/drawing/2016/5/9/chartex" xmlns:cx4="http://schemas.microsoft.com/office/drawing/2016/5/10/chartex" xmlns:cx5="http://schemas.microsoft.com/office/drawing/2016/5/11/chartex" xmlns:cx6="http://schemas.microsoft.com/office/drawing/2016/5/12/chartex" xmlns:cx7="http://schemas.microsoft.com/office/drawing/2016/5/13/chartex" xmlns:cx8="http://schemas.microsoft.com/office/drawing/2016/5/14/chartex" xmlns:mc="http://schemas.openxmlformats.org/markup-compatibility/2006" xmlns:aink="http://schemas.microsoft.com/office/drawing/2016/ink" xmlns:am3d="http://schemas.microsoft.com/office/drawing/2017/model3d" xmlns:o="urn:schemas-microsoft-com:office:office" xmlns:r="http://schemas.openxmlformats.org/officeDocument/2006/relationships" xmlns:m="http://schemas.openxmlformats.org/officeDocument/2006/math" xmlns:v="urn:schemas-microsoft-com:vml" xmlns:wp14="http://schemas.microsoft.com/office/word/2010/wordprocessingDrawing" xmlns:wp="http://schemas.openxmlformats.org/drawingml/2006/wordprocessingDrawing" xmlns:w10="urn:schemas-microsoft-com:office:word" xmlns:w="http://schemas.openxmlformats.org/wordprocessingml/2006/main" xmlns:w14="http://schemas.microsoft.com/office/word/2010/wordml" xmlns:w15="http://schemas.microsoft.com/office/word/2012/wordml" xmlns:w16cid="http://schemas.microsoft.com/office/word/2016/wordml/cid" xmlns:w16se="http://schemas.microsoft.com/office/word/2015/wordml/symex" xmlns:wpg="http://schemas.microsoft.com/office/word/2010/wordprocessingGroup" xmlns:wpi="http://schemas.microsoft.com/office/word/2010/wordprocessingInk" xmlns:wne="http://schemas.microsoft.com/office/word/2006/wordml" xmlns:wps="http://schemas.microsoft.com/office/word/2010/wordprocessingShape" mc:Ignorable="w14 w15 w16se w16cid wp14">
+<w:numbering xmlns:wpc="http://schemas.microsoft.com/office/word/2010/wordprocessingCanvas" xmlns:cx="http://schemas.microsoft.com/office/drawing/2014/chartex" xmlns:mc="http://schemas.openxmlformats.org/markup-compatibility/2006" xmlns:o="urn:schemas-microsoft-com:office:office" xmlns:r="http://schemas.openxmlformats.org/officeDocument/2006/relationships" xmlns:m="http://schemas.openxmlformats.org/officeDocument/2006/math" xmlns:v="urn:schemas-microsoft-com:vml" xmlns:wp14="http://schemas.microsoft.com/office/word/2010/wordprocessingDrawing" xmlns:wp="http://schemas.openxmlformats.org/drawingml/2006/wordprocessingDrawing" xmlns:w10="urn:schemas-microsoft-com:office:word" xmlns:w="http://schemas.openxmlformats.org/wordprocessingml/2006/main" xmlns:w14="http://schemas.microsoft.com/office/word/2010/wordml" xmlns:w15="http://schemas.microsoft.com/office/word/2012/wordml" xmlns:w16se="http://schemas.microsoft.com/office/word/2015/wordml/symex" xmlns:wpg="http://schemas.microsoft.com/office/word/2010/wordprocessingGroup" xmlns:wpi="http://schemas.microsoft.com/office/word/2010/wordprocessingInk" xmlns:wne="http://schemas.microsoft.com/office/word/2006/wordml" xmlns:wps="http://schemas.microsoft.com/office/word/2010/wordprocessingShape" mc:Ignorable="w14 w15 w16se wp14">
   <w:abstractNum w:abstractNumId="0" w15:restartNumberingAfterBreak="0">
     <w:nsid w:val="02313346"/>
     <w:multiLevelType w:val="multilevel"/>
@@ -17148,7 +17198,7 @@
 </file>
 
 <file path=word/styles.xml><?xml version="1.0" encoding="utf-8"?>
-<w:styles xmlns:mc="http://schemas.openxmlformats.org/markup-compatibility/2006" xmlns:r="http://schemas.openxmlformats.org/officeDocument/2006/relationships" xmlns:w="http://schemas.openxmlformats.org/wordprocessingml/2006/main" xmlns:w14="http://schemas.microsoft.com/office/word/2010/wordml" xmlns:w15="http://schemas.microsoft.com/office/word/2012/wordml" xmlns:w16cid="http://schemas.microsoft.com/office/word/2016/wordml/cid" xmlns:w16se="http://schemas.microsoft.com/office/word/2015/wordml/symex" mc:Ignorable="w14 w15 w16se w16cid">
+<w:styles xmlns:mc="http://schemas.openxmlformats.org/markup-compatibility/2006" xmlns:r="http://schemas.openxmlformats.org/officeDocument/2006/relationships" xmlns:w="http://schemas.openxmlformats.org/wordprocessingml/2006/main" xmlns:w14="http://schemas.microsoft.com/office/word/2010/wordml" xmlns:w15="http://schemas.microsoft.com/office/word/2012/wordml" xmlns:w16se="http://schemas.microsoft.com/office/word/2015/wordml/symex" mc:Ignorable="w14 w15 w16se">
   <w:docDefaults>
     <w:rPrDefault>
       <w:rPr>
@@ -17164,7 +17214,7 @@
       </w:pPr>
     </w:pPrDefault>
   </w:docDefaults>
-  <w:latentStyles w:defLockedState="0" w:defUIPriority="99" w:defSemiHidden="0" w:defUnhideWhenUsed="0" w:defQFormat="0" w:count="375">
+  <w:latentStyles w:defLockedState="0" w:defUIPriority="99" w:defSemiHidden="0" w:defUnhideWhenUsed="0" w:defQFormat="0" w:count="371">
     <w:lsdException w:name="Normal" w:uiPriority="0" w:qFormat="1"/>
     <w:lsdException w:name="heading 1" w:uiPriority="9" w:qFormat="1"/>
     <w:lsdException w:name="heading 2" w:semiHidden="1" w:uiPriority="9" w:unhideWhenUsed="1" w:qFormat="1"/>
@@ -17270,6 +17320,7 @@
     <w:lsdException w:name="HTML Sample" w:semiHidden="1" w:unhideWhenUsed="1"/>
     <w:lsdException w:name="HTML Typewriter" w:semiHidden="1" w:unhideWhenUsed="1"/>
     <w:lsdException w:name="HTML Variable" w:semiHidden="1" w:unhideWhenUsed="1"/>
+    <w:lsdException w:name="Normal Table" w:semiHidden="1" w:unhideWhenUsed="1"/>
     <w:lsdException w:name="annotation subject" w:semiHidden="1" w:unhideWhenUsed="1"/>
     <w:lsdException w:name="No List" w:semiHidden="1" w:unhideWhenUsed="1"/>
     <w:lsdException w:name="Outline List 1" w:semiHidden="1" w:unhideWhenUsed="1"/>
@@ -17313,8 +17364,10 @@
     <w:lsdException w:name="Table Elegant" w:semiHidden="1" w:unhideWhenUsed="1"/>
     <w:lsdException w:name="Table Professional" w:semiHidden="1" w:unhideWhenUsed="1"/>
     <w:lsdException w:name="Table Subtle 1" w:semiHidden="1" w:unhideWhenUsed="1"/>
+    <w:lsdException w:name="Table Subtle 2" w:semiHidden="1" w:unhideWhenUsed="1"/>
     <w:lsdException w:name="Table Web 1" w:semiHidden="1" w:unhideWhenUsed="1"/>
     <w:lsdException w:name="Table Web 2" w:semiHidden="1" w:unhideWhenUsed="1"/>
+    <w:lsdException w:name="Table Web 3" w:semiHidden="1" w:unhideWhenUsed="1"/>
     <w:lsdException w:name="Balloon Text" w:semiHidden="1" w:unhideWhenUsed="1"/>
     <w:lsdException w:name="Table Grid" w:uiPriority="39"/>
     <w:lsdException w:name="Table Theme" w:semiHidden="1" w:unhideWhenUsed="1"/>
@@ -17533,10 +17586,6 @@
     <w:lsdException w:name="List Table 5 Dark Accent 6" w:uiPriority="50"/>
     <w:lsdException w:name="List Table 6 Colorful Accent 6" w:uiPriority="51"/>
     <w:lsdException w:name="List Table 7 Colorful Accent 6" w:uiPriority="52"/>
-    <w:lsdException w:name="Mention" w:semiHidden="1" w:unhideWhenUsed="1"/>
-    <w:lsdException w:name="Smart Hyperlink" w:semiHidden="1" w:unhideWhenUsed="1"/>
-    <w:lsdException w:name="Hashtag" w:semiHidden="1" w:unhideWhenUsed="1"/>
-    <w:lsdException w:name="Unresolved Mention" w:semiHidden="1" w:unhideWhenUsed="1"/>
   </w:latentStyles>
   <w:style w:type="paragraph" w:default="1" w:styleId="Normal">
     <w:name w:val="Normal"/>
@@ -18216,7 +18265,7 @@
 </file>
 
 <file path=customXml/itemProps1.xml><?xml version="1.0" encoding="utf-8"?>
-<ds:datastoreItem xmlns:ds="http://schemas.openxmlformats.org/officeDocument/2006/customXml" ds:itemID="{815C8068-6D60-44FF-8428-946D1B849830}">
+<ds:datastoreItem xmlns:ds="http://schemas.openxmlformats.org/officeDocument/2006/customXml" ds:itemID="{A92C2E46-023A-45E8-8BB2-8F61775231CB}">
   <ds:schemaRefs>
     <ds:schemaRef ds:uri="http://schemas.openxmlformats.org/officeDocument/2006/bibliography"/>
   </ds:schemaRefs>

</xml_diff>

<commit_message>
feat:adiciona o dicionario de dados em excel
</commit_message>
<xml_diff>
--- a/Documentacao/Documentacao.docx
+++ b/Documentacao/Documentacao.docx
@@ -1,6 +1,6 @@
 
 <file path=word/document.xml><?xml version="1.0" encoding="utf-8"?>
-<w:document xmlns:wpc="http://schemas.microsoft.com/office/word/2010/wordprocessingCanvas" xmlns:cx="http://schemas.microsoft.com/office/drawing/2014/chartex" xmlns:cx1="http://schemas.microsoft.com/office/drawing/2015/9/8/chartex" xmlns:cx2="http://schemas.microsoft.com/office/drawing/2015/10/21/chartex" xmlns:cx3="http://schemas.microsoft.com/office/drawing/2016/5/9/chartex" xmlns:cx4="http://schemas.microsoft.com/office/drawing/2016/5/10/chartex" xmlns:cx5="http://schemas.microsoft.com/office/drawing/2016/5/11/chartex" xmlns:cx6="http://schemas.microsoft.com/office/drawing/2016/5/12/chartex" xmlns:cx7="http://schemas.microsoft.com/office/drawing/2016/5/13/chartex" xmlns:cx8="http://schemas.microsoft.com/office/drawing/2016/5/14/chartex" xmlns:mc="http://schemas.openxmlformats.org/markup-compatibility/2006" xmlns:aink="http://schemas.microsoft.com/office/drawing/2016/ink" xmlns:am3d="http://schemas.microsoft.com/office/drawing/2017/model3d" xmlns:o="urn:schemas-microsoft-com:office:office" xmlns:r="http://schemas.openxmlformats.org/officeDocument/2006/relationships" xmlns:m="http://schemas.openxmlformats.org/officeDocument/2006/math" xmlns:v="urn:schemas-microsoft-com:vml" xmlns:wp14="http://schemas.microsoft.com/office/word/2010/wordprocessingDrawing" xmlns:wp="http://schemas.openxmlformats.org/drawingml/2006/wordprocessingDrawing" xmlns:w10="urn:schemas-microsoft-com:office:word" xmlns:w="http://schemas.openxmlformats.org/wordprocessingml/2006/main" xmlns:w14="http://schemas.microsoft.com/office/word/2010/wordml" xmlns:w15="http://schemas.microsoft.com/office/word/2012/wordml" xmlns:w16cid="http://schemas.microsoft.com/office/word/2016/wordml/cid" xmlns:w16se="http://schemas.microsoft.com/office/word/2015/wordml/symex" xmlns:wpg="http://schemas.microsoft.com/office/word/2010/wordprocessingGroup" xmlns:wpi="http://schemas.microsoft.com/office/word/2010/wordprocessingInk" xmlns:wne="http://schemas.microsoft.com/office/word/2006/wordml" xmlns:wps="http://schemas.microsoft.com/office/word/2010/wordprocessingShape" mc:Ignorable="w14 w15 w16se w16cid wp14">
+<w:document xmlns:wpc="http://schemas.microsoft.com/office/word/2010/wordprocessingCanvas" xmlns:cx="http://schemas.microsoft.com/office/drawing/2014/chartex" xmlns:cx1="http://schemas.microsoft.com/office/drawing/2015/9/8/chartex" xmlns:cx2="http://schemas.microsoft.com/office/drawing/2015/10/21/chartex" xmlns:cx3="http://schemas.microsoft.com/office/drawing/2016/5/9/chartex" xmlns:cx4="http://schemas.microsoft.com/office/drawing/2016/5/10/chartex" xmlns:cx5="http://schemas.microsoft.com/office/drawing/2016/5/11/chartex" xmlns:cx6="http://schemas.microsoft.com/office/drawing/2016/5/12/chartex" xmlns:cx7="http://schemas.microsoft.com/office/drawing/2016/5/13/chartex" xmlns:cx8="http://schemas.microsoft.com/office/drawing/2016/5/14/chartex" xmlns:mc="http://schemas.openxmlformats.org/markup-compatibility/2006" xmlns:aink="http://schemas.microsoft.com/office/drawing/2016/ink" xmlns:am3d="http://schemas.microsoft.com/office/drawing/2017/model3d" xmlns:o="urn:schemas-microsoft-com:office:office" xmlns:oel="http://schemas.microsoft.com/office/2019/extlst" xmlns:r="http://schemas.openxmlformats.org/officeDocument/2006/relationships" xmlns:m="http://schemas.openxmlformats.org/officeDocument/2006/math" xmlns:v="urn:schemas-microsoft-com:vml" xmlns:wp14="http://schemas.microsoft.com/office/word/2010/wordprocessingDrawing" xmlns:wp="http://schemas.openxmlformats.org/drawingml/2006/wordprocessingDrawing" xmlns:w10="urn:schemas-microsoft-com:office:word" xmlns:w="http://schemas.openxmlformats.org/wordprocessingml/2006/main" xmlns:w14="http://schemas.microsoft.com/office/word/2010/wordml" xmlns:w15="http://schemas.microsoft.com/office/word/2012/wordml" xmlns:w16cei="http://schemas.microsoft.com/office/word/2026/wordml/cei" xmlns:w16cex="http://schemas.microsoft.com/office/word/2018/wordml/cex" xmlns:w16cid="http://schemas.microsoft.com/office/word/2016/wordml/cid" xmlns:w16="http://schemas.microsoft.com/office/word/2018/wordml" xmlns:w16du="http://schemas.microsoft.com/office/word/2023/wordml/word16du" xmlns:w16sdtdh="http://schemas.microsoft.com/office/word/2020/wordml/sdtdatahash" xmlns:w16sdtfl="http://schemas.microsoft.com/office/word/2024/wordml/sdtformatlock" xmlns:w16se="http://schemas.microsoft.com/office/word/2015/wordml/symex" xmlns:wpg="http://schemas.microsoft.com/office/word/2010/wordprocessingGroup" xmlns:wpi="http://schemas.microsoft.com/office/word/2010/wordprocessingInk" xmlns:wne="http://schemas.microsoft.com/office/word/2006/wordml" xmlns:wps="http://schemas.microsoft.com/office/word/2010/wordprocessingShape" mc:Ignorable="w14 w15 w16se w16cid w16 w16cex w16sdtdh w16sdtfl w16du wp14">
   <w:body>
     <w:p>
       <w:pPr>
@@ -737,6 +737,7 @@
         <w:rPr>
           <w:rFonts w:ascii="Arial" w:eastAsia="Arial" w:hAnsi="Arial" w:cs="Arial"/>
           <w:sz w:val="24"/>
+          <w:lang w:val="en-US"/>
         </w:rPr>
       </w:pPr>
       <w:r>
@@ -752,7 +753,25 @@
           <w:rFonts w:ascii="Arial" w:eastAsia="Arial" w:hAnsi="Arial" w:cs="Arial"/>
           <w:sz w:val="24"/>
         </w:rPr>
-        <w:t xml:space="preserve"> Materiais adaptados. Inteligência Artificial. Inclusão.</w:t>
+        <w:t xml:space="preserve"> Materiais adaptados. Inteligência Artificial. </w:t>
+      </w:r>
+      <w:proofErr w:type="spellStart"/>
+      <w:r>
+        <w:rPr>
+          <w:rFonts w:ascii="Arial" w:eastAsia="Arial" w:hAnsi="Arial" w:cs="Arial"/>
+          <w:sz w:val="24"/>
+          <w:lang w:val="en-US"/>
+        </w:rPr>
+        <w:t>Inclusão</w:t>
+      </w:r>
+      <w:proofErr w:type="spellEnd"/>
+      <w:r>
+        <w:rPr>
+          <w:rFonts w:ascii="Arial" w:eastAsia="Arial" w:hAnsi="Arial" w:cs="Arial"/>
+          <w:sz w:val="24"/>
+          <w:lang w:val="en-US"/>
+        </w:rPr>
+        <w:t>.</w:t>
       </w:r>
     </w:p>
     <w:p>
@@ -762,6 +781,7 @@
         <w:rPr>
           <w:rFonts w:ascii="Arial" w:eastAsia="Arial" w:hAnsi="Arial" w:cs="Arial"/>
           <w:sz w:val="24"/>
+          <w:lang w:val="en-US"/>
         </w:rPr>
       </w:pPr>
     </w:p>
@@ -772,6 +792,7 @@
         <w:rPr>
           <w:rFonts w:ascii="Arial" w:eastAsia="Arial" w:hAnsi="Arial" w:cs="Arial"/>
           <w:sz w:val="24"/>
+          <w:lang w:val="en-US"/>
         </w:rPr>
       </w:pPr>
     </w:p>
@@ -782,6 +803,7 @@
         <w:rPr>
           <w:rFonts w:ascii="Arial" w:eastAsia="Arial" w:hAnsi="Arial" w:cs="Arial"/>
           <w:sz w:val="24"/>
+          <w:lang w:val="en-US"/>
         </w:rPr>
       </w:pPr>
     </w:p>
@@ -792,6 +814,7 @@
         <w:rPr>
           <w:rFonts w:ascii="Arial" w:eastAsia="Arial" w:hAnsi="Arial" w:cs="Arial"/>
           <w:sz w:val="24"/>
+          <w:lang w:val="en-US"/>
         </w:rPr>
       </w:pPr>
     </w:p>
@@ -802,6 +825,7 @@
         <w:rPr>
           <w:rFonts w:ascii="Arial" w:eastAsia="Arial" w:hAnsi="Arial" w:cs="Arial"/>
           <w:sz w:val="24"/>
+          <w:lang w:val="en-US"/>
         </w:rPr>
       </w:pPr>
     </w:p>
@@ -812,6 +836,7 @@
         <w:rPr>
           <w:rFonts w:ascii="Arial" w:eastAsia="Arial" w:hAnsi="Arial" w:cs="Arial"/>
           <w:sz w:val="24"/>
+          <w:lang w:val="en-US"/>
         </w:rPr>
       </w:pPr>
     </w:p>
@@ -822,6 +847,7 @@
         <w:rPr>
           <w:rFonts w:ascii="Arial" w:eastAsia="Arial" w:hAnsi="Arial" w:cs="Arial"/>
           <w:sz w:val="24"/>
+          <w:lang w:val="en-US"/>
         </w:rPr>
       </w:pPr>
     </w:p>
@@ -832,6 +858,7 @@
         <w:rPr>
           <w:rFonts w:ascii="Arial" w:eastAsia="Arial" w:hAnsi="Arial" w:cs="Arial"/>
           <w:sz w:val="24"/>
+          <w:lang w:val="en-US"/>
         </w:rPr>
       </w:pPr>
     </w:p>
@@ -842,6 +869,7 @@
         <w:rPr>
           <w:rFonts w:ascii="Arial" w:eastAsia="Arial" w:hAnsi="Arial" w:cs="Arial"/>
           <w:sz w:val="24"/>
+          <w:lang w:val="en-US"/>
         </w:rPr>
       </w:pPr>
     </w:p>
@@ -852,6 +880,7 @@
         <w:rPr>
           <w:rFonts w:ascii="Arial" w:eastAsia="Arial" w:hAnsi="Arial" w:cs="Arial"/>
           <w:sz w:val="24"/>
+          <w:lang w:val="en-US"/>
         </w:rPr>
       </w:pPr>
     </w:p>
@@ -862,6 +891,7 @@
         <w:rPr>
           <w:rFonts w:ascii="Arial" w:eastAsia="Arial" w:hAnsi="Arial" w:cs="Arial"/>
           <w:sz w:val="24"/>
+          <w:lang w:val="en-US"/>
         </w:rPr>
       </w:pPr>
     </w:p>
@@ -872,6 +902,7 @@
         <w:rPr>
           <w:rFonts w:ascii="Arial" w:eastAsia="Arial" w:hAnsi="Arial" w:cs="Arial"/>
           <w:sz w:val="24"/>
+          <w:lang w:val="en-US"/>
         </w:rPr>
       </w:pPr>
     </w:p>
@@ -882,6 +913,7 @@
         <w:rPr>
           <w:rFonts w:ascii="Arial" w:eastAsia="Arial" w:hAnsi="Arial" w:cs="Arial"/>
           <w:sz w:val="24"/>
+          <w:lang w:val="en-US"/>
         </w:rPr>
       </w:pPr>
     </w:p>
@@ -892,6 +924,7 @@
         <w:rPr>
           <w:rFonts w:ascii="Arial" w:eastAsia="Arial" w:hAnsi="Arial" w:cs="Arial"/>
           <w:sz w:val="24"/>
+          <w:lang w:val="en-US"/>
         </w:rPr>
       </w:pPr>
     </w:p>
@@ -902,6 +935,7 @@
         <w:rPr>
           <w:rFonts w:ascii="Arial" w:eastAsia="Arial" w:hAnsi="Arial" w:cs="Arial"/>
           <w:sz w:val="24"/>
+          <w:lang w:val="en-US"/>
         </w:rPr>
       </w:pPr>
     </w:p>
@@ -912,6 +946,7 @@
         <w:rPr>
           <w:rFonts w:ascii="Arial" w:eastAsia="Arial" w:hAnsi="Arial" w:cs="Arial"/>
           <w:sz w:val="24"/>
+          <w:lang w:val="en-US"/>
         </w:rPr>
       </w:pPr>
     </w:p>
@@ -922,6 +957,7 @@
         <w:rPr>
           <w:rFonts w:ascii="Arial" w:eastAsia="Arial" w:hAnsi="Arial" w:cs="Arial"/>
           <w:sz w:val="24"/>
+          <w:lang w:val="en-US"/>
         </w:rPr>
       </w:pPr>
     </w:p>
@@ -932,6 +968,7 @@
         <w:rPr>
           <w:rFonts w:ascii="Arial" w:eastAsia="Arial" w:hAnsi="Arial" w:cs="Arial"/>
           <w:sz w:val="24"/>
+          <w:lang w:val="en-US"/>
         </w:rPr>
       </w:pPr>
     </w:p>
@@ -942,6 +979,7 @@
         <w:rPr>
           <w:rFonts w:ascii="Arial" w:eastAsia="Arial" w:hAnsi="Arial" w:cs="Arial"/>
           <w:sz w:val="24"/>
+          <w:lang w:val="en-US"/>
         </w:rPr>
       </w:pPr>
     </w:p>
@@ -952,6 +990,7 @@
         <w:rPr>
           <w:rFonts w:ascii="Arial" w:eastAsia="Arial" w:hAnsi="Arial" w:cs="Arial"/>
           <w:sz w:val="24"/>
+          <w:lang w:val="en-US"/>
         </w:rPr>
       </w:pPr>
     </w:p>
@@ -962,6 +1001,7 @@
         <w:rPr>
           <w:rFonts w:ascii="Arial" w:eastAsia="Arial" w:hAnsi="Arial" w:cs="Arial"/>
           <w:sz w:val="24"/>
+          <w:lang w:val="en-US"/>
         </w:rPr>
       </w:pPr>
     </w:p>
@@ -972,6 +1012,7 @@
         <w:rPr>
           <w:rFonts w:ascii="Arial" w:eastAsia="Arial" w:hAnsi="Arial" w:cs="Arial"/>
           <w:sz w:val="24"/>
+          <w:lang w:val="en-US"/>
         </w:rPr>
       </w:pPr>
     </w:p>
@@ -982,6 +1023,7 @@
         <w:rPr>
           <w:rFonts w:ascii="Arial" w:eastAsia="Arial" w:hAnsi="Arial" w:cs="Arial"/>
           <w:sz w:val="24"/>
+          <w:lang w:val="en-US"/>
         </w:rPr>
       </w:pPr>
     </w:p>
@@ -992,6 +1034,7 @@
         <w:rPr>
           <w:rFonts w:ascii="Arial" w:eastAsia="Arial" w:hAnsi="Arial" w:cs="Arial"/>
           <w:sz w:val="24"/>
+          <w:lang w:val="en-US"/>
         </w:rPr>
       </w:pPr>
     </w:p>
@@ -1002,6 +1045,7 @@
         <w:rPr>
           <w:rFonts w:ascii="Arial" w:eastAsia="Arial" w:hAnsi="Arial" w:cs="Arial"/>
           <w:sz w:val="24"/>
+          <w:lang w:val="en-US"/>
         </w:rPr>
       </w:pPr>
     </w:p>
@@ -1012,23 +1056,26 @@
         <w:rPr>
           <w:rFonts w:ascii="Arial" w:eastAsia="Arial" w:hAnsi="Arial" w:cs="Arial"/>
           <w:sz w:val="24"/>
-        </w:rPr>
-      </w:pPr>
-    </w:p>
-    <w:p>
-      <w:pPr>
-        <w:spacing w:after="0" w:line="360" w:lineRule="auto"/>
-        <w:rPr>
-          <w:rFonts w:ascii="Arial" w:eastAsia="Arial" w:hAnsi="Arial" w:cs="Arial"/>
-          <w:b/>
-          <w:sz w:val="24"/>
-        </w:rPr>
-      </w:pPr>
-      <w:r>
-        <w:rPr>
-          <w:rFonts w:ascii="Arial" w:eastAsia="Arial" w:hAnsi="Arial" w:cs="Arial"/>
-          <w:b/>
-          <w:sz w:val="24"/>
+          <w:lang w:val="en-US"/>
+        </w:rPr>
+      </w:pPr>
+    </w:p>
+    <w:p>
+      <w:pPr>
+        <w:spacing w:after="0" w:line="360" w:lineRule="auto"/>
+        <w:rPr>
+          <w:rFonts w:ascii="Arial" w:eastAsia="Arial" w:hAnsi="Arial" w:cs="Arial"/>
+          <w:b/>
+          <w:sz w:val="24"/>
+          <w:lang w:val="en-US"/>
+        </w:rPr>
+      </w:pPr>
+      <w:r>
+        <w:rPr>
+          <w:rFonts w:ascii="Arial" w:eastAsia="Arial" w:hAnsi="Arial" w:cs="Arial"/>
+          <w:b/>
+          <w:sz w:val="24"/>
+          <w:lang w:val="en-US"/>
         </w:rPr>
         <w:t>Abstract</w:t>
       </w:r>
@@ -1049,25 +1096,25 @@
           <w:sz w:val="24"/>
           <w:lang w:val="en-US"/>
         </w:rPr>
-        <w:t xml:space="preserve">This undergraduate thesis proposes an analysis of the difficulties faced by teachers at ETEC Professor Camargo </w:t>
-      </w:r>
-      <w:proofErr w:type="spellStart"/>
+        <w:t xml:space="preserve">This undergraduate thesis proposes an analysis of the difficulties faced by teachers at ETEC Professor Camargo Aranha when teaching verbal students with Level 1 </w:t>
+      </w:r>
+      <w:proofErr w:type="gramStart"/>
       <w:r>
         <w:rPr>
           <w:rFonts w:ascii="Arial" w:eastAsia="Arial" w:hAnsi="Arial" w:cs="Arial"/>
           <w:sz w:val="24"/>
           <w:lang w:val="en-US"/>
         </w:rPr>
-        <w:t>Aranha</w:t>
-      </w:r>
-      <w:proofErr w:type="spellEnd"/>
+        <w:t>Autism Spectrum Disorder</w:t>
+      </w:r>
+      <w:proofErr w:type="gramEnd"/>
       <w:r>
         <w:rPr>
           <w:rFonts w:ascii="Arial" w:eastAsia="Arial" w:hAnsi="Arial" w:cs="Arial"/>
           <w:sz w:val="24"/>
           <w:lang w:val="en-US"/>
         </w:rPr>
-        <w:t xml:space="preserve"> when teaching verbal students with Level 1 Autism Spectrum Disorder (ASD). Through a qualitative research approach, the main obstacles were investigated using individual interviews and records provided by the faculty. As a result, the following bottlenecks were identified: the difficulty in creating adapted and genuinely inclusive learning materials, alongside ensuring these students' comprehension of the content. In response to these challenges, TEA Learn was developed with the objective of mitigating these barriers and assisting educators through the application of Artificial Intelligence.</w:t>
+        <w:t xml:space="preserve"> (ASD). Through a qualitative research approach, the main obstacles were investigated using individual interviews and records provided by the faculty. As a result, the following bottlenecks were identified: the difficulty in creating adapted and genuinely inclusive learning materials, alongside ensuring these students' comprehension of the content. In response to these challenges, TEA Learn was developed with the objective of mitigating these barriers and assisting educators through the application of Artificial Intelligence.</w:t>
       </w:r>
     </w:p>
     <w:p>
@@ -2620,9 +2667,9 @@
       <w:r>
         <w:object w:dxaOrig="8708" w:dyaOrig="4157" w14:anchorId="2FD0AA89">
           <v:rect id="rectole0000000000" o:spid="_x0000_i1025" style="width:435.75pt;height:207.75pt" o:ole="" o:preferrelative="t" stroked="f">
-            <v:imagedata r:id="rId5" o:title=""/>
+            <v:imagedata r:id="rId7" o:title=""/>
           </v:rect>
-          <o:OLEObject Type="Embed" ProgID="StaticMetafile" ShapeID="rectole0000000000" DrawAspect="Content" ObjectID="_1849323887" r:id="rId6"/>
+          <o:OLEObject Type="Embed" ProgID="StaticMetafile" ShapeID="rectole0000000000" DrawAspect="Content" ObjectID="_1849609617" r:id="rId8"/>
         </w:object>
       </w:r>
     </w:p>
@@ -2638,9 +2685,9 @@
       <w:r>
         <w:object w:dxaOrig="8708" w:dyaOrig="4135" w14:anchorId="0FF3ACFC">
           <v:rect id="rectole0000000001" o:spid="_x0000_i1026" style="width:435.75pt;height:207pt" o:ole="" o:preferrelative="t" stroked="f">
-            <v:imagedata r:id="rId7" o:title=""/>
+            <v:imagedata r:id="rId9" o:title=""/>
           </v:rect>
-          <o:OLEObject Type="Embed" ProgID="StaticMetafile" ShapeID="rectole0000000001" DrawAspect="Content" ObjectID="_1849323888" r:id="rId8"/>
+          <o:OLEObject Type="Embed" ProgID="StaticMetafile" ShapeID="rectole0000000001" DrawAspect="Content" ObjectID="_1849609618" r:id="rId10"/>
         </w:object>
       </w:r>
     </w:p>
@@ -2656,9 +2703,9 @@
       <w:r>
         <w:object w:dxaOrig="8708" w:dyaOrig="4131" w14:anchorId="2177ABA7">
           <v:rect id="rectole0000000002" o:spid="_x0000_i1027" style="width:435.75pt;height:206.25pt" o:ole="" o:preferrelative="t" stroked="f">
-            <v:imagedata r:id="rId9" o:title=""/>
+            <v:imagedata r:id="rId11" o:title=""/>
           </v:rect>
-          <o:OLEObject Type="Embed" ProgID="StaticMetafile" ShapeID="rectole0000000002" DrawAspect="Content" ObjectID="_1849323889" r:id="rId10"/>
+          <o:OLEObject Type="Embed" ProgID="StaticMetafile" ShapeID="rectole0000000002" DrawAspect="Content" ObjectID="_1849609619" r:id="rId12"/>
         </w:object>
       </w:r>
     </w:p>
@@ -2785,9 +2832,9 @@
       <w:r>
         <w:object w:dxaOrig="8425" w:dyaOrig="12068" w14:anchorId="07FE2B97">
           <v:rect id="rectole0000000003" o:spid="_x0000_i1028" style="width:421.5pt;height:603.75pt" o:ole="" o:preferrelative="t" stroked="f">
-            <v:imagedata r:id="rId11" o:title=""/>
+            <v:imagedata r:id="rId13" o:title=""/>
           </v:rect>
-          <o:OLEObject Type="Embed" ProgID="StaticMetafile" ShapeID="rectole0000000003" DrawAspect="Content" ObjectID="_1849323890" r:id="rId12"/>
+          <o:OLEObject Type="Embed" ProgID="StaticMetafile" ShapeID="rectole0000000003" DrawAspect="Content" ObjectID="_1849609620" r:id="rId14"/>
         </w:object>
       </w:r>
     </w:p>
@@ -2803,9 +2850,9 @@
       <w:r>
         <w:object w:dxaOrig="8439" w:dyaOrig="11953" w14:anchorId="1330EBED">
           <v:rect id="rectole0000000004" o:spid="_x0000_i1029" style="width:422.25pt;height:597.75pt" o:ole="" o:preferrelative="t" stroked="f">
-            <v:imagedata r:id="rId13" o:title=""/>
+            <v:imagedata r:id="rId15" o:title=""/>
           </v:rect>
-          <o:OLEObject Type="Embed" ProgID="StaticMetafile" ShapeID="rectole0000000004" DrawAspect="Content" ObjectID="_1849323891" r:id="rId14"/>
+          <o:OLEObject Type="Embed" ProgID="StaticMetafile" ShapeID="rectole0000000004" DrawAspect="Content" ObjectID="_1849609621" r:id="rId16"/>
         </w:object>
       </w:r>
     </w:p>
@@ -2821,9 +2868,9 @@
       <w:r>
         <w:object w:dxaOrig="8454" w:dyaOrig="11967" w14:anchorId="68641223">
           <v:rect id="rectole0000000005" o:spid="_x0000_i1030" style="width:423pt;height:598.5pt" o:ole="" o:preferrelative="t" stroked="f">
-            <v:imagedata r:id="rId15" o:title=""/>
+            <v:imagedata r:id="rId17" o:title=""/>
           </v:rect>
-          <o:OLEObject Type="Embed" ProgID="StaticMetafile" ShapeID="rectole0000000005" DrawAspect="Content" ObjectID="_1849323892" r:id="rId16"/>
+          <o:OLEObject Type="Embed" ProgID="StaticMetafile" ShapeID="rectole0000000005" DrawAspect="Content" ObjectID="_1849609622" r:id="rId18"/>
         </w:object>
       </w:r>
     </w:p>
@@ -3683,8 +3730,17 @@
           <w:rFonts w:ascii="Arial" w:eastAsia="Arial" w:hAnsi="Arial" w:cs="Arial"/>
           <w:sz w:val="24"/>
         </w:rPr>
-        <w:t>, blocos de notas, slides e etc.</w:t>
-      </w:r>
+        <w:t xml:space="preserve">, blocos de notas, </w:t>
+      </w:r>
+      <w:proofErr w:type="gramStart"/>
+      <w:r>
+        <w:rPr>
+          <w:rFonts w:ascii="Arial" w:eastAsia="Arial" w:hAnsi="Arial" w:cs="Arial"/>
+          <w:sz w:val="24"/>
+        </w:rPr>
+        <w:t>slides e etc.</w:t>
+      </w:r>
+      <w:proofErr w:type="gramEnd"/>
     </w:p>
     <w:p>
       <w:pPr>
@@ -3729,8 +3785,17 @@
           <w:rFonts w:ascii="Arial" w:eastAsia="Arial" w:hAnsi="Arial" w:cs="Arial"/>
           <w:sz w:val="24"/>
         </w:rPr>
-        <w:t>, como Matemática, Física, Química, etc</w:t>
-      </w:r>
+        <w:t xml:space="preserve">, como Matemática, Física, </w:t>
+      </w:r>
+      <w:proofErr w:type="gramStart"/>
+      <w:r>
+        <w:rPr>
+          <w:rFonts w:ascii="Arial" w:eastAsia="Arial" w:hAnsi="Arial" w:cs="Arial"/>
+          <w:sz w:val="24"/>
+        </w:rPr>
+        <w:t>Química, etc</w:t>
+      </w:r>
+      <w:proofErr w:type="gramEnd"/>
     </w:p>
     <w:p>
       <w:pPr>
@@ -3909,25 +3974,7 @@
           <w:sz w:val="24"/>
           <w:lang w:val="en-US"/>
         </w:rPr>
-        <w:t xml:space="preserve"> Java, Spring Boot, Spring Security, JWT Authentication, Spring Data JPA, Maven, Lombok, Flyway, REST API, PostgreSQL, Spring AI, </w:t>
-      </w:r>
-      <w:proofErr w:type="spellStart"/>
-      <w:r>
-        <w:rPr>
-          <w:rFonts w:ascii="Arial" w:eastAsia="Arial" w:hAnsi="Arial" w:cs="Arial"/>
-          <w:sz w:val="24"/>
-          <w:lang w:val="en-US"/>
-        </w:rPr>
-        <w:t>OpenAI</w:t>
-      </w:r>
-      <w:proofErr w:type="spellEnd"/>
-      <w:r>
-        <w:rPr>
-          <w:rFonts w:ascii="Arial" w:eastAsia="Arial" w:hAnsi="Arial" w:cs="Arial"/>
-          <w:sz w:val="24"/>
-          <w:lang w:val="en-US"/>
-        </w:rPr>
-        <w:t xml:space="preserve"> API, Docker, React, CSS, TypeScript, HTML, </w:t>
+        <w:t xml:space="preserve"> Java, Spring Boot, Spring Security, JWT Authentication, Spring Data JPA, Maven, Lombok, Flyway, REST API, PostgreSQL, Spring AI, OpenAI API, Docker, React, CSS, TypeScript, HTML, </w:t>
       </w:r>
       <w:proofErr w:type="spellStart"/>
       <w:r>
@@ -7033,9 +7080,9 @@
       <w:r>
         <w:object w:dxaOrig="8708" w:dyaOrig="1981" w14:anchorId="082C5221">
           <v:rect id="rectole0000000006" o:spid="_x0000_i1031" style="width:435.75pt;height:99pt" o:ole="" o:preferrelative="t" stroked="f">
-            <v:imagedata r:id="rId17" o:title=""/>
+            <v:imagedata r:id="rId19" o:title=""/>
           </v:rect>
-          <o:OLEObject Type="Embed" ProgID="StaticMetafile" ShapeID="rectole0000000006" DrawAspect="Content" ObjectID="_1849323893" r:id="rId18"/>
+          <o:OLEObject Type="Embed" ProgID="StaticMetafile" ShapeID="rectole0000000006" DrawAspect="Content" ObjectID="_1849609623" r:id="rId20"/>
         </w:object>
       </w:r>
     </w:p>
@@ -7156,9 +7203,9 @@
       <w:r>
         <w:object w:dxaOrig="8708" w:dyaOrig="1717" w14:anchorId="5889FA5F">
           <v:rect id="rectole0000000007" o:spid="_x0000_i1032" style="width:435.75pt;height:85.5pt" o:ole="" o:preferrelative="t" stroked="f">
-            <v:imagedata r:id="rId19" o:title=""/>
+            <v:imagedata r:id="rId21" o:title=""/>
           </v:rect>
-          <o:OLEObject Type="Embed" ProgID="StaticMetafile" ShapeID="rectole0000000007" DrawAspect="Content" ObjectID="_1849323894" r:id="rId20"/>
+          <o:OLEObject Type="Embed" ProgID="StaticMetafile" ShapeID="rectole0000000007" DrawAspect="Content" ObjectID="_1849609624" r:id="rId22"/>
         </w:object>
       </w:r>
     </w:p>
@@ -7221,9 +7268,9 @@
       <w:r>
         <w:object w:dxaOrig="8708" w:dyaOrig="6535" w14:anchorId="60FDE02B">
           <v:rect id="rectole0000000008" o:spid="_x0000_i1033" style="width:435.75pt;height:327pt" o:ole="" o:preferrelative="t" stroked="f">
-            <v:imagedata r:id="rId21" o:title=""/>
+            <v:imagedata r:id="rId23" o:title=""/>
           </v:rect>
-          <o:OLEObject Type="Embed" ProgID="StaticMetafile" ShapeID="rectole0000000008" DrawAspect="Content" ObjectID="_1849323895" r:id="rId22"/>
+          <o:OLEObject Type="Embed" ProgID="StaticMetafile" ShapeID="rectole0000000008" DrawAspect="Content" ObjectID="_1849609625" r:id="rId24"/>
         </w:object>
       </w:r>
     </w:p>
@@ -7327,9 +7374,9 @@
       <w:r>
         <w:object w:dxaOrig="7210" w:dyaOrig="4300" w14:anchorId="4E8C6866">
           <v:rect id="rectole0000000009" o:spid="_x0000_i1034" style="width:360.75pt;height:215.25pt" o:ole="" o:preferrelative="t" stroked="f">
-            <v:imagedata r:id="rId23" o:title=""/>
+            <v:imagedata r:id="rId25" o:title=""/>
           </v:rect>
-          <o:OLEObject Type="Embed" ProgID="StaticMetafile" ShapeID="rectole0000000009" DrawAspect="Content" ObjectID="_1849323896" r:id="rId24"/>
+          <o:OLEObject Type="Embed" ProgID="StaticMetafile" ShapeID="rectole0000000009" DrawAspect="Content" ObjectID="_1849609626" r:id="rId26"/>
         </w:object>
       </w:r>
     </w:p>
@@ -7385,9 +7432,9 @@
       <w:r>
         <w:object w:dxaOrig="8158" w:dyaOrig="7221" w14:anchorId="5B433630">
           <v:rect id="rectole0000000010" o:spid="_x0000_i1035" style="width:408pt;height:360.75pt" o:ole="" o:preferrelative="t" stroked="f">
-            <v:imagedata r:id="rId25" o:title=""/>
+            <v:imagedata r:id="rId27" o:title=""/>
           </v:rect>
-          <o:OLEObject Type="Embed" ProgID="StaticMetafile" ShapeID="rectole0000000010" DrawAspect="Content" ObjectID="_1849323897" r:id="rId26"/>
+          <o:OLEObject Type="Embed" ProgID="StaticMetafile" ShapeID="rectole0000000010" DrawAspect="Content" ObjectID="_1849609627" r:id="rId28"/>
         </w:object>
       </w:r>
     </w:p>
@@ -7484,9 +7531,9 @@
       <w:r>
         <w:object w:dxaOrig="8708" w:dyaOrig="2421" w14:anchorId="10A6EDE8">
           <v:rect id="rectole0000000011" o:spid="_x0000_i1036" style="width:435.75pt;height:120.75pt" o:ole="" o:preferrelative="t" stroked="f">
-            <v:imagedata r:id="rId27" o:title=""/>
+            <v:imagedata r:id="rId29" o:title=""/>
           </v:rect>
-          <o:OLEObject Type="Embed" ProgID="StaticMetafile" ShapeID="rectole0000000011" DrawAspect="Content" ObjectID="_1849323898" r:id="rId28"/>
+          <o:OLEObject Type="Embed" ProgID="StaticMetafile" ShapeID="rectole0000000011" DrawAspect="Content" ObjectID="_1849609628" r:id="rId30"/>
         </w:object>
       </w:r>
     </w:p>
@@ -7538,9 +7585,9 @@
       <w:r>
         <w:object w:dxaOrig="8708" w:dyaOrig="1364" w14:anchorId="58983C51">
           <v:rect id="rectole0000000012" o:spid="_x0000_i1037" style="width:435.75pt;height:68.25pt" o:ole="" o:preferrelative="t" stroked="f">
-            <v:imagedata r:id="rId29" o:title=""/>
+            <v:imagedata r:id="rId31" o:title=""/>
           </v:rect>
-          <o:OLEObject Type="Embed" ProgID="StaticMetafile" ShapeID="rectole0000000012" DrawAspect="Content" ObjectID="_1849323899" r:id="rId30"/>
+          <o:OLEObject Type="Embed" ProgID="StaticMetafile" ShapeID="rectole0000000012" DrawAspect="Content" ObjectID="_1849609629" r:id="rId32"/>
         </w:object>
       </w:r>
     </w:p>
@@ -7573,16 +7620,7 @@
           <w:rFonts w:ascii="Arial" w:eastAsia="Arial" w:hAnsi="Arial" w:cs="Arial"/>
           <w:sz w:val="24"/>
         </w:rPr>
-        <w:t xml:space="preserve"> utiliza</w:t>
-      </w:r>
-      <w:bookmarkStart w:id="0" w:name="_GoBack"/>
-      <w:bookmarkEnd w:id="0"/>
-      <w:r>
-        <w:rPr>
-          <w:rFonts w:ascii="Arial" w:eastAsia="Arial" w:hAnsi="Arial" w:cs="Arial"/>
-          <w:sz w:val="24"/>
-        </w:rPr>
-        <w:t xml:space="preserve">do </w:t>
+        <w:t xml:space="preserve"> utilizado </w:t>
       </w:r>
       <w:r>
         <w:rPr>
@@ -7669,6 +7707,8 @@
         <w:t>DASHBOARD</w:t>
       </w:r>
     </w:p>
+    <w:bookmarkStart w:id="0" w:name="_MON_1849609531"/>
+    <w:bookmarkEnd w:id="0"/>
     <w:p>
       <w:pPr>
         <w:spacing w:after="0" w:line="360" w:lineRule="auto"/>
@@ -7678,6 +7718,38 @@
           <w:szCs w:val="24"/>
         </w:rPr>
       </w:pPr>
+      <w:r>
+        <w:rPr>
+          <w:rFonts w:ascii="Arial" w:eastAsia="Arial" w:hAnsi="Arial" w:cs="Arial"/>
+          <w:sz w:val="24"/>
+          <w:szCs w:val="24"/>
+        </w:rPr>
+        <w:object w:dxaOrig="9954" w:dyaOrig="23025" w14:anchorId="3C5725A8">
+          <v:shapetype id="_x0000_t75" coordsize="21600,21600" o:spt="75" o:preferrelative="t" path="m@4@5l@4@11@9@11@9@5xe" filled="f" stroked="f">
+            <v:stroke joinstyle="miter"/>
+            <v:formulas>
+              <v:f eqn="if lineDrawn pixelLineWidth 0"/>
+              <v:f eqn="sum @0 1 0"/>
+              <v:f eqn="sum 0 0 @1"/>
+              <v:f eqn="prod @2 1 2"/>
+              <v:f eqn="prod @3 21600 pixelWidth"/>
+              <v:f eqn="prod @3 21600 pixelHeight"/>
+              <v:f eqn="sum @0 0 1"/>
+              <v:f eqn="prod @6 1 2"/>
+              <v:f eqn="prod @7 21600 pixelWidth"/>
+              <v:f eqn="sum @8 21600 0"/>
+              <v:f eqn="prod @7 21600 pixelHeight"/>
+              <v:f eqn="sum @10 21600 0"/>
+            </v:formulas>
+            <v:path o:extrusionok="f" gradientshapeok="t" o:connecttype="rect"/>
+            <o:lock v:ext="edit" aspectratio="t"/>
+          </v:shapetype>
+          <v:shape id="_x0000_i1100" type="#_x0000_t75" style="width:327pt;height:761.25pt" o:ole="">
+            <v:imagedata r:id="rId33" o:title=""/>
+          </v:shape>
+          <o:OLEObject Type="Embed" ProgID="Excel.Sheet.12" ShapeID="_x0000_i1100" DrawAspect="Content" ObjectID="_1849609630" r:id="rId34"/>
+        </w:object>
+      </w:r>
     </w:p>
     <w:p>
       <w:pPr>
@@ -7709,7 +7781,7 @@
                     <pic:cNvPicPr/>
                   </pic:nvPicPr>
                   <pic:blipFill>
-                    <a:blip r:embed="rId31">
+                    <a:blip r:embed="rId35">
                       <a:extLst>
                         <a:ext uri="{28A0092B-C50C-407E-A947-70E740481C1C}">
                           <a14:useLocalDpi xmlns:a14="http://schemas.microsoft.com/office/drawing/2010/main"/>
@@ -7808,7 +7880,7 @@
                     <pic:cNvPicPr/>
                   </pic:nvPicPr>
                   <pic:blipFill>
-                    <a:blip r:embed="rId32">
+                    <a:blip r:embed="rId36">
                       <a:extLst>
                         <a:ext uri="{28A0092B-C50C-407E-A947-70E740481C1C}">
                           <a14:useLocalDpi xmlns:a14="http://schemas.microsoft.com/office/drawing/2010/main"/>
@@ -7872,7 +7944,7 @@
                     <pic:cNvPicPr/>
                   </pic:nvPicPr>
                   <pic:blipFill>
-                    <a:blip r:embed="rId33">
+                    <a:blip r:embed="rId37">
                       <a:extLst>
                         <a:ext uri="{28A0092B-C50C-407E-A947-70E740481C1C}">
                           <a14:useLocalDpi xmlns:a14="http://schemas.microsoft.com/office/drawing/2010/main"/>
@@ -8849,7 +8921,7 @@
           <w:sz w:val="24"/>
         </w:rPr>
       </w:pPr>
-      <w:hyperlink r:id="rId34">
+      <w:hyperlink r:id="rId38">
         <w:r>
           <w:rPr>
             <w:rFonts w:ascii="Arial" w:eastAsia="Arial" w:hAnsi="Arial" w:cs="Arial"/>
@@ -8897,7 +8969,7 @@
           <w:sz w:val="24"/>
         </w:rPr>
       </w:pPr>
-      <w:hyperlink r:id="rId35">
+      <w:hyperlink r:id="rId39">
         <w:r>
           <w:rPr>
             <w:rFonts w:ascii="Arial" w:eastAsia="Arial" w:hAnsi="Arial" w:cs="Arial"/>
@@ -8929,7 +9001,7 @@
           <w:sz w:val="24"/>
         </w:rPr>
       </w:pPr>
-      <w:hyperlink r:id="rId36">
+      <w:hyperlink r:id="rId40">
         <w:r>
           <w:rPr>
             <w:rFonts w:ascii="Arial" w:eastAsia="Arial" w:hAnsi="Arial" w:cs="Arial"/>
@@ -8977,7 +9049,7 @@
           <w:sz w:val="24"/>
         </w:rPr>
       </w:pPr>
-      <w:hyperlink r:id="rId37">
+      <w:hyperlink r:id="rId41">
         <w:r>
           <w:rPr>
             <w:rFonts w:ascii="Arial" w:eastAsia="Arial" w:hAnsi="Arial" w:cs="Arial"/>
@@ -9009,7 +9081,7 @@
           <w:sz w:val="24"/>
         </w:rPr>
       </w:pPr>
-      <w:hyperlink r:id="rId38">
+      <w:hyperlink r:id="rId42">
         <w:r>
           <w:rPr>
             <w:rFonts w:ascii="Arial" w:eastAsia="Arial" w:hAnsi="Arial" w:cs="Arial"/>
@@ -9057,7 +9129,7 @@
           <w:sz w:val="24"/>
         </w:rPr>
       </w:pPr>
-      <w:hyperlink r:id="rId39">
+      <w:hyperlink r:id="rId43">
         <w:r>
           <w:rPr>
             <w:rFonts w:ascii="Arial" w:eastAsia="Arial" w:hAnsi="Arial" w:cs="Arial"/>
@@ -9111,7 +9183,7 @@
         </w:rPr>
         <w:tab/>
       </w:r>
-      <w:hyperlink r:id="rId40">
+      <w:hyperlink r:id="rId44">
         <w:r>
           <w:rPr>
             <w:rFonts w:ascii="Arial" w:eastAsia="Arial" w:hAnsi="Arial" w:cs="Arial"/>
@@ -9157,7 +9229,7 @@
         </w:rPr>
         <w:t xml:space="preserve">Diagrama de Gantt: </w:t>
       </w:r>
-      <w:hyperlink r:id="rId41">
+      <w:hyperlink r:id="rId45">
         <w:r>
           <w:rPr>
             <w:rFonts w:ascii="Arial" w:eastAsia="Arial" w:hAnsi="Arial" w:cs="Arial"/>
@@ -9200,7 +9272,7 @@
         </w:rPr>
         <w:t xml:space="preserve">DUA: </w:t>
       </w:r>
-      <w:hyperlink r:id="rId42">
+      <w:hyperlink r:id="rId46">
         <w:r>
           <w:rPr>
             <w:rFonts w:ascii="Arial" w:eastAsia="Arial" w:hAnsi="Arial" w:cs="Arial"/>
@@ -9259,7 +9331,7 @@
         </w:rPr>
         <w:tab/>
       </w:r>
-      <w:hyperlink r:id="rId43">
+      <w:hyperlink r:id="rId47">
         <w:r>
           <w:rPr>
             <w:rFonts w:ascii="Arial" w:eastAsia="Arial" w:hAnsi="Arial" w:cs="Arial"/>
@@ -9288,8 +9360,58 @@
 </w:document>
 </file>
 
+<file path=word/endnotes.xml><?xml version="1.0" encoding="utf-8"?>
+<w:endnotes xmlns:wpc="http://schemas.microsoft.com/office/word/2010/wordprocessingCanvas" xmlns:cx="http://schemas.microsoft.com/office/drawing/2014/chartex" xmlns:cx1="http://schemas.microsoft.com/office/drawing/2015/9/8/chartex" xmlns:cx2="http://schemas.microsoft.com/office/drawing/2015/10/21/chartex" xmlns:cx3="http://schemas.microsoft.com/office/drawing/2016/5/9/chartex" xmlns:cx4="http://schemas.microsoft.com/office/drawing/2016/5/10/chartex" xmlns:cx5="http://schemas.microsoft.com/office/drawing/2016/5/11/chartex" xmlns:cx6="http://schemas.microsoft.com/office/drawing/2016/5/12/chartex" xmlns:cx7="http://schemas.microsoft.com/office/drawing/2016/5/13/chartex" xmlns:cx8="http://schemas.microsoft.com/office/drawing/2016/5/14/chartex" xmlns:mc="http://schemas.openxmlformats.org/markup-compatibility/2006" xmlns:aink="http://schemas.microsoft.com/office/drawing/2016/ink" xmlns:am3d="http://schemas.microsoft.com/office/drawing/2017/model3d" xmlns:o="urn:schemas-microsoft-com:office:office" xmlns:oel="http://schemas.microsoft.com/office/2019/extlst" xmlns:r="http://schemas.openxmlformats.org/officeDocument/2006/relationships" xmlns:m="http://schemas.openxmlformats.org/officeDocument/2006/math" xmlns:v="urn:schemas-microsoft-com:vml" xmlns:wp14="http://schemas.microsoft.com/office/word/2010/wordprocessingDrawing" xmlns:wp="http://schemas.openxmlformats.org/drawingml/2006/wordprocessingDrawing" xmlns:w10="urn:schemas-microsoft-com:office:word" xmlns:w="http://schemas.openxmlformats.org/wordprocessingml/2006/main" xmlns:w14="http://schemas.microsoft.com/office/word/2010/wordml" xmlns:w15="http://schemas.microsoft.com/office/word/2012/wordml" xmlns:w16cei="http://schemas.microsoft.com/office/word/2026/wordml/cei" xmlns:w16cex="http://schemas.microsoft.com/office/word/2018/wordml/cex" xmlns:w16cid="http://schemas.microsoft.com/office/word/2016/wordml/cid" xmlns:w16="http://schemas.microsoft.com/office/word/2018/wordml" xmlns:w16du="http://schemas.microsoft.com/office/word/2023/wordml/word16du" xmlns:w16sdtdh="http://schemas.microsoft.com/office/word/2020/wordml/sdtdatahash" xmlns:w16sdtfl="http://schemas.microsoft.com/office/word/2024/wordml/sdtformatlock" xmlns:w16se="http://schemas.microsoft.com/office/word/2015/wordml/symex" xmlns:wpg="http://schemas.microsoft.com/office/word/2010/wordprocessingGroup" xmlns:wpi="http://schemas.microsoft.com/office/word/2010/wordprocessingInk" xmlns:wne="http://schemas.microsoft.com/office/word/2006/wordml" xmlns:wps="http://schemas.microsoft.com/office/word/2010/wordprocessingShape" mc:Ignorable="w14 w15 w16se w16cid w16 w16cex w16sdtdh w16sdtfl w16du wp14">
+  <w:endnote w:type="separator" w:id="-1">
+    <w:p>
+      <w:pPr>
+        <w:spacing w:after="0" w:line="240" w:lineRule="auto"/>
+      </w:pPr>
+      <w:r>
+        <w:separator/>
+      </w:r>
+    </w:p>
+  </w:endnote>
+  <w:endnote w:type="continuationSeparator" w:id="0">
+    <w:p>
+      <w:pPr>
+        <w:spacing w:after="0" w:line="240" w:lineRule="auto"/>
+      </w:pPr>
+      <w:r>
+        <w:continuationSeparator/>
+      </w:r>
+    </w:p>
+  </w:endnote>
+</w:endnotes>
+</file>
+
+<file path=word/footnotes.xml><?xml version="1.0" encoding="utf-8"?>
+<w:footnotes xmlns:wpc="http://schemas.microsoft.com/office/word/2010/wordprocessingCanvas" xmlns:cx="http://schemas.microsoft.com/office/drawing/2014/chartex" xmlns:cx1="http://schemas.microsoft.com/office/drawing/2015/9/8/chartex" xmlns:cx2="http://schemas.microsoft.com/office/drawing/2015/10/21/chartex" xmlns:cx3="http://schemas.microsoft.com/office/drawing/2016/5/9/chartex" xmlns:cx4="http://schemas.microsoft.com/office/drawing/2016/5/10/chartex" xmlns:cx5="http://schemas.microsoft.com/office/drawing/2016/5/11/chartex" xmlns:cx6="http://schemas.microsoft.com/office/drawing/2016/5/12/chartex" xmlns:cx7="http://schemas.microsoft.com/office/drawing/2016/5/13/chartex" xmlns:cx8="http://schemas.microsoft.com/office/drawing/2016/5/14/chartex" xmlns:mc="http://schemas.openxmlformats.org/markup-compatibility/2006" xmlns:aink="http://schemas.microsoft.com/office/drawing/2016/ink" xmlns:am3d="http://schemas.microsoft.com/office/drawing/2017/model3d" xmlns:o="urn:schemas-microsoft-com:office:office" xmlns:oel="http://schemas.microsoft.com/office/2019/extlst" xmlns:r="http://schemas.openxmlformats.org/officeDocument/2006/relationships" xmlns:m="http://schemas.openxmlformats.org/officeDocument/2006/math" xmlns:v="urn:schemas-microsoft-com:vml" xmlns:wp14="http://schemas.microsoft.com/office/word/2010/wordprocessingDrawing" xmlns:wp="http://schemas.openxmlformats.org/drawingml/2006/wordprocessingDrawing" xmlns:w10="urn:schemas-microsoft-com:office:word" xmlns:w="http://schemas.openxmlformats.org/wordprocessingml/2006/main" xmlns:w14="http://schemas.microsoft.com/office/word/2010/wordml" xmlns:w15="http://schemas.microsoft.com/office/word/2012/wordml" xmlns:w16cei="http://schemas.microsoft.com/office/word/2026/wordml/cei" xmlns:w16cex="http://schemas.microsoft.com/office/word/2018/wordml/cex" xmlns:w16cid="http://schemas.microsoft.com/office/word/2016/wordml/cid" xmlns:w16="http://schemas.microsoft.com/office/word/2018/wordml" xmlns:w16du="http://schemas.microsoft.com/office/word/2023/wordml/word16du" xmlns:w16sdtdh="http://schemas.microsoft.com/office/word/2020/wordml/sdtdatahash" xmlns:w16sdtfl="http://schemas.microsoft.com/office/word/2024/wordml/sdtformatlock" xmlns:w16se="http://schemas.microsoft.com/office/word/2015/wordml/symex" xmlns:wpg="http://schemas.microsoft.com/office/word/2010/wordprocessingGroup" xmlns:wpi="http://schemas.microsoft.com/office/word/2010/wordprocessingInk" xmlns:wne="http://schemas.microsoft.com/office/word/2006/wordml" xmlns:wps="http://schemas.microsoft.com/office/word/2010/wordprocessingShape" mc:Ignorable="w14 w15 w16se w16cid w16 w16cex w16sdtdh w16sdtfl w16du wp14">
+  <w:footnote w:type="separator" w:id="-1">
+    <w:p>
+      <w:pPr>
+        <w:spacing w:after="0" w:line="240" w:lineRule="auto"/>
+      </w:pPr>
+      <w:r>
+        <w:separator/>
+      </w:r>
+    </w:p>
+  </w:footnote>
+  <w:footnote w:type="continuationSeparator" w:id="0">
+    <w:p>
+      <w:pPr>
+        <w:spacing w:after="0" w:line="240" w:lineRule="auto"/>
+      </w:pPr>
+      <w:r>
+        <w:continuationSeparator/>
+      </w:r>
+    </w:p>
+  </w:footnote>
+</w:footnotes>
+</file>
+
 <file path=word/numbering.xml><?xml version="1.0" encoding="utf-8"?>
-<w:numbering xmlns:wpc="http://schemas.microsoft.com/office/word/2010/wordprocessingCanvas" xmlns:cx="http://schemas.microsoft.com/office/drawing/2014/chartex" xmlns:cx1="http://schemas.microsoft.com/office/drawing/2015/9/8/chartex" xmlns:cx2="http://schemas.microsoft.com/office/drawing/2015/10/21/chartex" xmlns:cx3="http://schemas.microsoft.com/office/drawing/2016/5/9/chartex" xmlns:cx4="http://schemas.microsoft.com/office/drawing/2016/5/10/chartex" xmlns:cx5="http://schemas.microsoft.com/office/drawing/2016/5/11/chartex" xmlns:cx6="http://schemas.microsoft.com/office/drawing/2016/5/12/chartex" xmlns:cx7="http://schemas.microsoft.com/office/drawing/2016/5/13/chartex" xmlns:cx8="http://schemas.microsoft.com/office/drawing/2016/5/14/chartex" xmlns:mc="http://schemas.openxmlformats.org/markup-compatibility/2006" xmlns:aink="http://schemas.microsoft.com/office/drawing/2016/ink" xmlns:am3d="http://schemas.microsoft.com/office/drawing/2017/model3d" xmlns:o="urn:schemas-microsoft-com:office:office" xmlns:r="http://schemas.openxmlformats.org/officeDocument/2006/relationships" xmlns:m="http://schemas.openxmlformats.org/officeDocument/2006/math" xmlns:v="urn:schemas-microsoft-com:vml" xmlns:wp14="http://schemas.microsoft.com/office/word/2010/wordprocessingDrawing" xmlns:wp="http://schemas.openxmlformats.org/drawingml/2006/wordprocessingDrawing" xmlns:w10="urn:schemas-microsoft-com:office:word" xmlns:w="http://schemas.openxmlformats.org/wordprocessingml/2006/main" xmlns:w14="http://schemas.microsoft.com/office/word/2010/wordml" xmlns:w15="http://schemas.microsoft.com/office/word/2012/wordml" xmlns:w16cid="http://schemas.microsoft.com/office/word/2016/wordml/cid" xmlns:w16se="http://schemas.microsoft.com/office/word/2015/wordml/symex" xmlns:wpg="http://schemas.microsoft.com/office/word/2010/wordprocessingGroup" xmlns:wpi="http://schemas.microsoft.com/office/word/2010/wordprocessingInk" xmlns:wne="http://schemas.microsoft.com/office/word/2006/wordml" xmlns:wps="http://schemas.microsoft.com/office/word/2010/wordprocessingShape" mc:Ignorable="w14 w15 w16se w16cid wp14">
+<w:numbering xmlns:wpc="http://schemas.microsoft.com/office/word/2010/wordprocessingCanvas" xmlns:cx="http://schemas.microsoft.com/office/drawing/2014/chartex" xmlns:cx1="http://schemas.microsoft.com/office/drawing/2015/9/8/chartex" xmlns:cx2="http://schemas.microsoft.com/office/drawing/2015/10/21/chartex" xmlns:cx3="http://schemas.microsoft.com/office/drawing/2016/5/9/chartex" xmlns:cx4="http://schemas.microsoft.com/office/drawing/2016/5/10/chartex" xmlns:cx5="http://schemas.microsoft.com/office/drawing/2016/5/11/chartex" xmlns:cx6="http://schemas.microsoft.com/office/drawing/2016/5/12/chartex" xmlns:cx7="http://schemas.microsoft.com/office/drawing/2016/5/13/chartex" xmlns:cx8="http://schemas.microsoft.com/office/drawing/2016/5/14/chartex" xmlns:mc="http://schemas.openxmlformats.org/markup-compatibility/2006" xmlns:aink="http://schemas.microsoft.com/office/drawing/2016/ink" xmlns:am3d="http://schemas.microsoft.com/office/drawing/2017/model3d" xmlns:o="urn:schemas-microsoft-com:office:office" xmlns:oel="http://schemas.microsoft.com/office/2019/extlst" xmlns:r="http://schemas.openxmlformats.org/officeDocument/2006/relationships" xmlns:m="http://schemas.openxmlformats.org/officeDocument/2006/math" xmlns:v="urn:schemas-microsoft-com:vml" xmlns:wp14="http://schemas.microsoft.com/office/word/2010/wordprocessingDrawing" xmlns:wp="http://schemas.openxmlformats.org/drawingml/2006/wordprocessingDrawing" xmlns:w10="urn:schemas-microsoft-com:office:word" xmlns:w="http://schemas.openxmlformats.org/wordprocessingml/2006/main" xmlns:w14="http://schemas.microsoft.com/office/word/2010/wordml" xmlns:w15="http://schemas.microsoft.com/office/word/2012/wordml" xmlns:w16cei="http://schemas.microsoft.com/office/word/2026/wordml/cei" xmlns:w16cex="http://schemas.microsoft.com/office/word/2018/wordml/cex" xmlns:w16cid="http://schemas.microsoft.com/office/word/2016/wordml/cid" xmlns:w16="http://schemas.microsoft.com/office/word/2018/wordml" xmlns:w16du="http://schemas.microsoft.com/office/word/2023/wordml/word16du" xmlns:w16sdtdh="http://schemas.microsoft.com/office/word/2020/wordml/sdtdatahash" xmlns:w16sdtfl="http://schemas.microsoft.com/office/word/2024/wordml/sdtformatlock" xmlns:w16se="http://schemas.microsoft.com/office/word/2015/wordml/symex" xmlns:wpg="http://schemas.microsoft.com/office/word/2010/wordprocessingGroup" xmlns:wpi="http://schemas.microsoft.com/office/word/2010/wordprocessingInk" xmlns:wne="http://schemas.microsoft.com/office/word/2006/wordml" xmlns:wps="http://schemas.microsoft.com/office/word/2010/wordprocessingShape" mc:Ignorable="w14 w15 w16se w16cid w16 w16cex w16sdtdh w16sdtfl w16du wp14">
   <w:abstractNum w:abstractNumId="0" w15:restartNumberingAfterBreak="0">
     <w:nsid w:val="018B6DEB"/>
     <w:multiLevelType w:val="multilevel"/>
@@ -12544,155 +12666,155 @@
       <w:lvlJc w:val="left"/>
     </w:lvl>
   </w:abstractNum>
-  <w:num w:numId="1">
+  <w:num w:numId="1" w16cid:durableId="2079084775">
     <w:abstractNumId w:val="32"/>
   </w:num>
-  <w:num w:numId="2">
+  <w:num w:numId="2" w16cid:durableId="327903602">
     <w:abstractNumId w:val="43"/>
   </w:num>
-  <w:num w:numId="3">
+  <w:num w:numId="3" w16cid:durableId="924417789">
     <w:abstractNumId w:val="4"/>
   </w:num>
-  <w:num w:numId="4">
+  <w:num w:numId="4" w16cid:durableId="954874739">
     <w:abstractNumId w:val="29"/>
   </w:num>
-  <w:num w:numId="5">
+  <w:num w:numId="5" w16cid:durableId="65150020">
     <w:abstractNumId w:val="18"/>
   </w:num>
-  <w:num w:numId="6">
+  <w:num w:numId="6" w16cid:durableId="1997370480">
     <w:abstractNumId w:val="21"/>
   </w:num>
-  <w:num w:numId="7">
+  <w:num w:numId="7" w16cid:durableId="1797601166">
     <w:abstractNumId w:val="5"/>
   </w:num>
-  <w:num w:numId="8">
+  <w:num w:numId="8" w16cid:durableId="152571161">
     <w:abstractNumId w:val="45"/>
   </w:num>
-  <w:num w:numId="9">
+  <w:num w:numId="9" w16cid:durableId="406878990">
     <w:abstractNumId w:val="36"/>
   </w:num>
-  <w:num w:numId="10">
+  <w:num w:numId="10" w16cid:durableId="1806847916">
     <w:abstractNumId w:val="35"/>
   </w:num>
-  <w:num w:numId="11">
+  <w:num w:numId="11" w16cid:durableId="1304236389">
     <w:abstractNumId w:val="22"/>
   </w:num>
-  <w:num w:numId="12">
+  <w:num w:numId="12" w16cid:durableId="324358022">
     <w:abstractNumId w:val="3"/>
   </w:num>
-  <w:num w:numId="13">
+  <w:num w:numId="13" w16cid:durableId="401176591">
     <w:abstractNumId w:val="40"/>
   </w:num>
-  <w:num w:numId="14">
+  <w:num w:numId="14" w16cid:durableId="459032090">
     <w:abstractNumId w:val="12"/>
   </w:num>
-  <w:num w:numId="15">
+  <w:num w:numId="15" w16cid:durableId="924805699">
     <w:abstractNumId w:val="46"/>
   </w:num>
-  <w:num w:numId="16">
+  <w:num w:numId="16" w16cid:durableId="1944150633">
     <w:abstractNumId w:val="13"/>
   </w:num>
-  <w:num w:numId="17">
+  <w:num w:numId="17" w16cid:durableId="925920228">
     <w:abstractNumId w:val="47"/>
   </w:num>
-  <w:num w:numId="18">
+  <w:num w:numId="18" w16cid:durableId="857161388">
     <w:abstractNumId w:val="16"/>
   </w:num>
-  <w:num w:numId="19">
+  <w:num w:numId="19" w16cid:durableId="2112699068">
     <w:abstractNumId w:val="37"/>
   </w:num>
-  <w:num w:numId="20">
+  <w:num w:numId="20" w16cid:durableId="1432581979">
     <w:abstractNumId w:val="24"/>
   </w:num>
-  <w:num w:numId="21">
+  <w:num w:numId="21" w16cid:durableId="1463229999">
     <w:abstractNumId w:val="38"/>
   </w:num>
-  <w:num w:numId="22">
+  <w:num w:numId="22" w16cid:durableId="2008819932">
     <w:abstractNumId w:val="26"/>
   </w:num>
-  <w:num w:numId="23">
+  <w:num w:numId="23" w16cid:durableId="1893733752">
     <w:abstractNumId w:val="23"/>
   </w:num>
-  <w:num w:numId="24">
+  <w:num w:numId="24" w16cid:durableId="1191532226">
     <w:abstractNumId w:val="19"/>
   </w:num>
-  <w:num w:numId="25">
+  <w:num w:numId="25" w16cid:durableId="587929410">
     <w:abstractNumId w:val="39"/>
   </w:num>
-  <w:num w:numId="26">
+  <w:num w:numId="26" w16cid:durableId="411196720">
     <w:abstractNumId w:val="44"/>
   </w:num>
-  <w:num w:numId="27">
+  <w:num w:numId="27" w16cid:durableId="2020695193">
     <w:abstractNumId w:val="17"/>
   </w:num>
-  <w:num w:numId="28">
+  <w:num w:numId="28" w16cid:durableId="1836530338">
     <w:abstractNumId w:val="33"/>
   </w:num>
-  <w:num w:numId="29">
+  <w:num w:numId="29" w16cid:durableId="1206525469">
     <w:abstractNumId w:val="31"/>
   </w:num>
-  <w:num w:numId="30">
+  <w:num w:numId="30" w16cid:durableId="761804644">
     <w:abstractNumId w:val="30"/>
   </w:num>
-  <w:num w:numId="31">
+  <w:num w:numId="31" w16cid:durableId="295913850">
     <w:abstractNumId w:val="2"/>
   </w:num>
-  <w:num w:numId="32">
+  <w:num w:numId="32" w16cid:durableId="1487935491">
     <w:abstractNumId w:val="25"/>
   </w:num>
-  <w:num w:numId="33">
+  <w:num w:numId="33" w16cid:durableId="1073505867">
     <w:abstractNumId w:val="7"/>
   </w:num>
-  <w:num w:numId="34">
+  <w:num w:numId="34" w16cid:durableId="1234588961">
     <w:abstractNumId w:val="34"/>
   </w:num>
-  <w:num w:numId="35">
+  <w:num w:numId="35" w16cid:durableId="1696031792">
     <w:abstractNumId w:val="9"/>
   </w:num>
-  <w:num w:numId="36">
+  <w:num w:numId="36" w16cid:durableId="870996034">
     <w:abstractNumId w:val="1"/>
   </w:num>
-  <w:num w:numId="37">
+  <w:num w:numId="37" w16cid:durableId="1223366133">
     <w:abstractNumId w:val="10"/>
   </w:num>
-  <w:num w:numId="38">
+  <w:num w:numId="38" w16cid:durableId="900209182">
     <w:abstractNumId w:val="15"/>
   </w:num>
-  <w:num w:numId="39">
+  <w:num w:numId="39" w16cid:durableId="581178900">
     <w:abstractNumId w:val="8"/>
   </w:num>
-  <w:num w:numId="40">
+  <w:num w:numId="40" w16cid:durableId="1812478528">
     <w:abstractNumId w:val="0"/>
   </w:num>
-  <w:num w:numId="41">
+  <w:num w:numId="41" w16cid:durableId="891312349">
     <w:abstractNumId w:val="11"/>
   </w:num>
-  <w:num w:numId="42">
+  <w:num w:numId="42" w16cid:durableId="129245732">
     <w:abstractNumId w:val="41"/>
   </w:num>
-  <w:num w:numId="43">
+  <w:num w:numId="43" w16cid:durableId="1743719934">
     <w:abstractNumId w:val="6"/>
   </w:num>
-  <w:num w:numId="44">
+  <w:num w:numId="44" w16cid:durableId="698430595">
     <w:abstractNumId w:val="20"/>
   </w:num>
-  <w:num w:numId="45">
+  <w:num w:numId="45" w16cid:durableId="725106304">
     <w:abstractNumId w:val="27"/>
   </w:num>
-  <w:num w:numId="46">
+  <w:num w:numId="46" w16cid:durableId="27874592">
     <w:abstractNumId w:val="14"/>
   </w:num>
-  <w:num w:numId="47">
+  <w:num w:numId="47" w16cid:durableId="578445140">
     <w:abstractNumId w:val="28"/>
   </w:num>
-  <w:num w:numId="48">
+  <w:num w:numId="48" w16cid:durableId="1643656490">
     <w:abstractNumId w:val="42"/>
   </w:num>
 </w:numbering>
 </file>
 
 <file path=word/styles.xml><?xml version="1.0" encoding="utf-8"?>
-<w:styles xmlns:mc="http://schemas.openxmlformats.org/markup-compatibility/2006" xmlns:r="http://schemas.openxmlformats.org/officeDocument/2006/relationships" xmlns:w="http://schemas.openxmlformats.org/wordprocessingml/2006/main" xmlns:w14="http://schemas.microsoft.com/office/word/2010/wordml" xmlns:w15="http://schemas.microsoft.com/office/word/2012/wordml" xmlns:w16cid="http://schemas.microsoft.com/office/word/2016/wordml/cid" xmlns:w16se="http://schemas.microsoft.com/office/word/2015/wordml/symex" mc:Ignorable="w14 w15 w16se w16cid">
+<w:styles xmlns:mc="http://schemas.openxmlformats.org/markup-compatibility/2006" xmlns:r="http://schemas.openxmlformats.org/officeDocument/2006/relationships" xmlns:w="http://schemas.openxmlformats.org/wordprocessingml/2006/main" xmlns:w14="http://schemas.microsoft.com/office/word/2010/wordml" xmlns:w15="http://schemas.microsoft.com/office/word/2012/wordml" xmlns:w16cex="http://schemas.microsoft.com/office/word/2018/wordml/cex" xmlns:w16cid="http://schemas.microsoft.com/office/word/2016/wordml/cid" xmlns:w16="http://schemas.microsoft.com/office/word/2018/wordml" xmlns:w16du="http://schemas.microsoft.com/office/word/2023/wordml/word16du" xmlns:w16sdtdh="http://schemas.microsoft.com/office/word/2020/wordml/sdtdatahash" xmlns:w16sdtfl="http://schemas.microsoft.com/office/word/2024/wordml/sdtformatlock" xmlns:w16se="http://schemas.microsoft.com/office/word/2015/wordml/symex" mc:Ignorable="w14 w15 w16se w16cid w16 w16cex w16sdtdh w16sdtfl w16du">
   <w:docDefaults>
     <w:rPrDefault>
       <w:rPr>
@@ -12708,7 +12830,7 @@
       </w:pPr>
     </w:pPrDefault>
   </w:docDefaults>
-  <w:latentStyles w:defLockedState="0" w:defUIPriority="99" w:defSemiHidden="0" w:defUnhideWhenUsed="0" w:defQFormat="0" w:count="375">
+  <w:latentStyles w:defLockedState="0" w:defUIPriority="99" w:defSemiHidden="0" w:defUnhideWhenUsed="0" w:defQFormat="0" w:count="376">
     <w:lsdException w:name="Normal" w:uiPriority="0" w:qFormat="1"/>
     <w:lsdException w:name="heading 1" w:uiPriority="9" w:qFormat="1"/>
     <w:lsdException w:name="heading 2" w:semiHidden="1" w:uiPriority="9" w:unhideWhenUsed="1" w:qFormat="1"/>
@@ -12814,6 +12936,7 @@
     <w:lsdException w:name="HTML Sample" w:semiHidden="1" w:unhideWhenUsed="1"/>
     <w:lsdException w:name="HTML Typewriter" w:semiHidden="1" w:unhideWhenUsed="1"/>
     <w:lsdException w:name="HTML Variable" w:semiHidden="1" w:unhideWhenUsed="1"/>
+    <w:lsdException w:name="Normal Table" w:semiHidden="1" w:unhideWhenUsed="1"/>
     <w:lsdException w:name="annotation subject" w:semiHidden="1" w:unhideWhenUsed="1"/>
     <w:lsdException w:name="No List" w:semiHidden="1" w:unhideWhenUsed="1"/>
     <w:lsdException w:name="Outline List 1" w:semiHidden="1" w:unhideWhenUsed="1"/>
@@ -12857,8 +12980,10 @@
     <w:lsdException w:name="Table Elegant" w:semiHidden="1" w:unhideWhenUsed="1"/>
     <w:lsdException w:name="Table Professional" w:semiHidden="1" w:unhideWhenUsed="1"/>
     <w:lsdException w:name="Table Subtle 1" w:semiHidden="1" w:unhideWhenUsed="1"/>
+    <w:lsdException w:name="Table Subtle 2" w:semiHidden="1" w:unhideWhenUsed="1"/>
     <w:lsdException w:name="Table Web 1" w:semiHidden="1" w:unhideWhenUsed="1"/>
     <w:lsdException w:name="Table Web 2" w:semiHidden="1" w:unhideWhenUsed="1"/>
+    <w:lsdException w:name="Table Web 3" w:semiHidden="1" w:unhideWhenUsed="1"/>
     <w:lsdException w:name="Balloon Text" w:semiHidden="1" w:unhideWhenUsed="1"/>
     <w:lsdException w:name="Table Grid" w:uiPriority="59"/>
     <w:lsdException w:name="Table Theme" w:semiHidden="1" w:unhideWhenUsed="1"/>
@@ -13081,6 +13206,7 @@
     <w:lsdException w:name="Smart Hyperlink" w:semiHidden="1" w:unhideWhenUsed="1"/>
     <w:lsdException w:name="Hashtag" w:semiHidden="1" w:unhideWhenUsed="1"/>
     <w:lsdException w:name="Unresolved Mention" w:semiHidden="1" w:unhideWhenUsed="1"/>
+    <w:lsdException w:name="Smart Link" w:semiHidden="1" w:unhideWhenUsed="1"/>
   </w:latentStyles>
   <w:style w:type="paragraph" w:default="1" w:styleId="Normal">
     <w:name w:val="Normal"/>
@@ -13122,6 +13248,50 @@
       <w:ind w:left="720"/>
       <w:contextualSpacing/>
     </w:pPr>
+  </w:style>
+  <w:style w:type="paragraph" w:styleId="Cabealho">
+    <w:name w:val="header"/>
+    <w:basedOn w:val="Normal"/>
+    <w:link w:val="CabealhoChar"/>
+    <w:uiPriority w:val="99"/>
+    <w:unhideWhenUsed/>
+    <w:rsid w:val="002E4F8D"/>
+    <w:pPr>
+      <w:tabs>
+        <w:tab w:val="center" w:pos="4252"/>
+        <w:tab w:val="right" w:pos="8504"/>
+      </w:tabs>
+      <w:spacing w:after="0" w:line="240" w:lineRule="auto"/>
+    </w:pPr>
+  </w:style>
+  <w:style w:type="character" w:customStyle="1" w:styleId="CabealhoChar">
+    <w:name w:val="Cabeçalho Char"/>
+    <w:basedOn w:val="Fontepargpadro"/>
+    <w:link w:val="Cabealho"/>
+    <w:uiPriority w:val="99"/>
+    <w:rsid w:val="002E4F8D"/>
+  </w:style>
+  <w:style w:type="paragraph" w:styleId="Rodap">
+    <w:name w:val="footer"/>
+    <w:basedOn w:val="Normal"/>
+    <w:link w:val="RodapChar"/>
+    <w:uiPriority w:val="99"/>
+    <w:unhideWhenUsed/>
+    <w:rsid w:val="002E4F8D"/>
+    <w:pPr>
+      <w:tabs>
+        <w:tab w:val="center" w:pos="4252"/>
+        <w:tab w:val="right" w:pos="8504"/>
+      </w:tabs>
+      <w:spacing w:after="0" w:line="240" w:lineRule="auto"/>
+    </w:pPr>
+  </w:style>
+  <w:style w:type="character" w:customStyle="1" w:styleId="RodapChar">
+    <w:name w:val="Rodapé Char"/>
+    <w:basedOn w:val="Fontepargpadro"/>
+    <w:link w:val="Rodap"/>
+    <w:uiPriority w:val="99"/>
+    <w:rsid w:val="002E4F8D"/>
   </w:style>
 </w:styles>
 </file>

</xml_diff>